<commit_message>
Remove Story type (ADR-110), add New menu, localized default names, graphify rules
Hierarchy is now Epic > Task > Sub-Task; migration flattens existing data.
Top-bar New menu (Task/Epic/Bug/Space, shortcut N). Default list and status
names are displayed in the user's language. Graphify section in CLAUDE.md.

Co-Authored-By: Claude Sonnet 5.5 <noreply@anthropic.com>
</commit_message>
<xml_diff>
--- a/apps/web/public/help/Egebis-Seyir-Kullanim-Kilavuzu.docx
+++ b/apps/web/public/help/Egebis-Seyir-Kullanim-Kilavuzu.docx
@@ -612,7 +612,7 @@
                 <w:sz w:val="20"/>
                 <w:szCs w:val="20"/>
               </w:rPr>
-              <w:t xml:space="preserve">Birçok Story ve Task'ı çatısı altında toplayan büyük hedef. İsteğe bağlıdır.</w:t>
+              <w:t xml:space="preserve">Birçok Task'ı çatısı altında toplayan büyük hedef. İsteğe bağlıdır.</w:t>
             </w:r>
           </w:p>
         </w:tc>
@@ -682,7 +682,7 @@
                 <w:sz w:val="20"/>
                 <w:szCs w:val="20"/>
               </w:rPr>
-              <w:t xml:space="preserve">Story</w:t>
+              <w:t xml:space="preserve">Task</w:t>
             </w:r>
           </w:p>
         </w:tc>
@@ -714,7 +714,7 @@
                 <w:sz w:val="20"/>
                 <w:szCs w:val="20"/>
               </w:rPr>
-              <w:t xml:space="preserve">Kullanıcının gözünden anlatılan bir özellik; Epic'in parçasıdır.</w:t>
+              <w:t xml:space="preserve">Yapılacak tek bir iş. Başlığı, sahibi, tarihi ve puanı vardır.</w:t>
             </w:r>
           </w:p>
         </w:tc>
@@ -746,7 +746,7 @@
                 <w:sz w:val="20"/>
                 <w:szCs w:val="20"/>
               </w:rPr>
-              <w:t xml:space="preserve">Kullanıcı şifresini sıfırlayabilir</w:t>
+              <w:t xml:space="preserve">Giriş ekranını tasarla</w:t>
             </w:r>
           </w:p>
         </w:tc>
@@ -784,7 +784,7 @@
                 <w:sz w:val="20"/>
                 <w:szCs w:val="20"/>
               </w:rPr>
-              <w:t xml:space="preserve">Task</w:t>
+              <w:t xml:space="preserve">Sub-Task</w:t>
             </w:r>
           </w:p>
         </w:tc>
@@ -817,7 +817,7 @@
                 <w:sz w:val="20"/>
                 <w:szCs w:val="20"/>
               </w:rPr>
-              <w:t xml:space="preserve">Yapılacak tek bir iş. Başlığı, sahibi, tarihi ve puanı vardır.</w:t>
+              <w:t xml:space="preserve">Bir Task'ın küçük parçası. Tek başına var olamaz, her zaman bir üst Task'a bağlıdır.</w:t>
             </w:r>
           </w:p>
         </w:tc>
@@ -850,7 +850,7 @@
                 <w:sz w:val="20"/>
                 <w:szCs w:val="20"/>
               </w:rPr>
-              <w:t xml:space="preserve">Giriş ekranını tasarla</w:t>
+              <w:t xml:space="preserve">Form alanlarını çiz</w:t>
             </w:r>
           </w:p>
         </w:tc>
@@ -887,7 +887,7 @@
                 <w:sz w:val="20"/>
                 <w:szCs w:val="20"/>
               </w:rPr>
-              <w:t xml:space="preserve">Sub-Task</w:t>
+              <w:t xml:space="preserve">Sprint</w:t>
             </w:r>
           </w:p>
         </w:tc>
@@ -919,7 +919,7 @@
                 <w:sz w:val="20"/>
                 <w:szCs w:val="20"/>
               </w:rPr>
-              <w:t xml:space="preserve">Bir Task'ın küçük parçası. Tek başına var olamaz, her zaman bir üst Task'a bağlıdır.</w:t>
+              <w:t xml:space="preserve">Genellikle 1–2 hafta süren, hedefi ve tarihleri belli çalışma dönemi. Ekip o dönemde hangi işleri yapacağını seçer.</w:t>
             </w:r>
           </w:p>
         </w:tc>
@@ -951,7 +951,7 @@
                 <w:sz w:val="20"/>
                 <w:szCs w:val="20"/>
               </w:rPr>
-              <w:t xml:space="preserve">Form alanlarını çiz</w:t>
+              <w:t xml:space="preserve">Sprint 1 (15–28 Ekim)</w:t>
             </w:r>
           </w:p>
         </w:tc>
@@ -989,7 +989,7 @@
                 <w:sz w:val="20"/>
                 <w:szCs w:val="20"/>
               </w:rPr>
-              <w:t xml:space="preserve">Sprint</w:t>
+              <w:t xml:space="preserve">Backlog</w:t>
             </w:r>
           </w:p>
         </w:tc>
@@ -1022,7 +1022,7 @@
                 <w:sz w:val="20"/>
                 <w:szCs w:val="20"/>
               </w:rPr>
-              <w:t xml:space="preserve">Genellikle 1–2 hafta süren, hedefi ve tarihleri belli çalışma dönemi. Ekip o dönemde hangi işleri yapacağını seçer.</w:t>
+              <w:t xml:space="preserve">Henüz bir Sprint'e alınmamış, öncelik sırasıyla bekleyen işlerin listesi.</w:t>
             </w:r>
           </w:p>
         </w:tc>
@@ -1055,7 +1055,7 @@
                 <w:sz w:val="20"/>
                 <w:szCs w:val="20"/>
               </w:rPr>
-              <w:t xml:space="preserve">Sprint 1 (15–28 Ekim)</w:t>
+              <w:t xml:space="preserve">—</w:t>
             </w:r>
           </w:p>
         </w:tc>
@@ -1092,7 +1092,7 @@
                 <w:sz w:val="20"/>
                 <w:szCs w:val="20"/>
               </w:rPr>
-              <w:t xml:space="preserve">Backlog</w:t>
+              <w:t xml:space="preserve">Story Point</w:t>
             </w:r>
           </w:p>
         </w:tc>
@@ -1124,7 +1124,7 @@
                 <w:sz w:val="20"/>
                 <w:szCs w:val="20"/>
               </w:rPr>
-              <w:t xml:space="preserve">Henüz bir Sprint'e alınmamış, öncelik sırasıyla bekleyen işlerin listesi.</w:t>
+              <w:t xml:space="preserve">Bir işin büyüklüğünü gösteren puan (1, 2, 3, 5, 8, 13, 21, 34, 55).</w:t>
             </w:r>
           </w:p>
         </w:tc>
@@ -1137,110 +1137,6 @@
               <w:bottom w:val="single" w:color="C9CEDB" w:sz="4"/>
               <w:right w:val="single" w:color="C9CEDB" w:sz="4"/>
             </w:tcBorders>
-            <w:tcMar>
-              <w:top w:type="dxa" w:w="70"/>
-              <w:left w:type="dxa" w:w="110"/>
-              <w:bottom w:type="dxa" w:w="70"/>
-              <w:right w:type="dxa" w:w="110"/>
-            </w:tcMar>
-          </w:tcPr>
-          <w:p>
-            <w:pPr>
-              <w:spacing w:after="0" w:line="270"/>
-            </w:pPr>
-            <w:r>
-              <w:rPr>
-                <w:rFonts w:ascii="Calibri" w:cs="Calibri" w:eastAsia="Calibri" w:hAnsi="Calibri"/>
-                <w:b w:val="false"/>
-                <w:bCs w:val="false"/>
-                <w:sz w:val="20"/>
-                <w:szCs w:val="20"/>
-              </w:rPr>
-              <w:t xml:space="preserve">—</w:t>
-            </w:r>
-          </w:p>
-        </w:tc>
-      </w:tr>
-      <w:tr>
-        <w:trPr>
-          <w:cantSplit/>
-        </w:trPr>
-        <w:tc>
-          <w:tcPr>
-            <w:tcW w:type="dxa" w:w="2120"/>
-            <w:tcBorders>
-              <w:top w:val="single" w:color="C9CEDB" w:sz="4"/>
-              <w:left w:val="single" w:color="C9CEDB" w:sz="4"/>
-              <w:bottom w:val="single" w:color="C9CEDB" w:sz="4"/>
-              <w:right w:val="single" w:color="C9CEDB" w:sz="4"/>
-            </w:tcBorders>
-            <w:shd w:fill="F4F5FA" w:color="auto" w:val="clear"/>
-            <w:tcMar>
-              <w:top w:type="dxa" w:w="70"/>
-              <w:left w:type="dxa" w:w="110"/>
-              <w:bottom w:type="dxa" w:w="70"/>
-              <w:right w:type="dxa" w:w="110"/>
-            </w:tcMar>
-          </w:tcPr>
-          <w:p>
-            <w:pPr>
-              <w:spacing w:after="0" w:line="270"/>
-            </w:pPr>
-            <w:r>
-              <w:rPr>
-                <w:rFonts w:ascii="Calibri" w:cs="Calibri" w:eastAsia="Calibri" w:hAnsi="Calibri"/>
-                <w:b/>
-                <w:bCs/>
-                <w:sz w:val="20"/>
-                <w:szCs w:val="20"/>
-              </w:rPr>
-              <w:t xml:space="preserve">Story Point</w:t>
-            </w:r>
-          </w:p>
-        </w:tc>
-        <w:tc>
-          <w:tcPr>
-            <w:tcW w:type="dxa" w:w="3759"/>
-            <w:tcBorders>
-              <w:top w:val="single" w:color="C9CEDB" w:sz="4"/>
-              <w:left w:val="single" w:color="C9CEDB" w:sz="4"/>
-              <w:bottom w:val="single" w:color="C9CEDB" w:sz="4"/>
-              <w:right w:val="single" w:color="C9CEDB" w:sz="4"/>
-            </w:tcBorders>
-            <w:shd w:fill="F4F5FA" w:color="auto" w:val="clear"/>
-            <w:tcMar>
-              <w:top w:type="dxa" w:w="70"/>
-              <w:left w:type="dxa" w:w="110"/>
-              <w:bottom w:type="dxa" w:w="70"/>
-              <w:right w:type="dxa" w:w="110"/>
-            </w:tcMar>
-          </w:tcPr>
-          <w:p>
-            <w:pPr>
-              <w:spacing w:after="0" w:line="270"/>
-            </w:pPr>
-            <w:r>
-              <w:rPr>
-                <w:rFonts w:ascii="Calibri" w:cs="Calibri" w:eastAsia="Calibri" w:hAnsi="Calibri"/>
-                <w:b w:val="false"/>
-                <w:bCs w:val="false"/>
-                <w:sz w:val="20"/>
-                <w:szCs w:val="20"/>
-              </w:rPr>
-              <w:t xml:space="preserve">Bir işin büyüklüğünü gösteren puan (1, 2, 3, 5, 8, 13, 21, 34, 55).</w:t>
-            </w:r>
-          </w:p>
-        </w:tc>
-        <w:tc>
-          <w:tcPr>
-            <w:tcW w:type="dxa" w:w="3759"/>
-            <w:tcBorders>
-              <w:top w:val="single" w:color="C9CEDB" w:sz="4"/>
-              <w:left w:val="single" w:color="C9CEDB" w:sz="4"/>
-              <w:bottom w:val="single" w:color="C9CEDB" w:sz="4"/>
-              <w:right w:val="single" w:color="C9CEDB" w:sz="4"/>
-            </w:tcBorders>
-            <w:shd w:fill="F4F5FA" w:color="auto" w:val="clear"/>
             <w:tcMar>
               <w:top w:type="dxa" w:w="70"/>
               <w:left w:type="dxa" w:w="110"/>
@@ -2915,7 +2811,7 @@
           <w:sz w:val="22"/>
           <w:szCs w:val="22"/>
         </w:rPr>
-        <w:t xml:space="preserve">, birçok Story ve Task'ı çatısı altında toplayan büyük bir hedeftir (ör. “Kullanıcı hesabı yönetimi”). Hiyerarşi şöyledir: </w:t>
+        <w:t xml:space="preserve">, birçok Task'ı çatısı altında toplayan büyük bir hedeftir (ör. “Kullanıcı hesabı yönetimi”). Hiyerarşi şöyledir: </w:t>
       </w:r>
       <w:r>
         <w:rPr>
@@ -2925,7 +2821,7 @@
           <w:sz w:val="22"/>
           <w:szCs w:val="22"/>
         </w:rPr>
-        <w:t xml:space="preserve">Epic → Story → Task → Sub-Task</w:t>
+        <w:t xml:space="preserve">Epic → Task → Sub-Task</w:t>
       </w:r>
       <w:r>
         <w:rPr>
@@ -2969,7 +2865,7 @@
           <w:sz w:val="22"/>
           <w:szCs w:val="22"/>
         </w:rPr>
-        <w:t xml:space="preserve">Epic sprint'e girmez; çatı olarak kalır. Sprint'e Story, Task ve Bug alınır.</w:t>
+        <w:t xml:space="preserve">Epic sprint'e girmez; çatı olarak kalır. Sprint'e Task ve Bug alınır.</w:t>
       </w:r>
     </w:p>
     <w:p>
@@ -2987,7 +2883,7 @@
           <w:sz w:val="22"/>
           <w:szCs w:val="22"/>
         </w:rPr>
-        <w:t xml:space="preserve">Epic'in ilerleme çubuğu, altındaki Story'lerin durumundan otomatik hesaplanır.</w:t>
+        <w:t xml:space="preserve">Epic'in ilerleme çubuğu, altındaki Task'ların durumundan otomatik hesaplanır.</w:t>
       </w:r>
     </w:p>
     <w:p>
@@ -3544,6 +3440,145 @@
         <w:spacing w:after="200"/>
       </w:pPr>
     </w:p>
+    <w:tbl>
+      <w:tblPr>
+        <w:tblW w:type="dxa" w:w="9638"/>
+        <w:tblBorders>
+          <w:top w:val="single" w:color="auto" w:sz="4"/>
+          <w:left w:val="single" w:color="auto" w:sz="4"/>
+          <w:bottom w:val="single" w:color="auto" w:sz="4"/>
+          <w:right w:val="single" w:color="auto" w:sz="4"/>
+          <w:insideH w:val="single" w:color="auto" w:sz="4"/>
+          <w:insideV w:val="single" w:color="auto" w:sz="4"/>
+        </w:tblBorders>
+      </w:tblPr>
+      <w:tblGrid>
+        <w:gridCol w:w="9638"/>
+      </w:tblGrid>
+      <w:tr>
+        <w:trPr>
+          <w:cantSplit/>
+        </w:trPr>
+        <w:tc>
+          <w:tcPr>
+            <w:tcW w:type="dxa" w:w="9638"/>
+            <w:tcBorders>
+              <w:top w:val="none" w:color="FFFFFF" w:sz="0"/>
+              <w:left w:val="single" w:color="10B981" w:sz="24"/>
+              <w:bottom w:val="none" w:color="FFFFFF" w:sz="0"/>
+              <w:right w:val="none" w:color="FFFFFF" w:sz="0"/>
+            </w:tcBorders>
+            <w:shd w:fill="E7F7EE" w:color="auto" w:val="clear"/>
+            <w:tcMar>
+              <w:top w:type="dxa" w:w="100"/>
+              <w:left w:type="dxa" w:w="180"/>
+              <w:bottom w:type="dxa" w:w="100"/>
+              <w:right w:type="dxa" w:w="140"/>
+            </w:tcMar>
+          </w:tcPr>
+          <w:p>
+            <w:pPr>
+              <w:spacing w:after="0" w:line="290"/>
+            </w:pPr>
+            <w:r>
+              <w:rPr>
+                <w:rFonts w:ascii="Calibri" w:cs="Calibri" w:eastAsia="Calibri" w:hAnsi="Calibri"/>
+                <w:b/>
+                <w:bCs/>
+                <w:sz w:val="22"/>
+                <w:szCs w:val="22"/>
+              </w:rPr>
+              <w:t xml:space="preserve">İpucu: </w:t>
+            </w:r>
+            <w:r>
+              <w:rPr>
+                <w:rFonts w:ascii="Calibri" w:cs="Calibri" w:eastAsia="Calibri" w:hAnsi="Calibri"/>
+                <w:sz w:val="22"/>
+                <w:szCs w:val="22"/>
+              </w:rPr>
+              <w:t xml:space="preserve">Epic'in altına Task eklemek için Epic satırının sağındaki </w:t>
+            </w:r>
+            <w:r>
+              <w:rPr>
+                <w:rFonts w:ascii="Calibri" w:cs="Calibri" w:eastAsia="Calibri" w:hAnsi="Calibri"/>
+                <w:b/>
+                <w:bCs/>
+                <w:sz w:val="22"/>
+                <w:szCs w:val="22"/>
+              </w:rPr>
+              <w:t xml:space="preserve">⋯</w:t>
+            </w:r>
+            <w:r>
+              <w:rPr>
+                <w:rFonts w:ascii="Calibri" w:cs="Calibri" w:eastAsia="Calibri" w:hAnsi="Calibri"/>
+                <w:sz w:val="22"/>
+                <w:szCs w:val="22"/>
+              </w:rPr>
+              <w:t xml:space="preserve"> düğmesine tıkla, </w:t>
+            </w:r>
+            <w:r>
+              <w:rPr>
+                <w:rFonts w:ascii="Calibri" w:cs="Calibri" w:eastAsia="Calibri" w:hAnsi="Calibri"/>
+                <w:b/>
+                <w:bCs/>
+                <w:sz w:val="22"/>
+                <w:szCs w:val="22"/>
+              </w:rPr>
+              <w:t xml:space="preserve">Alt öğe ekle</w:t>
+            </w:r>
+            <w:r>
+              <w:rPr>
+                <w:rFonts w:ascii="Calibri" w:cs="Calibri" w:eastAsia="Calibri" w:hAnsi="Calibri"/>
+                <w:sz w:val="22"/>
+                <w:szCs w:val="22"/>
+              </w:rPr>
+              <w:t xml:space="preserve">'yi seç ve </w:t>
+            </w:r>
+            <w:r>
+              <w:rPr>
+                <w:rFonts w:ascii="Calibri" w:cs="Calibri" w:eastAsia="Calibri" w:hAnsi="Calibri"/>
+                <w:b/>
+                <w:bCs/>
+                <w:sz w:val="22"/>
+                <w:szCs w:val="22"/>
+              </w:rPr>
+              <w:t xml:space="preserve">Tip</w:t>
+            </w:r>
+            <w:r>
+              <w:rPr>
+                <w:rFonts w:ascii="Calibri" w:cs="Calibri" w:eastAsia="Calibri" w:hAnsi="Calibri"/>
+                <w:sz w:val="22"/>
+                <w:szCs w:val="22"/>
+              </w:rPr>
+              <w:t xml:space="preserve"> kutusunda </w:t>
+            </w:r>
+            <w:r>
+              <w:rPr>
+                <w:rFonts w:ascii="Calibri" w:cs="Calibri" w:eastAsia="Calibri" w:hAnsi="Calibri"/>
+                <w:b/>
+                <w:bCs/>
+                <w:sz w:val="22"/>
+                <w:szCs w:val="22"/>
+              </w:rPr>
+              <w:t xml:space="preserve">Task</w:t>
+            </w:r>
+            <w:r>
+              <w:rPr>
+                <w:rFonts w:ascii="Calibri" w:cs="Calibri" w:eastAsia="Calibri" w:hAnsi="Calibri"/>
+                <w:sz w:val="22"/>
+                <w:szCs w:val="22"/>
+              </w:rPr>
+              <w:t xml:space="preserve">'ı bırak. Epic'in altına Bug da eklenebilir.</w:t>
+            </w:r>
+          </w:p>
+        </w:tc>
+      </w:tr>
+    </w:tbl>
+    <w:p>
+      <w:pPr>
+        <w:spacing w:after="160"/>
+      </w:pPr>
+    </w:p>
     <w:p>
       <w:pPr>
         <w:spacing w:after="140" w:line="300"/>
@@ -4431,7 +4466,7 @@
           <w:sz w:val="20"/>
           <w:szCs w:val="20"/>
         </w:rPr>
-        <w:t xml:space="preserve">Dönüşüm sonrası: iki Epic var; dönüşen Epic'in Sub-Task'ı artık Story.</w:t>
+        <w:t xml:space="preserve">Dönüşüm sonrası: iki Epic var; dönüşen Epic'in Sub-Task'ı artık Task.</w:t>
       </w:r>
     </w:p>
     <w:tbl>
@@ -4701,15 +4736,15 @@
                 <w:sz w:val="21"/>
                 <w:szCs w:val="21"/>
               </w:rPr>
-              <w:t xml:space="preserve">Story</w:t>
-            </w:r>
-            <w:r>
-              <w:rPr>
-                <w:rFonts w:ascii="Calibri" w:cs="Calibri" w:eastAsia="Calibri" w:hAnsi="Calibri"/>
-                <w:sz w:val="21"/>
-                <w:szCs w:val="21"/>
-              </w:rPr>
-              <w:t xml:space="preserve">: Eskiden Sub-Task'tı; Epic'in altında Story olarak durur.</w:t>
+              <w:t xml:space="preserve">Task</w:t>
+            </w:r>
+            <w:r>
+              <w:rPr>
+                <w:rFonts w:ascii="Calibri" w:cs="Calibri" w:eastAsia="Calibri" w:hAnsi="Calibri"/>
+                <w:sz w:val="21"/>
+                <w:szCs w:val="21"/>
+              </w:rPr>
+              <w:t xml:space="preserve">: Eskiden Sub-Task'tı; Epic'in altında Task olarak durur.</w:t>
             </w:r>
           </w:p>
         </w:tc>
@@ -4932,7 +4967,7 @@
                 <w:sz w:val="20"/>
                 <w:szCs w:val="20"/>
               </w:rPr>
-              <w:t xml:space="preserve">Üst Story</w:t>
+              <w:t xml:space="preserve">Üst Epic</w:t>
             </w:r>
           </w:p>
         </w:tc>
@@ -4965,7 +5000,7 @@
                 <w:sz w:val="20"/>
                 <w:szCs w:val="20"/>
               </w:rPr>
-              <w:t xml:space="preserve">Task bir Story'nin altındaysa </w:t>
+              <w:t xml:space="preserve">Task bir Epic'in altındaysa </w:t>
             </w:r>
             <w:r>
               <w:rPr>
@@ -5155,7 +5190,7 @@
                 <w:sz w:val="20"/>
                 <w:szCs w:val="20"/>
               </w:rPr>
-              <w:t xml:space="preserve">Story'ye dönüşür</w:t>
+              <w:t xml:space="preserve">Task'a dönüşür</w:t>
             </w:r>
             <w:r>
               <w:rPr>
@@ -5428,7 +5463,7 @@
                 <w:sz w:val="22"/>
                 <w:szCs w:val="22"/>
               </w:rPr>
-              <w:t xml:space="preserve"> dönüştürülebilir (Story, Bug veya Sub-Task değil) ve Space'in çalışma modu </w:t>
+              <w:t xml:space="preserve"> dönüştürülebilir (Bug veya Sub-Task değil) ve Space'in çalışma modu </w:t>
             </w:r>
             <w:r>
               <w:rPr>
@@ -5836,7 +5871,7 @@
                 <w:sz w:val="21"/>
                 <w:szCs w:val="21"/>
               </w:rPr>
-              <w:t xml:space="preserve"> seçili (diğerleri: Epic, Story, Bug).</w:t>
+              <w:t xml:space="preserve"> seçili (diğerleri: Epic, Bug).</w:t>
             </w:r>
           </w:p>
         </w:tc>
@@ -8674,7 +8709,7 @@
           <w:sz w:val="22"/>
           <w:szCs w:val="22"/>
         </w:rPr>
-        <w:t xml:space="preserve">Büyük bir işi parçalara bölmek için Sub-Task kullanılır. Sub-Task her zaman bir üst öğeye (Task, Story veya Bug) bağlıdır ve onun altında görünür.</w:t>
+        <w:t xml:space="preserve">Büyük bir işi parçalara bölmek için Sub-Task kullanılır. Sub-Task her zaman bir üst öğeye (Task veya Bug) bağlıdır ve onun altında görünür.</w:t>
       </w:r>
     </w:p>
     <w:p>
@@ -13518,7 +13553,7 @@
           <w:sz w:val="22"/>
           <w:szCs w:val="22"/>
         </w:rPr>
-        <w:t xml:space="preserve">Sprint'e Task, Story ve Bug girer; Epic girmez. Sub-Task'lar üstleriyle birlikte gelir.</w:t>
+        <w:t xml:space="preserve">Sprint'e Task ve Bug girer; Epic girmez. Sub-Task'lar üstleriyle birlikte gelir.</w:t>
       </w:r>
     </w:p>
     <w:p>
@@ -16996,7 +17031,7 @@
           <w:sz w:val="22"/>
           <w:szCs w:val="22"/>
         </w:rPr>
-        <w:t xml:space="preserve"> Yalnızca Task'larda ve çalışma modu Scrum olan Space'lerde görünür; Story, Bug ve Sub-Task'ta yoktur. Yazma yetkin de olmalı.</w:t>
+        <w:t xml:space="preserve"> Yalnızca Task'larda ve çalışma modu Scrum olan Space'lerde görünür; Bug ve Sub-Task'ta yoktur. Yazma yetkin de olmalı.</w:t>
       </w:r>
     </w:p>
     <w:p>

</xml_diff>

<commit_message>
feat: Faz 10 polish - guide sections/screenshots, ADR-111..115, e2e fixes
New Share/Roles/Attachments/Kanban/New-button guide sections (TR/EN) with
screenshots and Word guides, big CTA buttons in sidebar, New menu default
target from the open page/item, role delete robust to unmount, e2e updates.

Co-Authored-By: Claude Sonnet 5.5 <noreply@anthropic.com>
</commit_message>
<xml_diff>
--- a/apps/web/public/help/Egebis-Seyir-Kullanim-Kilavuzu.docx
+++ b/apps/web/public/help/Egebis-Seyir-Kullanim-Kilavuzu.docx
@@ -238,7 +238,7 @@
           <w:sz w:val="24"/>
           <w:szCs w:val="24"/>
         </w:rPr>
-        <w:t xml:space="preserve">10. Sprint panosu (Kanban)</w:t>
+        <w:t xml:space="preserve">10. Sprint panosu</w:t>
       </w:r>
     </w:p>
     <w:p>
@@ -251,7 +251,72 @@
           <w:sz w:val="24"/>
           <w:szCs w:val="24"/>
         </w:rPr>
-        <w:t xml:space="preserve">11. Kısa ipuçları ve sık sorulanlar</w:t>
+        <w:t xml:space="preserve">11. Büyük New düğmesi</w:t>
+      </w:r>
+    </w:p>
+    <w:p>
+      <w:pPr>
+        <w:spacing w:after="100"/>
+      </w:pPr>
+      <w:r>
+        <w:rPr>
+          <w:rFonts w:ascii="Calibri" w:cs="Calibri" w:eastAsia="Calibri" w:hAnsi="Calibri"/>
+          <w:sz w:val="24"/>
+          <w:szCs w:val="24"/>
+        </w:rPr>
+        <w:t xml:space="preserve">12. Task veya Epic üzerinde paylaşım ve yetkiler</w:t>
+      </w:r>
+    </w:p>
+    <w:p>
+      <w:pPr>
+        <w:spacing w:after="100"/>
+      </w:pPr>
+      <w:r>
+        <w:rPr>
+          <w:rFonts w:ascii="Calibri" w:cs="Calibri" w:eastAsia="Calibri" w:hAnsi="Calibri"/>
+          <w:sz w:val="24"/>
+          <w:szCs w:val="24"/>
+        </w:rPr>
+        <w:t xml:space="preserve">13. Roller ve yetkiler (Ayarlar)</w:t>
+      </w:r>
+    </w:p>
+    <w:p>
+      <w:pPr>
+        <w:spacing w:after="100"/>
+      </w:pPr>
+      <w:r>
+        <w:rPr>
+          <w:rFonts w:ascii="Calibri" w:cs="Calibri" w:eastAsia="Calibri" w:hAnsi="Calibri"/>
+          <w:sz w:val="24"/>
+          <w:szCs w:val="24"/>
+        </w:rPr>
+        <w:t xml:space="preserve">14. Dosya ekleme</w:t>
+      </w:r>
+    </w:p>
+    <w:p>
+      <w:pPr>
+        <w:spacing w:after="100"/>
+      </w:pPr>
+      <w:r>
+        <w:rPr>
+          <w:rFonts w:ascii="Calibri" w:cs="Calibri" w:eastAsia="Calibri" w:hAnsi="Calibri"/>
+          <w:sz w:val="24"/>
+          <w:szCs w:val="24"/>
+        </w:rPr>
+        <w:t xml:space="preserve">15. Tüm Space için Kanban board</w:t>
+      </w:r>
+    </w:p>
+    <w:p>
+      <w:pPr>
+        <w:spacing w:after="100"/>
+      </w:pPr>
+      <w:r>
+        <w:rPr>
+          <w:rFonts w:ascii="Calibri" w:cs="Calibri" w:eastAsia="Calibri" w:hAnsi="Calibri"/>
+          <w:sz w:val="24"/>
+          <w:szCs w:val="24"/>
+        </w:rPr>
+        <w:t xml:space="preserve">16. Kısa ipuçları ve sık sorulanlar</w:t>
       </w:r>
     </w:p>
     <w:p>
@@ -2250,7 +2315,7 @@
           <w:sz w:val="22"/>
           <w:szCs w:val="22"/>
         </w:rPr>
-        <w:t xml:space="preserve">İstersen renk ve ikon seç. </w:t>
+        <w:t xml:space="preserve">İstersen renk ve ikon seç. Sprint ve Backlog kullanacaksan </w:t>
       </w:r>
       <w:r>
         <w:rPr>
@@ -2268,7 +2333,7 @@
           <w:sz w:val="22"/>
           <w:szCs w:val="22"/>
         </w:rPr>
-        <w:t xml:space="preserve"> olarak </w:t>
+        <w:t xml:space="preserve">nu </w:t>
       </w:r>
       <w:r>
         <w:rPr>
@@ -2286,7 +2351,25 @@
           <w:sz w:val="22"/>
           <w:szCs w:val="22"/>
         </w:rPr>
-        <w:t xml:space="preserve"> seçersen Epic, Sprint ve Backlog özellikleri açık olur.</w:t>
+        <w:t xml:space="preserve">da bırak; sprintsiz, sürekli akışlı bir pano istiyorsan </w:t>
+      </w:r>
+      <w:r>
+        <w:rPr>
+          <w:rFonts w:ascii="Calibri" w:cs="Calibri" w:eastAsia="Calibri" w:hAnsi="Calibri"/>
+          <w:b/>
+          <w:bCs/>
+          <w:sz w:val="22"/>
+          <w:szCs w:val="22"/>
+        </w:rPr>
+        <w:t xml:space="preserve">Kanban</w:t>
+      </w:r>
+      <w:r>
+        <w:rPr>
+          <w:rFonts w:ascii="Calibri" w:cs="Calibri" w:eastAsia="Calibri" w:hAnsi="Calibri"/>
+          <w:sz w:val="22"/>
+          <w:szCs w:val="22"/>
+        </w:rPr>
+        <w:t xml:space="preserve">ı seç.</w:t>
       </w:r>
     </w:p>
     <w:p>
@@ -4062,7 +4145,7 @@
       <w:r>
         <w:drawing>
           <wp:inline distT="0" distB="0" distL="0" distR="0">
-            <wp:extent cx="4800600" cy="3209925"/>
+            <wp:extent cx="4791075" cy="3200400"/>
             <wp:effectExtent t="0" r="0" b="0" l="0"/>
             <wp:docPr id="5" name="19-epic-promote-dialog" descr="Epic'e dönüştürme onay penceresi" title="Epic'e dönüştürme onay penceresi"/>
             <wp:cNvGraphicFramePr>
@@ -4087,7 +4170,7 @@
                   <pic:spPr bwMode="auto">
                     <a:xfrm>
                       <a:off x="0" y="0"/>
-                      <a:ext cx="4800600" cy="3209925"/>
+                      <a:ext cx="4791075" cy="3200400"/>
                     </a:xfrm>
                     <a:prstGeom prst="rect">
                       <a:avLst/>
@@ -15493,7 +15576,7 @@
           <w:sz w:val="34"/>
           <w:szCs w:val="34"/>
         </w:rPr>
-        <w:t xml:space="preserve">10. Sprint panosu (Kanban)</w:t>
+        <w:t xml:space="preserve">10. Sprint panosu</w:t>
       </w:r>
     </w:p>
     <w:p>
@@ -16183,7 +16266,3530 @@
           <w:sz w:val="34"/>
           <w:szCs w:val="34"/>
         </w:rPr>
-        <w:t xml:space="preserve">11. Kısa ipuçları ve sık sorulanlar</w:t>
+        <w:t xml:space="preserve">11. Büyük New düğmesi</w:t>
+      </w:r>
+    </w:p>
+    <w:p>
+      <w:pPr>
+        <w:spacing w:after="140" w:line="300"/>
+      </w:pPr>
+      <w:r>
+        <w:rPr>
+          <w:rFonts w:ascii="Calibri" w:cs="Calibri" w:eastAsia="Calibri" w:hAnsi="Calibri"/>
+          <w:sz w:val="22"/>
+          <w:szCs w:val="22"/>
+        </w:rPr>
+        <w:t xml:space="preserve">Her sayfanın üstündeki </w:t>
+      </w:r>
+      <w:r>
+        <w:rPr>
+          <w:rFonts w:ascii="Calibri" w:cs="Calibri" w:eastAsia="Calibri" w:hAnsi="Calibri"/>
+          <w:b/>
+          <w:bCs/>
+          <w:sz w:val="22"/>
+          <w:szCs w:val="22"/>
+        </w:rPr>
+        <w:t xml:space="preserve">New</w:t>
+      </w:r>
+      <w:r>
+        <w:rPr>
+          <w:rFonts w:ascii="Calibri" w:cs="Calibri" w:eastAsia="Calibri" w:hAnsi="Calibri"/>
+          <w:sz w:val="22"/>
+          <w:szCs w:val="22"/>
+        </w:rPr>
+        <w:t xml:space="preserve"> düğmesi, bir şeye başlamanın en hızlı yoludur. Önce bir liste açman gerekmez.</w:t>
+      </w:r>
+    </w:p>
+    <w:p>
+      <w:pPr>
+        <w:pStyle w:val="ListParagraph"/>
+        <w:numPr>
+          <w:ilvl w:val="0"/>
+          <w:numId w:val="14"/>
+        </w:numPr>
+        <w:spacing w:after="100" w:line="290"/>
+      </w:pPr>
+      <w:r>
+        <w:rPr>
+          <w:rFonts w:ascii="Calibri" w:cs="Calibri" w:eastAsia="Calibri" w:hAnsi="Calibri"/>
+          <w:sz w:val="22"/>
+          <w:szCs w:val="22"/>
+        </w:rPr>
+        <w:t xml:space="preserve"/>
+      </w:r>
+      <w:r>
+        <w:rPr>
+          <w:rFonts w:ascii="Calibri" w:cs="Calibri" w:eastAsia="Calibri" w:hAnsi="Calibri"/>
+          <w:b/>
+          <w:bCs/>
+          <w:sz w:val="22"/>
+          <w:szCs w:val="22"/>
+        </w:rPr>
+        <w:t xml:space="preserve">New</w:t>
+      </w:r>
+      <w:r>
+        <w:rPr>
+          <w:rFonts w:ascii="Calibri" w:cs="Calibri" w:eastAsia="Calibri" w:hAnsi="Calibri"/>
+          <w:sz w:val="22"/>
+          <w:szCs w:val="22"/>
+        </w:rPr>
+        <w:t xml:space="preserve">e tıkla (ya da yazı yazmıyorken klavyede </w:t>
+      </w:r>
+      <w:r>
+        <w:rPr>
+          <w:rFonts w:ascii="Calibri" w:cs="Calibri" w:eastAsia="Calibri" w:hAnsi="Calibri"/>
+          <w:b/>
+          <w:bCs/>
+          <w:sz w:val="22"/>
+          <w:szCs w:val="22"/>
+        </w:rPr>
+        <w:t xml:space="preserve">N</w:t>
+      </w:r>
+      <w:r>
+        <w:rPr>
+          <w:rFonts w:ascii="Calibri" w:cs="Calibri" w:eastAsia="Calibri" w:hAnsi="Calibri"/>
+          <w:sz w:val="22"/>
+          <w:szCs w:val="22"/>
+        </w:rPr>
+        <w:t xml:space="preserve">ye bas).</w:t>
+      </w:r>
+    </w:p>
+    <w:p>
+      <w:pPr>
+        <w:pStyle w:val="ListParagraph"/>
+        <w:numPr>
+          <w:ilvl w:val="0"/>
+          <w:numId w:val="14"/>
+        </w:numPr>
+        <w:spacing w:after="100" w:line="290"/>
+      </w:pPr>
+      <w:r>
+        <w:rPr>
+          <w:rFonts w:ascii="Calibri" w:cs="Calibri" w:eastAsia="Calibri" w:hAnsi="Calibri"/>
+          <w:sz w:val="22"/>
+          <w:szCs w:val="22"/>
+        </w:rPr>
+        <w:t xml:space="preserve">Ne oluşturacağını seç: </w:t>
+      </w:r>
+      <w:r>
+        <w:rPr>
+          <w:rFonts w:ascii="Calibri" w:cs="Calibri" w:eastAsia="Calibri" w:hAnsi="Calibri"/>
+          <w:b/>
+          <w:bCs/>
+          <w:sz w:val="22"/>
+          <w:szCs w:val="22"/>
+        </w:rPr>
+        <w:t xml:space="preserve">Task</w:t>
+      </w:r>
+      <w:r>
+        <w:rPr>
+          <w:rFonts w:ascii="Calibri" w:cs="Calibri" w:eastAsia="Calibri" w:hAnsi="Calibri"/>
+          <w:sz w:val="22"/>
+          <w:szCs w:val="22"/>
+        </w:rPr>
+        <w:t xml:space="preserve">, </w:t>
+      </w:r>
+      <w:r>
+        <w:rPr>
+          <w:rFonts w:ascii="Calibri" w:cs="Calibri" w:eastAsia="Calibri" w:hAnsi="Calibri"/>
+          <w:b/>
+          <w:bCs/>
+          <w:sz w:val="22"/>
+          <w:szCs w:val="22"/>
+        </w:rPr>
+        <w:t xml:space="preserve">Epic</w:t>
+      </w:r>
+      <w:r>
+        <w:rPr>
+          <w:rFonts w:ascii="Calibri" w:cs="Calibri" w:eastAsia="Calibri" w:hAnsi="Calibri"/>
+          <w:sz w:val="22"/>
+          <w:szCs w:val="22"/>
+        </w:rPr>
+        <w:t xml:space="preserve">, </w:t>
+      </w:r>
+      <w:r>
+        <w:rPr>
+          <w:rFonts w:ascii="Calibri" w:cs="Calibri" w:eastAsia="Calibri" w:hAnsi="Calibri"/>
+          <w:b/>
+          <w:bCs/>
+          <w:sz w:val="22"/>
+          <w:szCs w:val="22"/>
+        </w:rPr>
+        <w:t xml:space="preserve">Bug</w:t>
+      </w:r>
+      <w:r>
+        <w:rPr>
+          <w:rFonts w:ascii="Calibri" w:cs="Calibri" w:eastAsia="Calibri" w:hAnsi="Calibri"/>
+          <w:sz w:val="22"/>
+          <w:szCs w:val="22"/>
+        </w:rPr>
+        <w:t xml:space="preserve"> veya </w:t>
+      </w:r>
+      <w:r>
+        <w:rPr>
+          <w:rFonts w:ascii="Calibri" w:cs="Calibri" w:eastAsia="Calibri" w:hAnsi="Calibri"/>
+          <w:b/>
+          <w:bCs/>
+          <w:sz w:val="22"/>
+          <w:szCs w:val="22"/>
+        </w:rPr>
+        <w:t xml:space="preserve">Space</w:t>
+      </w:r>
+      <w:r>
+        <w:rPr>
+          <w:rFonts w:ascii="Calibri" w:cs="Calibri" w:eastAsia="Calibri" w:hAnsi="Calibri"/>
+          <w:sz w:val="22"/>
+          <w:szCs w:val="22"/>
+        </w:rPr>
+        <w:t xml:space="preserve">.</w:t>
+      </w:r>
+    </w:p>
+    <w:p>
+      <w:pPr>
+        <w:pStyle w:val="ListParagraph"/>
+        <w:numPr>
+          <w:ilvl w:val="0"/>
+          <w:numId w:val="14"/>
+        </w:numPr>
+        <w:spacing w:after="100" w:line="290"/>
+      </w:pPr>
+      <w:r>
+        <w:rPr>
+          <w:rFonts w:ascii="Calibri" w:cs="Calibri" w:eastAsia="Calibri" w:hAnsi="Calibri"/>
+          <w:sz w:val="22"/>
+          <w:szCs w:val="22"/>
+        </w:rPr>
+        <w:t xml:space="preserve">Task, Epic ve Bug için küçük bir pencere açılır. </w:t>
+      </w:r>
+      <w:r>
+        <w:rPr>
+          <w:rFonts w:ascii="Calibri" w:cs="Calibri" w:eastAsia="Calibri" w:hAnsi="Calibri"/>
+          <w:b/>
+          <w:bCs/>
+          <w:sz w:val="22"/>
+          <w:szCs w:val="22"/>
+        </w:rPr>
+        <w:t xml:space="preserve">Başlığı</w:t>
+      </w:r>
+      <w:r>
+        <w:rPr>
+          <w:rFonts w:ascii="Calibri" w:cs="Calibri" w:eastAsia="Calibri" w:hAnsi="Calibri"/>
+          <w:sz w:val="22"/>
+          <w:szCs w:val="22"/>
+        </w:rPr>
+        <w:t xml:space="preserve"> yaz; </w:t>
+      </w:r>
+      <w:r>
+        <w:rPr>
+          <w:rFonts w:ascii="Calibri" w:cs="Calibri" w:eastAsia="Calibri" w:hAnsi="Calibri"/>
+          <w:b/>
+          <w:bCs/>
+          <w:sz w:val="22"/>
+          <w:szCs w:val="22"/>
+        </w:rPr>
+        <w:t xml:space="preserve">Space</w:t>
+      </w:r>
+      <w:r>
+        <w:rPr>
+          <w:rFonts w:ascii="Calibri" w:cs="Calibri" w:eastAsia="Calibri" w:hAnsi="Calibri"/>
+          <w:sz w:val="22"/>
+          <w:szCs w:val="22"/>
+        </w:rPr>
+        <w:t xml:space="preserve"> ve </w:t>
+      </w:r>
+      <w:r>
+        <w:rPr>
+          <w:rFonts w:ascii="Calibri" w:cs="Calibri" w:eastAsia="Calibri" w:hAnsi="Calibri"/>
+          <w:b/>
+          <w:bCs/>
+          <w:sz w:val="22"/>
+          <w:szCs w:val="22"/>
+        </w:rPr>
+        <w:t xml:space="preserve">List</w:t>
+      </w:r>
+      <w:r>
+        <w:rPr>
+          <w:rFonts w:ascii="Calibri" w:cs="Calibri" w:eastAsia="Calibri" w:hAnsi="Calibri"/>
+          <w:sz w:val="22"/>
+          <w:szCs w:val="22"/>
+        </w:rPr>
+        <w:t xml:space="preserve"> seçimini kontrol et (baktığın Space/List hazır gelir).</w:t>
+      </w:r>
+    </w:p>
+    <w:p>
+      <w:pPr>
+        <w:pStyle w:val="ListParagraph"/>
+        <w:numPr>
+          <w:ilvl w:val="0"/>
+          <w:numId w:val="14"/>
+        </w:numPr>
+        <w:spacing w:after="100" w:line="290"/>
+      </w:pPr>
+      <w:r>
+        <w:rPr>
+          <w:rFonts w:ascii="Calibri" w:cs="Calibri" w:eastAsia="Calibri" w:hAnsi="Calibri"/>
+          <w:sz w:val="22"/>
+          <w:szCs w:val="22"/>
+        </w:rPr>
+        <w:t xml:space="preserve">İstersen hemen dosya eklemek için </w:t>
+      </w:r>
+      <w:r>
+        <w:rPr>
+          <w:rFonts w:ascii="Calibri" w:cs="Calibri" w:eastAsia="Calibri" w:hAnsi="Calibri"/>
+          <w:b/>
+          <w:bCs/>
+          <w:sz w:val="22"/>
+          <w:szCs w:val="22"/>
+        </w:rPr>
+        <w:t xml:space="preserve">Dosya ekle</w:t>
+      </w:r>
+      <w:r>
+        <w:rPr>
+          <w:rFonts w:ascii="Calibri" w:cs="Calibri" w:eastAsia="Calibri" w:hAnsi="Calibri"/>
+          <w:sz w:val="22"/>
+          <w:szCs w:val="22"/>
+        </w:rPr>
+        <w:t xml:space="preserve">ye tıkla.</w:t>
+      </w:r>
+    </w:p>
+    <w:p>
+      <w:pPr>
+        <w:pStyle w:val="ListParagraph"/>
+        <w:numPr>
+          <w:ilvl w:val="0"/>
+          <w:numId w:val="14"/>
+        </w:numPr>
+        <w:spacing w:after="100" w:line="290"/>
+      </w:pPr>
+      <w:r>
+        <w:rPr>
+          <w:rFonts w:ascii="Calibri" w:cs="Calibri" w:eastAsia="Calibri" w:hAnsi="Calibri"/>
+          <w:sz w:val="22"/>
+          <w:szCs w:val="22"/>
+        </w:rPr>
+        <w:t xml:space="preserve"/>
+      </w:r>
+      <w:r>
+        <w:rPr>
+          <w:rFonts w:ascii="Calibri" w:cs="Calibri" w:eastAsia="Calibri" w:hAnsi="Calibri"/>
+          <w:b/>
+          <w:bCs/>
+          <w:sz w:val="22"/>
+          <w:szCs w:val="22"/>
+        </w:rPr>
+        <w:t xml:space="preserve">Create</w:t>
+      </w:r>
+      <w:r>
+        <w:rPr>
+          <w:rFonts w:ascii="Calibri" w:cs="Calibri" w:eastAsia="Calibri" w:hAnsi="Calibri"/>
+          <w:sz w:val="22"/>
+          <w:szCs w:val="22"/>
+        </w:rPr>
+        <w:t xml:space="preserve">e tıkla. Yeni öğe ayrıntıları doldurman için açılır.</w:t>
+      </w:r>
+    </w:p>
+    <w:p>
+      <w:pPr>
+        <w:spacing w:after="100"/>
+      </w:pPr>
+    </w:p>
+    <w:p>
+      <w:pPr>
+        <w:keepNext/>
+        <w:spacing w:after="80" w:before="120"/>
+        <w:jc w:val="center"/>
+      </w:pPr>
+      <w:r>
+        <w:drawing>
+          <wp:inline distT="0" distB="0" distL="0" distR="0">
+            <wp:extent cx="5715000" cy="3571875"/>
+            <wp:effectExtent t="0" r="0" b="0" l="0"/>
+            <wp:docPr id="22" name="22-new-menu" descr="New menüsü" title="New menüsü"/>
+            <wp:cNvGraphicFramePr>
+              <a:graphicFrameLocks xmlns:a="http://schemas.openxmlformats.org/drawingml/2006/main" noChangeAspect="1"/>
+            </wp:cNvGraphicFramePr>
+            <a:graphic xmlns:a="http://schemas.openxmlformats.org/drawingml/2006/main">
+              <a:graphicData uri="http://schemas.openxmlformats.org/drawingml/2006/picture">
+                <pic:pic xmlns:pic="http://schemas.openxmlformats.org/drawingml/2006/picture">
+                  <pic:nvPicPr>
+                    <pic:cNvPr id="0" name="" descr=""/>
+                    <pic:cNvPicPr>
+                      <a:picLocks noChangeAspect="1" noChangeArrowheads="1"/>
+                    </pic:cNvPicPr>
+                  </pic:nvPicPr>
+                  <pic:blipFill>
+                    <a:blip r:embed="rId29" cstate="none"/>
+                    <a:srcRect/>
+                    <a:stretch>
+                      <a:fillRect/>
+                    </a:stretch>
+                  </pic:blipFill>
+                  <pic:spPr bwMode="auto">
+                    <a:xfrm>
+                      <a:off x="0" y="0"/>
+                      <a:ext cx="5715000" cy="3571875"/>
+                    </a:xfrm>
+                    <a:prstGeom prst="rect">
+                      <a:avLst/>
+                    </a:prstGeom>
+                  </pic:spPr>
+                </pic:pic>
+              </a:graphicData>
+            </a:graphic>
+          </wp:inline>
+        </w:drawing>
+      </w:r>
+    </w:p>
+    <w:p>
+      <w:pPr>
+        <w:keepNext/>
+        <w:spacing w:after="120"/>
+        <w:jc w:val="center"/>
+      </w:pPr>
+      <w:r>
+        <w:rPr>
+          <w:rFonts w:ascii="Calibri" w:cs="Calibri" w:eastAsia="Calibri" w:hAnsi="Calibri"/>
+          <w:i/>
+          <w:iCs/>
+          <w:color w:val="555B6E"/>
+          <w:sz w:val="20"/>
+          <w:szCs w:val="20"/>
+        </w:rPr>
+        <w:t xml:space="preserve">Üst çubuktan açılan New menüsü.</w:t>
+      </w:r>
+    </w:p>
+    <w:tbl>
+      <w:tblPr>
+        <w:tblW w:type="dxa" w:w="9638"/>
+        <w:tblBorders>
+          <w:top w:val="single" w:color="auto" w:sz="4"/>
+          <w:left w:val="single" w:color="auto" w:sz="4"/>
+          <w:bottom w:val="single" w:color="auto" w:sz="4"/>
+          <w:right w:val="single" w:color="auto" w:sz="4"/>
+          <w:insideH w:val="single" w:color="auto" w:sz="4"/>
+          <w:insideV w:val="single" w:color="auto" w:sz="4"/>
+        </w:tblBorders>
+      </w:tblPr>
+      <w:tblGrid>
+        <w:gridCol w:w="560"/>
+        <w:gridCol w:w="9078"/>
+      </w:tblGrid>
+      <w:tr>
+        <w:trPr>
+          <w:cantSplit/>
+        </w:trPr>
+        <w:tc>
+          <w:tcPr>
+            <w:tcW w:type="dxa" w:w="560"/>
+            <w:tcBorders>
+              <w:top w:val="none" w:color="FFFFFF" w:sz="0"/>
+              <w:left w:val="none" w:color="FFFFFF" w:sz="0"/>
+              <w:bottom w:val="none" w:color="FFFFFF" w:sz="0"/>
+              <w:right w:val="none" w:color="FFFFFF" w:sz="0"/>
+            </w:tcBorders>
+            <w:tcMar>
+              <w:top w:type="dxa" w:w="40"/>
+              <w:left w:type="dxa" w:w="40"/>
+              <w:bottom w:type="dxa" w:w="40"/>
+              <w:right w:type="dxa" w:w="60"/>
+            </w:tcMar>
+            <w:vAlign w:val="top"/>
+          </w:tcPr>
+          <w:p>
+            <w:pPr>
+              <w:jc w:val="center"/>
+            </w:pPr>
+            <w:r>
+              <w:rPr>
+                <w:rFonts w:ascii="Calibri" w:cs="Calibri" w:eastAsia="Calibri" w:hAnsi="Calibri"/>
+                <w:b/>
+                <w:bCs/>
+                <w:color w:val="FFFFFF"/>
+                <w:sz w:val="22"/>
+                <w:szCs w:val="22"/>
+                <w:shd w:fill="E11D48" w:color="auto" w:val="clear"/>
+              </w:rPr>
+              <w:t xml:space="preserve"> 1 </w:t>
+            </w:r>
+          </w:p>
+        </w:tc>
+        <w:tc>
+          <w:tcPr>
+            <w:tcW w:type="dxa" w:w="9078"/>
+            <w:tcBorders>
+              <w:top w:val="none" w:color="FFFFFF" w:sz="0"/>
+              <w:left w:val="none" w:color="FFFFFF" w:sz="0"/>
+              <w:bottom w:val="none" w:color="FFFFFF" w:sz="0"/>
+              <w:right w:val="none" w:color="FFFFFF" w:sz="0"/>
+            </w:tcBorders>
+            <w:tcMar>
+              <w:top w:type="dxa" w:w="40"/>
+              <w:left w:type="dxa" w:w="60"/>
+              <w:bottom w:type="dxa" w:w="40"/>
+              <w:right w:type="dxa" w:w="40"/>
+            </w:tcMar>
+          </w:tcPr>
+          <w:p>
+            <w:pPr>
+              <w:spacing w:after="0"/>
+            </w:pPr>
+            <w:r>
+              <w:rPr>
+                <w:rFonts w:ascii="Calibri" w:cs="Calibri" w:eastAsia="Calibri" w:hAnsi="Calibri"/>
+                <w:sz w:val="21"/>
+                <w:szCs w:val="21"/>
+              </w:rPr>
+              <w:t xml:space="preserve"/>
+            </w:r>
+            <w:r>
+              <w:rPr>
+                <w:rFonts w:ascii="Calibri" w:cs="Calibri" w:eastAsia="Calibri" w:hAnsi="Calibri"/>
+                <w:b/>
+                <w:bCs/>
+                <w:sz w:val="21"/>
+                <w:szCs w:val="21"/>
+              </w:rPr>
+              <w:t xml:space="preserve">New</w:t>
+            </w:r>
+            <w:r>
+              <w:rPr>
+                <w:rFonts w:ascii="Calibri" w:cs="Calibri" w:eastAsia="Calibri" w:hAnsi="Calibri"/>
+                <w:sz w:val="21"/>
+                <w:szCs w:val="21"/>
+              </w:rPr>
+              <w:t xml:space="preserve">: Üst çubuktaki büyük düğme. Kısayol: N.</w:t>
+            </w:r>
+          </w:p>
+        </w:tc>
+      </w:tr>
+      <w:tr>
+        <w:trPr>
+          <w:cantSplit/>
+        </w:trPr>
+        <w:tc>
+          <w:tcPr>
+            <w:tcW w:type="dxa" w:w="560"/>
+            <w:tcBorders>
+              <w:top w:val="none" w:color="FFFFFF" w:sz="0"/>
+              <w:left w:val="none" w:color="FFFFFF" w:sz="0"/>
+              <w:bottom w:val="none" w:color="FFFFFF" w:sz="0"/>
+              <w:right w:val="none" w:color="FFFFFF" w:sz="0"/>
+            </w:tcBorders>
+            <w:tcMar>
+              <w:top w:type="dxa" w:w="40"/>
+              <w:left w:type="dxa" w:w="40"/>
+              <w:bottom w:type="dxa" w:w="40"/>
+              <w:right w:type="dxa" w:w="60"/>
+            </w:tcMar>
+            <w:vAlign w:val="top"/>
+          </w:tcPr>
+          <w:p>
+            <w:pPr>
+              <w:jc w:val="center"/>
+            </w:pPr>
+            <w:r>
+              <w:rPr>
+                <w:rFonts w:ascii="Calibri" w:cs="Calibri" w:eastAsia="Calibri" w:hAnsi="Calibri"/>
+                <w:b/>
+                <w:bCs/>
+                <w:color w:val="FFFFFF"/>
+                <w:sz w:val="22"/>
+                <w:szCs w:val="22"/>
+                <w:shd w:fill="E11D48" w:color="auto" w:val="clear"/>
+              </w:rPr>
+              <w:t xml:space="preserve"> 2 </w:t>
+            </w:r>
+          </w:p>
+        </w:tc>
+        <w:tc>
+          <w:tcPr>
+            <w:tcW w:type="dxa" w:w="9078"/>
+            <w:tcBorders>
+              <w:top w:val="none" w:color="FFFFFF" w:sz="0"/>
+              <w:left w:val="none" w:color="FFFFFF" w:sz="0"/>
+              <w:bottom w:val="none" w:color="FFFFFF" w:sz="0"/>
+              <w:right w:val="none" w:color="FFFFFF" w:sz="0"/>
+            </w:tcBorders>
+            <w:tcMar>
+              <w:top w:type="dxa" w:w="40"/>
+              <w:left w:type="dxa" w:w="60"/>
+              <w:bottom w:type="dxa" w:w="40"/>
+              <w:right w:type="dxa" w:w="40"/>
+            </w:tcMar>
+          </w:tcPr>
+          <w:p>
+            <w:pPr>
+              <w:spacing w:after="0"/>
+            </w:pPr>
+            <w:r>
+              <w:rPr>
+                <w:rFonts w:ascii="Calibri" w:cs="Calibri" w:eastAsia="Calibri" w:hAnsi="Calibri"/>
+                <w:sz w:val="21"/>
+                <w:szCs w:val="21"/>
+              </w:rPr>
+              <w:t xml:space="preserve"/>
+            </w:r>
+            <w:r>
+              <w:rPr>
+                <w:rFonts w:ascii="Calibri" w:cs="Calibri" w:eastAsia="Calibri" w:hAnsi="Calibri"/>
+                <w:b/>
+                <w:bCs/>
+                <w:sz w:val="21"/>
+                <w:szCs w:val="21"/>
+              </w:rPr>
+              <w:t xml:space="preserve">Task</w:t>
+            </w:r>
+            <w:r>
+              <w:rPr>
+                <w:rFonts w:ascii="Calibri" w:cs="Calibri" w:eastAsia="Calibri" w:hAnsi="Calibri"/>
+                <w:sz w:val="21"/>
+                <w:szCs w:val="21"/>
+              </w:rPr>
+              <w:t xml:space="preserve">: Sprint için bir iş parçası.</w:t>
+            </w:r>
+          </w:p>
+        </w:tc>
+      </w:tr>
+      <w:tr>
+        <w:trPr>
+          <w:cantSplit/>
+        </w:trPr>
+        <w:tc>
+          <w:tcPr>
+            <w:tcW w:type="dxa" w:w="560"/>
+            <w:tcBorders>
+              <w:top w:val="none" w:color="FFFFFF" w:sz="0"/>
+              <w:left w:val="none" w:color="FFFFFF" w:sz="0"/>
+              <w:bottom w:val="none" w:color="FFFFFF" w:sz="0"/>
+              <w:right w:val="none" w:color="FFFFFF" w:sz="0"/>
+            </w:tcBorders>
+            <w:tcMar>
+              <w:top w:type="dxa" w:w="40"/>
+              <w:left w:type="dxa" w:w="40"/>
+              <w:bottom w:type="dxa" w:w="40"/>
+              <w:right w:type="dxa" w:w="60"/>
+            </w:tcMar>
+            <w:vAlign w:val="top"/>
+          </w:tcPr>
+          <w:p>
+            <w:pPr>
+              <w:jc w:val="center"/>
+            </w:pPr>
+            <w:r>
+              <w:rPr>
+                <w:rFonts w:ascii="Calibri" w:cs="Calibri" w:eastAsia="Calibri" w:hAnsi="Calibri"/>
+                <w:b/>
+                <w:bCs/>
+                <w:color w:val="FFFFFF"/>
+                <w:sz w:val="22"/>
+                <w:szCs w:val="22"/>
+                <w:shd w:fill="E11D48" w:color="auto" w:val="clear"/>
+              </w:rPr>
+              <w:t xml:space="preserve"> 3 </w:t>
+            </w:r>
+          </w:p>
+        </w:tc>
+        <w:tc>
+          <w:tcPr>
+            <w:tcW w:type="dxa" w:w="9078"/>
+            <w:tcBorders>
+              <w:top w:val="none" w:color="FFFFFF" w:sz="0"/>
+              <w:left w:val="none" w:color="FFFFFF" w:sz="0"/>
+              <w:bottom w:val="none" w:color="FFFFFF" w:sz="0"/>
+              <w:right w:val="none" w:color="FFFFFF" w:sz="0"/>
+            </w:tcBorders>
+            <w:tcMar>
+              <w:top w:type="dxa" w:w="40"/>
+              <w:left w:type="dxa" w:w="60"/>
+              <w:bottom w:type="dxa" w:w="40"/>
+              <w:right w:type="dxa" w:w="40"/>
+            </w:tcMar>
+          </w:tcPr>
+          <w:p>
+            <w:pPr>
+              <w:spacing w:after="0"/>
+            </w:pPr>
+            <w:r>
+              <w:rPr>
+                <w:rFonts w:ascii="Calibri" w:cs="Calibri" w:eastAsia="Calibri" w:hAnsi="Calibri"/>
+                <w:sz w:val="21"/>
+                <w:szCs w:val="21"/>
+              </w:rPr>
+              <w:t xml:space="preserve"/>
+            </w:r>
+            <w:r>
+              <w:rPr>
+                <w:rFonts w:ascii="Calibri" w:cs="Calibri" w:eastAsia="Calibri" w:hAnsi="Calibri"/>
+                <w:b/>
+                <w:bCs/>
+                <w:sz w:val="21"/>
+                <w:szCs w:val="21"/>
+              </w:rPr>
+              <w:t xml:space="preserve">Epic</w:t>
+            </w:r>
+            <w:r>
+              <w:rPr>
+                <w:rFonts w:ascii="Calibri" w:cs="Calibri" w:eastAsia="Calibri" w:hAnsi="Calibri"/>
+                <w:sz w:val="21"/>
+                <w:szCs w:val="21"/>
+              </w:rPr>
+              <w:t xml:space="preserve">: Birçok Task’ı toplayan büyük hedef.</w:t>
+            </w:r>
+          </w:p>
+        </w:tc>
+      </w:tr>
+      <w:tr>
+        <w:trPr>
+          <w:cantSplit/>
+        </w:trPr>
+        <w:tc>
+          <w:tcPr>
+            <w:tcW w:type="dxa" w:w="560"/>
+            <w:tcBorders>
+              <w:top w:val="none" w:color="FFFFFF" w:sz="0"/>
+              <w:left w:val="none" w:color="FFFFFF" w:sz="0"/>
+              <w:bottom w:val="none" w:color="FFFFFF" w:sz="0"/>
+              <w:right w:val="none" w:color="FFFFFF" w:sz="0"/>
+            </w:tcBorders>
+            <w:tcMar>
+              <w:top w:type="dxa" w:w="40"/>
+              <w:left w:type="dxa" w:w="40"/>
+              <w:bottom w:type="dxa" w:w="40"/>
+              <w:right w:type="dxa" w:w="60"/>
+            </w:tcMar>
+            <w:vAlign w:val="top"/>
+          </w:tcPr>
+          <w:p>
+            <w:pPr>
+              <w:jc w:val="center"/>
+            </w:pPr>
+            <w:r>
+              <w:rPr>
+                <w:rFonts w:ascii="Calibri" w:cs="Calibri" w:eastAsia="Calibri" w:hAnsi="Calibri"/>
+                <w:b/>
+                <w:bCs/>
+                <w:color w:val="FFFFFF"/>
+                <w:sz w:val="22"/>
+                <w:szCs w:val="22"/>
+                <w:shd w:fill="E11D48" w:color="auto" w:val="clear"/>
+              </w:rPr>
+              <w:t xml:space="preserve"> 4 </w:t>
+            </w:r>
+          </w:p>
+        </w:tc>
+        <w:tc>
+          <w:tcPr>
+            <w:tcW w:type="dxa" w:w="9078"/>
+            <w:tcBorders>
+              <w:top w:val="none" w:color="FFFFFF" w:sz="0"/>
+              <w:left w:val="none" w:color="FFFFFF" w:sz="0"/>
+              <w:bottom w:val="none" w:color="FFFFFF" w:sz="0"/>
+              <w:right w:val="none" w:color="FFFFFF" w:sz="0"/>
+            </w:tcBorders>
+            <w:tcMar>
+              <w:top w:type="dxa" w:w="40"/>
+              <w:left w:type="dxa" w:w="60"/>
+              <w:bottom w:type="dxa" w:w="40"/>
+              <w:right w:type="dxa" w:w="40"/>
+            </w:tcMar>
+          </w:tcPr>
+          <w:p>
+            <w:pPr>
+              <w:spacing w:after="0"/>
+            </w:pPr>
+            <w:r>
+              <w:rPr>
+                <w:rFonts w:ascii="Calibri" w:cs="Calibri" w:eastAsia="Calibri" w:hAnsi="Calibri"/>
+                <w:sz w:val="21"/>
+                <w:szCs w:val="21"/>
+              </w:rPr>
+              <w:t xml:space="preserve"/>
+            </w:r>
+            <w:r>
+              <w:rPr>
+                <w:rFonts w:ascii="Calibri" w:cs="Calibri" w:eastAsia="Calibri" w:hAnsi="Calibri"/>
+                <w:b/>
+                <w:bCs/>
+                <w:sz w:val="21"/>
+                <w:szCs w:val="21"/>
+              </w:rPr>
+              <w:t xml:space="preserve">Space</w:t>
+            </w:r>
+            <w:r>
+              <w:rPr>
+                <w:rFonts w:ascii="Calibri" w:cs="Calibri" w:eastAsia="Calibri" w:hAnsi="Calibri"/>
+                <w:sz w:val="21"/>
+                <w:szCs w:val="21"/>
+              </w:rPr>
+              <w:t xml:space="preserve">: Yeni proje veya takım alanı.</w:t>
+            </w:r>
+          </w:p>
+        </w:tc>
+      </w:tr>
+    </w:tbl>
+    <w:p>
+      <w:pPr>
+        <w:spacing w:after="200"/>
+      </w:pPr>
+    </w:p>
+    <w:tbl>
+      <w:tblPr>
+        <w:tblW w:type="dxa" w:w="9638"/>
+        <w:tblBorders>
+          <w:top w:val="single" w:color="auto" w:sz="4"/>
+          <w:left w:val="single" w:color="auto" w:sz="4"/>
+          <w:bottom w:val="single" w:color="auto" w:sz="4"/>
+          <w:right w:val="single" w:color="auto" w:sz="4"/>
+          <w:insideH w:val="single" w:color="auto" w:sz="4"/>
+          <w:insideV w:val="single" w:color="auto" w:sz="4"/>
+        </w:tblBorders>
+      </w:tblPr>
+      <w:tblGrid>
+        <w:gridCol w:w="9638"/>
+      </w:tblGrid>
+      <w:tr>
+        <w:trPr>
+          <w:cantSplit/>
+        </w:trPr>
+        <w:tc>
+          <w:tcPr>
+            <w:tcW w:type="dxa" w:w="9638"/>
+            <w:tcBorders>
+              <w:top w:val="none" w:color="FFFFFF" w:sz="0"/>
+              <w:left w:val="single" w:color="10B981" w:sz="24"/>
+              <w:bottom w:val="none" w:color="FFFFFF" w:sz="0"/>
+              <w:right w:val="none" w:color="FFFFFF" w:sz="0"/>
+            </w:tcBorders>
+            <w:shd w:fill="E7F7EE" w:color="auto" w:val="clear"/>
+            <w:tcMar>
+              <w:top w:type="dxa" w:w="100"/>
+              <w:left w:type="dxa" w:w="180"/>
+              <w:bottom w:type="dxa" w:w="100"/>
+              <w:right w:type="dxa" w:w="140"/>
+            </w:tcMar>
+          </w:tcPr>
+          <w:p>
+            <w:pPr>
+              <w:spacing w:after="0" w:line="290"/>
+            </w:pPr>
+            <w:r>
+              <w:rPr>
+                <w:rFonts w:ascii="Calibri" w:cs="Calibri" w:eastAsia="Calibri" w:hAnsi="Calibri"/>
+                <w:b/>
+                <w:bCs/>
+                <w:sz w:val="22"/>
+                <w:szCs w:val="22"/>
+              </w:rPr>
+              <w:t xml:space="preserve">İpucu: </w:t>
+            </w:r>
+            <w:r>
+              <w:rPr>
+                <w:rFonts w:ascii="Calibri" w:cs="Calibri" w:eastAsia="Calibri" w:hAnsi="Calibri"/>
+                <w:sz w:val="22"/>
+                <w:szCs w:val="22"/>
+              </w:rPr>
+              <w:t xml:space="preserve">Sub-Task’lar bir Task’ın içinden oluşturulur (</w:t>
+            </w:r>
+            <w:r>
+              <w:rPr>
+                <w:rFonts w:ascii="Calibri" w:cs="Calibri" w:eastAsia="Calibri" w:hAnsi="Calibri"/>
+                <w:b/>
+                <w:bCs/>
+                <w:sz w:val="22"/>
+                <w:szCs w:val="22"/>
+              </w:rPr>
+              <w:t xml:space="preserve">⋯ → Alt öğe ekle</w:t>
+            </w:r>
+            <w:r>
+              <w:rPr>
+                <w:rFonts w:ascii="Calibri" w:cs="Calibri" w:eastAsia="Calibri" w:hAnsi="Calibri"/>
+                <w:sz w:val="22"/>
+                <w:szCs w:val="22"/>
+              </w:rPr>
+              <w:t xml:space="preserve">), çünkü her zaman bir üst öğeye bağlıdırlar.</w:t>
+            </w:r>
+          </w:p>
+        </w:tc>
+      </w:tr>
+    </w:tbl>
+    <w:p>
+      <w:pPr>
+        <w:spacing w:after="160"/>
+      </w:pPr>
+    </w:p>
+    <w:p>
+      <w:pPr>
+        <w:pStyle w:val="Heading1"/>
+        <w:keepNext/>
+      </w:pPr>
+      <w:r>
+        <w:rPr>
+          <w:rFonts w:ascii="Calibri" w:cs="Calibri" w:eastAsia="Calibri" w:hAnsi="Calibri"/>
+          <w:b/>
+          <w:bCs/>
+          <w:color w:val="3B2A9E"/>
+          <w:sz w:val="34"/>
+          <w:szCs w:val="34"/>
+        </w:rPr>
+        <w:t xml:space="preserve">12. Task veya Epic üzerinde paylaşım ve yetkiler</w:t>
+      </w:r>
+    </w:p>
+    <w:p>
+      <w:pPr>
+        <w:spacing w:after="140" w:line="300"/>
+      </w:pPr>
+      <w:r>
+        <w:rPr>
+          <w:rFonts w:ascii="Calibri" w:cs="Calibri" w:eastAsia="Calibri" w:hAnsi="Calibri"/>
+          <w:sz w:val="22"/>
+          <w:szCs w:val="22"/>
+        </w:rPr>
+        <w:t xml:space="preserve">Varsayılan olarak her öğe Space’inin erişimini izler. </w:t>
+      </w:r>
+      <w:r>
+        <w:rPr>
+          <w:rFonts w:ascii="Calibri" w:cs="Calibri" w:eastAsia="Calibri" w:hAnsi="Calibri"/>
+          <w:b/>
+          <w:bCs/>
+          <w:sz w:val="22"/>
+          <w:szCs w:val="22"/>
+        </w:rPr>
+        <w:t xml:space="preserve">Share</w:t>
+      </w:r>
+      <w:r>
+        <w:rPr>
+          <w:rFonts w:ascii="Calibri" w:cs="Calibri" w:eastAsia="Calibri" w:hAnsi="Calibri"/>
+          <w:sz w:val="22"/>
+          <w:szCs w:val="22"/>
+        </w:rPr>
+        <w:t xml:space="preserve"> ile bir öğeye (ve altındaki her şeye) kişi ya da takım ekleyebilir veya öğeyi </w:t>
+      </w:r>
+      <w:r>
+        <w:rPr>
+          <w:rFonts w:ascii="Calibri" w:cs="Calibri" w:eastAsia="Calibri" w:hAnsi="Calibri"/>
+          <w:b/>
+          <w:bCs/>
+          <w:sz w:val="22"/>
+          <w:szCs w:val="22"/>
+        </w:rPr>
+        <w:t xml:space="preserve">Gizli</w:t>
+      </w:r>
+      <w:r>
+        <w:rPr>
+          <w:rFonts w:ascii="Calibri" w:cs="Calibri" w:eastAsia="Calibri" w:hAnsi="Calibri"/>
+          <w:sz w:val="22"/>
+          <w:szCs w:val="22"/>
+        </w:rPr>
+        <w:t xml:space="preserve"> yapabilirsin.</w:t>
+      </w:r>
+    </w:p>
+    <w:p>
+      <w:pPr>
+        <w:pStyle w:val="ListParagraph"/>
+        <w:numPr>
+          <w:ilvl w:val="0"/>
+          <w:numId w:val="15"/>
+        </w:numPr>
+        <w:spacing w:after="100" w:line="290"/>
+      </w:pPr>
+      <w:r>
+        <w:rPr>
+          <w:rFonts w:ascii="Calibri" w:cs="Calibri" w:eastAsia="Calibri" w:hAnsi="Calibri"/>
+          <w:sz w:val="22"/>
+          <w:szCs w:val="22"/>
+        </w:rPr>
+        <w:t xml:space="preserve">Task veya Epic’i aç ve sağ üstteki büyük </w:t>
+      </w:r>
+      <w:r>
+        <w:rPr>
+          <w:rFonts w:ascii="Calibri" w:cs="Calibri" w:eastAsia="Calibri" w:hAnsi="Calibri"/>
+          <w:b/>
+          <w:bCs/>
+          <w:sz w:val="22"/>
+          <w:szCs w:val="22"/>
+        </w:rPr>
+        <w:t xml:space="preserve">Share</w:t>
+      </w:r>
+      <w:r>
+        <w:rPr>
+          <w:rFonts w:ascii="Calibri" w:cs="Calibri" w:eastAsia="Calibri" w:hAnsi="Calibri"/>
+          <w:sz w:val="22"/>
+          <w:szCs w:val="22"/>
+        </w:rPr>
+        <w:t xml:space="preserve"> düğmesine tıkla.</w:t>
+      </w:r>
+    </w:p>
+    <w:p>
+      <w:pPr>
+        <w:pStyle w:val="ListParagraph"/>
+        <w:numPr>
+          <w:ilvl w:val="0"/>
+          <w:numId w:val="15"/>
+        </w:numPr>
+        <w:spacing w:after="100" w:line="290"/>
+      </w:pPr>
+      <w:r>
+        <w:rPr>
+          <w:rFonts w:ascii="Calibri" w:cs="Calibri" w:eastAsia="Calibri" w:hAnsi="Calibri"/>
+          <w:sz w:val="22"/>
+          <w:szCs w:val="22"/>
+        </w:rPr>
+        <w:t xml:space="preserve">Birine yalnızca bu öğede daha fazla yetki vermek için </w:t>
+      </w:r>
+      <w:r>
+        <w:rPr>
+          <w:rFonts w:ascii="Calibri" w:cs="Calibri" w:eastAsia="Calibri" w:hAnsi="Calibri"/>
+          <w:b/>
+          <w:bCs/>
+          <w:sz w:val="22"/>
+          <w:szCs w:val="22"/>
+        </w:rPr>
+        <w:t xml:space="preserve">Kişi veya takım ekle</w:t>
+      </w:r>
+      <w:r>
+        <w:rPr>
+          <w:rFonts w:ascii="Calibri" w:cs="Calibri" w:eastAsia="Calibri" w:hAnsi="Calibri"/>
+          <w:sz w:val="22"/>
+          <w:szCs w:val="22"/>
+        </w:rPr>
+        <w:t xml:space="preserve"> altından seç, bir rol seç (örneğin </w:t>
+      </w:r>
+      <w:r>
+        <w:rPr>
+          <w:rFonts w:ascii="Calibri" w:cs="Calibri" w:eastAsia="Calibri" w:hAnsi="Calibri"/>
+          <w:b/>
+          <w:bCs/>
+          <w:sz w:val="22"/>
+          <w:szCs w:val="22"/>
+        </w:rPr>
+        <w:t xml:space="preserve">Developer</w:t>
+      </w:r>
+      <w:r>
+        <w:rPr>
+          <w:rFonts w:ascii="Calibri" w:cs="Calibri" w:eastAsia="Calibri" w:hAnsi="Calibri"/>
+          <w:sz w:val="22"/>
+          <w:szCs w:val="22"/>
+        </w:rPr>
+        <w:t xml:space="preserve">) ve </w:t>
+      </w:r>
+      <w:r>
+        <w:rPr>
+          <w:rFonts w:ascii="Calibri" w:cs="Calibri" w:eastAsia="Calibri" w:hAnsi="Calibri"/>
+          <w:b/>
+          <w:bCs/>
+          <w:sz w:val="22"/>
+          <w:szCs w:val="22"/>
+        </w:rPr>
+        <w:t xml:space="preserve">Ekle</w:t>
+      </w:r>
+      <w:r>
+        <w:rPr>
+          <w:rFonts w:ascii="Calibri" w:cs="Calibri" w:eastAsia="Calibri" w:hAnsi="Calibri"/>
+          <w:sz w:val="22"/>
+          <w:szCs w:val="22"/>
+        </w:rPr>
+        <w:t xml:space="preserve">ye tıkla.</w:t>
+      </w:r>
+    </w:p>
+    <w:p>
+      <w:pPr>
+        <w:pStyle w:val="ListParagraph"/>
+        <w:numPr>
+          <w:ilvl w:val="0"/>
+          <w:numId w:val="15"/>
+        </w:numPr>
+        <w:spacing w:after="100" w:line="290"/>
+      </w:pPr>
+      <w:r>
+        <w:rPr>
+          <w:rFonts w:ascii="Calibri" w:cs="Calibri" w:eastAsia="Calibri" w:hAnsi="Calibri"/>
+          <w:sz w:val="22"/>
+          <w:szCs w:val="22"/>
+        </w:rPr>
+        <w:t xml:space="preserve">Öğeyi gizlemek için </w:t>
+      </w:r>
+      <w:r>
+        <w:rPr>
+          <w:rFonts w:ascii="Calibri" w:cs="Calibri" w:eastAsia="Calibri" w:hAnsi="Calibri"/>
+          <w:b/>
+          <w:bCs/>
+          <w:sz w:val="22"/>
+          <w:szCs w:val="22"/>
+        </w:rPr>
+        <w:t xml:space="preserve">Gizli</w:t>
+      </w:r>
+      <w:r>
+        <w:rPr>
+          <w:rFonts w:ascii="Calibri" w:cs="Calibri" w:eastAsia="Calibri" w:hAnsi="Calibri"/>
+          <w:sz w:val="22"/>
+          <w:szCs w:val="22"/>
+        </w:rPr>
+        <w:t xml:space="preserve">yi aç. Onu ve altındaki her şeyi yalnızca listedekiler (ve Owner/Admin) görür.</w:t>
+      </w:r>
+    </w:p>
+    <w:p>
+      <w:pPr>
+        <w:pStyle w:val="ListParagraph"/>
+        <w:numPr>
+          <w:ilvl w:val="0"/>
+          <w:numId w:val="15"/>
+        </w:numPr>
+        <w:spacing w:after="100" w:line="290"/>
+      </w:pPr>
+      <w:r>
+        <w:rPr>
+          <w:rFonts w:ascii="Calibri" w:cs="Calibri" w:eastAsia="Calibri" w:hAnsi="Calibri"/>
+          <w:sz w:val="22"/>
+          <w:szCs w:val="22"/>
+        </w:rPr>
+        <w:t xml:space="preserve"/>
+      </w:r>
+      <w:r>
+        <w:rPr>
+          <w:rFonts w:ascii="Calibri" w:cs="Calibri" w:eastAsia="Calibri" w:hAnsi="Calibri"/>
+          <w:b/>
+          <w:bCs/>
+          <w:sz w:val="22"/>
+          <w:szCs w:val="22"/>
+        </w:rPr>
+        <w:t xml:space="preserve">Kaydet</w:t>
+      </w:r>
+      <w:r>
+        <w:rPr>
+          <w:rFonts w:ascii="Calibri" w:cs="Calibri" w:eastAsia="Calibri" w:hAnsi="Calibri"/>
+          <w:sz w:val="22"/>
+          <w:szCs w:val="22"/>
+        </w:rPr>
+        <w:t xml:space="preserve">e tıkla. Düğme artık </w:t>
+      </w:r>
+      <w:r>
+        <w:rPr>
+          <w:rFonts w:ascii="Calibri" w:cs="Calibri" w:eastAsia="Calibri" w:hAnsi="Calibri"/>
+          <w:b/>
+          <w:bCs/>
+          <w:sz w:val="22"/>
+          <w:szCs w:val="22"/>
+        </w:rPr>
+        <w:t xml:space="preserve">Shared</w:t>
+      </w:r>
+      <w:r>
+        <w:rPr>
+          <w:rFonts w:ascii="Calibri" w:cs="Calibri" w:eastAsia="Calibri" w:hAnsi="Calibri"/>
+          <w:sz w:val="22"/>
+          <w:szCs w:val="22"/>
+        </w:rPr>
+        <w:t xml:space="preserve"> veya </w:t>
+      </w:r>
+      <w:r>
+        <w:rPr>
+          <w:rFonts w:ascii="Calibri" w:cs="Calibri" w:eastAsia="Calibri" w:hAnsi="Calibri"/>
+          <w:b/>
+          <w:bCs/>
+          <w:sz w:val="22"/>
+          <w:szCs w:val="22"/>
+        </w:rPr>
+        <w:t xml:space="preserve">Private</w:t>
+      </w:r>
+      <w:r>
+        <w:rPr>
+          <w:rFonts w:ascii="Calibri" w:cs="Calibri" w:eastAsia="Calibri" w:hAnsi="Calibri"/>
+          <w:sz w:val="22"/>
+          <w:szCs w:val="22"/>
+        </w:rPr>
+        <w:t xml:space="preserve"> yazar.</w:t>
+      </w:r>
+    </w:p>
+    <w:p>
+      <w:pPr>
+        <w:pStyle w:val="ListParagraph"/>
+        <w:numPr>
+          <w:ilvl w:val="0"/>
+          <w:numId w:val="15"/>
+        </w:numPr>
+        <w:spacing w:after="100" w:line="290"/>
+      </w:pPr>
+      <w:r>
+        <w:rPr>
+          <w:rFonts w:ascii="Calibri" w:cs="Calibri" w:eastAsia="Calibri" w:hAnsi="Calibri"/>
+          <w:sz w:val="22"/>
+          <w:szCs w:val="22"/>
+        </w:rPr>
+        <w:t xml:space="preserve">Space kurallarına dönmek için </w:t>
+      </w:r>
+      <w:r>
+        <w:rPr>
+          <w:rFonts w:ascii="Calibri" w:cs="Calibri" w:eastAsia="Calibri" w:hAnsi="Calibri"/>
+          <w:b/>
+          <w:bCs/>
+          <w:sz w:val="22"/>
+          <w:szCs w:val="22"/>
+        </w:rPr>
+        <w:t xml:space="preserve">Share</w:t>
+      </w:r>
+      <w:r>
+        <w:rPr>
+          <w:rFonts w:ascii="Calibri" w:cs="Calibri" w:eastAsia="Calibri" w:hAnsi="Calibri"/>
+          <w:sz w:val="22"/>
+          <w:szCs w:val="22"/>
+        </w:rPr>
+        <w:t xml:space="preserve">i yeniden aç ve </w:t>
+      </w:r>
+      <w:r>
+        <w:rPr>
+          <w:rFonts w:ascii="Calibri" w:cs="Calibri" w:eastAsia="Calibri" w:hAnsi="Calibri"/>
+          <w:b/>
+          <w:bCs/>
+          <w:sz w:val="22"/>
+          <w:szCs w:val="22"/>
+        </w:rPr>
+        <w:t xml:space="preserve">Mirasa döndür</w:t>
+      </w:r>
+      <w:r>
+        <w:rPr>
+          <w:rFonts w:ascii="Calibri" w:cs="Calibri" w:eastAsia="Calibri" w:hAnsi="Calibri"/>
+          <w:sz w:val="22"/>
+          <w:szCs w:val="22"/>
+        </w:rPr>
+        <w:t xml:space="preserve">e tıkla.</w:t>
+      </w:r>
+    </w:p>
+    <w:p>
+      <w:pPr>
+        <w:spacing w:after="100"/>
+      </w:pPr>
+    </w:p>
+    <w:p>
+      <w:pPr>
+        <w:keepNext/>
+        <w:spacing w:after="80" w:before="120"/>
+        <w:jc w:val="center"/>
+      </w:pPr>
+      <w:r>
+        <w:drawing>
+          <wp:inline distT="0" distB="0" distL="0" distR="0">
+            <wp:extent cx="5029200" cy="4095750"/>
+            <wp:effectExtent t="0" r="0" b="0" l="0"/>
+            <wp:docPr id="23" name="23-share" descr="Sharing and permissions penceresi" title="Sharing and permissions penceresi"/>
+            <wp:cNvGraphicFramePr>
+              <a:graphicFrameLocks xmlns:a="http://schemas.openxmlformats.org/drawingml/2006/main" noChangeAspect="1"/>
+            </wp:cNvGraphicFramePr>
+            <a:graphic xmlns:a="http://schemas.openxmlformats.org/drawingml/2006/main">
+              <a:graphicData uri="http://schemas.openxmlformats.org/drawingml/2006/picture">
+                <pic:pic xmlns:pic="http://schemas.openxmlformats.org/drawingml/2006/picture">
+                  <pic:nvPicPr>
+                    <pic:cNvPr id="0" name="" descr=""/>
+                    <pic:cNvPicPr>
+                      <a:picLocks noChangeAspect="1" noChangeArrowheads="1"/>
+                    </pic:cNvPicPr>
+                  </pic:nvPicPr>
+                  <pic:blipFill>
+                    <a:blip r:embed="rId30" cstate="none"/>
+                    <a:srcRect/>
+                    <a:stretch>
+                      <a:fillRect/>
+                    </a:stretch>
+                  </pic:blipFill>
+                  <pic:spPr bwMode="auto">
+                    <a:xfrm>
+                      <a:off x="0" y="0"/>
+                      <a:ext cx="5029200" cy="4095750"/>
+                    </a:xfrm>
+                    <a:prstGeom prst="rect">
+                      <a:avLst/>
+                    </a:prstGeom>
+                  </pic:spPr>
+                </pic:pic>
+              </a:graphicData>
+            </a:graphic>
+          </wp:inline>
+        </w:drawing>
+      </w:r>
+    </w:p>
+    <w:p>
+      <w:pPr>
+        <w:keepNext/>
+        <w:spacing w:after="120"/>
+        <w:jc w:val="center"/>
+      </w:pPr>
+      <w:r>
+        <w:rPr>
+          <w:rFonts w:ascii="Calibri" w:cs="Calibri" w:eastAsia="Calibri" w:hAnsi="Calibri"/>
+          <w:i/>
+          <w:iCs/>
+          <w:color w:val="555B6E"/>
+          <w:sz w:val="20"/>
+          <w:szCs w:val="20"/>
+        </w:rPr>
+        <w:t xml:space="preserve">Bir Epic’in Sharing and permissions penceresi.</w:t>
+      </w:r>
+    </w:p>
+    <w:tbl>
+      <w:tblPr>
+        <w:tblW w:type="dxa" w:w="9638"/>
+        <w:tblBorders>
+          <w:top w:val="single" w:color="auto" w:sz="4"/>
+          <w:left w:val="single" w:color="auto" w:sz="4"/>
+          <w:bottom w:val="single" w:color="auto" w:sz="4"/>
+          <w:right w:val="single" w:color="auto" w:sz="4"/>
+          <w:insideH w:val="single" w:color="auto" w:sz="4"/>
+          <w:insideV w:val="single" w:color="auto" w:sz="4"/>
+        </w:tblBorders>
+      </w:tblPr>
+      <w:tblGrid>
+        <w:gridCol w:w="560"/>
+        <w:gridCol w:w="9078"/>
+      </w:tblGrid>
+      <w:tr>
+        <w:trPr>
+          <w:cantSplit/>
+        </w:trPr>
+        <w:tc>
+          <w:tcPr>
+            <w:tcW w:type="dxa" w:w="560"/>
+            <w:tcBorders>
+              <w:top w:val="none" w:color="FFFFFF" w:sz="0"/>
+              <w:left w:val="none" w:color="FFFFFF" w:sz="0"/>
+              <w:bottom w:val="none" w:color="FFFFFF" w:sz="0"/>
+              <w:right w:val="none" w:color="FFFFFF" w:sz="0"/>
+            </w:tcBorders>
+            <w:tcMar>
+              <w:top w:type="dxa" w:w="40"/>
+              <w:left w:type="dxa" w:w="40"/>
+              <w:bottom w:type="dxa" w:w="40"/>
+              <w:right w:type="dxa" w:w="60"/>
+            </w:tcMar>
+            <w:vAlign w:val="top"/>
+          </w:tcPr>
+          <w:p>
+            <w:pPr>
+              <w:jc w:val="center"/>
+            </w:pPr>
+            <w:r>
+              <w:rPr>
+                <w:rFonts w:ascii="Calibri" w:cs="Calibri" w:eastAsia="Calibri" w:hAnsi="Calibri"/>
+                <w:b/>
+                <w:bCs/>
+                <w:color w:val="FFFFFF"/>
+                <w:sz w:val="22"/>
+                <w:szCs w:val="22"/>
+                <w:shd w:fill="E11D48" w:color="auto" w:val="clear"/>
+              </w:rPr>
+              <w:t xml:space="preserve"> 1 </w:t>
+            </w:r>
+          </w:p>
+        </w:tc>
+        <w:tc>
+          <w:tcPr>
+            <w:tcW w:type="dxa" w:w="9078"/>
+            <w:tcBorders>
+              <w:top w:val="none" w:color="FFFFFF" w:sz="0"/>
+              <w:left w:val="none" w:color="FFFFFF" w:sz="0"/>
+              <w:bottom w:val="none" w:color="FFFFFF" w:sz="0"/>
+              <w:right w:val="none" w:color="FFFFFF" w:sz="0"/>
+            </w:tcBorders>
+            <w:tcMar>
+              <w:top w:type="dxa" w:w="40"/>
+              <w:left w:type="dxa" w:w="60"/>
+              <w:bottom w:type="dxa" w:w="40"/>
+              <w:right w:type="dxa" w:w="40"/>
+            </w:tcMar>
+          </w:tcPr>
+          <w:p>
+            <w:pPr>
+              <w:spacing w:after="0"/>
+            </w:pPr>
+            <w:r>
+              <w:rPr>
+                <w:rFonts w:ascii="Calibri" w:cs="Calibri" w:eastAsia="Calibri" w:hAnsi="Calibri"/>
+                <w:sz w:val="21"/>
+                <w:szCs w:val="21"/>
+              </w:rPr>
+              <w:t xml:space="preserve"/>
+            </w:r>
+            <w:r>
+              <w:rPr>
+                <w:rFonts w:ascii="Calibri" w:cs="Calibri" w:eastAsia="Calibri" w:hAnsi="Calibri"/>
+                <w:b/>
+                <w:bCs/>
+                <w:sz w:val="21"/>
+                <w:szCs w:val="21"/>
+              </w:rPr>
+              <w:t xml:space="preserve">Gizli</w:t>
+            </w:r>
+            <w:r>
+              <w:rPr>
+                <w:rFonts w:ascii="Calibri" w:cs="Calibri" w:eastAsia="Calibri" w:hAnsi="Calibri"/>
+                <w:sz w:val="21"/>
+                <w:szCs w:val="21"/>
+              </w:rPr>
+              <w:t xml:space="preserve">: Öğeyi ve altındaki her şeyi listede olmayanlardan gizler.</w:t>
+            </w:r>
+          </w:p>
+        </w:tc>
+      </w:tr>
+      <w:tr>
+        <w:trPr>
+          <w:cantSplit/>
+        </w:trPr>
+        <w:tc>
+          <w:tcPr>
+            <w:tcW w:type="dxa" w:w="560"/>
+            <w:tcBorders>
+              <w:top w:val="none" w:color="FFFFFF" w:sz="0"/>
+              <w:left w:val="none" w:color="FFFFFF" w:sz="0"/>
+              <w:bottom w:val="none" w:color="FFFFFF" w:sz="0"/>
+              <w:right w:val="none" w:color="FFFFFF" w:sz="0"/>
+            </w:tcBorders>
+            <w:tcMar>
+              <w:top w:type="dxa" w:w="40"/>
+              <w:left w:type="dxa" w:w="40"/>
+              <w:bottom w:type="dxa" w:w="40"/>
+              <w:right w:type="dxa" w:w="60"/>
+            </w:tcMar>
+            <w:vAlign w:val="top"/>
+          </w:tcPr>
+          <w:p>
+            <w:pPr>
+              <w:jc w:val="center"/>
+            </w:pPr>
+            <w:r>
+              <w:rPr>
+                <w:rFonts w:ascii="Calibri" w:cs="Calibri" w:eastAsia="Calibri" w:hAnsi="Calibri"/>
+                <w:b/>
+                <w:bCs/>
+                <w:color w:val="FFFFFF"/>
+                <w:sz w:val="22"/>
+                <w:szCs w:val="22"/>
+                <w:shd w:fill="E11D48" w:color="auto" w:val="clear"/>
+              </w:rPr>
+              <w:t xml:space="preserve"> 2 </w:t>
+            </w:r>
+          </w:p>
+        </w:tc>
+        <w:tc>
+          <w:tcPr>
+            <w:tcW w:type="dxa" w:w="9078"/>
+            <w:tcBorders>
+              <w:top w:val="none" w:color="FFFFFF" w:sz="0"/>
+              <w:left w:val="none" w:color="FFFFFF" w:sz="0"/>
+              <w:bottom w:val="none" w:color="FFFFFF" w:sz="0"/>
+              <w:right w:val="none" w:color="FFFFFF" w:sz="0"/>
+            </w:tcBorders>
+            <w:tcMar>
+              <w:top w:type="dxa" w:w="40"/>
+              <w:left w:type="dxa" w:w="60"/>
+              <w:bottom w:type="dxa" w:w="40"/>
+              <w:right w:type="dxa" w:w="40"/>
+            </w:tcMar>
+          </w:tcPr>
+          <w:p>
+            <w:pPr>
+              <w:spacing w:after="0"/>
+            </w:pPr>
+            <w:r>
+              <w:rPr>
+                <w:rFonts w:ascii="Calibri" w:cs="Calibri" w:eastAsia="Calibri" w:hAnsi="Calibri"/>
+                <w:sz w:val="21"/>
+                <w:szCs w:val="21"/>
+              </w:rPr>
+              <w:t xml:space="preserve"/>
+            </w:r>
+            <w:r>
+              <w:rPr>
+                <w:rFonts w:ascii="Calibri" w:cs="Calibri" w:eastAsia="Calibri" w:hAnsi="Calibri"/>
+                <w:b/>
+                <w:bCs/>
+                <w:sz w:val="21"/>
+                <w:szCs w:val="21"/>
+              </w:rPr>
+              <w:t xml:space="preserve">Kişi veya takım ekle</w:t>
+            </w:r>
+            <w:r>
+              <w:rPr>
+                <w:rFonts w:ascii="Calibri" w:cs="Calibri" w:eastAsia="Calibri" w:hAnsi="Calibri"/>
+                <w:sz w:val="21"/>
+                <w:szCs w:val="21"/>
+              </w:rPr>
+              <w:t xml:space="preserve">: Kimin erişeceğini seç.</w:t>
+            </w:r>
+          </w:p>
+        </w:tc>
+      </w:tr>
+      <w:tr>
+        <w:trPr>
+          <w:cantSplit/>
+        </w:trPr>
+        <w:tc>
+          <w:tcPr>
+            <w:tcW w:type="dxa" w:w="560"/>
+            <w:tcBorders>
+              <w:top w:val="none" w:color="FFFFFF" w:sz="0"/>
+              <w:left w:val="none" w:color="FFFFFF" w:sz="0"/>
+              <w:bottom w:val="none" w:color="FFFFFF" w:sz="0"/>
+              <w:right w:val="none" w:color="FFFFFF" w:sz="0"/>
+            </w:tcBorders>
+            <w:tcMar>
+              <w:top w:type="dxa" w:w="40"/>
+              <w:left w:type="dxa" w:w="40"/>
+              <w:bottom w:type="dxa" w:w="40"/>
+              <w:right w:type="dxa" w:w="60"/>
+            </w:tcMar>
+            <w:vAlign w:val="top"/>
+          </w:tcPr>
+          <w:p>
+            <w:pPr>
+              <w:jc w:val="center"/>
+            </w:pPr>
+            <w:r>
+              <w:rPr>
+                <w:rFonts w:ascii="Calibri" w:cs="Calibri" w:eastAsia="Calibri" w:hAnsi="Calibri"/>
+                <w:b/>
+                <w:bCs/>
+                <w:color w:val="FFFFFF"/>
+                <w:sz w:val="22"/>
+                <w:szCs w:val="22"/>
+                <w:shd w:fill="E11D48" w:color="auto" w:val="clear"/>
+              </w:rPr>
+              <w:t xml:space="preserve"> 3 </w:t>
+            </w:r>
+          </w:p>
+        </w:tc>
+        <w:tc>
+          <w:tcPr>
+            <w:tcW w:type="dxa" w:w="9078"/>
+            <w:tcBorders>
+              <w:top w:val="none" w:color="FFFFFF" w:sz="0"/>
+              <w:left w:val="none" w:color="FFFFFF" w:sz="0"/>
+              <w:bottom w:val="none" w:color="FFFFFF" w:sz="0"/>
+              <w:right w:val="none" w:color="FFFFFF" w:sz="0"/>
+            </w:tcBorders>
+            <w:tcMar>
+              <w:top w:type="dxa" w:w="40"/>
+              <w:left w:type="dxa" w:w="60"/>
+              <w:bottom w:type="dxa" w:w="40"/>
+              <w:right w:type="dxa" w:w="40"/>
+            </w:tcMar>
+          </w:tcPr>
+          <w:p>
+            <w:pPr>
+              <w:spacing w:after="0"/>
+            </w:pPr>
+            <w:r>
+              <w:rPr>
+                <w:rFonts w:ascii="Calibri" w:cs="Calibri" w:eastAsia="Calibri" w:hAnsi="Calibri"/>
+                <w:sz w:val="21"/>
+                <w:szCs w:val="21"/>
+              </w:rPr>
+              <w:t xml:space="preserve"/>
+            </w:r>
+            <w:r>
+              <w:rPr>
+                <w:rFonts w:ascii="Calibri" w:cs="Calibri" w:eastAsia="Calibri" w:hAnsi="Calibri"/>
+                <w:b/>
+                <w:bCs/>
+                <w:sz w:val="21"/>
+                <w:szCs w:val="21"/>
+              </w:rPr>
+              <w:t xml:space="preserve">Ekle</w:t>
+            </w:r>
+            <w:r>
+              <w:rPr>
+                <w:rFonts w:ascii="Calibri" w:cs="Calibri" w:eastAsia="Calibri" w:hAnsi="Calibri"/>
+                <w:sz w:val="21"/>
+                <w:szCs w:val="21"/>
+              </w:rPr>
+              <w:t xml:space="preserve">: Kişiyi seçilen rolle listeye koyar.</w:t>
+            </w:r>
+          </w:p>
+        </w:tc>
+      </w:tr>
+      <w:tr>
+        <w:trPr>
+          <w:cantSplit/>
+        </w:trPr>
+        <w:tc>
+          <w:tcPr>
+            <w:tcW w:type="dxa" w:w="560"/>
+            <w:tcBorders>
+              <w:top w:val="none" w:color="FFFFFF" w:sz="0"/>
+              <w:left w:val="none" w:color="FFFFFF" w:sz="0"/>
+              <w:bottom w:val="none" w:color="FFFFFF" w:sz="0"/>
+              <w:right w:val="none" w:color="FFFFFF" w:sz="0"/>
+            </w:tcBorders>
+            <w:tcMar>
+              <w:top w:type="dxa" w:w="40"/>
+              <w:left w:type="dxa" w:w="40"/>
+              <w:bottom w:type="dxa" w:w="40"/>
+              <w:right w:type="dxa" w:w="60"/>
+            </w:tcMar>
+            <w:vAlign w:val="top"/>
+          </w:tcPr>
+          <w:p>
+            <w:pPr>
+              <w:jc w:val="center"/>
+            </w:pPr>
+            <w:r>
+              <w:rPr>
+                <w:rFonts w:ascii="Calibri" w:cs="Calibri" w:eastAsia="Calibri" w:hAnsi="Calibri"/>
+                <w:b/>
+                <w:bCs/>
+                <w:color w:val="FFFFFF"/>
+                <w:sz w:val="22"/>
+                <w:szCs w:val="22"/>
+                <w:shd w:fill="E11D48" w:color="auto" w:val="clear"/>
+              </w:rPr>
+              <w:t xml:space="preserve"> 4 </w:t>
+            </w:r>
+          </w:p>
+        </w:tc>
+        <w:tc>
+          <w:tcPr>
+            <w:tcW w:type="dxa" w:w="9078"/>
+            <w:tcBorders>
+              <w:top w:val="none" w:color="FFFFFF" w:sz="0"/>
+              <w:left w:val="none" w:color="FFFFFF" w:sz="0"/>
+              <w:bottom w:val="none" w:color="FFFFFF" w:sz="0"/>
+              <w:right w:val="none" w:color="FFFFFF" w:sz="0"/>
+            </w:tcBorders>
+            <w:tcMar>
+              <w:top w:type="dxa" w:w="40"/>
+              <w:left w:type="dxa" w:w="60"/>
+              <w:bottom w:type="dxa" w:w="40"/>
+              <w:right w:type="dxa" w:w="40"/>
+            </w:tcMar>
+          </w:tcPr>
+          <w:p>
+            <w:pPr>
+              <w:spacing w:after="0"/>
+            </w:pPr>
+            <w:r>
+              <w:rPr>
+                <w:rFonts w:ascii="Calibri" w:cs="Calibri" w:eastAsia="Calibri" w:hAnsi="Calibri"/>
+                <w:sz w:val="21"/>
+                <w:szCs w:val="21"/>
+              </w:rPr>
+              <w:t xml:space="preserve"/>
+            </w:r>
+            <w:r>
+              <w:rPr>
+                <w:rFonts w:ascii="Calibri" w:cs="Calibri" w:eastAsia="Calibri" w:hAnsi="Calibri"/>
+                <w:b/>
+                <w:bCs/>
+                <w:sz w:val="21"/>
+                <w:szCs w:val="21"/>
+              </w:rPr>
+              <w:t xml:space="preserve">Kaydet</w:t>
+            </w:r>
+            <w:r>
+              <w:rPr>
+                <w:rFonts w:ascii="Calibri" w:cs="Calibri" w:eastAsia="Calibri" w:hAnsi="Calibri"/>
+                <w:sz w:val="21"/>
+                <w:szCs w:val="21"/>
+              </w:rPr>
+              <w:t xml:space="preserve">: Ayarları uygular.</w:t>
+            </w:r>
+          </w:p>
+        </w:tc>
+      </w:tr>
+    </w:tbl>
+    <w:p>
+      <w:pPr>
+        <w:spacing w:after="200"/>
+      </w:pPr>
+    </w:p>
+    <w:tbl>
+      <w:tblPr>
+        <w:tblW w:type="dxa" w:w="9638"/>
+        <w:tblBorders>
+          <w:top w:val="single" w:color="auto" w:sz="4"/>
+          <w:left w:val="single" w:color="auto" w:sz="4"/>
+          <w:bottom w:val="single" w:color="auto" w:sz="4"/>
+          <w:right w:val="single" w:color="auto" w:sz="4"/>
+          <w:insideH w:val="single" w:color="auto" w:sz="4"/>
+          <w:insideV w:val="single" w:color="auto" w:sz="4"/>
+        </w:tblBorders>
+      </w:tblPr>
+      <w:tblGrid>
+        <w:gridCol w:w="9638"/>
+      </w:tblGrid>
+      <w:tr>
+        <w:trPr>
+          <w:cantSplit/>
+        </w:trPr>
+        <w:tc>
+          <w:tcPr>
+            <w:tcW w:type="dxa" w:w="9638"/>
+            <w:tcBorders>
+              <w:top w:val="none" w:color="FFFFFF" w:sz="0"/>
+              <w:left w:val="single" w:color="0EA5E9" w:sz="24"/>
+              <w:bottom w:val="none" w:color="FFFFFF" w:sz="0"/>
+              <w:right w:val="none" w:color="FFFFFF" w:sz="0"/>
+            </w:tcBorders>
+            <w:shd w:fill="E8F3FB" w:color="auto" w:val="clear"/>
+            <w:tcMar>
+              <w:top w:type="dxa" w:w="100"/>
+              <w:left w:type="dxa" w:w="180"/>
+              <w:bottom w:type="dxa" w:w="100"/>
+              <w:right w:type="dxa" w:w="140"/>
+            </w:tcMar>
+          </w:tcPr>
+          <w:p>
+            <w:pPr>
+              <w:spacing w:after="0" w:line="290"/>
+            </w:pPr>
+            <w:r>
+              <w:rPr>
+                <w:rFonts w:ascii="Calibri" w:cs="Calibri" w:eastAsia="Calibri" w:hAnsi="Calibri"/>
+                <w:b/>
+                <w:bCs/>
+                <w:sz w:val="22"/>
+                <w:szCs w:val="22"/>
+              </w:rPr>
+              <w:t xml:space="preserve">Not: </w:t>
+            </w:r>
+            <w:r>
+              <w:rPr>
+                <w:rFonts w:ascii="Calibri" w:cs="Calibri" w:eastAsia="Calibri" w:hAnsi="Calibri"/>
+                <w:sz w:val="22"/>
+                <w:szCs w:val="22"/>
+              </w:rPr>
+              <w:t xml:space="preserve">Sub-Task’lar ve alt Task’lar, üstlerindeki öğenin ayarlarını </w:t>
+            </w:r>
+            <w:r>
+              <w:rPr>
+                <w:rFonts w:ascii="Calibri" w:cs="Calibri" w:eastAsia="Calibri" w:hAnsi="Calibri"/>
+                <w:b/>
+                <w:bCs/>
+                <w:sz w:val="22"/>
+                <w:szCs w:val="22"/>
+              </w:rPr>
+              <w:t xml:space="preserve">miras alır</w:t>
+            </w:r>
+            <w:r>
+              <w:rPr>
+                <w:rFonts w:ascii="Calibri" w:cs="Calibri" w:eastAsia="Calibri" w:hAnsi="Calibri"/>
+                <w:sz w:val="22"/>
+                <w:szCs w:val="22"/>
+              </w:rPr>
+              <w:t xml:space="preserve">. Bir alt öğe kendi ayarlarını açabilir; o zaman onunki geçerlidir.</w:t>
+            </w:r>
+          </w:p>
+        </w:tc>
+      </w:tr>
+    </w:tbl>
+    <w:p>
+      <w:pPr>
+        <w:spacing w:after="160"/>
+      </w:pPr>
+    </w:p>
+    <w:tbl>
+      <w:tblPr>
+        <w:tblW w:type="dxa" w:w="9638"/>
+        <w:tblBorders>
+          <w:top w:val="single" w:color="auto" w:sz="4"/>
+          <w:left w:val="single" w:color="auto" w:sz="4"/>
+          <w:bottom w:val="single" w:color="auto" w:sz="4"/>
+          <w:right w:val="single" w:color="auto" w:sz="4"/>
+          <w:insideH w:val="single" w:color="auto" w:sz="4"/>
+          <w:insideV w:val="single" w:color="auto" w:sz="4"/>
+        </w:tblBorders>
+      </w:tblPr>
+      <w:tblGrid>
+        <w:gridCol w:w="9638"/>
+      </w:tblGrid>
+      <w:tr>
+        <w:trPr>
+          <w:cantSplit/>
+        </w:trPr>
+        <w:tc>
+          <w:tcPr>
+            <w:tcW w:type="dxa" w:w="9638"/>
+            <w:tcBorders>
+              <w:top w:val="none" w:color="FFFFFF" w:sz="0"/>
+              <w:left w:val="single" w:color="F59E0B" w:sz="24"/>
+              <w:bottom w:val="none" w:color="FFFFFF" w:sz="0"/>
+              <w:right w:val="none" w:color="FFFFFF" w:sz="0"/>
+            </w:tcBorders>
+            <w:shd w:fill="FFF4DC" w:color="auto" w:val="clear"/>
+            <w:tcMar>
+              <w:top w:type="dxa" w:w="100"/>
+              <w:left w:type="dxa" w:w="180"/>
+              <w:bottom w:type="dxa" w:w="100"/>
+              <w:right w:type="dxa" w:w="140"/>
+            </w:tcMar>
+          </w:tcPr>
+          <w:p>
+            <w:pPr>
+              <w:spacing w:after="0" w:line="290"/>
+            </w:pPr>
+            <w:r>
+              <w:rPr>
+                <w:rFonts w:ascii="Calibri" w:cs="Calibri" w:eastAsia="Calibri" w:hAnsi="Calibri"/>
+                <w:b/>
+                <w:bCs/>
+                <w:sz w:val="22"/>
+                <w:szCs w:val="22"/>
+              </w:rPr>
+              <w:t xml:space="preserve">Dikkat: </w:t>
+            </w:r>
+            <w:r>
+              <w:rPr>
+                <w:rFonts w:ascii="Calibri" w:cs="Calibri" w:eastAsia="Calibri" w:hAnsi="Calibri"/>
+                <w:sz w:val="22"/>
+                <w:szCs w:val="22"/>
+              </w:rPr>
+              <w:t xml:space="preserve">Birine kendi sahip olduğundan fazla yetki veremezsin. Özel bir Space’te olmayan biriyle öğe paylaşmak için önce onu o Space’e ekle.</w:t>
+            </w:r>
+          </w:p>
+        </w:tc>
+      </w:tr>
+    </w:tbl>
+    <w:p>
+      <w:pPr>
+        <w:spacing w:after="160"/>
+      </w:pPr>
+    </w:p>
+    <w:p>
+      <w:pPr>
+        <w:pStyle w:val="Heading1"/>
+        <w:keepNext/>
+      </w:pPr>
+      <w:r>
+        <w:rPr>
+          <w:rFonts w:ascii="Calibri" w:cs="Calibri" w:eastAsia="Calibri" w:hAnsi="Calibri"/>
+          <w:b/>
+          <w:bCs/>
+          <w:color w:val="3B2A9E"/>
+          <w:sz w:val="34"/>
+          <w:szCs w:val="34"/>
+        </w:rPr>
+        <w:t xml:space="preserve">13. Roller ve yetkiler (Ayarlar)</w:t>
+      </w:r>
+    </w:p>
+    <w:p>
+      <w:pPr>
+        <w:spacing w:after="140" w:line="300"/>
+      </w:pPr>
+      <w:r>
+        <w:rPr>
+          <w:rFonts w:ascii="Calibri" w:cs="Calibri" w:eastAsia="Calibri" w:hAnsi="Calibri"/>
+          <w:sz w:val="22"/>
+          <w:szCs w:val="22"/>
+        </w:rPr>
+        <w:t xml:space="preserve">Yöneticiler, her rolün neler yapabileceğini </w:t>
+      </w:r>
+      <w:r>
+        <w:rPr>
+          <w:rFonts w:ascii="Calibri" w:cs="Calibri" w:eastAsia="Calibri" w:hAnsi="Calibri"/>
+          <w:b/>
+          <w:bCs/>
+          <w:sz w:val="22"/>
+          <w:szCs w:val="22"/>
+        </w:rPr>
+        <w:t xml:space="preserve">Ayarlar → Roles</w:t>
+      </w:r>
+      <w:r>
+        <w:rPr>
+          <w:rFonts w:ascii="Calibri" w:cs="Calibri" w:eastAsia="Calibri" w:hAnsi="Calibri"/>
+          <w:sz w:val="22"/>
+          <w:szCs w:val="22"/>
+        </w:rPr>
+        <w:t xml:space="preserve"> içinde belirler. Değişiklikler anında geçerli olur.</w:t>
+      </w:r>
+    </w:p>
+    <w:p>
+      <w:pPr>
+        <w:pStyle w:val="ListParagraph"/>
+        <w:numPr>
+          <w:ilvl w:val="0"/>
+          <w:numId w:val="16"/>
+        </w:numPr>
+        <w:spacing w:after="100" w:line="290"/>
+      </w:pPr>
+      <w:r>
+        <w:rPr>
+          <w:rFonts w:ascii="Calibri" w:cs="Calibri" w:eastAsia="Calibri" w:hAnsi="Calibri"/>
+          <w:sz w:val="22"/>
+          <w:szCs w:val="22"/>
+        </w:rPr>
+        <w:t xml:space="preserve"/>
+      </w:r>
+      <w:r>
+        <w:rPr>
+          <w:rFonts w:ascii="Calibri" w:cs="Calibri" w:eastAsia="Calibri" w:hAnsi="Calibri"/>
+          <w:b/>
+          <w:bCs/>
+          <w:sz w:val="22"/>
+          <w:szCs w:val="22"/>
+        </w:rPr>
+        <w:t xml:space="preserve">Ayarlar</w:t>
+      </w:r>
+      <w:r>
+        <w:rPr>
+          <w:rFonts w:ascii="Calibri" w:cs="Calibri" w:eastAsia="Calibri" w:hAnsi="Calibri"/>
+          <w:sz w:val="22"/>
+          <w:szCs w:val="22"/>
+        </w:rPr>
+        <w:t xml:space="preserve">ı aç ve </w:t>
+      </w:r>
+      <w:r>
+        <w:rPr>
+          <w:rFonts w:ascii="Calibri" w:cs="Calibri" w:eastAsia="Calibri" w:hAnsi="Calibri"/>
+          <w:b/>
+          <w:bCs/>
+          <w:sz w:val="22"/>
+          <w:szCs w:val="22"/>
+        </w:rPr>
+        <w:t xml:space="preserve">Roles</w:t>
+      </w:r>
+      <w:r>
+        <w:rPr>
+          <w:rFonts w:ascii="Calibri" w:cs="Calibri" w:eastAsia="Calibri" w:hAnsi="Calibri"/>
+          <w:sz w:val="22"/>
+          <w:szCs w:val="22"/>
+        </w:rPr>
+        <w:t xml:space="preserve">e tıkla.</w:t>
+      </w:r>
+    </w:p>
+    <w:p>
+      <w:pPr>
+        <w:pStyle w:val="ListParagraph"/>
+        <w:numPr>
+          <w:ilvl w:val="0"/>
+          <w:numId w:val="16"/>
+        </w:numPr>
+        <w:spacing w:after="100" w:line="290"/>
+      </w:pPr>
+      <w:r>
+        <w:rPr>
+          <w:rFonts w:ascii="Calibri" w:cs="Calibri" w:eastAsia="Calibri" w:hAnsi="Calibri"/>
+          <w:sz w:val="22"/>
+          <w:szCs w:val="22"/>
+        </w:rPr>
+        <w:t xml:space="preserve"/>
+      </w:r>
+      <w:r>
+        <w:rPr>
+          <w:rFonts w:ascii="Calibri" w:cs="Calibri" w:eastAsia="Calibri" w:hAnsi="Calibri"/>
+          <w:b/>
+          <w:bCs/>
+          <w:sz w:val="22"/>
+          <w:szCs w:val="22"/>
+        </w:rPr>
+        <w:t xml:space="preserve">Space roles</w:t>
+      </w:r>
+      <w:r>
+        <w:rPr>
+          <w:rFonts w:ascii="Calibri" w:cs="Calibri" w:eastAsia="Calibri" w:hAnsi="Calibri"/>
+          <w:sz w:val="22"/>
+          <w:szCs w:val="22"/>
+        </w:rPr>
+        <w:t xml:space="preserve"> (bir Space içindeki haklar) veya </w:t>
+      </w:r>
+      <w:r>
+        <w:rPr>
+          <w:rFonts w:ascii="Calibri" w:cs="Calibri" w:eastAsia="Calibri" w:hAnsi="Calibri"/>
+          <w:b/>
+          <w:bCs/>
+          <w:sz w:val="22"/>
+          <w:szCs w:val="22"/>
+        </w:rPr>
+        <w:t xml:space="preserve">Workspace roles</w:t>
+      </w:r>
+      <w:r>
+        <w:rPr>
+          <w:rFonts w:ascii="Calibri" w:cs="Calibri" w:eastAsia="Calibri" w:hAnsi="Calibri"/>
+          <w:sz w:val="22"/>
+          <w:szCs w:val="22"/>
+        </w:rPr>
+        <w:t xml:space="preserve"> (tüm workspace’teki haklar) seç.</w:t>
+      </w:r>
+    </w:p>
+    <w:p>
+      <w:pPr>
+        <w:pStyle w:val="ListParagraph"/>
+        <w:numPr>
+          <w:ilvl w:val="0"/>
+          <w:numId w:val="16"/>
+        </w:numPr>
+        <w:spacing w:after="100" w:line="290"/>
+      </w:pPr>
+      <w:r>
+        <w:rPr>
+          <w:rFonts w:ascii="Calibri" w:cs="Calibri" w:eastAsia="Calibri" w:hAnsi="Calibri"/>
+          <w:sz w:val="22"/>
+          <w:szCs w:val="22"/>
+        </w:rPr>
+        <w:t xml:space="preserve">Bir rolü değiştirmek için kutuyu işaretle ya da kaldır. Her satır bir yetkidir.</w:t>
+      </w:r>
+    </w:p>
+    <w:p>
+      <w:pPr>
+        <w:pStyle w:val="ListParagraph"/>
+        <w:numPr>
+          <w:ilvl w:val="0"/>
+          <w:numId w:val="16"/>
+        </w:numPr>
+        <w:spacing w:after="100" w:line="290"/>
+      </w:pPr>
+      <w:r>
+        <w:rPr>
+          <w:rFonts w:ascii="Calibri" w:cs="Calibri" w:eastAsia="Calibri" w:hAnsi="Calibri"/>
+          <w:sz w:val="22"/>
+          <w:szCs w:val="22"/>
+        </w:rPr>
+        <w:t xml:space="preserve">Kendi rolünü oluşturmak için </w:t>
+      </w:r>
+      <w:r>
+        <w:rPr>
+          <w:rFonts w:ascii="Calibri" w:cs="Calibri" w:eastAsia="Calibri" w:hAnsi="Calibri"/>
+          <w:b/>
+          <w:bCs/>
+          <w:sz w:val="22"/>
+          <w:szCs w:val="22"/>
+        </w:rPr>
+        <w:t xml:space="preserve">New role</w:t>
+      </w:r>
+      <w:r>
+        <w:rPr>
+          <w:rFonts w:ascii="Calibri" w:cs="Calibri" w:eastAsia="Calibri" w:hAnsi="Calibri"/>
+          <w:sz w:val="22"/>
+          <w:szCs w:val="22"/>
+        </w:rPr>
+        <w:t xml:space="preserve">a tıkla (örneğin </w:t>
+      </w:r>
+      <w:r>
+        <w:rPr>
+          <w:rFonts w:ascii="Calibri" w:cs="Calibri" w:eastAsia="Calibri" w:hAnsi="Calibri"/>
+          <w:b/>
+          <w:bCs/>
+          <w:sz w:val="22"/>
+          <w:szCs w:val="22"/>
+        </w:rPr>
+        <w:t xml:space="preserve">QA Engineer</w:t>
+      </w:r>
+      <w:r>
+        <w:rPr>
+          <w:rFonts w:ascii="Calibri" w:cs="Calibri" w:eastAsia="Calibri" w:hAnsi="Calibri"/>
+          <w:sz w:val="22"/>
+          <w:szCs w:val="22"/>
+        </w:rPr>
+        <w:t xml:space="preserve">). Mevcut bir rolden başlayabilirsin.</w:t>
+      </w:r>
+    </w:p>
+    <w:p>
+      <w:pPr>
+        <w:pStyle w:val="ListParagraph"/>
+        <w:numPr>
+          <w:ilvl w:val="0"/>
+          <w:numId w:val="16"/>
+        </w:numPr>
+        <w:spacing w:after="100" w:line="290"/>
+      </w:pPr>
+      <w:r>
+        <w:rPr>
+          <w:rFonts w:ascii="Calibri" w:cs="Calibri" w:eastAsia="Calibri" w:hAnsi="Calibri"/>
+          <w:sz w:val="22"/>
+          <w:szCs w:val="22"/>
+        </w:rPr>
+        <w:t xml:space="preserve">Bir sütundaki </w:t>
+      </w:r>
+      <w:r>
+        <w:rPr>
+          <w:rFonts w:ascii="Calibri" w:cs="Calibri" w:eastAsia="Calibri" w:hAnsi="Calibri"/>
+          <w:b/>
+          <w:bCs/>
+          <w:sz w:val="22"/>
+          <w:szCs w:val="22"/>
+        </w:rPr>
+        <w:t xml:space="preserve">⋯</w:t>
+      </w:r>
+      <w:r>
+        <w:rPr>
+          <w:rFonts w:ascii="Calibri" w:cs="Calibri" w:eastAsia="Calibri" w:hAnsi="Calibri"/>
+          <w:sz w:val="22"/>
+          <w:szCs w:val="22"/>
+        </w:rPr>
+        <w:t xml:space="preserve"> menüsüyle özel rolü yeniden adlandır, sil ya da hazır rolü varsayılana döndür.</w:t>
+      </w:r>
+    </w:p>
+    <w:p>
+      <w:pPr>
+        <w:spacing w:after="100"/>
+      </w:pPr>
+    </w:p>
+    <w:p>
+      <w:pPr>
+        <w:keepNext/>
+        <w:spacing w:after="80" w:before="120"/>
+        <w:jc w:val="center"/>
+      </w:pPr>
+      <w:r>
+        <w:drawing>
+          <wp:inline distT="0" distB="0" distL="0" distR="0">
+            <wp:extent cx="5715000" cy="3571875"/>
+            <wp:effectExtent t="0" r="0" b="0" l="0"/>
+            <wp:docPr id="24" name="24-roles" descr="Roller ve yetkiler tablosu" title="Roller ve yetkiler tablosu"/>
+            <wp:cNvGraphicFramePr>
+              <a:graphicFrameLocks xmlns:a="http://schemas.openxmlformats.org/drawingml/2006/main" noChangeAspect="1"/>
+            </wp:cNvGraphicFramePr>
+            <a:graphic xmlns:a="http://schemas.openxmlformats.org/drawingml/2006/main">
+              <a:graphicData uri="http://schemas.openxmlformats.org/drawingml/2006/picture">
+                <pic:pic xmlns:pic="http://schemas.openxmlformats.org/drawingml/2006/picture">
+                  <pic:nvPicPr>
+                    <pic:cNvPr id="0" name="" descr=""/>
+                    <pic:cNvPicPr>
+                      <a:picLocks noChangeAspect="1" noChangeArrowheads="1"/>
+                    </pic:cNvPicPr>
+                  </pic:nvPicPr>
+                  <pic:blipFill>
+                    <a:blip r:embed="rId31" cstate="none"/>
+                    <a:srcRect/>
+                    <a:stretch>
+                      <a:fillRect/>
+                    </a:stretch>
+                  </pic:blipFill>
+                  <pic:spPr bwMode="auto">
+                    <a:xfrm>
+                      <a:off x="0" y="0"/>
+                      <a:ext cx="5715000" cy="3571875"/>
+                    </a:xfrm>
+                    <a:prstGeom prst="rect">
+                      <a:avLst/>
+                    </a:prstGeom>
+                  </pic:spPr>
+                </pic:pic>
+              </a:graphicData>
+            </a:graphic>
+          </wp:inline>
+        </w:drawing>
+      </w:r>
+    </w:p>
+    <w:p>
+      <w:pPr>
+        <w:keepNext/>
+        <w:spacing w:after="120"/>
+        <w:jc w:val="center"/>
+      </w:pPr>
+      <w:r>
+        <w:rPr>
+          <w:rFonts w:ascii="Calibri" w:cs="Calibri" w:eastAsia="Calibri" w:hAnsi="Calibri"/>
+          <w:i/>
+          <w:iCs/>
+          <w:color w:val="555B6E"/>
+          <w:sz w:val="20"/>
+          <w:szCs w:val="20"/>
+        </w:rPr>
+        <w:t xml:space="preserve">Her rol için bir sütun içeren Roles sayfası.</w:t>
+      </w:r>
+    </w:p>
+    <w:tbl>
+      <w:tblPr>
+        <w:tblW w:type="dxa" w:w="9638"/>
+        <w:tblBorders>
+          <w:top w:val="single" w:color="auto" w:sz="4"/>
+          <w:left w:val="single" w:color="auto" w:sz="4"/>
+          <w:bottom w:val="single" w:color="auto" w:sz="4"/>
+          <w:right w:val="single" w:color="auto" w:sz="4"/>
+          <w:insideH w:val="single" w:color="auto" w:sz="4"/>
+          <w:insideV w:val="single" w:color="auto" w:sz="4"/>
+        </w:tblBorders>
+      </w:tblPr>
+      <w:tblGrid>
+        <w:gridCol w:w="560"/>
+        <w:gridCol w:w="9078"/>
+      </w:tblGrid>
+      <w:tr>
+        <w:trPr>
+          <w:cantSplit/>
+        </w:trPr>
+        <w:tc>
+          <w:tcPr>
+            <w:tcW w:type="dxa" w:w="560"/>
+            <w:tcBorders>
+              <w:top w:val="none" w:color="FFFFFF" w:sz="0"/>
+              <w:left w:val="none" w:color="FFFFFF" w:sz="0"/>
+              <w:bottom w:val="none" w:color="FFFFFF" w:sz="0"/>
+              <w:right w:val="none" w:color="FFFFFF" w:sz="0"/>
+            </w:tcBorders>
+            <w:tcMar>
+              <w:top w:type="dxa" w:w="40"/>
+              <w:left w:type="dxa" w:w="40"/>
+              <w:bottom w:type="dxa" w:w="40"/>
+              <w:right w:type="dxa" w:w="60"/>
+            </w:tcMar>
+            <w:vAlign w:val="top"/>
+          </w:tcPr>
+          <w:p>
+            <w:pPr>
+              <w:jc w:val="center"/>
+            </w:pPr>
+            <w:r>
+              <w:rPr>
+                <w:rFonts w:ascii="Calibri" w:cs="Calibri" w:eastAsia="Calibri" w:hAnsi="Calibri"/>
+                <w:b/>
+                <w:bCs/>
+                <w:color w:val="FFFFFF"/>
+                <w:sz w:val="22"/>
+                <w:szCs w:val="22"/>
+                <w:shd w:fill="E11D48" w:color="auto" w:val="clear"/>
+              </w:rPr>
+              <w:t xml:space="preserve"> 1 </w:t>
+            </w:r>
+          </w:p>
+        </w:tc>
+        <w:tc>
+          <w:tcPr>
+            <w:tcW w:type="dxa" w:w="9078"/>
+            <w:tcBorders>
+              <w:top w:val="none" w:color="FFFFFF" w:sz="0"/>
+              <w:left w:val="none" w:color="FFFFFF" w:sz="0"/>
+              <w:bottom w:val="none" w:color="FFFFFF" w:sz="0"/>
+              <w:right w:val="none" w:color="FFFFFF" w:sz="0"/>
+            </w:tcBorders>
+            <w:tcMar>
+              <w:top w:type="dxa" w:w="40"/>
+              <w:left w:type="dxa" w:w="60"/>
+              <w:bottom w:type="dxa" w:w="40"/>
+              <w:right w:type="dxa" w:w="40"/>
+            </w:tcMar>
+          </w:tcPr>
+          <w:p>
+            <w:pPr>
+              <w:spacing w:after="0"/>
+            </w:pPr>
+            <w:r>
+              <w:rPr>
+                <w:rFonts w:ascii="Calibri" w:cs="Calibri" w:eastAsia="Calibri" w:hAnsi="Calibri"/>
+                <w:sz w:val="21"/>
+                <w:szCs w:val="21"/>
+              </w:rPr>
+              <w:t xml:space="preserve"/>
+            </w:r>
+            <w:r>
+              <w:rPr>
+                <w:rFonts w:ascii="Calibri" w:cs="Calibri" w:eastAsia="Calibri" w:hAnsi="Calibri"/>
+                <w:b/>
+                <w:bCs/>
+                <w:sz w:val="21"/>
+                <w:szCs w:val="21"/>
+              </w:rPr>
+              <w:t xml:space="preserve">Space roles / Workspace roles</w:t>
+            </w:r>
+            <w:r>
+              <w:rPr>
+                <w:rFonts w:ascii="Calibri" w:cs="Calibri" w:eastAsia="Calibri" w:hAnsi="Calibri"/>
+                <w:sz w:val="21"/>
+                <w:szCs w:val="21"/>
+              </w:rPr>
+              <w:t xml:space="preserve">: İki rol türü arasında geçiş yapar.</w:t>
+            </w:r>
+          </w:p>
+        </w:tc>
+      </w:tr>
+      <w:tr>
+        <w:trPr>
+          <w:cantSplit/>
+        </w:trPr>
+        <w:tc>
+          <w:tcPr>
+            <w:tcW w:type="dxa" w:w="560"/>
+            <w:tcBorders>
+              <w:top w:val="none" w:color="FFFFFF" w:sz="0"/>
+              <w:left w:val="none" w:color="FFFFFF" w:sz="0"/>
+              <w:bottom w:val="none" w:color="FFFFFF" w:sz="0"/>
+              <w:right w:val="none" w:color="FFFFFF" w:sz="0"/>
+            </w:tcBorders>
+            <w:tcMar>
+              <w:top w:type="dxa" w:w="40"/>
+              <w:left w:type="dxa" w:w="40"/>
+              <w:bottom w:type="dxa" w:w="40"/>
+              <w:right w:type="dxa" w:w="60"/>
+            </w:tcMar>
+            <w:vAlign w:val="top"/>
+          </w:tcPr>
+          <w:p>
+            <w:pPr>
+              <w:jc w:val="center"/>
+            </w:pPr>
+            <w:r>
+              <w:rPr>
+                <w:rFonts w:ascii="Calibri" w:cs="Calibri" w:eastAsia="Calibri" w:hAnsi="Calibri"/>
+                <w:b/>
+                <w:bCs/>
+                <w:color w:val="FFFFFF"/>
+                <w:sz w:val="22"/>
+                <w:szCs w:val="22"/>
+                <w:shd w:fill="E11D48" w:color="auto" w:val="clear"/>
+              </w:rPr>
+              <w:t xml:space="preserve"> 2 </w:t>
+            </w:r>
+          </w:p>
+        </w:tc>
+        <w:tc>
+          <w:tcPr>
+            <w:tcW w:type="dxa" w:w="9078"/>
+            <w:tcBorders>
+              <w:top w:val="none" w:color="FFFFFF" w:sz="0"/>
+              <w:left w:val="none" w:color="FFFFFF" w:sz="0"/>
+              <w:bottom w:val="none" w:color="FFFFFF" w:sz="0"/>
+              <w:right w:val="none" w:color="FFFFFF" w:sz="0"/>
+            </w:tcBorders>
+            <w:tcMar>
+              <w:top w:type="dxa" w:w="40"/>
+              <w:left w:type="dxa" w:w="60"/>
+              <w:bottom w:type="dxa" w:w="40"/>
+              <w:right w:type="dxa" w:w="40"/>
+            </w:tcMar>
+          </w:tcPr>
+          <w:p>
+            <w:pPr>
+              <w:spacing w:after="0"/>
+            </w:pPr>
+            <w:r>
+              <w:rPr>
+                <w:rFonts w:ascii="Calibri" w:cs="Calibri" w:eastAsia="Calibri" w:hAnsi="Calibri"/>
+                <w:sz w:val="21"/>
+                <w:szCs w:val="21"/>
+              </w:rPr>
+              <w:t xml:space="preserve"/>
+            </w:r>
+            <w:r>
+              <w:rPr>
+                <w:rFonts w:ascii="Calibri" w:cs="Calibri" w:eastAsia="Calibri" w:hAnsi="Calibri"/>
+                <w:b/>
+                <w:bCs/>
+                <w:sz w:val="21"/>
+                <w:szCs w:val="21"/>
+              </w:rPr>
+              <w:t xml:space="preserve">New role</w:t>
+            </w:r>
+            <w:r>
+              <w:rPr>
+                <w:rFonts w:ascii="Calibri" w:cs="Calibri" w:eastAsia="Calibri" w:hAnsi="Calibri"/>
+                <w:sz w:val="21"/>
+                <w:szCs w:val="21"/>
+              </w:rPr>
+              <w:t xml:space="preserve">: Özel rol oluşturur.</w:t>
+            </w:r>
+          </w:p>
+        </w:tc>
+      </w:tr>
+      <w:tr>
+        <w:trPr>
+          <w:cantSplit/>
+        </w:trPr>
+        <w:tc>
+          <w:tcPr>
+            <w:tcW w:type="dxa" w:w="560"/>
+            <w:tcBorders>
+              <w:top w:val="none" w:color="FFFFFF" w:sz="0"/>
+              <w:left w:val="none" w:color="FFFFFF" w:sz="0"/>
+              <w:bottom w:val="none" w:color="FFFFFF" w:sz="0"/>
+              <w:right w:val="none" w:color="FFFFFF" w:sz="0"/>
+            </w:tcBorders>
+            <w:tcMar>
+              <w:top w:type="dxa" w:w="40"/>
+              <w:left w:type="dxa" w:w="40"/>
+              <w:bottom w:type="dxa" w:w="40"/>
+              <w:right w:type="dxa" w:w="60"/>
+            </w:tcMar>
+            <w:vAlign w:val="top"/>
+          </w:tcPr>
+          <w:p>
+            <w:pPr>
+              <w:jc w:val="center"/>
+            </w:pPr>
+            <w:r>
+              <w:rPr>
+                <w:rFonts w:ascii="Calibri" w:cs="Calibri" w:eastAsia="Calibri" w:hAnsi="Calibri"/>
+                <w:b/>
+                <w:bCs/>
+                <w:color w:val="FFFFFF"/>
+                <w:sz w:val="22"/>
+                <w:szCs w:val="22"/>
+                <w:shd w:fill="E11D48" w:color="auto" w:val="clear"/>
+              </w:rPr>
+              <w:t xml:space="preserve"> 3 </w:t>
+            </w:r>
+          </w:p>
+        </w:tc>
+        <w:tc>
+          <w:tcPr>
+            <w:tcW w:type="dxa" w:w="9078"/>
+            <w:tcBorders>
+              <w:top w:val="none" w:color="FFFFFF" w:sz="0"/>
+              <w:left w:val="none" w:color="FFFFFF" w:sz="0"/>
+              <w:bottom w:val="none" w:color="FFFFFF" w:sz="0"/>
+              <w:right w:val="none" w:color="FFFFFF" w:sz="0"/>
+            </w:tcBorders>
+            <w:tcMar>
+              <w:top w:type="dxa" w:w="40"/>
+              <w:left w:type="dxa" w:w="60"/>
+              <w:bottom w:type="dxa" w:w="40"/>
+              <w:right w:type="dxa" w:w="40"/>
+            </w:tcMar>
+          </w:tcPr>
+          <w:p>
+            <w:pPr>
+              <w:spacing w:after="0"/>
+            </w:pPr>
+            <w:r>
+              <w:rPr>
+                <w:rFonts w:ascii="Calibri" w:cs="Calibri" w:eastAsia="Calibri" w:hAnsi="Calibri"/>
+                <w:sz w:val="21"/>
+                <w:szCs w:val="21"/>
+              </w:rPr>
+              <w:t xml:space="preserve"/>
+            </w:r>
+            <w:r>
+              <w:rPr>
+                <w:rFonts w:ascii="Calibri" w:cs="Calibri" w:eastAsia="Calibri" w:hAnsi="Calibri"/>
+                <w:b/>
+                <w:bCs/>
+                <w:sz w:val="21"/>
+                <w:szCs w:val="21"/>
+              </w:rPr>
+              <w:t xml:space="preserve">Rol sütunu</w:t>
+            </w:r>
+            <w:r>
+              <w:rPr>
+                <w:rFonts w:ascii="Calibri" w:cs="Calibri" w:eastAsia="Calibri" w:hAnsi="Calibri"/>
+                <w:sz w:val="21"/>
+                <w:szCs w:val="21"/>
+              </w:rPr>
+              <w:t xml:space="preserve">: Her rol için bir sütun; sayı, rolü kaç kişinin kullandığını gösterir.</w:t>
+            </w:r>
+          </w:p>
+        </w:tc>
+      </w:tr>
+      <w:tr>
+        <w:trPr>
+          <w:cantSplit/>
+        </w:trPr>
+        <w:tc>
+          <w:tcPr>
+            <w:tcW w:type="dxa" w:w="560"/>
+            <w:tcBorders>
+              <w:top w:val="none" w:color="FFFFFF" w:sz="0"/>
+              <w:left w:val="none" w:color="FFFFFF" w:sz="0"/>
+              <w:bottom w:val="none" w:color="FFFFFF" w:sz="0"/>
+              <w:right w:val="none" w:color="FFFFFF" w:sz="0"/>
+            </w:tcBorders>
+            <w:tcMar>
+              <w:top w:type="dxa" w:w="40"/>
+              <w:left w:type="dxa" w:w="40"/>
+              <w:bottom w:type="dxa" w:w="40"/>
+              <w:right w:type="dxa" w:w="60"/>
+            </w:tcMar>
+            <w:vAlign w:val="top"/>
+          </w:tcPr>
+          <w:p>
+            <w:pPr>
+              <w:jc w:val="center"/>
+            </w:pPr>
+            <w:r>
+              <w:rPr>
+                <w:rFonts w:ascii="Calibri" w:cs="Calibri" w:eastAsia="Calibri" w:hAnsi="Calibri"/>
+                <w:b/>
+                <w:bCs/>
+                <w:color w:val="FFFFFF"/>
+                <w:sz w:val="22"/>
+                <w:szCs w:val="22"/>
+                <w:shd w:fill="E11D48" w:color="auto" w:val="clear"/>
+              </w:rPr>
+              <w:t xml:space="preserve"> 4 </w:t>
+            </w:r>
+          </w:p>
+        </w:tc>
+        <w:tc>
+          <w:tcPr>
+            <w:tcW w:type="dxa" w:w="9078"/>
+            <w:tcBorders>
+              <w:top w:val="none" w:color="FFFFFF" w:sz="0"/>
+              <w:left w:val="none" w:color="FFFFFF" w:sz="0"/>
+              <w:bottom w:val="none" w:color="FFFFFF" w:sz="0"/>
+              <w:right w:val="none" w:color="FFFFFF" w:sz="0"/>
+            </w:tcBorders>
+            <w:tcMar>
+              <w:top w:type="dxa" w:w="40"/>
+              <w:left w:type="dxa" w:w="60"/>
+              <w:bottom w:type="dxa" w:w="40"/>
+              <w:right w:type="dxa" w:w="40"/>
+            </w:tcMar>
+          </w:tcPr>
+          <w:p>
+            <w:pPr>
+              <w:spacing w:after="0"/>
+            </w:pPr>
+            <w:r>
+              <w:rPr>
+                <w:rFonts w:ascii="Calibri" w:cs="Calibri" w:eastAsia="Calibri" w:hAnsi="Calibri"/>
+                <w:sz w:val="21"/>
+                <w:szCs w:val="21"/>
+              </w:rPr>
+              <w:t xml:space="preserve"/>
+            </w:r>
+            <w:r>
+              <w:rPr>
+                <w:rFonts w:ascii="Calibri" w:cs="Calibri" w:eastAsia="Calibri" w:hAnsi="Calibri"/>
+                <w:b/>
+                <w:bCs/>
+                <w:sz w:val="21"/>
+                <w:szCs w:val="21"/>
+              </w:rPr>
+              <w:t xml:space="preserve">Onay kutusu</w:t>
+            </w:r>
+            <w:r>
+              <w:rPr>
+                <w:rFonts w:ascii="Calibri" w:cs="Calibri" w:eastAsia="Calibri" w:hAnsi="Calibri"/>
+                <w:sz w:val="21"/>
+                <w:szCs w:val="21"/>
+              </w:rPr>
+              <w:t xml:space="preserve">: O rol için bir yetkiyi açar veya kapatır.</w:t>
+            </w:r>
+          </w:p>
+        </w:tc>
+      </w:tr>
+    </w:tbl>
+    <w:p>
+      <w:pPr>
+        <w:spacing w:after="200"/>
+      </w:pPr>
+    </w:p>
+    <w:tbl>
+      <w:tblPr>
+        <w:tblW w:type="dxa" w:w="9638"/>
+        <w:tblBorders>
+          <w:top w:val="single" w:color="auto" w:sz="4"/>
+          <w:left w:val="single" w:color="auto" w:sz="4"/>
+          <w:bottom w:val="single" w:color="auto" w:sz="4"/>
+          <w:right w:val="single" w:color="auto" w:sz="4"/>
+          <w:insideH w:val="single" w:color="auto" w:sz="4"/>
+          <w:insideV w:val="single" w:color="auto" w:sz="4"/>
+        </w:tblBorders>
+      </w:tblPr>
+      <w:tblGrid>
+        <w:gridCol w:w="9638"/>
+      </w:tblGrid>
+      <w:tr>
+        <w:trPr>
+          <w:cantSplit/>
+        </w:trPr>
+        <w:tc>
+          <w:tcPr>
+            <w:tcW w:type="dxa" w:w="9638"/>
+            <w:tcBorders>
+              <w:top w:val="none" w:color="FFFFFF" w:sz="0"/>
+              <w:left w:val="single" w:color="10B981" w:sz="24"/>
+              <w:bottom w:val="none" w:color="FFFFFF" w:sz="0"/>
+              <w:right w:val="none" w:color="FFFFFF" w:sz="0"/>
+            </w:tcBorders>
+            <w:shd w:fill="E7F7EE" w:color="auto" w:val="clear"/>
+            <w:tcMar>
+              <w:top w:type="dxa" w:w="100"/>
+              <w:left w:type="dxa" w:w="180"/>
+              <w:bottom w:type="dxa" w:w="100"/>
+              <w:right w:type="dxa" w:w="140"/>
+            </w:tcMar>
+          </w:tcPr>
+          <w:p>
+            <w:pPr>
+              <w:spacing w:after="0" w:line="290"/>
+            </w:pPr>
+            <w:r>
+              <w:rPr>
+                <w:rFonts w:ascii="Calibri" w:cs="Calibri" w:eastAsia="Calibri" w:hAnsi="Calibri"/>
+                <w:b/>
+                <w:bCs/>
+                <w:sz w:val="22"/>
+                <w:szCs w:val="22"/>
+              </w:rPr>
+              <w:t xml:space="preserve">İpucu: </w:t>
+            </w:r>
+            <w:r>
+              <w:rPr>
+                <w:rFonts w:ascii="Calibri" w:cs="Calibri" w:eastAsia="Calibri" w:hAnsi="Calibri"/>
+                <w:sz w:val="22"/>
+                <w:szCs w:val="22"/>
+              </w:rPr>
+              <w:t xml:space="preserve">Owner her zaman tüm haklara sahiptir ve bir rol, workspace’in çalışmaya devam etmesi için gereken yetkileri kaybedemez (örneğin Admin, üye ve ayar yönetimini korur).</w:t>
+            </w:r>
+          </w:p>
+        </w:tc>
+      </w:tr>
+    </w:tbl>
+    <w:p>
+      <w:pPr>
+        <w:spacing w:after="160"/>
+      </w:pPr>
+    </w:p>
+    <w:p>
+      <w:pPr>
+        <w:pStyle w:val="Heading1"/>
+        <w:keepNext/>
+      </w:pPr>
+      <w:r>
+        <w:rPr>
+          <w:rFonts w:ascii="Calibri" w:cs="Calibri" w:eastAsia="Calibri" w:hAnsi="Calibri"/>
+          <w:b/>
+          <w:bCs/>
+          <w:color w:val="3B2A9E"/>
+          <w:sz w:val="34"/>
+          <w:szCs w:val="34"/>
+        </w:rPr>
+        <w:t xml:space="preserve">14. Dosya ekleme</w:t>
+      </w:r>
+    </w:p>
+    <w:p>
+      <w:pPr>
+        <w:spacing w:after="140" w:line="300"/>
+      </w:pPr>
+      <w:r>
+        <w:rPr>
+          <w:rFonts w:ascii="Calibri" w:cs="Calibri" w:eastAsia="Calibri" w:hAnsi="Calibri"/>
+          <w:sz w:val="22"/>
+          <w:szCs w:val="22"/>
+        </w:rPr>
+        <w:t xml:space="preserve">Her Task, Epic, Sub-Task veya Bug’a ve dokümanlara dosya ekleyebilirsin.</w:t>
+      </w:r>
+    </w:p>
+    <w:p>
+      <w:pPr>
+        <w:pStyle w:val="ListParagraph"/>
+        <w:numPr>
+          <w:ilvl w:val="0"/>
+          <w:numId w:val="3"/>
+        </w:numPr>
+        <w:spacing w:after="80" w:line="290"/>
+      </w:pPr>
+      <w:r>
+        <w:rPr>
+          <w:rFonts w:ascii="Calibri" w:cs="Calibri" w:eastAsia="Calibri" w:hAnsi="Calibri"/>
+          <w:sz w:val="22"/>
+          <w:szCs w:val="22"/>
+        </w:rPr>
+        <w:t xml:space="preserve"/>
+      </w:r>
+      <w:r>
+        <w:rPr>
+          <w:rFonts w:ascii="Calibri" w:cs="Calibri" w:eastAsia="Calibri" w:hAnsi="Calibri"/>
+          <w:b/>
+          <w:bCs/>
+          <w:sz w:val="22"/>
+          <w:szCs w:val="22"/>
+        </w:rPr>
+        <w:t xml:space="preserve">Her dosya türü</w:t>
+      </w:r>
+      <w:r>
+        <w:rPr>
+          <w:rFonts w:ascii="Calibri" w:cs="Calibri" w:eastAsia="Calibri" w:hAnsi="Calibri"/>
+          <w:sz w:val="22"/>
+          <w:szCs w:val="22"/>
+        </w:rPr>
+        <w:t xml:space="preserve"> kabul edilir; dosya başına en çok </w:t>
+      </w:r>
+      <w:r>
+        <w:rPr>
+          <w:rFonts w:ascii="Calibri" w:cs="Calibri" w:eastAsia="Calibri" w:hAnsi="Calibri"/>
+          <w:b/>
+          <w:bCs/>
+          <w:sz w:val="22"/>
+          <w:szCs w:val="22"/>
+        </w:rPr>
+        <w:t xml:space="preserve">100 MB</w:t>
+      </w:r>
+      <w:r>
+        <w:rPr>
+          <w:rFonts w:ascii="Calibri" w:cs="Calibri" w:eastAsia="Calibri" w:hAnsi="Calibri"/>
+          <w:sz w:val="22"/>
+          <w:szCs w:val="22"/>
+        </w:rPr>
+        <w:t xml:space="preserve">, öğe başına 50 dosya.</w:t>
+      </w:r>
+    </w:p>
+    <w:p>
+      <w:pPr>
+        <w:pStyle w:val="ListParagraph"/>
+        <w:numPr>
+          <w:ilvl w:val="0"/>
+          <w:numId w:val="3"/>
+        </w:numPr>
+        <w:spacing w:after="80" w:line="290"/>
+      </w:pPr>
+      <w:r>
+        <w:rPr>
+          <w:rFonts w:ascii="Calibri" w:cs="Calibri" w:eastAsia="Calibri" w:hAnsi="Calibri"/>
+          <w:sz w:val="22"/>
+          <w:szCs w:val="22"/>
+        </w:rPr>
+        <w:t xml:space="preserve">Dosyaları </w:t>
+      </w:r>
+      <w:r>
+        <w:rPr>
+          <w:rFonts w:ascii="Calibri" w:cs="Calibri" w:eastAsia="Calibri" w:hAnsi="Calibri"/>
+          <w:b/>
+          <w:bCs/>
+          <w:sz w:val="22"/>
+          <w:szCs w:val="22"/>
+        </w:rPr>
+        <w:t xml:space="preserve">Ekler</w:t>
+      </w:r>
+      <w:r>
+        <w:rPr>
+          <w:rFonts w:ascii="Calibri" w:cs="Calibri" w:eastAsia="Calibri" w:hAnsi="Calibri"/>
+          <w:sz w:val="22"/>
+          <w:szCs w:val="22"/>
+        </w:rPr>
+        <w:t xml:space="preserve"> alanına sürükle, panodan ekran görüntüsü </w:t>
+      </w:r>
+      <w:r>
+        <w:rPr>
+          <w:rFonts w:ascii="Calibri" w:cs="Calibri" w:eastAsia="Calibri" w:hAnsi="Calibri"/>
+          <w:b/>
+          <w:bCs/>
+          <w:sz w:val="22"/>
+          <w:szCs w:val="22"/>
+        </w:rPr>
+        <w:t xml:space="preserve">yapıştır</w:t>
+      </w:r>
+      <w:r>
+        <w:rPr>
+          <w:rFonts w:ascii="Calibri" w:cs="Calibri" w:eastAsia="Calibri" w:hAnsi="Calibri"/>
+          <w:sz w:val="22"/>
+          <w:szCs w:val="22"/>
+        </w:rPr>
+        <w:t xml:space="preserve"> ya da alana tıklayıp göz at.</w:t>
+      </w:r>
+    </w:p>
+    <w:p>
+      <w:pPr>
+        <w:pStyle w:val="ListParagraph"/>
+        <w:numPr>
+          <w:ilvl w:val="0"/>
+          <w:numId w:val="3"/>
+        </w:numPr>
+        <w:spacing w:after="80" w:line="290"/>
+      </w:pPr>
+      <w:r>
+        <w:rPr>
+          <w:rFonts w:ascii="Calibri" w:cs="Calibri" w:eastAsia="Calibri" w:hAnsi="Calibri"/>
+          <w:sz w:val="22"/>
+          <w:szCs w:val="22"/>
+        </w:rPr>
+        <w:t xml:space="preserve">Öğe oluştururken </w:t>
+      </w:r>
+      <w:r>
+        <w:rPr>
+          <w:rFonts w:ascii="Calibri" w:cs="Calibri" w:eastAsia="Calibri" w:hAnsi="Calibri"/>
+          <w:b/>
+          <w:bCs/>
+          <w:sz w:val="22"/>
+          <w:szCs w:val="22"/>
+        </w:rPr>
+        <w:t xml:space="preserve">New</w:t>
+      </w:r>
+      <w:r>
+        <w:rPr>
+          <w:rFonts w:ascii="Calibri" w:cs="Calibri" w:eastAsia="Calibri" w:hAnsi="Calibri"/>
+          <w:sz w:val="22"/>
+          <w:szCs w:val="22"/>
+        </w:rPr>
+        <w:t xml:space="preserve"> penceresinde de dosya ekleyebilirsin.</w:t>
+      </w:r>
+    </w:p>
+    <w:p>
+      <w:pPr>
+        <w:pStyle w:val="ListParagraph"/>
+        <w:numPr>
+          <w:ilvl w:val="0"/>
+          <w:numId w:val="3"/>
+        </w:numPr>
+        <w:spacing w:after="80" w:line="290"/>
+      </w:pPr>
+      <w:r>
+        <w:rPr>
+          <w:rFonts w:ascii="Calibri" w:cs="Calibri" w:eastAsia="Calibri" w:hAnsi="Calibri"/>
+          <w:sz w:val="22"/>
+          <w:szCs w:val="22"/>
+        </w:rPr>
+        <w:t xml:space="preserve">Resim ve PDF’ler önizlemeyle açılır. Diğer her dosya (Office, zip, video, program…) indirilir; tarayıcıda açılmaz.</w:t>
+      </w:r>
+    </w:p>
+    <w:p>
+      <w:pPr>
+        <w:spacing w:after="100"/>
+      </w:pPr>
+    </w:p>
+    <w:tbl>
+      <w:tblPr>
+        <w:tblW w:type="dxa" w:w="9638"/>
+        <w:tblBorders>
+          <w:top w:val="single" w:color="auto" w:sz="4"/>
+          <w:left w:val="single" w:color="auto" w:sz="4"/>
+          <w:bottom w:val="single" w:color="auto" w:sz="4"/>
+          <w:right w:val="single" w:color="auto" w:sz="4"/>
+          <w:insideH w:val="single" w:color="auto" w:sz="4"/>
+          <w:insideV w:val="single" w:color="auto" w:sz="4"/>
+        </w:tblBorders>
+      </w:tblPr>
+      <w:tblGrid>
+        <w:gridCol w:w="9638"/>
+      </w:tblGrid>
+      <w:tr>
+        <w:trPr>
+          <w:cantSplit/>
+        </w:trPr>
+        <w:tc>
+          <w:tcPr>
+            <w:tcW w:type="dxa" w:w="9638"/>
+            <w:tcBorders>
+              <w:top w:val="none" w:color="FFFFFF" w:sz="0"/>
+              <w:left w:val="single" w:color="0EA5E9" w:sz="24"/>
+              <w:bottom w:val="none" w:color="FFFFFF" w:sz="0"/>
+              <w:right w:val="none" w:color="FFFFFF" w:sz="0"/>
+            </w:tcBorders>
+            <w:shd w:fill="E8F3FB" w:color="auto" w:val="clear"/>
+            <w:tcMar>
+              <w:top w:type="dxa" w:w="100"/>
+              <w:left w:type="dxa" w:w="180"/>
+              <w:bottom w:type="dxa" w:w="100"/>
+              <w:right w:type="dxa" w:w="140"/>
+            </w:tcMar>
+          </w:tcPr>
+          <w:p>
+            <w:pPr>
+              <w:spacing w:after="0" w:line="290"/>
+            </w:pPr>
+            <w:r>
+              <w:rPr>
+                <w:rFonts w:ascii="Calibri" w:cs="Calibri" w:eastAsia="Calibri" w:hAnsi="Calibri"/>
+                <w:b/>
+                <w:bCs/>
+                <w:sz w:val="22"/>
+                <w:szCs w:val="22"/>
+              </w:rPr>
+              <w:t xml:space="preserve">Not: </w:t>
+            </w:r>
+            <w:r>
+              <w:rPr>
+                <w:rFonts w:ascii="Calibri" w:cs="Calibri" w:eastAsia="Calibri" w:hAnsi="Calibri"/>
+                <w:sz w:val="22"/>
+                <w:szCs w:val="22"/>
+              </w:rPr>
+              <w:t xml:space="preserve">Program ve betikler (.exe gibi) de eklenebilir ama yalnızca indirilir. Göndereni tanımıyorsan açma.</w:t>
+            </w:r>
+          </w:p>
+        </w:tc>
+      </w:tr>
+    </w:tbl>
+    <w:p>
+      <w:pPr>
+        <w:spacing w:after="160"/>
+      </w:pPr>
+    </w:p>
+    <w:p>
+      <w:pPr>
+        <w:pStyle w:val="Heading1"/>
+        <w:keepNext/>
+      </w:pPr>
+      <w:r>
+        <w:rPr>
+          <w:rFonts w:ascii="Calibri" w:cs="Calibri" w:eastAsia="Calibri" w:hAnsi="Calibri"/>
+          <w:b/>
+          <w:bCs/>
+          <w:color w:val="3B2A9E"/>
+          <w:sz w:val="34"/>
+          <w:szCs w:val="34"/>
+        </w:rPr>
+        <w:t xml:space="preserve">15. Tüm Space için Kanban board</w:t>
+      </w:r>
+    </w:p>
+    <w:p>
+      <w:pPr>
+        <w:spacing w:after="140" w:line="300"/>
+      </w:pPr>
+      <w:r>
+        <w:rPr>
+          <w:rFonts w:ascii="Calibri" w:cs="Calibri" w:eastAsia="Calibri" w:hAnsi="Calibri"/>
+          <w:sz w:val="22"/>
+          <w:szCs w:val="22"/>
+        </w:rPr>
+        <w:t xml:space="preserve">Her Space’in sol menüsünde bir </w:t>
+      </w:r>
+      <w:r>
+        <w:rPr>
+          <w:rFonts w:ascii="Calibri" w:cs="Calibri" w:eastAsia="Calibri" w:hAnsi="Calibri"/>
+          <w:b/>
+          <w:bCs/>
+          <w:sz w:val="22"/>
+          <w:szCs w:val="22"/>
+        </w:rPr>
+        <w:t xml:space="preserve">Kanban board</w:t>
+      </w:r>
+      <w:r>
+        <w:rPr>
+          <w:rFonts w:ascii="Calibri" w:cs="Calibri" w:eastAsia="Calibri" w:hAnsi="Calibri"/>
+          <w:sz w:val="22"/>
+          <w:szCs w:val="22"/>
+        </w:rPr>
+        <w:t xml:space="preserve"> bağlantısı vardır. Space’in tüm listelerindeki açık öğeleri tek panoda gösterir. Sprintsiz, sürekli akış için Space oluştururken çalışma modu olarak </w:t>
+      </w:r>
+      <w:r>
+        <w:rPr>
+          <w:rFonts w:ascii="Calibri" w:cs="Calibri" w:eastAsia="Calibri" w:hAnsi="Calibri"/>
+          <w:b/>
+          <w:bCs/>
+          <w:sz w:val="22"/>
+          <w:szCs w:val="22"/>
+        </w:rPr>
+        <w:t xml:space="preserve">Kanban</w:t>
+      </w:r>
+      <w:r>
+        <w:rPr>
+          <w:rFonts w:ascii="Calibri" w:cs="Calibri" w:eastAsia="Calibri" w:hAnsi="Calibri"/>
+          <w:sz w:val="22"/>
+          <w:szCs w:val="22"/>
+        </w:rPr>
+        <w:t xml:space="preserve">ı seç.</w:t>
+      </w:r>
+    </w:p>
+    <w:p>
+      <w:pPr>
+        <w:pStyle w:val="ListParagraph"/>
+        <w:numPr>
+          <w:ilvl w:val="0"/>
+          <w:numId w:val="17"/>
+        </w:numPr>
+        <w:spacing w:after="100" w:line="290"/>
+      </w:pPr>
+      <w:r>
+        <w:rPr>
+          <w:rFonts w:ascii="Calibri" w:cs="Calibri" w:eastAsia="Calibri" w:hAnsi="Calibri"/>
+          <w:sz w:val="22"/>
+          <w:szCs w:val="22"/>
+        </w:rPr>
+        <w:t xml:space="preserve">Sol menüde Space’inin altındaki </w:t>
+      </w:r>
+      <w:r>
+        <w:rPr>
+          <w:rFonts w:ascii="Calibri" w:cs="Calibri" w:eastAsia="Calibri" w:hAnsi="Calibri"/>
+          <w:b/>
+          <w:bCs/>
+          <w:sz w:val="22"/>
+          <w:szCs w:val="22"/>
+        </w:rPr>
+        <w:t xml:space="preserve">Kanban board</w:t>
+      </w:r>
+      <w:r>
+        <w:rPr>
+          <w:rFonts w:ascii="Calibri" w:cs="Calibri" w:eastAsia="Calibri" w:hAnsi="Calibri"/>
+          <w:sz w:val="22"/>
+          <w:szCs w:val="22"/>
+        </w:rPr>
+        <w:t xml:space="preserve">a tıkla.</w:t>
+      </w:r>
+    </w:p>
+    <w:p>
+      <w:pPr>
+        <w:pStyle w:val="ListParagraph"/>
+        <w:numPr>
+          <w:ilvl w:val="0"/>
+          <w:numId w:val="17"/>
+        </w:numPr>
+        <w:spacing w:after="100" w:line="290"/>
+      </w:pPr>
+      <w:r>
+        <w:rPr>
+          <w:rFonts w:ascii="Calibri" w:cs="Calibri" w:eastAsia="Calibri" w:hAnsi="Calibri"/>
+          <w:sz w:val="22"/>
+          <w:szCs w:val="22"/>
+        </w:rPr>
+        <w:t xml:space="preserve">Her sütun bir durumdur. Durumu değiştirmek için kartı başka sütuna sürükle.</w:t>
+      </w:r>
+    </w:p>
+    <w:p>
+      <w:pPr>
+        <w:pStyle w:val="ListParagraph"/>
+        <w:numPr>
+          <w:ilvl w:val="0"/>
+          <w:numId w:val="17"/>
+        </w:numPr>
+        <w:spacing w:after="100" w:line="290"/>
+      </w:pPr>
+      <w:r>
+        <w:rPr>
+          <w:rFonts w:ascii="Calibri" w:cs="Calibri" w:eastAsia="Calibri" w:hAnsi="Calibri"/>
+          <w:sz w:val="22"/>
+          <w:szCs w:val="22"/>
+        </w:rPr>
+        <w:t xml:space="preserve">Bir sütunun altındaki </w:t>
+      </w:r>
+      <w:r>
+        <w:rPr>
+          <w:rFonts w:ascii="Calibri" w:cs="Calibri" w:eastAsia="Calibri" w:hAnsi="Calibri"/>
+          <w:b/>
+          <w:bCs/>
+          <w:sz w:val="22"/>
+          <w:szCs w:val="22"/>
+        </w:rPr>
+        <w:t xml:space="preserve">Kart ekle</w:t>
+      </w:r>
+      <w:r>
+        <w:rPr>
+          <w:rFonts w:ascii="Calibri" w:cs="Calibri" w:eastAsia="Calibri" w:hAnsi="Calibri"/>
+          <w:sz w:val="22"/>
+          <w:szCs w:val="22"/>
+        </w:rPr>
+        <w:t xml:space="preserve">ye tıkla, başlığı yaz ve Enter’a bas; kart o durumda oluşur.</w:t>
+      </w:r>
+    </w:p>
+    <w:p>
+      <w:pPr>
+        <w:pStyle w:val="ListParagraph"/>
+        <w:numPr>
+          <w:ilvl w:val="0"/>
+          <w:numId w:val="17"/>
+        </w:numPr>
+        <w:spacing w:after="100" w:line="290"/>
+      </w:pPr>
+      <w:r>
+        <w:rPr>
+          <w:rFonts w:ascii="Calibri" w:cs="Calibri" w:eastAsia="Calibri" w:hAnsi="Calibri"/>
+          <w:sz w:val="22"/>
+          <w:szCs w:val="22"/>
+        </w:rPr>
+        <w:t xml:space="preserve">Panoyu daraltmak için </w:t>
+      </w:r>
+      <w:r>
+        <w:rPr>
+          <w:rFonts w:ascii="Calibri" w:cs="Calibri" w:eastAsia="Calibri" w:hAnsi="Calibri"/>
+          <w:b/>
+          <w:bCs/>
+          <w:sz w:val="22"/>
+          <w:szCs w:val="22"/>
+        </w:rPr>
+        <w:t xml:space="preserve">Liste</w:t>
+      </w:r>
+      <w:r>
+        <w:rPr>
+          <w:rFonts w:ascii="Calibri" w:cs="Calibri" w:eastAsia="Calibri" w:hAnsi="Calibri"/>
+          <w:sz w:val="22"/>
+          <w:szCs w:val="22"/>
+        </w:rPr>
+        <w:t xml:space="preserve">, süzgeç kutusu ve </w:t>
+      </w:r>
+      <w:r>
+        <w:rPr>
+          <w:rFonts w:ascii="Calibri" w:cs="Calibri" w:eastAsia="Calibri" w:hAnsi="Calibri"/>
+          <w:b/>
+          <w:bCs/>
+          <w:sz w:val="22"/>
+          <w:szCs w:val="22"/>
+        </w:rPr>
+        <w:t xml:space="preserve">Yalnızca benimkiler</w:t>
+      </w:r>
+      <w:r>
+        <w:rPr>
+          <w:rFonts w:ascii="Calibri" w:cs="Calibri" w:eastAsia="Calibri" w:hAnsi="Calibri"/>
+          <w:sz w:val="22"/>
+          <w:szCs w:val="22"/>
+        </w:rPr>
+        <w:t xml:space="preserve">i kullan. </w:t>
+      </w:r>
+      <w:r>
+        <w:rPr>
+          <w:rFonts w:ascii="Calibri" w:cs="Calibri" w:eastAsia="Calibri" w:hAnsi="Calibri"/>
+          <w:b/>
+          <w:bCs/>
+          <w:sz w:val="22"/>
+          <w:szCs w:val="22"/>
+        </w:rPr>
+        <w:t xml:space="preserve">Satırlar</w:t>
+      </w:r>
+      <w:r>
+        <w:rPr>
+          <w:rFonts w:ascii="Calibri" w:cs="Calibri" w:eastAsia="Calibri" w:hAnsi="Calibri"/>
+          <w:sz w:val="22"/>
+          <w:szCs w:val="22"/>
+        </w:rPr>
+        <w:t xml:space="preserve"> seçici kartları kişiye, Epic’e veya önceliğe göre gruplar.</w:t>
+      </w:r>
+    </w:p>
+    <w:p>
+      <w:pPr>
+        <w:pStyle w:val="ListParagraph"/>
+        <w:numPr>
+          <w:ilvl w:val="0"/>
+          <w:numId w:val="17"/>
+        </w:numPr>
+        <w:spacing w:after="100" w:line="290"/>
+      </w:pPr>
+      <w:r>
+        <w:rPr>
+          <w:rFonts w:ascii="Calibri" w:cs="Calibri" w:eastAsia="Calibri" w:hAnsi="Calibri"/>
+          <w:sz w:val="22"/>
+          <w:szCs w:val="22"/>
+        </w:rPr>
+        <w:t xml:space="preserve">Limiti olan bir sütun dolunca uyarı verir; pano seni asla engellemez.</w:t>
+      </w:r>
+    </w:p>
+    <w:p>
+      <w:pPr>
+        <w:spacing w:after="100"/>
+      </w:pPr>
+    </w:p>
+    <w:p>
+      <w:pPr>
+        <w:keepNext/>
+        <w:spacing w:after="80" w:before="120"/>
+        <w:jc w:val="center"/>
+      </w:pPr>
+      <w:r>
+        <w:drawing>
+          <wp:inline distT="0" distB="0" distL="0" distR="0">
+            <wp:extent cx="5715000" cy="3571875"/>
+            <wp:effectExtent t="0" r="0" b="0" l="0"/>
+            <wp:docPr id="25" name="25-kanban" descr="Space Kanban board" title="Space Kanban board"/>
+            <wp:cNvGraphicFramePr>
+              <a:graphicFrameLocks xmlns:a="http://schemas.openxmlformats.org/drawingml/2006/main" noChangeAspect="1"/>
+            </wp:cNvGraphicFramePr>
+            <a:graphic xmlns:a="http://schemas.openxmlformats.org/drawingml/2006/main">
+              <a:graphicData uri="http://schemas.openxmlformats.org/drawingml/2006/picture">
+                <pic:pic xmlns:pic="http://schemas.openxmlformats.org/drawingml/2006/picture">
+                  <pic:nvPicPr>
+                    <pic:cNvPr id="0" name="" descr=""/>
+                    <pic:cNvPicPr>
+                      <a:picLocks noChangeAspect="1" noChangeArrowheads="1"/>
+                    </pic:cNvPicPr>
+                  </pic:nvPicPr>
+                  <pic:blipFill>
+                    <a:blip r:embed="rId32" cstate="none"/>
+                    <a:srcRect/>
+                    <a:stretch>
+                      <a:fillRect/>
+                    </a:stretch>
+                  </pic:blipFill>
+                  <pic:spPr bwMode="auto">
+                    <a:xfrm>
+                      <a:off x="0" y="0"/>
+                      <a:ext cx="5715000" cy="3571875"/>
+                    </a:xfrm>
+                    <a:prstGeom prst="rect">
+                      <a:avLst/>
+                    </a:prstGeom>
+                  </pic:spPr>
+                </pic:pic>
+              </a:graphicData>
+            </a:graphic>
+          </wp:inline>
+        </w:drawing>
+      </w:r>
+    </w:p>
+    <w:p>
+      <w:pPr>
+        <w:keepNext/>
+        <w:spacing w:after="120"/>
+        <w:jc w:val="center"/>
+      </w:pPr>
+      <w:r>
+        <w:rPr>
+          <w:rFonts w:ascii="Calibri" w:cs="Calibri" w:eastAsia="Calibri" w:hAnsi="Calibri"/>
+          <w:i/>
+          <w:iCs/>
+          <w:color w:val="555B6E"/>
+          <w:sz w:val="20"/>
+          <w:szCs w:val="20"/>
+        </w:rPr>
+        <w:t xml:space="preserve">Süzgeçleri ve Kart ekle düğmesiyle Kanban board.</w:t>
+      </w:r>
+    </w:p>
+    <w:tbl>
+      <w:tblPr>
+        <w:tblW w:type="dxa" w:w="9638"/>
+        <w:tblBorders>
+          <w:top w:val="single" w:color="auto" w:sz="4"/>
+          <w:left w:val="single" w:color="auto" w:sz="4"/>
+          <w:bottom w:val="single" w:color="auto" w:sz="4"/>
+          <w:right w:val="single" w:color="auto" w:sz="4"/>
+          <w:insideH w:val="single" w:color="auto" w:sz="4"/>
+          <w:insideV w:val="single" w:color="auto" w:sz="4"/>
+        </w:tblBorders>
+      </w:tblPr>
+      <w:tblGrid>
+        <w:gridCol w:w="560"/>
+        <w:gridCol w:w="9078"/>
+      </w:tblGrid>
+      <w:tr>
+        <w:trPr>
+          <w:cantSplit/>
+        </w:trPr>
+        <w:tc>
+          <w:tcPr>
+            <w:tcW w:type="dxa" w:w="560"/>
+            <w:tcBorders>
+              <w:top w:val="none" w:color="FFFFFF" w:sz="0"/>
+              <w:left w:val="none" w:color="FFFFFF" w:sz="0"/>
+              <w:bottom w:val="none" w:color="FFFFFF" w:sz="0"/>
+              <w:right w:val="none" w:color="FFFFFF" w:sz="0"/>
+            </w:tcBorders>
+            <w:tcMar>
+              <w:top w:type="dxa" w:w="40"/>
+              <w:left w:type="dxa" w:w="40"/>
+              <w:bottom w:type="dxa" w:w="40"/>
+              <w:right w:type="dxa" w:w="60"/>
+            </w:tcMar>
+            <w:vAlign w:val="top"/>
+          </w:tcPr>
+          <w:p>
+            <w:pPr>
+              <w:jc w:val="center"/>
+            </w:pPr>
+            <w:r>
+              <w:rPr>
+                <w:rFonts w:ascii="Calibri" w:cs="Calibri" w:eastAsia="Calibri" w:hAnsi="Calibri"/>
+                <w:b/>
+                <w:bCs/>
+                <w:color w:val="FFFFFF"/>
+                <w:sz w:val="22"/>
+                <w:szCs w:val="22"/>
+                <w:shd w:fill="E11D48" w:color="auto" w:val="clear"/>
+              </w:rPr>
+              <w:t xml:space="preserve"> 1 </w:t>
+            </w:r>
+          </w:p>
+        </w:tc>
+        <w:tc>
+          <w:tcPr>
+            <w:tcW w:type="dxa" w:w="9078"/>
+            <w:tcBorders>
+              <w:top w:val="none" w:color="FFFFFF" w:sz="0"/>
+              <w:left w:val="none" w:color="FFFFFF" w:sz="0"/>
+              <w:bottom w:val="none" w:color="FFFFFF" w:sz="0"/>
+              <w:right w:val="none" w:color="FFFFFF" w:sz="0"/>
+            </w:tcBorders>
+            <w:tcMar>
+              <w:top w:type="dxa" w:w="40"/>
+              <w:left w:type="dxa" w:w="60"/>
+              <w:bottom w:type="dxa" w:w="40"/>
+              <w:right w:type="dxa" w:w="40"/>
+            </w:tcMar>
+          </w:tcPr>
+          <w:p>
+            <w:pPr>
+              <w:spacing w:after="0"/>
+            </w:pPr>
+            <w:r>
+              <w:rPr>
+                <w:rFonts w:ascii="Calibri" w:cs="Calibri" w:eastAsia="Calibri" w:hAnsi="Calibri"/>
+                <w:sz w:val="21"/>
+                <w:szCs w:val="21"/>
+              </w:rPr>
+              <w:t xml:space="preserve"/>
+            </w:r>
+            <w:r>
+              <w:rPr>
+                <w:rFonts w:ascii="Calibri" w:cs="Calibri" w:eastAsia="Calibri" w:hAnsi="Calibri"/>
+                <w:b/>
+                <w:bCs/>
+                <w:sz w:val="21"/>
+                <w:szCs w:val="21"/>
+              </w:rPr>
+              <w:t xml:space="preserve">Liste</w:t>
+            </w:r>
+            <w:r>
+              <w:rPr>
+                <w:rFonts w:ascii="Calibri" w:cs="Calibri" w:eastAsia="Calibri" w:hAnsi="Calibri"/>
+                <w:sz w:val="21"/>
+                <w:szCs w:val="21"/>
+              </w:rPr>
+              <w:t xml:space="preserve">: Tek bir listeyi ya da tüm listeleri gösterir.</w:t>
+            </w:r>
+          </w:p>
+        </w:tc>
+      </w:tr>
+      <w:tr>
+        <w:trPr>
+          <w:cantSplit/>
+        </w:trPr>
+        <w:tc>
+          <w:tcPr>
+            <w:tcW w:type="dxa" w:w="560"/>
+            <w:tcBorders>
+              <w:top w:val="none" w:color="FFFFFF" w:sz="0"/>
+              <w:left w:val="none" w:color="FFFFFF" w:sz="0"/>
+              <w:bottom w:val="none" w:color="FFFFFF" w:sz="0"/>
+              <w:right w:val="none" w:color="FFFFFF" w:sz="0"/>
+            </w:tcBorders>
+            <w:tcMar>
+              <w:top w:type="dxa" w:w="40"/>
+              <w:left w:type="dxa" w:w="40"/>
+              <w:bottom w:type="dxa" w:w="40"/>
+              <w:right w:type="dxa" w:w="60"/>
+            </w:tcMar>
+            <w:vAlign w:val="top"/>
+          </w:tcPr>
+          <w:p>
+            <w:pPr>
+              <w:jc w:val="center"/>
+            </w:pPr>
+            <w:r>
+              <w:rPr>
+                <w:rFonts w:ascii="Calibri" w:cs="Calibri" w:eastAsia="Calibri" w:hAnsi="Calibri"/>
+                <w:b/>
+                <w:bCs/>
+                <w:color w:val="FFFFFF"/>
+                <w:sz w:val="22"/>
+                <w:szCs w:val="22"/>
+                <w:shd w:fill="E11D48" w:color="auto" w:val="clear"/>
+              </w:rPr>
+              <w:t xml:space="preserve"> 2 </w:t>
+            </w:r>
+          </w:p>
+        </w:tc>
+        <w:tc>
+          <w:tcPr>
+            <w:tcW w:type="dxa" w:w="9078"/>
+            <w:tcBorders>
+              <w:top w:val="none" w:color="FFFFFF" w:sz="0"/>
+              <w:left w:val="none" w:color="FFFFFF" w:sz="0"/>
+              <w:bottom w:val="none" w:color="FFFFFF" w:sz="0"/>
+              <w:right w:val="none" w:color="FFFFFF" w:sz="0"/>
+            </w:tcBorders>
+            <w:tcMar>
+              <w:top w:type="dxa" w:w="40"/>
+              <w:left w:type="dxa" w:w="60"/>
+              <w:bottom w:type="dxa" w:w="40"/>
+              <w:right w:type="dxa" w:w="40"/>
+            </w:tcMar>
+          </w:tcPr>
+          <w:p>
+            <w:pPr>
+              <w:spacing w:after="0"/>
+            </w:pPr>
+            <w:r>
+              <w:rPr>
+                <w:rFonts w:ascii="Calibri" w:cs="Calibri" w:eastAsia="Calibri" w:hAnsi="Calibri"/>
+                <w:sz w:val="21"/>
+                <w:szCs w:val="21"/>
+              </w:rPr>
+              <w:t xml:space="preserve"/>
+            </w:r>
+            <w:r>
+              <w:rPr>
+                <w:rFonts w:ascii="Calibri" w:cs="Calibri" w:eastAsia="Calibri" w:hAnsi="Calibri"/>
+                <w:b/>
+                <w:bCs/>
+                <w:sz w:val="21"/>
+                <w:szCs w:val="21"/>
+              </w:rPr>
+              <w:t xml:space="preserve">Kartları süz</w:t>
+            </w:r>
+            <w:r>
+              <w:rPr>
+                <w:rFonts w:ascii="Calibri" w:cs="Calibri" w:eastAsia="Calibri" w:hAnsi="Calibri"/>
+                <w:sz w:val="21"/>
+                <w:szCs w:val="21"/>
+              </w:rPr>
+              <w:t xml:space="preserve">: Panoyu başlığa veya ID’ye göre daraltır.</w:t>
+            </w:r>
+          </w:p>
+        </w:tc>
+      </w:tr>
+      <w:tr>
+        <w:trPr>
+          <w:cantSplit/>
+        </w:trPr>
+        <w:tc>
+          <w:tcPr>
+            <w:tcW w:type="dxa" w:w="560"/>
+            <w:tcBorders>
+              <w:top w:val="none" w:color="FFFFFF" w:sz="0"/>
+              <w:left w:val="none" w:color="FFFFFF" w:sz="0"/>
+              <w:bottom w:val="none" w:color="FFFFFF" w:sz="0"/>
+              <w:right w:val="none" w:color="FFFFFF" w:sz="0"/>
+            </w:tcBorders>
+            <w:tcMar>
+              <w:top w:type="dxa" w:w="40"/>
+              <w:left w:type="dxa" w:w="40"/>
+              <w:bottom w:type="dxa" w:w="40"/>
+              <w:right w:type="dxa" w:w="60"/>
+            </w:tcMar>
+            <w:vAlign w:val="top"/>
+          </w:tcPr>
+          <w:p>
+            <w:pPr>
+              <w:jc w:val="center"/>
+            </w:pPr>
+            <w:r>
+              <w:rPr>
+                <w:rFonts w:ascii="Calibri" w:cs="Calibri" w:eastAsia="Calibri" w:hAnsi="Calibri"/>
+                <w:b/>
+                <w:bCs/>
+                <w:color w:val="FFFFFF"/>
+                <w:sz w:val="22"/>
+                <w:szCs w:val="22"/>
+                <w:shd w:fill="E11D48" w:color="auto" w:val="clear"/>
+              </w:rPr>
+              <w:t xml:space="preserve"> 3 </w:t>
+            </w:r>
+          </w:p>
+        </w:tc>
+        <w:tc>
+          <w:tcPr>
+            <w:tcW w:type="dxa" w:w="9078"/>
+            <w:tcBorders>
+              <w:top w:val="none" w:color="FFFFFF" w:sz="0"/>
+              <w:left w:val="none" w:color="FFFFFF" w:sz="0"/>
+              <w:bottom w:val="none" w:color="FFFFFF" w:sz="0"/>
+              <w:right w:val="none" w:color="FFFFFF" w:sz="0"/>
+            </w:tcBorders>
+            <w:tcMar>
+              <w:top w:type="dxa" w:w="40"/>
+              <w:left w:type="dxa" w:w="60"/>
+              <w:bottom w:type="dxa" w:w="40"/>
+              <w:right w:type="dxa" w:w="40"/>
+            </w:tcMar>
+          </w:tcPr>
+          <w:p>
+            <w:pPr>
+              <w:spacing w:after="0"/>
+            </w:pPr>
+            <w:r>
+              <w:rPr>
+                <w:rFonts w:ascii="Calibri" w:cs="Calibri" w:eastAsia="Calibri" w:hAnsi="Calibri"/>
+                <w:sz w:val="21"/>
+                <w:szCs w:val="21"/>
+              </w:rPr>
+              <w:t xml:space="preserve"/>
+            </w:r>
+            <w:r>
+              <w:rPr>
+                <w:rFonts w:ascii="Calibri" w:cs="Calibri" w:eastAsia="Calibri" w:hAnsi="Calibri"/>
+                <w:b/>
+                <w:bCs/>
+                <w:sz w:val="21"/>
+                <w:szCs w:val="21"/>
+              </w:rPr>
+              <w:t xml:space="preserve">Kanban board</w:t>
+            </w:r>
+            <w:r>
+              <w:rPr>
+                <w:rFonts w:ascii="Calibri" w:cs="Calibri" w:eastAsia="Calibri" w:hAnsi="Calibri"/>
+                <w:sz w:val="21"/>
+                <w:szCs w:val="21"/>
+              </w:rPr>
+              <w:t xml:space="preserve">: Bu panoyu sol menüden açar. Kart eklemek için sütunun altındaki </w:t>
+            </w:r>
+            <w:r>
+              <w:rPr>
+                <w:rFonts w:ascii="Calibri" w:cs="Calibri" w:eastAsia="Calibri" w:hAnsi="Calibri"/>
+                <w:b/>
+                <w:bCs/>
+                <w:sz w:val="21"/>
+                <w:szCs w:val="21"/>
+              </w:rPr>
+              <w:t xml:space="preserve">Kart ekle</w:t>
+            </w:r>
+            <w:r>
+              <w:rPr>
+                <w:rFonts w:ascii="Calibri" w:cs="Calibri" w:eastAsia="Calibri" w:hAnsi="Calibri"/>
+                <w:sz w:val="21"/>
+                <w:szCs w:val="21"/>
+              </w:rPr>
+              <w:t xml:space="preserve">yi kullan.</w:t>
+            </w:r>
+          </w:p>
+        </w:tc>
+      </w:tr>
+    </w:tbl>
+    <w:p>
+      <w:pPr>
+        <w:spacing w:after="200"/>
+      </w:pPr>
+    </w:p>
+    <w:tbl>
+      <w:tblPr>
+        <w:tblW w:type="dxa" w:w="9638"/>
+        <w:tblBorders>
+          <w:top w:val="single" w:color="auto" w:sz="4"/>
+          <w:left w:val="single" w:color="auto" w:sz="4"/>
+          <w:bottom w:val="single" w:color="auto" w:sz="4"/>
+          <w:right w:val="single" w:color="auto" w:sz="4"/>
+          <w:insideH w:val="single" w:color="auto" w:sz="4"/>
+          <w:insideV w:val="single" w:color="auto" w:sz="4"/>
+        </w:tblBorders>
+      </w:tblPr>
+      <w:tblGrid>
+        <w:gridCol w:w="9638"/>
+      </w:tblGrid>
+      <w:tr>
+        <w:trPr>
+          <w:cantSplit/>
+        </w:trPr>
+        <w:tc>
+          <w:tcPr>
+            <w:tcW w:type="dxa" w:w="9638"/>
+            <w:tcBorders>
+              <w:top w:val="none" w:color="FFFFFF" w:sz="0"/>
+              <w:left w:val="single" w:color="10B981" w:sz="24"/>
+              <w:bottom w:val="none" w:color="FFFFFF" w:sz="0"/>
+              <w:right w:val="none" w:color="FFFFFF" w:sz="0"/>
+            </w:tcBorders>
+            <w:shd w:fill="E7F7EE" w:color="auto" w:val="clear"/>
+            <w:tcMar>
+              <w:top w:type="dxa" w:w="100"/>
+              <w:left w:type="dxa" w:w="180"/>
+              <w:bottom w:type="dxa" w:w="100"/>
+              <w:right w:type="dxa" w:w="140"/>
+            </w:tcMar>
+          </w:tcPr>
+          <w:p>
+            <w:pPr>
+              <w:spacing w:after="0" w:line="290"/>
+            </w:pPr>
+            <w:r>
+              <w:rPr>
+                <w:rFonts w:ascii="Calibri" w:cs="Calibri" w:eastAsia="Calibri" w:hAnsi="Calibri"/>
+                <w:b/>
+                <w:bCs/>
+                <w:sz w:val="22"/>
+                <w:szCs w:val="22"/>
+              </w:rPr>
+              <w:t xml:space="preserve">İpucu: </w:t>
+            </w:r>
+            <w:r>
+              <w:rPr>
+                <w:rFonts w:ascii="Calibri" w:cs="Calibri" w:eastAsia="Calibri" w:hAnsi="Calibri"/>
+                <w:sz w:val="22"/>
+                <w:szCs w:val="22"/>
+              </w:rPr>
+              <w:t xml:space="preserve">Panodan çıkmadan bir kartı yan panelde açmak için başlığına tıkla.</w:t>
+            </w:r>
+          </w:p>
+        </w:tc>
+      </w:tr>
+    </w:tbl>
+    <w:p>
+      <w:pPr>
+        <w:spacing w:after="160"/>
+      </w:pPr>
+    </w:p>
+    <w:p>
+      <w:pPr>
+        <w:pStyle w:val="Heading1"/>
+        <w:keepNext/>
+      </w:pPr>
+      <w:r>
+        <w:rPr>
+          <w:rFonts w:ascii="Calibri" w:cs="Calibri" w:eastAsia="Calibri" w:hAnsi="Calibri"/>
+          <w:b/>
+          <w:bCs/>
+          <w:color w:val="3B2A9E"/>
+          <w:sz w:val="34"/>
+          <w:szCs w:val="34"/>
+        </w:rPr>
+        <w:t xml:space="preserve">16. Kısa ipuçları ve sık sorulanlar</w:t>
       </w:r>
     </w:p>
     <w:tbl>
@@ -17725,6 +21331,74 @@
     </w:lvl>
   </w:abstractNum>
   <w:abstractNum w:abstractNumId="13" w15:restartNumberingAfterBreak="0">
+    <w:multiLevelType w:val="hybridMultilevel"/>
+    <w:lvl w:ilvl="0" w:tentative="1">
+      <w:start w:val="1"/>
+      <w:numFmt w:val="decimal"/>
+      <w:lvlText w:val="%1."/>
+      <w:lvlJc w:val="left"/>
+      <w:pPr>
+        <w:ind w:left="540" w:hanging="360"/>
+      </w:pPr>
+      <w:rPr>
+        <w:b/>
+        <w:bCs/>
+        <w:color w:val="3B2A9E"/>
+      </w:rPr>
+    </w:lvl>
+  </w:abstractNum>
+  <w:abstractNum w:abstractNumId="14" w15:restartNumberingAfterBreak="0">
+    <w:multiLevelType w:val="hybridMultilevel"/>
+    <w:lvl w:ilvl="0" w:tentative="1">
+      <w:start w:val="1"/>
+      <w:numFmt w:val="decimal"/>
+      <w:lvlText w:val="%1."/>
+      <w:lvlJc w:val="left"/>
+      <w:pPr>
+        <w:ind w:left="540" w:hanging="360"/>
+      </w:pPr>
+      <w:rPr>
+        <w:b/>
+        <w:bCs/>
+        <w:color w:val="3B2A9E"/>
+      </w:rPr>
+    </w:lvl>
+  </w:abstractNum>
+  <w:abstractNum w:abstractNumId="15" w15:restartNumberingAfterBreak="0">
+    <w:multiLevelType w:val="hybridMultilevel"/>
+    <w:lvl w:ilvl="0" w:tentative="1">
+      <w:start w:val="1"/>
+      <w:numFmt w:val="decimal"/>
+      <w:lvlText w:val="%1."/>
+      <w:lvlJc w:val="left"/>
+      <w:pPr>
+        <w:ind w:left="540" w:hanging="360"/>
+      </w:pPr>
+      <w:rPr>
+        <w:b/>
+        <w:bCs/>
+        <w:color w:val="3B2A9E"/>
+      </w:rPr>
+    </w:lvl>
+  </w:abstractNum>
+  <w:abstractNum w:abstractNumId="16" w15:restartNumberingAfterBreak="0">
+    <w:multiLevelType w:val="hybridMultilevel"/>
+    <w:lvl w:ilvl="0" w:tentative="1">
+      <w:start w:val="1"/>
+      <w:numFmt w:val="decimal"/>
+      <w:lvlText w:val="%1."/>
+      <w:lvlJc w:val="left"/>
+      <w:pPr>
+        <w:ind w:left="540" w:hanging="360"/>
+      </w:pPr>
+      <w:rPr>
+        <w:b/>
+        <w:bCs/>
+        <w:color w:val="3B2A9E"/>
+      </w:rPr>
+    </w:lvl>
+  </w:abstractNum>
+  <w:abstractNum w:abstractNumId="17" w15:restartNumberingAfterBreak="0">
     <w:multiLevelType w:val="hybridMultilevel"/>
     <w:lvl w:ilvl="0" w:tentative="1">
       <w:start w:val="1"/>
@@ -17815,6 +21489,30 @@
   </w:num>
   <w:num w:numId="13">
     <w:abstractNumId w:val="13"/>
+    <w:lvlOverride w:ilvl="0">
+      <w:startOverride w:val="1"/>
+    </w:lvlOverride>
+  </w:num>
+  <w:num w:numId="14">
+    <w:abstractNumId w:val="14"/>
+    <w:lvlOverride w:ilvl="0">
+      <w:startOverride w:val="1"/>
+    </w:lvlOverride>
+  </w:num>
+  <w:num w:numId="15">
+    <w:abstractNumId w:val="15"/>
+    <w:lvlOverride w:ilvl="0">
+      <w:startOverride w:val="1"/>
+    </w:lvlOverride>
+  </w:num>
+  <w:num w:numId="16">
+    <w:abstractNumId w:val="16"/>
+    <w:lvlOverride w:ilvl="0">
+      <w:startOverride w:val="1"/>
+    </w:lvlOverride>
+  </w:num>
+  <w:num w:numId="17">
+    <w:abstractNumId w:val="17"/>
     <w:lvlOverride w:ilvl="0">
       <w:startOverride w:val="1"/>
     </w:lvlOverride>

</xml_diff>

<commit_message>
docs: regenerate illustrated guide (TR/EN) and add technical documentation
Guide screenshots re-captured for the current UI (drag & drop, Proje
naming, Bugs, Kanban). New scripts/docs/make-tech-docx.cjs builds the
technical doc: request pipeline, auth/permissions, data model and storage,
background jobs and events, reports, backups, deployment, limits.

Co-Authored-By: Claude Opus 5.5 <noreply@anthropic.com>
</commit_message>
<xml_diff>
--- a/apps/web/public/help/Egebis-Seyir-Kullanim-Kilavuzu.docx
+++ b/apps/web/public/help/Egebis-Seyir-Kullanim-Kilavuzu.docx
@@ -4171,7 +4171,7 @@
       <w:r>
         <w:drawing>
           <wp:inline distT="0" distB="0" distL="0" distR="0">
-            <wp:extent cx="4781550" cy="3190875"/>
+            <wp:extent cx="4800600" cy="3209925"/>
             <wp:effectExtent t="0" r="0" b="0" l="0"/>
             <wp:docPr id="5" name="19-epic-promote-dialog" descr="Epic'e dönüştürme onay penceresi" title="Epic'e dönüştürme onay penceresi"/>
             <wp:cNvGraphicFramePr>
@@ -4196,7 +4196,7 @@
                   <pic:spPr bwMode="auto">
                     <a:xfrm>
                       <a:off x="0" y="0"/>
-                      <a:ext cx="4781550" cy="3190875"/>
+                      <a:ext cx="4800600" cy="3209925"/>
                     </a:xfrm>
                     <a:prstGeom prst="rect">
                       <a:avLst/>
@@ -11366,25 +11366,7 @@
           <w:sz w:val="22"/>
           <w:szCs w:val="22"/>
         </w:rPr>
-        <w:t xml:space="preserve">Fareyi satırın üzerine getir; satırın en solunda </w:t>
-      </w:r>
-      <w:r>
-        <w:rPr>
-          <w:rFonts w:ascii="Calibri" w:cs="Calibri" w:eastAsia="Calibri" w:hAnsi="Calibri"/>
-          <w:b/>
-          <w:bCs/>
-          <w:sz w:val="22"/>
-          <w:szCs w:val="22"/>
-        </w:rPr>
-        <w:t xml:space="preserve">sürükleme tutamacı</w:t>
-      </w:r>
-      <w:r>
-        <w:rPr>
-          <w:rFonts w:ascii="Calibri" w:cs="Calibri" w:eastAsia="Calibri" w:hAnsi="Calibri"/>
-          <w:sz w:val="22"/>
-          <w:szCs w:val="22"/>
-        </w:rPr>
-        <w:t xml:space="preserve"> (⋮⋮) belirir.</w:t>
+        <w:t xml:space="preserve">Task satırının herhangi bir boş yerine basılı tut ve fareyi hareket ettir: satır, masaüstündeki bir klasör gibi havaya kalkıp imleçle gelir; eski yerinde kesik çizgili boş bir yuva kalır.</w:t>
       </w:r>
     </w:p>
     <w:p>
@@ -11402,7 +11384,7 @@
           <w:sz w:val="22"/>
           <w:szCs w:val="22"/>
         </w:rPr>
-        <w:t xml:space="preserve">Tutamaçtan tutup Task’ı, altına koymak istediğin </w:t>
+        <w:t xml:space="preserve">Satırı, altına koymak istediğin </w:t>
       </w:r>
       <w:r>
         <w:rPr>
@@ -11420,7 +11402,7 @@
           <w:sz w:val="22"/>
           <w:szCs w:val="22"/>
         </w:rPr>
-        <w:t xml:space="preserve">’ın satırının üstüne sürükle; hedef satır renklenir.</w:t>
+        <w:t xml:space="preserve">’ın üstüne getir: hedef satır mor renklenir, taşıdığın satırın altında “HTK-1 altına Sub-Task olarak taşı” yazar. Epic ve Bug satırları soluklaşır; onlara bırakılamaz.</w:t>
       </w:r>
     </w:p>
     <w:p>
@@ -11474,7 +11456,7 @@
           <w:sz w:val="22"/>
           <w:szCs w:val="22"/>
         </w:rPr>
-        <w:t xml:space="preserve">Bir Sub-Task’ı ayırmak için onu sürüklemeye başla; ekranın altında ortada büyük </w:t>
+        <w:t xml:space="preserve">Bir Sub-Task’ı ayırmak için onu sürüklemeye başla; ekranın en altında ortada </w:t>
       </w:r>
       <w:r>
         <w:rPr>
@@ -11565,7 +11547,7 @@
           <wp:inline distT="0" distB="0" distL="0" distR="0">
             <wp:extent cx="5715000" cy="3571875"/>
             <wp:effectExtent t="0" r="0" b="0" l="0"/>
-            <wp:docPr id="15" name="28-dnd" descr="Sürüklerken çıkan Ayır alanı" title="Sürüklerken çıkan Ayır alanı"/>
+            <wp:docPr id="15" name="28-dnd" descr="Bir Task sürüklenirken hedef Task ve Ayır alanı" title="Bir Task sürüklenirken hedef Task ve Ayır alanı"/>
             <wp:cNvGraphicFramePr>
               <a:graphicFrameLocks xmlns:a="http://schemas.openxmlformats.org/drawingml/2006/main" noChangeAspect="1"/>
             </wp:cNvGraphicFramePr>
@@ -11616,7 +11598,7 @@
           <w:sz w:val="20"/>
           <w:szCs w:val="20"/>
         </w:rPr>
-        <w:t xml:space="preserve">Bir Sub-Task sürüklenirken altta çıkan Ayır alanı.</w:t>
+        <w:t xml:space="preserve">Taşınan satır imleçle gelir; hedef Task mor renklenir, altta Ayır alanı çıkar.</w:t>
       </w:r>
     </w:p>
     <w:tbl>
@@ -11710,15 +11692,15 @@
                 <w:sz w:val="21"/>
                 <w:szCs w:val="21"/>
               </w:rPr>
-              <w:t xml:space="preserve">Sürüklenen öğe</w:t>
-            </w:r>
-            <w:r>
-              <w:rPr>
-                <w:rFonts w:ascii="Calibri" w:cs="Calibri" w:eastAsia="Calibri" w:hAnsi="Calibri"/>
-                <w:sz w:val="21"/>
-                <w:szCs w:val="21"/>
-              </w:rPr>
-              <w:t xml:space="preserve">: Fareyle taşınan kart.</w:t>
+              <w:t xml:space="preserve">Sürüklenen satır</w:t>
+            </w:r>
+            <w:r>
+              <w:rPr>
+                <w:rFonts w:ascii="Calibri" w:cs="Calibri" w:eastAsia="Calibri" w:hAnsi="Calibri"/>
+                <w:sz w:val="21"/>
+                <w:szCs w:val="21"/>
+              </w:rPr>
+              <w:t xml:space="preserve">: Altında bırakınca ne olacağı yazar (burada MOB-3 altına Sub-Task).</w:t>
             </w:r>
           </w:p>
         </w:tc>

</xml_diff>

<commit_message>
feat: Sprint in New menu, Bugs tab, public app URL setting, quick-tour guide, checkbox style
- New menu: Sprint first; opens the Backlog sprint dialog (ADR-121)
- Bugs is a red tab next to Reports on Scrum pages; sprint board header button removed
- Settings > General: application address stored in app_settings, used for all
  email/webhook links instead of only APP_URL (ADR-122); fixes invite links
  pointing to localhost
- In-app help: Quick tour section for presenting (TR/EN), screenshots and Word
  guides regenerated
- Native checkboxes replaced with one consistent style (filled black boxes bug)

Co-Authored-By: Claude Sonnet 5.5 <noreply@anthropic.com>
</commit_message>
<xml_diff>
--- a/apps/web/public/help/Egebis-Seyir-Kullanim-Kilavuzu.docx
+++ b/apps/web/public/help/Egebis-Seyir-Kullanim-Kilavuzu.docx
@@ -108,6 +108,19 @@
           <w:sz w:val="24"/>
           <w:szCs w:val="24"/>
         </w:rPr>
+        <w:t xml:space="preserve">Hızlı tur: Seyir’i 5 dakikada anlat (sunum için)</w:t>
+      </w:r>
+    </w:p>
+    <w:p>
+      <w:pPr>
+        <w:spacing w:after="100"/>
+      </w:pPr>
+      <w:r>
+        <w:rPr>
+          <w:rFonts w:ascii="Calibri" w:cs="Calibri" w:eastAsia="Calibri" w:hAnsi="Calibri"/>
+          <w:sz w:val="24"/>
+          <w:szCs w:val="24"/>
+        </w:rPr>
         <w:t xml:space="preserve">Başlamadan önce: temel kavramlar</w:t>
       </w:r>
     </w:p>
@@ -364,7 +377,7 @@
           <w:sz w:val="34"/>
           <w:szCs w:val="34"/>
         </w:rPr>
-        <w:t xml:space="preserve">Başlamadan önce: temel kavramlar</w:t>
+        <w:t xml:space="preserve">Hızlı tur: Seyir’i 5 dakikada anlat (sunum için)</w:t>
       </w:r>
     </w:p>
     <w:p>
@@ -377,7 +390,7 @@
           <w:sz w:val="22"/>
           <w:szCs w:val="22"/>
         </w:rPr>
-        <w:t xml:space="preserve">Seyir, ekibin işlerini planladığı ve takip ettiği bir proje yönetimi uygulamasıdır. Bu kılavuz hiç kullanmamış biri için yazıldı: her adımda ekranın neresine bakacağını, kırmızı </w:t>
+        <w:t xml:space="preserve">Bu bölüm uygulamayı hızlıca öğrenmek ve başkasına göstermek için. Uzun anlatımlar sonraki bölümlerde; burada yalnızca </w:t>
       </w:r>
       <w:r>
         <w:rPr>
@@ -387,29 +400,129 @@
           <w:sz w:val="22"/>
           <w:szCs w:val="22"/>
         </w:rPr>
-        <w:t xml:space="preserve">numaralı işaretlerle</w:t>
-      </w:r>
-      <w:r>
-        <w:rPr>
-          <w:rFonts w:ascii="Calibri" w:cs="Calibri" w:eastAsia="Calibri" w:hAnsi="Calibri"/>
-          <w:sz w:val="22"/>
-          <w:szCs w:val="22"/>
-        </w:rPr>
-        <w:t xml:space="preserve"> gösteriyoruz. Görseldeki numara, görselin altındaki listeyle birebir eşleşir.</w:t>
-      </w:r>
-    </w:p>
-    <w:p>
-      <w:pPr>
-        <w:spacing w:after="140" w:line="300"/>
-      </w:pPr>
-      <w:r>
-        <w:rPr>
-          <w:rFonts w:ascii="Calibri" w:cs="Calibri" w:eastAsia="Calibri" w:hAnsi="Calibri"/>
-          <w:sz w:val="22"/>
-          <w:szCs w:val="22"/>
-        </w:rPr>
-        <w:t xml:space="preserve">Önce şu kelimeleri bilmek yeterli (Seyir'de bunların İngilizce adları kullanılır):</w:t>
-      </w:r>
+        <w:t xml:space="preserve">ne gösterip ne söyleyeceğin</w:t>
+      </w:r>
+      <w:r>
+        <w:rPr>
+          <w:rFonts w:ascii="Calibri" w:cs="Calibri" w:eastAsia="Calibri" w:hAnsi="Calibri"/>
+          <w:sz w:val="22"/>
+          <w:szCs w:val="22"/>
+        </w:rPr>
+        <w:t xml:space="preserve"> var.</w:t>
+      </w:r>
+    </w:p>
+    <w:p>
+      <w:pPr>
+        <w:pStyle w:val="ListParagraph"/>
+        <w:numPr>
+          <w:ilvl w:val="0"/>
+          <w:numId w:val="2"/>
+        </w:numPr>
+        <w:spacing w:after="80" w:line="290"/>
+      </w:pPr>
+      <w:r>
+        <w:rPr>
+          <w:rFonts w:ascii="Calibri" w:cs="Calibri" w:eastAsia="Calibri" w:hAnsi="Calibri"/>
+          <w:sz w:val="22"/>
+          <w:szCs w:val="22"/>
+        </w:rPr>
+        <w:t xml:space="preserve"/>
+      </w:r>
+      <w:r>
+        <w:rPr>
+          <w:rFonts w:ascii="Calibri" w:cs="Calibri" w:eastAsia="Calibri" w:hAnsi="Calibri"/>
+          <w:b/>
+          <w:bCs/>
+          <w:sz w:val="22"/>
+          <w:szCs w:val="22"/>
+        </w:rPr>
+        <w:t xml:space="preserve">Seyir nedir?</w:t>
+      </w:r>
+      <w:r>
+        <w:rPr>
+          <w:rFonts w:ascii="Calibri" w:cs="Calibri" w:eastAsia="Calibri" w:hAnsi="Calibri"/>
+          <w:sz w:val="22"/>
+          <w:szCs w:val="22"/>
+        </w:rPr>
+        <w:t xml:space="preserve"> Ekibin bütün işini tek yerde planladığı, sprintlerle ilerlettiği ve takip ettiği uygulama.</w:t>
+      </w:r>
+    </w:p>
+    <w:p>
+      <w:pPr>
+        <w:pStyle w:val="ListParagraph"/>
+        <w:numPr>
+          <w:ilvl w:val="0"/>
+          <w:numId w:val="2"/>
+        </w:numPr>
+        <w:spacing w:after="80" w:line="290"/>
+      </w:pPr>
+      <w:r>
+        <w:rPr>
+          <w:rFonts w:ascii="Calibri" w:cs="Calibri" w:eastAsia="Calibri" w:hAnsi="Calibri"/>
+          <w:sz w:val="22"/>
+          <w:szCs w:val="22"/>
+        </w:rPr>
+        <w:t xml:space="preserve"/>
+      </w:r>
+      <w:r>
+        <w:rPr>
+          <w:rFonts w:ascii="Calibri" w:cs="Calibri" w:eastAsia="Calibri" w:hAnsi="Calibri"/>
+          <w:b/>
+          <w:bCs/>
+          <w:sz w:val="22"/>
+          <w:szCs w:val="22"/>
+        </w:rPr>
+        <w:t xml:space="preserve">Kimin için?</w:t>
+      </w:r>
+      <w:r>
+        <w:rPr>
+          <w:rFonts w:ascii="Calibri" w:cs="Calibri" w:eastAsia="Calibri" w:hAnsi="Calibri"/>
+          <w:sz w:val="22"/>
+          <w:szCs w:val="22"/>
+        </w:rPr>
+        <w:t xml:space="preserve"> İş yazan, iş yapan ve ilerlemeyi izleyen herkes: yönetici, ürün sahibi, yazılımcı, paydaş.</w:t>
+      </w:r>
+    </w:p>
+    <w:p>
+      <w:pPr>
+        <w:pStyle w:val="ListParagraph"/>
+        <w:numPr>
+          <w:ilvl w:val="0"/>
+          <w:numId w:val="2"/>
+        </w:numPr>
+        <w:spacing w:after="80" w:line="290"/>
+      </w:pPr>
+      <w:r>
+        <w:rPr>
+          <w:rFonts w:ascii="Calibri" w:cs="Calibri" w:eastAsia="Calibri" w:hAnsi="Calibri"/>
+          <w:sz w:val="22"/>
+          <w:szCs w:val="22"/>
+        </w:rPr>
+        <w:t xml:space="preserve"/>
+      </w:r>
+      <w:r>
+        <w:rPr>
+          <w:rFonts w:ascii="Calibri" w:cs="Calibri" w:eastAsia="Calibri" w:hAnsi="Calibri"/>
+          <w:b/>
+          <w:bCs/>
+          <w:sz w:val="22"/>
+          <w:szCs w:val="22"/>
+        </w:rPr>
+        <w:t xml:space="preserve">Fark ne?</w:t>
+      </w:r>
+      <w:r>
+        <w:rPr>
+          <w:rFonts w:ascii="Calibri" w:cs="Calibri" w:eastAsia="Calibri" w:hAnsi="Calibri"/>
+          <w:sz w:val="22"/>
+          <w:szCs w:val="22"/>
+        </w:rPr>
+        <w:t xml:space="preserve"> Kendi sunucunuzda çalışır; veri kurumda kalır. Türkçe ve İngilizce.</w:t>
+      </w:r>
+    </w:p>
+    <w:p>
+      <w:pPr>
+        <w:spacing w:after="100"/>
+      </w:pPr>
     </w:p>
     <w:tbl>
       <w:tblPr>
@@ -463,7 +576,7 @@
                 <w:sz w:val="20"/>
                 <w:szCs w:val="20"/>
               </w:rPr>
-              <w:t xml:space="preserve">Kavram</w:t>
+              <w:t xml:space="preserve">Sıra</w:t>
             </w:r>
           </w:p>
         </w:tc>
@@ -497,7 +610,7 @@
                 <w:sz w:val="20"/>
                 <w:szCs w:val="20"/>
               </w:rPr>
-              <w:t xml:space="preserve">Ne demek?</w:t>
+              <w:t xml:space="preserve">Ekranda göster</w:t>
             </w:r>
           </w:p>
         </w:tc>
@@ -531,7 +644,7 @@
                 <w:sz w:val="20"/>
                 <w:szCs w:val="20"/>
               </w:rPr>
-              <w:t xml:space="preserve">Örnek</w:t>
+              <w:t xml:space="preserve">Söyleyeceğin cümle</w:t>
             </w:r>
           </w:p>
         </w:tc>
@@ -568,7 +681,7 @@
                 <w:sz w:val="20"/>
                 <w:szCs w:val="20"/>
               </w:rPr>
-              <w:t xml:space="preserve">Proje</w:t>
+              <w:t xml:space="preserve">1</w:t>
             </w:r>
           </w:p>
         </w:tc>
@@ -600,7 +713,27 @@
                 <w:sz w:val="20"/>
                 <w:szCs w:val="20"/>
               </w:rPr>
-              <w:t xml:space="preserve">Bir ürün veya ekip için ayrılmış çalışma alanı. Bütün işler bir Proje içinde tutulur.</w:t>
+              <w:t xml:space="preserve">Sol menüde </w:t>
+            </w:r>
+            <w:r>
+              <w:rPr>
+                <w:rFonts w:ascii="Calibri" w:cs="Calibri" w:eastAsia="Calibri" w:hAnsi="Calibri"/>
+                <w:b/>
+                <w:bCs/>
+                <w:sz w:val="20"/>
+                <w:szCs w:val="20"/>
+              </w:rPr>
+              <w:t xml:space="preserve">Proje oluştur</w:t>
+            </w:r>
+            <w:r>
+              <w:rPr>
+                <w:rFonts w:ascii="Calibri" w:cs="Calibri" w:eastAsia="Calibri" w:hAnsi="Calibri"/>
+                <w:b w:val="false"/>
+                <w:bCs w:val="false"/>
+                <w:sz w:val="20"/>
+                <w:szCs w:val="20"/>
+              </w:rPr>
+              <w:t xml:space="preserve"> (mor düğme)</w:t>
             </w:r>
           </w:p>
         </w:tc>
@@ -632,7 +765,7 @@
                 <w:sz w:val="20"/>
                 <w:szCs w:val="20"/>
               </w:rPr>
-              <w:t xml:space="preserve">Mobil Uygulama</w:t>
+              <w:t xml:space="preserve">Her ürün ya da ekip için ayrı bir çalışma alanı açılır.</w:t>
             </w:r>
           </w:p>
         </w:tc>
@@ -670,7 +803,7 @@
                 <w:sz w:val="20"/>
                 <w:szCs w:val="20"/>
               </w:rPr>
-              <w:t xml:space="preserve">Epic</w:t>
+              <w:t xml:space="preserve">2</w:t>
             </w:r>
           </w:p>
         </w:tc>
@@ -703,7 +836,27 @@
                 <w:sz w:val="20"/>
                 <w:szCs w:val="20"/>
               </w:rPr>
-              <w:t xml:space="preserve">Birçok Task'ı çatısı altında toplayan büyük hedef. İsteğe bağlıdır.</w:t>
+              <w:t xml:space="preserve">Üstteki mor </w:t>
+            </w:r>
+            <w:r>
+              <w:rPr>
+                <w:rFonts w:ascii="Calibri" w:cs="Calibri" w:eastAsia="Calibri" w:hAnsi="Calibri"/>
+                <w:b/>
+                <w:bCs/>
+                <w:sz w:val="20"/>
+                <w:szCs w:val="20"/>
+              </w:rPr>
+              <w:t xml:space="preserve">New</w:t>
+            </w:r>
+            <w:r>
+              <w:rPr>
+                <w:rFonts w:ascii="Calibri" w:cs="Calibri" w:eastAsia="Calibri" w:hAnsi="Calibri"/>
+                <w:b w:val="false"/>
+                <w:bCs w:val="false"/>
+                <w:sz w:val="20"/>
+                <w:szCs w:val="20"/>
+              </w:rPr>
+              <w:t xml:space="preserve"> düğmesi</w:t>
             </w:r>
           </w:p>
         </w:tc>
@@ -736,7 +889,7 @@
                 <w:sz w:val="20"/>
                 <w:szCs w:val="20"/>
               </w:rPr>
-              <w:t xml:space="preserve">Kullanıcı hesabı yönetimi</w:t>
+              <w:t xml:space="preserve">İş eklemenin tek kapısı: Sprint, Task, Epic, Bug buradan açılır.</w:t>
             </w:r>
           </w:p>
         </w:tc>
@@ -773,7 +926,7 @@
                 <w:sz w:val="20"/>
                 <w:szCs w:val="20"/>
               </w:rPr>
-              <w:t xml:space="preserve">Task</w:t>
+              <w:t xml:space="preserve">3</w:t>
             </w:r>
           </w:p>
         </w:tc>
@@ -805,7 +958,47 @@
                 <w:sz w:val="20"/>
                 <w:szCs w:val="20"/>
               </w:rPr>
-              <w:t xml:space="preserve">Yapılacak tek bir iş. Başlığı, sahibi, tarihi ve puanı vardır.</w:t>
+              <w:t xml:space="preserve">Bir </w:t>
+            </w:r>
+            <w:r>
+              <w:rPr>
+                <w:rFonts w:ascii="Calibri" w:cs="Calibri" w:eastAsia="Calibri" w:hAnsi="Calibri"/>
+                <w:b/>
+                <w:bCs/>
+                <w:sz w:val="20"/>
+                <w:szCs w:val="20"/>
+              </w:rPr>
+              <w:t xml:space="preserve">Epic</w:t>
+            </w:r>
+            <w:r>
+              <w:rPr>
+                <w:rFonts w:ascii="Calibri" w:cs="Calibri" w:eastAsia="Calibri" w:hAnsi="Calibri"/>
+                <w:b w:val="false"/>
+                <w:bCs w:val="false"/>
+                <w:sz w:val="20"/>
+                <w:szCs w:val="20"/>
+              </w:rPr>
+              <w:t xml:space="preserve"> ve altına </w:t>
+            </w:r>
+            <w:r>
+              <w:rPr>
+                <w:rFonts w:ascii="Calibri" w:cs="Calibri" w:eastAsia="Calibri" w:hAnsi="Calibri"/>
+                <w:b/>
+                <w:bCs/>
+                <w:sz w:val="20"/>
+                <w:szCs w:val="20"/>
+              </w:rPr>
+              <w:t xml:space="preserve">Task</w:t>
+            </w:r>
+            <w:r>
+              <w:rPr>
+                <w:rFonts w:ascii="Calibri" w:cs="Calibri" w:eastAsia="Calibri" w:hAnsi="Calibri"/>
+                <w:b w:val="false"/>
+                <w:bCs w:val="false"/>
+                <w:sz w:val="20"/>
+                <w:szCs w:val="20"/>
+              </w:rPr>
+              <w:t xml:space="preserve">’lar ekle</w:t>
             </w:r>
           </w:p>
         </w:tc>
@@ -837,7 +1030,7 @@
                 <w:sz w:val="20"/>
                 <w:szCs w:val="20"/>
               </w:rPr>
-              <w:t xml:space="preserve">Giriş ekranını tasarla</w:t>
+              <w:t xml:space="preserve">Büyük hedef Epic, yapılacak iş Task; küçük parçalar Sub-Task.</w:t>
             </w:r>
           </w:p>
         </w:tc>
@@ -875,7 +1068,7 @@
                 <w:sz w:val="20"/>
                 <w:szCs w:val="20"/>
               </w:rPr>
-              <w:t xml:space="preserve">Sub-Task</w:t>
+              <w:t xml:space="preserve">4</w:t>
             </w:r>
           </w:p>
         </w:tc>
@@ -908,7 +1101,27 @@
                 <w:sz w:val="20"/>
                 <w:szCs w:val="20"/>
               </w:rPr>
-              <w:t xml:space="preserve">Bir Task'ın küçük parçası. Tek başına var olamaz, her zaman bir üst Task'a bağlıdır.</w:t>
+              <w:t xml:space="preserve">Bir Task’ı başka Task’ın üstüne </w:t>
+            </w:r>
+            <w:r>
+              <w:rPr>
+                <w:rFonts w:ascii="Calibri" w:cs="Calibri" w:eastAsia="Calibri" w:hAnsi="Calibri"/>
+                <w:b/>
+                <w:bCs/>
+                <w:sz w:val="20"/>
+                <w:szCs w:val="20"/>
+              </w:rPr>
+              <w:t xml:space="preserve">sürükle</w:t>
+            </w:r>
+            <w:r>
+              <w:rPr>
+                <w:rFonts w:ascii="Calibri" w:cs="Calibri" w:eastAsia="Calibri" w:hAnsi="Calibri"/>
+                <w:b w:val="false"/>
+                <w:bCs w:val="false"/>
+                <w:sz w:val="20"/>
+                <w:szCs w:val="20"/>
+              </w:rPr>
+              <w:t xml:space="preserve"/>
             </w:r>
           </w:p>
         </w:tc>
@@ -941,7 +1154,7 @@
                 <w:sz w:val="20"/>
                 <w:szCs w:val="20"/>
               </w:rPr>
-              <w:t xml:space="preserve">Form alanlarını çiz</w:t>
+              <w:t xml:space="preserve">Sürüklemek yeterli: onay verince Sub-Task olur, “Ayır” alanına bırakınca tekrar Task.</w:t>
             </w:r>
           </w:p>
         </w:tc>
@@ -978,7 +1191,7 @@
                 <w:sz w:val="20"/>
                 <w:szCs w:val="20"/>
               </w:rPr>
-              <w:t xml:space="preserve">Sprint</w:t>
+              <w:t xml:space="preserve">5</w:t>
             </w:r>
           </w:p>
         </w:tc>
@@ -1010,7 +1223,27 @@
                 <w:sz w:val="20"/>
                 <w:szCs w:val="20"/>
               </w:rPr>
-              <w:t xml:space="preserve">Genellikle 1–2 hafta süren, hedefi ve tarihleri belli çalışma dönemi. Ekip o dönemde hangi işleri yapacağını seçer.</w:t>
+              <w:t xml:space="preserve">New → </w:t>
+            </w:r>
+            <w:r>
+              <w:rPr>
+                <w:rFonts w:ascii="Calibri" w:cs="Calibri" w:eastAsia="Calibri" w:hAnsi="Calibri"/>
+                <w:b/>
+                <w:bCs/>
+                <w:sz w:val="20"/>
+                <w:szCs w:val="20"/>
+              </w:rPr>
+              <w:t xml:space="preserve">Sprint</w:t>
+            </w:r>
+            <w:r>
+              <w:rPr>
+                <w:rFonts w:ascii="Calibri" w:cs="Calibri" w:eastAsia="Calibri" w:hAnsi="Calibri"/>
+                <w:b w:val="false"/>
+                <w:bCs w:val="false"/>
+                <w:sz w:val="20"/>
+                <w:szCs w:val="20"/>
+              </w:rPr>
+              <w:t xml:space="preserve"/>
             </w:r>
           </w:p>
         </w:tc>
@@ -1042,7 +1275,7 @@
                 <w:sz w:val="20"/>
                 <w:szCs w:val="20"/>
               </w:rPr>
-              <w:t xml:space="preserve">Sprint 1 (15–28 Ekim)</w:t>
+              <w:t xml:space="preserve">Sprint, ekibin 1–2 haftalık hedefidir; tarihleri ve hedefi burada yazılır.</w:t>
             </w:r>
           </w:p>
         </w:tc>
@@ -1080,7 +1313,7 @@
                 <w:sz w:val="20"/>
                 <w:szCs w:val="20"/>
               </w:rPr>
-              <w:t xml:space="preserve">Backlog</w:t>
+              <w:t xml:space="preserve">6</w:t>
             </w:r>
           </w:p>
         </w:tc>
@@ -1113,7 +1346,27 @@
                 <w:sz w:val="20"/>
                 <w:szCs w:val="20"/>
               </w:rPr>
-              <w:t xml:space="preserve">Henüz bir Sprint'e alınmamış, öncelik sırasıyla bekleyen işlerin listesi.</w:t>
+              <w:t xml:space="preserve">Backlog’daki işleri </w:t>
+            </w:r>
+            <w:r>
+              <w:rPr>
+                <w:rFonts w:ascii="Calibri" w:cs="Calibri" w:eastAsia="Calibri" w:hAnsi="Calibri"/>
+                <w:b/>
+                <w:bCs/>
+                <w:sz w:val="20"/>
+                <w:szCs w:val="20"/>
+              </w:rPr>
+              <w:t xml:space="preserve">Sprint’e taşı</w:t>
+            </w:r>
+            <w:r>
+              <w:rPr>
+                <w:rFonts w:ascii="Calibri" w:cs="Calibri" w:eastAsia="Calibri" w:hAnsi="Calibri"/>
+                <w:b w:val="false"/>
+                <w:bCs w:val="false"/>
+                <w:sz w:val="20"/>
+                <w:szCs w:val="20"/>
+              </w:rPr>
+              <w:t xml:space="preserve"/>
             </w:r>
           </w:p>
         </w:tc>
@@ -1146,7 +1399,7 @@
                 <w:sz w:val="20"/>
                 <w:szCs w:val="20"/>
               </w:rPr>
-              <w:t xml:space="preserve">—</w:t>
+              <w:t xml:space="preserve">Ekip bu dönem hangi işleri yapacağını seçer.</w:t>
             </w:r>
           </w:p>
         </w:tc>
@@ -1183,7 +1436,7 @@
                 <w:sz w:val="20"/>
                 <w:szCs w:val="20"/>
               </w:rPr>
-              <w:t xml:space="preserve">Story Point</w:t>
+              <w:t xml:space="preserve">7</w:t>
             </w:r>
           </w:p>
         </w:tc>
@@ -1215,7 +1468,27 @@
                 <w:sz w:val="20"/>
                 <w:szCs w:val="20"/>
               </w:rPr>
-              <w:t xml:space="preserve">Bir işin büyüklüğünü gösteren puan (1, 2, 3, 5, 8, 13, 21, 34, 55).</w:t>
+              <w:t xml:space="preserve"/>
+            </w:r>
+            <w:r>
+              <w:rPr>
+                <w:rFonts w:ascii="Calibri" w:cs="Calibri" w:eastAsia="Calibri" w:hAnsi="Calibri"/>
+                <w:b/>
+                <w:bCs/>
+                <w:sz w:val="20"/>
+                <w:szCs w:val="20"/>
+              </w:rPr>
+              <w:t xml:space="preserve">Sprint panosu</w:t>
+            </w:r>
+            <w:r>
+              <w:rPr>
+                <w:rFonts w:ascii="Calibri" w:cs="Calibri" w:eastAsia="Calibri" w:hAnsi="Calibri"/>
+                <w:b w:val="false"/>
+                <w:bCs w:val="false"/>
+                <w:sz w:val="20"/>
+                <w:szCs w:val="20"/>
+              </w:rPr>
+              <w:t xml:space="preserve">: kartı sütundan sütuna sürükle</w:t>
             </w:r>
           </w:p>
         </w:tc>
@@ -1247,7 +1520,463 @@
                 <w:sz w:val="20"/>
                 <w:szCs w:val="20"/>
               </w:rPr>
-              <w:t xml:space="preserve">5</w:t>
+              <w:t xml:space="preserve">Herkes işin hangi aşamada olduğunu bir bakışta görür.</w:t>
+            </w:r>
+          </w:p>
+        </w:tc>
+      </w:tr>
+      <w:tr>
+        <w:trPr>
+          <w:cantSplit/>
+        </w:trPr>
+        <w:tc>
+          <w:tcPr>
+            <w:tcW w:type="dxa" w:w="2120"/>
+            <w:tcBorders>
+              <w:top w:val="single" w:color="C9CEDB" w:sz="4"/>
+              <w:left w:val="single" w:color="C9CEDB" w:sz="4"/>
+              <w:bottom w:val="single" w:color="C9CEDB" w:sz="4"/>
+              <w:right w:val="single" w:color="C9CEDB" w:sz="4"/>
+            </w:tcBorders>
+            <w:shd w:fill="F4F5FA" w:color="auto" w:val="clear"/>
+            <w:tcMar>
+              <w:top w:type="dxa" w:w="70"/>
+              <w:left w:type="dxa" w:w="110"/>
+              <w:bottom w:type="dxa" w:w="70"/>
+              <w:right w:type="dxa" w:w="110"/>
+            </w:tcMar>
+          </w:tcPr>
+          <w:p>
+            <w:pPr>
+              <w:spacing w:after="0" w:line="270"/>
+            </w:pPr>
+            <w:r>
+              <w:rPr>
+                <w:rFonts w:ascii="Calibri" w:cs="Calibri" w:eastAsia="Calibri" w:hAnsi="Calibri"/>
+                <w:b/>
+                <w:bCs/>
+                <w:sz w:val="20"/>
+                <w:szCs w:val="20"/>
+              </w:rPr>
+              <w:t xml:space="preserve">8</w:t>
+            </w:r>
+          </w:p>
+        </w:tc>
+        <w:tc>
+          <w:tcPr>
+            <w:tcW w:type="dxa" w:w="3759"/>
+            <w:tcBorders>
+              <w:top w:val="single" w:color="C9CEDB" w:sz="4"/>
+              <w:left w:val="single" w:color="C9CEDB" w:sz="4"/>
+              <w:bottom w:val="single" w:color="C9CEDB" w:sz="4"/>
+              <w:right w:val="single" w:color="C9CEDB" w:sz="4"/>
+            </w:tcBorders>
+            <w:shd w:fill="F4F5FA" w:color="auto" w:val="clear"/>
+            <w:tcMar>
+              <w:top w:type="dxa" w:w="70"/>
+              <w:left w:type="dxa" w:w="110"/>
+              <w:bottom w:type="dxa" w:w="70"/>
+              <w:right w:type="dxa" w:w="110"/>
+            </w:tcMar>
+          </w:tcPr>
+          <w:p>
+            <w:pPr>
+              <w:spacing w:after="0" w:line="270"/>
+            </w:pPr>
+            <w:r>
+              <w:rPr>
+                <w:rFonts w:ascii="Calibri" w:cs="Calibri" w:eastAsia="Calibri" w:hAnsi="Calibri"/>
+                <w:b w:val="false"/>
+                <w:bCs w:val="false"/>
+                <w:sz w:val="20"/>
+                <w:szCs w:val="20"/>
+              </w:rPr>
+              <w:t xml:space="preserve">Kırmızı </w:t>
+            </w:r>
+            <w:r>
+              <w:rPr>
+                <w:rFonts w:ascii="Calibri" w:cs="Calibri" w:eastAsia="Calibri" w:hAnsi="Calibri"/>
+                <w:b/>
+                <w:bCs/>
+                <w:sz w:val="20"/>
+                <w:szCs w:val="20"/>
+              </w:rPr>
+              <w:t xml:space="preserve">Bugs</w:t>
+            </w:r>
+            <w:r>
+              <w:rPr>
+                <w:rFonts w:ascii="Calibri" w:cs="Calibri" w:eastAsia="Calibri" w:hAnsi="Calibri"/>
+                <w:b w:val="false"/>
+                <w:bCs w:val="false"/>
+                <w:sz w:val="20"/>
+                <w:szCs w:val="20"/>
+              </w:rPr>
+              <w:t xml:space="preserve"> sekmesi (Raporlar’ın yanında) → Bug aç → ata → Çözüldü</w:t>
+            </w:r>
+          </w:p>
+        </w:tc>
+        <w:tc>
+          <w:tcPr>
+            <w:tcW w:type="dxa" w:w="3759"/>
+            <w:tcBorders>
+              <w:top w:val="single" w:color="C9CEDB" w:sz="4"/>
+              <w:left w:val="single" w:color="C9CEDB" w:sz="4"/>
+              <w:bottom w:val="single" w:color="C9CEDB" w:sz="4"/>
+              <w:right w:val="single" w:color="C9CEDB" w:sz="4"/>
+            </w:tcBorders>
+            <w:shd w:fill="F4F5FA" w:color="auto" w:val="clear"/>
+            <w:tcMar>
+              <w:top w:type="dxa" w:w="70"/>
+              <w:left w:type="dxa" w:w="110"/>
+              <w:bottom w:type="dxa" w:w="70"/>
+              <w:right w:type="dxa" w:w="110"/>
+            </w:tcMar>
+          </w:tcPr>
+          <w:p>
+            <w:pPr>
+              <w:spacing w:after="0" w:line="270"/>
+            </w:pPr>
+            <w:r>
+              <w:rPr>
+                <w:rFonts w:ascii="Calibri" w:cs="Calibri" w:eastAsia="Calibri" w:hAnsi="Calibri"/>
+                <w:b w:val="false"/>
+                <w:bCs w:val="false"/>
+                <w:sz w:val="20"/>
+                <w:szCs w:val="20"/>
+              </w:rPr>
+              <w:t xml:space="preserve">Hatalar kaybolmaz: sahibi, atananı ve durumu olur; herkese e-posta gider.</w:t>
+            </w:r>
+          </w:p>
+        </w:tc>
+      </w:tr>
+      <w:tr>
+        <w:trPr>
+          <w:cantSplit/>
+        </w:trPr>
+        <w:tc>
+          <w:tcPr>
+            <w:tcW w:type="dxa" w:w="2120"/>
+            <w:tcBorders>
+              <w:top w:val="single" w:color="C9CEDB" w:sz="4"/>
+              <w:left w:val="single" w:color="C9CEDB" w:sz="4"/>
+              <w:bottom w:val="single" w:color="C9CEDB" w:sz="4"/>
+              <w:right w:val="single" w:color="C9CEDB" w:sz="4"/>
+            </w:tcBorders>
+            <w:tcMar>
+              <w:top w:type="dxa" w:w="70"/>
+              <w:left w:type="dxa" w:w="110"/>
+              <w:bottom w:type="dxa" w:w="70"/>
+              <w:right w:type="dxa" w:w="110"/>
+            </w:tcMar>
+          </w:tcPr>
+          <w:p>
+            <w:pPr>
+              <w:spacing w:after="0" w:line="270"/>
+            </w:pPr>
+            <w:r>
+              <w:rPr>
+                <w:rFonts w:ascii="Calibri" w:cs="Calibri" w:eastAsia="Calibri" w:hAnsi="Calibri"/>
+                <w:b/>
+                <w:bCs/>
+                <w:sz w:val="20"/>
+                <w:szCs w:val="20"/>
+              </w:rPr>
+              <w:t xml:space="preserve">9</w:t>
+            </w:r>
+          </w:p>
+        </w:tc>
+        <w:tc>
+          <w:tcPr>
+            <w:tcW w:type="dxa" w:w="3759"/>
+            <w:tcBorders>
+              <w:top w:val="single" w:color="C9CEDB" w:sz="4"/>
+              <w:left w:val="single" w:color="C9CEDB" w:sz="4"/>
+              <w:bottom w:val="single" w:color="C9CEDB" w:sz="4"/>
+              <w:right w:val="single" w:color="C9CEDB" w:sz="4"/>
+            </w:tcBorders>
+            <w:tcMar>
+              <w:top w:type="dxa" w:w="70"/>
+              <w:left w:type="dxa" w:w="110"/>
+              <w:bottom w:type="dxa" w:w="70"/>
+              <w:right w:type="dxa" w:w="110"/>
+            </w:tcMar>
+          </w:tcPr>
+          <w:p>
+            <w:pPr>
+              <w:spacing w:after="0" w:line="270"/>
+            </w:pPr>
+            <w:r>
+              <w:rPr>
+                <w:rFonts w:ascii="Calibri" w:cs="Calibri" w:eastAsia="Calibri" w:hAnsi="Calibri"/>
+                <w:b w:val="false"/>
+                <w:bCs w:val="false"/>
+                <w:sz w:val="20"/>
+                <w:szCs w:val="20"/>
+              </w:rPr>
+              <w:t xml:space="preserve"/>
+            </w:r>
+            <w:r>
+              <w:rPr>
+                <w:rFonts w:ascii="Calibri" w:cs="Calibri" w:eastAsia="Calibri" w:hAnsi="Calibri"/>
+                <w:b/>
+                <w:bCs/>
+                <w:sz w:val="20"/>
+                <w:szCs w:val="20"/>
+              </w:rPr>
+              <w:t xml:space="preserve">Raporlar</w:t>
+            </w:r>
+            <w:r>
+              <w:rPr>
+                <w:rFonts w:ascii="Calibri" w:cs="Calibri" w:eastAsia="Calibri" w:hAnsi="Calibri"/>
+                <w:b w:val="false"/>
+                <w:bCs w:val="false"/>
+                <w:sz w:val="20"/>
+                <w:szCs w:val="20"/>
+              </w:rPr>
+              <w:t xml:space="preserve">: Burndown ve Velocity</w:t>
+            </w:r>
+          </w:p>
+        </w:tc>
+        <w:tc>
+          <w:tcPr>
+            <w:tcW w:type="dxa" w:w="3759"/>
+            <w:tcBorders>
+              <w:top w:val="single" w:color="C9CEDB" w:sz="4"/>
+              <w:left w:val="single" w:color="C9CEDB" w:sz="4"/>
+              <w:bottom w:val="single" w:color="C9CEDB" w:sz="4"/>
+              <w:right w:val="single" w:color="C9CEDB" w:sz="4"/>
+            </w:tcBorders>
+            <w:tcMar>
+              <w:top w:type="dxa" w:w="70"/>
+              <w:left w:type="dxa" w:w="110"/>
+              <w:bottom w:type="dxa" w:w="70"/>
+              <w:right w:type="dxa" w:w="110"/>
+            </w:tcMar>
+          </w:tcPr>
+          <w:p>
+            <w:pPr>
+              <w:spacing w:after="0" w:line="270"/>
+            </w:pPr>
+            <w:r>
+              <w:rPr>
+                <w:rFonts w:ascii="Calibri" w:cs="Calibri" w:eastAsia="Calibri" w:hAnsi="Calibri"/>
+                <w:b w:val="false"/>
+                <w:bCs w:val="false"/>
+                <w:sz w:val="20"/>
+                <w:szCs w:val="20"/>
+              </w:rPr>
+              <w:t xml:space="preserve">Sprint zamanında biter mi, ekip ne kadar iş çıkarıyor: grafikte görünür.</w:t>
+            </w:r>
+          </w:p>
+        </w:tc>
+      </w:tr>
+      <w:tr>
+        <w:trPr>
+          <w:cantSplit/>
+        </w:trPr>
+        <w:tc>
+          <w:tcPr>
+            <w:tcW w:type="dxa" w:w="2120"/>
+            <w:tcBorders>
+              <w:top w:val="single" w:color="C9CEDB" w:sz="4"/>
+              <w:left w:val="single" w:color="C9CEDB" w:sz="4"/>
+              <w:bottom w:val="single" w:color="C9CEDB" w:sz="4"/>
+              <w:right w:val="single" w:color="C9CEDB" w:sz="4"/>
+            </w:tcBorders>
+            <w:shd w:fill="F4F5FA" w:color="auto" w:val="clear"/>
+            <w:tcMar>
+              <w:top w:type="dxa" w:w="70"/>
+              <w:left w:type="dxa" w:w="110"/>
+              <w:bottom w:type="dxa" w:w="70"/>
+              <w:right w:type="dxa" w:w="110"/>
+            </w:tcMar>
+          </w:tcPr>
+          <w:p>
+            <w:pPr>
+              <w:spacing w:after="0" w:line="270"/>
+            </w:pPr>
+            <w:r>
+              <w:rPr>
+                <w:rFonts w:ascii="Calibri" w:cs="Calibri" w:eastAsia="Calibri" w:hAnsi="Calibri"/>
+                <w:b/>
+                <w:bCs/>
+                <w:sz w:val="20"/>
+                <w:szCs w:val="20"/>
+              </w:rPr>
+              <w:t xml:space="preserve">10</w:t>
+            </w:r>
+          </w:p>
+        </w:tc>
+        <w:tc>
+          <w:tcPr>
+            <w:tcW w:type="dxa" w:w="3759"/>
+            <w:tcBorders>
+              <w:top w:val="single" w:color="C9CEDB" w:sz="4"/>
+              <w:left w:val="single" w:color="C9CEDB" w:sz="4"/>
+              <w:bottom w:val="single" w:color="C9CEDB" w:sz="4"/>
+              <w:right w:val="single" w:color="C9CEDB" w:sz="4"/>
+            </w:tcBorders>
+            <w:shd w:fill="F4F5FA" w:color="auto" w:val="clear"/>
+            <w:tcMar>
+              <w:top w:type="dxa" w:w="70"/>
+              <w:left w:type="dxa" w:w="110"/>
+              <w:bottom w:type="dxa" w:w="70"/>
+              <w:right w:type="dxa" w:w="110"/>
+            </w:tcMar>
+          </w:tcPr>
+          <w:p>
+            <w:pPr>
+              <w:spacing w:after="0" w:line="270"/>
+            </w:pPr>
+            <w:r>
+              <w:rPr>
+                <w:rFonts w:ascii="Calibri" w:cs="Calibri" w:eastAsia="Calibri" w:hAnsi="Calibri"/>
+                <w:b w:val="false"/>
+                <w:bCs w:val="false"/>
+                <w:sz w:val="20"/>
+                <w:szCs w:val="20"/>
+              </w:rPr>
+              <w:t xml:space="preserve">Bir Epic’te </w:t>
+            </w:r>
+            <w:r>
+              <w:rPr>
+                <w:rFonts w:ascii="Calibri" w:cs="Calibri" w:eastAsia="Calibri" w:hAnsi="Calibri"/>
+                <w:b/>
+                <w:bCs/>
+                <w:sz w:val="20"/>
+                <w:szCs w:val="20"/>
+              </w:rPr>
+              <w:t xml:space="preserve">Share</w:t>
+            </w:r>
+            <w:r>
+              <w:rPr>
+                <w:rFonts w:ascii="Calibri" w:cs="Calibri" w:eastAsia="Calibri" w:hAnsi="Calibri"/>
+                <w:b w:val="false"/>
+                <w:bCs w:val="false"/>
+                <w:sz w:val="20"/>
+                <w:szCs w:val="20"/>
+              </w:rPr>
+              <w:t xml:space="preserve">; Ayarlar → </w:t>
+            </w:r>
+            <w:r>
+              <w:rPr>
+                <w:rFonts w:ascii="Calibri" w:cs="Calibri" w:eastAsia="Calibri" w:hAnsi="Calibri"/>
+                <w:b/>
+                <w:bCs/>
+                <w:sz w:val="20"/>
+                <w:szCs w:val="20"/>
+              </w:rPr>
+              <w:t xml:space="preserve">Roles</w:t>
+            </w:r>
+            <w:r>
+              <w:rPr>
+                <w:rFonts w:ascii="Calibri" w:cs="Calibri" w:eastAsia="Calibri" w:hAnsi="Calibri"/>
+                <w:b w:val="false"/>
+                <w:bCs w:val="false"/>
+                <w:sz w:val="20"/>
+                <w:szCs w:val="20"/>
+              </w:rPr>
+              <w:t xml:space="preserve"/>
+            </w:r>
+          </w:p>
+        </w:tc>
+        <w:tc>
+          <w:tcPr>
+            <w:tcW w:type="dxa" w:w="3759"/>
+            <w:tcBorders>
+              <w:top w:val="single" w:color="C9CEDB" w:sz="4"/>
+              <w:left w:val="single" w:color="C9CEDB" w:sz="4"/>
+              <w:bottom w:val="single" w:color="C9CEDB" w:sz="4"/>
+              <w:right w:val="single" w:color="C9CEDB" w:sz="4"/>
+            </w:tcBorders>
+            <w:shd w:fill="F4F5FA" w:color="auto" w:val="clear"/>
+            <w:tcMar>
+              <w:top w:type="dxa" w:w="70"/>
+              <w:left w:type="dxa" w:w="110"/>
+              <w:bottom w:type="dxa" w:w="70"/>
+              <w:right w:type="dxa" w:w="110"/>
+            </w:tcMar>
+          </w:tcPr>
+          <w:p>
+            <w:pPr>
+              <w:spacing w:after="0" w:line="270"/>
+            </w:pPr>
+            <w:r>
+              <w:rPr>
+                <w:rFonts w:ascii="Calibri" w:cs="Calibri" w:eastAsia="Calibri" w:hAnsi="Calibri"/>
+                <w:b w:val="false"/>
+                <w:bCs w:val="false"/>
+                <w:sz w:val="20"/>
+                <w:szCs w:val="20"/>
+              </w:rPr>
+              <w:t xml:space="preserve">Kim neyi görür, neyi değiştirir: Proje’den tek bir işe kadar ayarlanır.</w:t>
+            </w:r>
+          </w:p>
+        </w:tc>
+      </w:tr>
+    </w:tbl>
+    <w:p>
+      <w:pPr>
+        <w:spacing w:after="160"/>
+      </w:pPr>
+    </w:p>
+    <w:tbl>
+      <w:tblPr>
+        <w:tblW w:type="dxa" w:w="9638"/>
+        <w:tblBorders>
+          <w:top w:val="single" w:color="auto" w:sz="4"/>
+          <w:left w:val="single" w:color="auto" w:sz="4"/>
+          <w:bottom w:val="single" w:color="auto" w:sz="4"/>
+          <w:right w:val="single" w:color="auto" w:sz="4"/>
+          <w:insideH w:val="single" w:color="auto" w:sz="4"/>
+          <w:insideV w:val="single" w:color="auto" w:sz="4"/>
+        </w:tblBorders>
+      </w:tblPr>
+      <w:tblGrid>
+        <w:gridCol w:w="9638"/>
+      </w:tblGrid>
+      <w:tr>
+        <w:trPr>
+          <w:cantSplit/>
+        </w:trPr>
+        <w:tc>
+          <w:tcPr>
+            <w:tcW w:type="dxa" w:w="9638"/>
+            <w:tcBorders>
+              <w:top w:val="none" w:color="FFFFFF" w:sz="0"/>
+              <w:left w:val="single" w:color="10B981" w:sz="24"/>
+              <w:bottom w:val="none" w:color="FFFFFF" w:sz="0"/>
+              <w:right w:val="none" w:color="FFFFFF" w:sz="0"/>
+            </w:tcBorders>
+            <w:shd w:fill="E7F7EE" w:color="auto" w:val="clear"/>
+            <w:tcMar>
+              <w:top w:type="dxa" w:w="100"/>
+              <w:left w:type="dxa" w:w="180"/>
+              <w:bottom w:type="dxa" w:w="100"/>
+              <w:right w:type="dxa" w:w="140"/>
+            </w:tcMar>
+          </w:tcPr>
+          <w:p>
+            <w:pPr>
+              <w:spacing w:after="0" w:line="290"/>
+            </w:pPr>
+            <w:r>
+              <w:rPr>
+                <w:rFonts w:ascii="Calibri" w:cs="Calibri" w:eastAsia="Calibri" w:hAnsi="Calibri"/>
+                <w:b/>
+                <w:bCs/>
+                <w:sz w:val="22"/>
+                <w:szCs w:val="22"/>
+              </w:rPr>
+              <w:t xml:space="preserve">İpucu: </w:t>
+            </w:r>
+            <w:r>
+              <w:rPr>
+                <w:rFonts w:ascii="Calibri" w:cs="Calibri" w:eastAsia="Calibri" w:hAnsi="Calibri"/>
+                <w:sz w:val="22"/>
+                <w:szCs w:val="22"/>
+              </w:rPr>
+              <w:t xml:space="preserve">Sunumdan önce bir Proje, birkaç Task ve bir Sprint hazırla. Sıfırdan yazmak zaman alır; hazır veriyle 5 dakikada bitirirsin. Sürükleme ve Bugs adımları en çok ilgi çekenlerdir, onlara zaman ayır.</w:t>
             </w:r>
           </w:p>
         </w:tc>
@@ -2049,6 +2778,1921 @@
         <w:spacing w:after="200"/>
       </w:pPr>
     </w:p>
+    <w:p>
+      <w:pPr>
+        <w:spacing w:after="140" w:line="300"/>
+      </w:pPr>
+      <w:r>
+        <w:rPr>
+          <w:rFonts w:ascii="Calibri" w:cs="Calibri" w:eastAsia="Calibri" w:hAnsi="Calibri"/>
+          <w:sz w:val="22"/>
+          <w:szCs w:val="22"/>
+        </w:rPr>
+        <w:t xml:space="preserve"/>
+      </w:r>
+      <w:r>
+        <w:rPr>
+          <w:rFonts w:ascii="Calibri" w:cs="Calibri" w:eastAsia="Calibri" w:hAnsi="Calibri"/>
+          <w:b/>
+          <w:bCs/>
+          <w:sz w:val="22"/>
+          <w:szCs w:val="22"/>
+        </w:rPr>
+        <w:t xml:space="preserve">Sık sorulacak sorular</w:t>
+      </w:r>
+      <w:r>
+        <w:rPr>
+          <w:rFonts w:ascii="Calibri" w:cs="Calibri" w:eastAsia="Calibri" w:hAnsi="Calibri"/>
+          <w:sz w:val="22"/>
+          <w:szCs w:val="22"/>
+        </w:rPr>
+        <w:t xml:space="preserve"/>
+      </w:r>
+    </w:p>
+    <w:p>
+      <w:pPr>
+        <w:pStyle w:val="ListParagraph"/>
+        <w:numPr>
+          <w:ilvl w:val="0"/>
+          <w:numId w:val="2"/>
+        </w:numPr>
+        <w:spacing w:after="80" w:line="290"/>
+      </w:pPr>
+      <w:r>
+        <w:rPr>
+          <w:rFonts w:ascii="Calibri" w:cs="Calibri" w:eastAsia="Calibri" w:hAnsi="Calibri"/>
+          <w:sz w:val="22"/>
+          <w:szCs w:val="22"/>
+        </w:rPr>
+        <w:t xml:space="preserve"/>
+      </w:r>
+      <w:r>
+        <w:rPr>
+          <w:rFonts w:ascii="Calibri" w:cs="Calibri" w:eastAsia="Calibri" w:hAnsi="Calibri"/>
+          <w:b/>
+          <w:bCs/>
+          <w:sz w:val="22"/>
+          <w:szCs w:val="22"/>
+        </w:rPr>
+        <w:t xml:space="preserve">Veriler nerede?</w:t>
+      </w:r>
+      <w:r>
+        <w:rPr>
+          <w:rFonts w:ascii="Calibri" w:cs="Calibri" w:eastAsia="Calibri" w:hAnsi="Calibri"/>
+          <w:sz w:val="22"/>
+          <w:szCs w:val="22"/>
+        </w:rPr>
+        <w:t xml:space="preserve"> Kurumun kendi sunucusunda (PostgreSQL). Günlük otomatik yedek alınır; bir Proje ayrıca yedekten geri yüklenebilir.</w:t>
+      </w:r>
+    </w:p>
+    <w:p>
+      <w:pPr>
+        <w:pStyle w:val="ListParagraph"/>
+        <w:numPr>
+          <w:ilvl w:val="0"/>
+          <w:numId w:val="2"/>
+        </w:numPr>
+        <w:spacing w:after="80" w:line="290"/>
+      </w:pPr>
+      <w:r>
+        <w:rPr>
+          <w:rFonts w:ascii="Calibri" w:cs="Calibri" w:eastAsia="Calibri" w:hAnsi="Calibri"/>
+          <w:sz w:val="22"/>
+          <w:szCs w:val="22"/>
+        </w:rPr>
+        <w:t xml:space="preserve"/>
+      </w:r>
+      <w:r>
+        <w:rPr>
+          <w:rFonts w:ascii="Calibri" w:cs="Calibri" w:eastAsia="Calibri" w:hAnsi="Calibri"/>
+          <w:b/>
+          <w:bCs/>
+          <w:sz w:val="22"/>
+          <w:szCs w:val="22"/>
+        </w:rPr>
+        <w:t xml:space="preserve">Kim neyi görür?</w:t>
+      </w:r>
+      <w:r>
+        <w:rPr>
+          <w:rFonts w:ascii="Calibri" w:cs="Calibri" w:eastAsia="Calibri" w:hAnsi="Calibri"/>
+          <w:sz w:val="22"/>
+          <w:szCs w:val="22"/>
+        </w:rPr>
+        <w:t xml:space="preserve"> Roller ve yetkiler Ayarlar → Roles’ten düzenlenir; özel bir Epic ya da Task “Private” yapılıp yalnızca seçilenlere açılabilir.</w:t>
+      </w:r>
+    </w:p>
+    <w:p>
+      <w:pPr>
+        <w:pStyle w:val="ListParagraph"/>
+        <w:numPr>
+          <w:ilvl w:val="0"/>
+          <w:numId w:val="2"/>
+        </w:numPr>
+        <w:spacing w:after="80" w:line="290"/>
+      </w:pPr>
+      <w:r>
+        <w:rPr>
+          <w:rFonts w:ascii="Calibri" w:cs="Calibri" w:eastAsia="Calibri" w:hAnsi="Calibri"/>
+          <w:sz w:val="22"/>
+          <w:szCs w:val="22"/>
+        </w:rPr>
+        <w:t xml:space="preserve"/>
+      </w:r>
+      <w:r>
+        <w:rPr>
+          <w:rFonts w:ascii="Calibri" w:cs="Calibri" w:eastAsia="Calibri" w:hAnsi="Calibri"/>
+          <w:b/>
+          <w:bCs/>
+          <w:sz w:val="22"/>
+          <w:szCs w:val="22"/>
+        </w:rPr>
+        <w:t xml:space="preserve">Dosya eklenir mi?</w:t>
+      </w:r>
+      <w:r>
+        <w:rPr>
+          <w:rFonts w:ascii="Calibri" w:cs="Calibri" w:eastAsia="Calibri" w:hAnsi="Calibri"/>
+          <w:sz w:val="22"/>
+          <w:szCs w:val="22"/>
+        </w:rPr>
+        <w:t xml:space="preserve"> Evet, Task ve Epic’e her türden dosya, 100 MB’a kadar.</w:t>
+      </w:r>
+    </w:p>
+    <w:p>
+      <w:pPr>
+        <w:pStyle w:val="ListParagraph"/>
+        <w:numPr>
+          <w:ilvl w:val="0"/>
+          <w:numId w:val="2"/>
+        </w:numPr>
+        <w:spacing w:after="80" w:line="290"/>
+      </w:pPr>
+      <w:r>
+        <w:rPr>
+          <w:rFonts w:ascii="Calibri" w:cs="Calibri" w:eastAsia="Calibri" w:hAnsi="Calibri"/>
+          <w:sz w:val="22"/>
+          <w:szCs w:val="22"/>
+        </w:rPr>
+        <w:t xml:space="preserve"/>
+      </w:r>
+      <w:r>
+        <w:rPr>
+          <w:rFonts w:ascii="Calibri" w:cs="Calibri" w:eastAsia="Calibri" w:hAnsi="Calibri"/>
+          <w:b/>
+          <w:bCs/>
+          <w:sz w:val="22"/>
+          <w:szCs w:val="22"/>
+        </w:rPr>
+        <w:t xml:space="preserve">Bildirim var mı?</w:t>
+      </w:r>
+      <w:r>
+        <w:rPr>
+          <w:rFonts w:ascii="Calibri" w:cs="Calibri" w:eastAsia="Calibri" w:hAnsi="Calibri"/>
+          <w:sz w:val="22"/>
+          <w:szCs w:val="22"/>
+        </w:rPr>
+        <w:t xml:space="preserve"> Evet: uygulama içinde ve e-postayla (atama, yorum, durum, Bug). E-posta ayarı Ayarlar → Genel’den girilir.</w:t>
+      </w:r>
+    </w:p>
+    <w:p>
+      <w:pPr>
+        <w:pStyle w:val="ListParagraph"/>
+        <w:numPr>
+          <w:ilvl w:val="0"/>
+          <w:numId w:val="2"/>
+        </w:numPr>
+        <w:spacing w:after="80" w:line="290"/>
+      </w:pPr>
+      <w:r>
+        <w:rPr>
+          <w:rFonts w:ascii="Calibri" w:cs="Calibri" w:eastAsia="Calibri" w:hAnsi="Calibri"/>
+          <w:sz w:val="22"/>
+          <w:szCs w:val="22"/>
+        </w:rPr>
+        <w:t xml:space="preserve"/>
+      </w:r>
+      <w:r>
+        <w:rPr>
+          <w:rFonts w:ascii="Calibri" w:cs="Calibri" w:eastAsia="Calibri" w:hAnsi="Calibri"/>
+          <w:b/>
+          <w:bCs/>
+          <w:sz w:val="22"/>
+          <w:szCs w:val="22"/>
+        </w:rPr>
+        <w:t xml:space="preserve">Başka araçla farkı?</w:t>
+      </w:r>
+      <w:r>
+        <w:rPr>
+          <w:rFonts w:ascii="Calibri" w:cs="Calibri" w:eastAsia="Calibri" w:hAnsi="Calibri"/>
+          <w:sz w:val="22"/>
+          <w:szCs w:val="22"/>
+        </w:rPr>
+        <w:t xml:space="preserve"> Scrum (Sprint, Backlog, Burndown) ve Kanban bir arada; Türkçe; kendi sunucunda.</w:t>
+      </w:r>
+    </w:p>
+    <w:p>
+      <w:pPr>
+        <w:spacing w:after="100"/>
+      </w:pPr>
+    </w:p>
+    <w:p>
+      <w:pPr>
+        <w:pStyle w:val="Heading1"/>
+        <w:keepNext/>
+      </w:pPr>
+      <w:r>
+        <w:rPr>
+          <w:rFonts w:ascii="Calibri" w:cs="Calibri" w:eastAsia="Calibri" w:hAnsi="Calibri"/>
+          <w:b/>
+          <w:bCs/>
+          <w:color w:val="3B2A9E"/>
+          <w:sz w:val="34"/>
+          <w:szCs w:val="34"/>
+        </w:rPr>
+        <w:t xml:space="preserve">Başlamadan önce: temel kavramlar</w:t>
+      </w:r>
+    </w:p>
+    <w:p>
+      <w:pPr>
+        <w:spacing w:after="140" w:line="300"/>
+      </w:pPr>
+      <w:r>
+        <w:rPr>
+          <w:rFonts w:ascii="Calibri" w:cs="Calibri" w:eastAsia="Calibri" w:hAnsi="Calibri"/>
+          <w:sz w:val="22"/>
+          <w:szCs w:val="22"/>
+        </w:rPr>
+        <w:t xml:space="preserve">Seyir, ekibin işlerini planladığı ve takip ettiği bir proje yönetimi uygulamasıdır. Bu kılavuz hiç kullanmamış biri için yazıldı: her adımda ekranın neresine bakacağını, kırmızı </w:t>
+      </w:r>
+      <w:r>
+        <w:rPr>
+          <w:rFonts w:ascii="Calibri" w:cs="Calibri" w:eastAsia="Calibri" w:hAnsi="Calibri"/>
+          <w:b/>
+          <w:bCs/>
+          <w:sz w:val="22"/>
+          <w:szCs w:val="22"/>
+        </w:rPr>
+        <w:t xml:space="preserve">numaralı işaretlerle</w:t>
+      </w:r>
+      <w:r>
+        <w:rPr>
+          <w:rFonts w:ascii="Calibri" w:cs="Calibri" w:eastAsia="Calibri" w:hAnsi="Calibri"/>
+          <w:sz w:val="22"/>
+          <w:szCs w:val="22"/>
+        </w:rPr>
+        <w:t xml:space="preserve"> gösteriyoruz. Görseldeki numara, görselin altındaki listeyle birebir eşleşir.</w:t>
+      </w:r>
+    </w:p>
+    <w:p>
+      <w:pPr>
+        <w:spacing w:after="140" w:line="300"/>
+      </w:pPr>
+      <w:r>
+        <w:rPr>
+          <w:rFonts w:ascii="Calibri" w:cs="Calibri" w:eastAsia="Calibri" w:hAnsi="Calibri"/>
+          <w:sz w:val="22"/>
+          <w:szCs w:val="22"/>
+        </w:rPr>
+        <w:t xml:space="preserve">Önce şu kelimeleri bilmek yeterli (Seyir'de bunların İngilizce adları kullanılır):</w:t>
+      </w:r>
+    </w:p>
+    <w:tbl>
+      <w:tblPr>
+        <w:tblW w:type="dxa" w:w="9638"/>
+        <w:tblBorders>
+          <w:top w:val="single" w:color="auto" w:sz="4"/>
+          <w:left w:val="single" w:color="auto" w:sz="4"/>
+          <w:bottom w:val="single" w:color="auto" w:sz="4"/>
+          <w:right w:val="single" w:color="auto" w:sz="4"/>
+          <w:insideH w:val="single" w:color="auto" w:sz="4"/>
+          <w:insideV w:val="single" w:color="auto" w:sz="4"/>
+        </w:tblBorders>
+      </w:tblPr>
+      <w:tblGrid>
+        <w:gridCol w:w="2120"/>
+        <w:gridCol w:w="3759"/>
+        <w:gridCol w:w="3759"/>
+      </w:tblGrid>
+      <w:tr>
+        <w:trPr>
+          <w:cantSplit/>
+          <w:tblHeader/>
+        </w:trPr>
+        <w:tc>
+          <w:tcPr>
+            <w:tcW w:type="dxa" w:w="2120"/>
+            <w:tcBorders>
+              <w:top w:val="single" w:color="C9CEDB" w:sz="4"/>
+              <w:left w:val="single" w:color="C9CEDB" w:sz="4"/>
+              <w:bottom w:val="single" w:color="C9CEDB" w:sz="4"/>
+              <w:right w:val="single" w:color="C9CEDB" w:sz="4"/>
+            </w:tcBorders>
+            <w:shd w:fill="5B3FD1" w:color="auto" w:val="clear"/>
+            <w:tcMar>
+              <w:top w:type="dxa" w:w="70"/>
+              <w:left w:type="dxa" w:w="110"/>
+              <w:bottom w:type="dxa" w:w="70"/>
+              <w:right w:type="dxa" w:w="110"/>
+            </w:tcMar>
+          </w:tcPr>
+          <w:p>
+            <w:pPr>
+              <w:spacing w:after="0" w:line="270"/>
+            </w:pPr>
+            <w:r>
+              <w:rPr>
+                <w:rFonts w:ascii="Calibri" w:cs="Calibri" w:eastAsia="Calibri" w:hAnsi="Calibri"/>
+                <w:b/>
+                <w:bCs/>
+                <w:color w:val="FFFFFF"/>
+                <w:sz w:val="20"/>
+                <w:szCs w:val="20"/>
+              </w:rPr>
+              <w:t xml:space="preserve">Kavram</w:t>
+            </w:r>
+          </w:p>
+        </w:tc>
+        <w:tc>
+          <w:tcPr>
+            <w:tcW w:type="dxa" w:w="3759"/>
+            <w:tcBorders>
+              <w:top w:val="single" w:color="C9CEDB" w:sz="4"/>
+              <w:left w:val="single" w:color="C9CEDB" w:sz="4"/>
+              <w:bottom w:val="single" w:color="C9CEDB" w:sz="4"/>
+              <w:right w:val="single" w:color="C9CEDB" w:sz="4"/>
+            </w:tcBorders>
+            <w:shd w:fill="5B3FD1" w:color="auto" w:val="clear"/>
+            <w:tcMar>
+              <w:top w:type="dxa" w:w="70"/>
+              <w:left w:type="dxa" w:w="110"/>
+              <w:bottom w:type="dxa" w:w="70"/>
+              <w:right w:type="dxa" w:w="110"/>
+            </w:tcMar>
+          </w:tcPr>
+          <w:p>
+            <w:pPr>
+              <w:spacing w:after="0" w:line="270"/>
+            </w:pPr>
+            <w:r>
+              <w:rPr>
+                <w:rFonts w:ascii="Calibri" w:cs="Calibri" w:eastAsia="Calibri" w:hAnsi="Calibri"/>
+                <w:b/>
+                <w:bCs/>
+                <w:color w:val="FFFFFF"/>
+                <w:sz w:val="20"/>
+                <w:szCs w:val="20"/>
+              </w:rPr>
+              <w:t xml:space="preserve">Ne demek?</w:t>
+            </w:r>
+          </w:p>
+        </w:tc>
+        <w:tc>
+          <w:tcPr>
+            <w:tcW w:type="dxa" w:w="3759"/>
+            <w:tcBorders>
+              <w:top w:val="single" w:color="C9CEDB" w:sz="4"/>
+              <w:left w:val="single" w:color="C9CEDB" w:sz="4"/>
+              <w:bottom w:val="single" w:color="C9CEDB" w:sz="4"/>
+              <w:right w:val="single" w:color="C9CEDB" w:sz="4"/>
+            </w:tcBorders>
+            <w:shd w:fill="5B3FD1" w:color="auto" w:val="clear"/>
+            <w:tcMar>
+              <w:top w:type="dxa" w:w="70"/>
+              <w:left w:type="dxa" w:w="110"/>
+              <w:bottom w:type="dxa" w:w="70"/>
+              <w:right w:type="dxa" w:w="110"/>
+            </w:tcMar>
+          </w:tcPr>
+          <w:p>
+            <w:pPr>
+              <w:spacing w:after="0" w:line="270"/>
+            </w:pPr>
+            <w:r>
+              <w:rPr>
+                <w:rFonts w:ascii="Calibri" w:cs="Calibri" w:eastAsia="Calibri" w:hAnsi="Calibri"/>
+                <w:b/>
+                <w:bCs/>
+                <w:color w:val="FFFFFF"/>
+                <w:sz w:val="20"/>
+                <w:szCs w:val="20"/>
+              </w:rPr>
+              <w:t xml:space="preserve">Örnek</w:t>
+            </w:r>
+          </w:p>
+        </w:tc>
+      </w:tr>
+      <w:tr>
+        <w:trPr>
+          <w:cantSplit/>
+        </w:trPr>
+        <w:tc>
+          <w:tcPr>
+            <w:tcW w:type="dxa" w:w="2120"/>
+            <w:tcBorders>
+              <w:top w:val="single" w:color="C9CEDB" w:sz="4"/>
+              <w:left w:val="single" w:color="C9CEDB" w:sz="4"/>
+              <w:bottom w:val="single" w:color="C9CEDB" w:sz="4"/>
+              <w:right w:val="single" w:color="C9CEDB" w:sz="4"/>
+            </w:tcBorders>
+            <w:tcMar>
+              <w:top w:type="dxa" w:w="70"/>
+              <w:left w:type="dxa" w:w="110"/>
+              <w:bottom w:type="dxa" w:w="70"/>
+              <w:right w:type="dxa" w:w="110"/>
+            </w:tcMar>
+          </w:tcPr>
+          <w:p>
+            <w:pPr>
+              <w:spacing w:after="0" w:line="270"/>
+            </w:pPr>
+            <w:r>
+              <w:rPr>
+                <w:rFonts w:ascii="Calibri" w:cs="Calibri" w:eastAsia="Calibri" w:hAnsi="Calibri"/>
+                <w:b/>
+                <w:bCs/>
+                <w:sz w:val="20"/>
+                <w:szCs w:val="20"/>
+              </w:rPr>
+              <w:t xml:space="preserve">Proje</w:t>
+            </w:r>
+          </w:p>
+        </w:tc>
+        <w:tc>
+          <w:tcPr>
+            <w:tcW w:type="dxa" w:w="3759"/>
+            <w:tcBorders>
+              <w:top w:val="single" w:color="C9CEDB" w:sz="4"/>
+              <w:left w:val="single" w:color="C9CEDB" w:sz="4"/>
+              <w:bottom w:val="single" w:color="C9CEDB" w:sz="4"/>
+              <w:right w:val="single" w:color="C9CEDB" w:sz="4"/>
+            </w:tcBorders>
+            <w:tcMar>
+              <w:top w:type="dxa" w:w="70"/>
+              <w:left w:type="dxa" w:w="110"/>
+              <w:bottom w:type="dxa" w:w="70"/>
+              <w:right w:type="dxa" w:w="110"/>
+            </w:tcMar>
+          </w:tcPr>
+          <w:p>
+            <w:pPr>
+              <w:spacing w:after="0" w:line="270"/>
+            </w:pPr>
+            <w:r>
+              <w:rPr>
+                <w:rFonts w:ascii="Calibri" w:cs="Calibri" w:eastAsia="Calibri" w:hAnsi="Calibri"/>
+                <w:b w:val="false"/>
+                <w:bCs w:val="false"/>
+                <w:sz w:val="20"/>
+                <w:szCs w:val="20"/>
+              </w:rPr>
+              <w:t xml:space="preserve">Bir ürün veya ekip için ayrılmış çalışma alanı. Bütün işler bir Proje içinde tutulur.</w:t>
+            </w:r>
+          </w:p>
+        </w:tc>
+        <w:tc>
+          <w:tcPr>
+            <w:tcW w:type="dxa" w:w="3759"/>
+            <w:tcBorders>
+              <w:top w:val="single" w:color="C9CEDB" w:sz="4"/>
+              <w:left w:val="single" w:color="C9CEDB" w:sz="4"/>
+              <w:bottom w:val="single" w:color="C9CEDB" w:sz="4"/>
+              <w:right w:val="single" w:color="C9CEDB" w:sz="4"/>
+            </w:tcBorders>
+            <w:tcMar>
+              <w:top w:type="dxa" w:w="70"/>
+              <w:left w:type="dxa" w:w="110"/>
+              <w:bottom w:type="dxa" w:w="70"/>
+              <w:right w:type="dxa" w:w="110"/>
+            </w:tcMar>
+          </w:tcPr>
+          <w:p>
+            <w:pPr>
+              <w:spacing w:after="0" w:line="270"/>
+            </w:pPr>
+            <w:r>
+              <w:rPr>
+                <w:rFonts w:ascii="Calibri" w:cs="Calibri" w:eastAsia="Calibri" w:hAnsi="Calibri"/>
+                <w:b w:val="false"/>
+                <w:bCs w:val="false"/>
+                <w:sz w:val="20"/>
+                <w:szCs w:val="20"/>
+              </w:rPr>
+              <w:t xml:space="preserve">Mobil Uygulama</w:t>
+            </w:r>
+          </w:p>
+        </w:tc>
+      </w:tr>
+      <w:tr>
+        <w:trPr>
+          <w:cantSplit/>
+        </w:trPr>
+        <w:tc>
+          <w:tcPr>
+            <w:tcW w:type="dxa" w:w="2120"/>
+            <w:tcBorders>
+              <w:top w:val="single" w:color="C9CEDB" w:sz="4"/>
+              <w:left w:val="single" w:color="C9CEDB" w:sz="4"/>
+              <w:bottom w:val="single" w:color="C9CEDB" w:sz="4"/>
+              <w:right w:val="single" w:color="C9CEDB" w:sz="4"/>
+            </w:tcBorders>
+            <w:shd w:fill="F4F5FA" w:color="auto" w:val="clear"/>
+            <w:tcMar>
+              <w:top w:type="dxa" w:w="70"/>
+              <w:left w:type="dxa" w:w="110"/>
+              <w:bottom w:type="dxa" w:w="70"/>
+              <w:right w:type="dxa" w:w="110"/>
+            </w:tcMar>
+          </w:tcPr>
+          <w:p>
+            <w:pPr>
+              <w:spacing w:after="0" w:line="270"/>
+            </w:pPr>
+            <w:r>
+              <w:rPr>
+                <w:rFonts w:ascii="Calibri" w:cs="Calibri" w:eastAsia="Calibri" w:hAnsi="Calibri"/>
+                <w:b/>
+                <w:bCs/>
+                <w:sz w:val="20"/>
+                <w:szCs w:val="20"/>
+              </w:rPr>
+              <w:t xml:space="preserve">Epic</w:t>
+            </w:r>
+          </w:p>
+        </w:tc>
+        <w:tc>
+          <w:tcPr>
+            <w:tcW w:type="dxa" w:w="3759"/>
+            <w:tcBorders>
+              <w:top w:val="single" w:color="C9CEDB" w:sz="4"/>
+              <w:left w:val="single" w:color="C9CEDB" w:sz="4"/>
+              <w:bottom w:val="single" w:color="C9CEDB" w:sz="4"/>
+              <w:right w:val="single" w:color="C9CEDB" w:sz="4"/>
+            </w:tcBorders>
+            <w:shd w:fill="F4F5FA" w:color="auto" w:val="clear"/>
+            <w:tcMar>
+              <w:top w:type="dxa" w:w="70"/>
+              <w:left w:type="dxa" w:w="110"/>
+              <w:bottom w:type="dxa" w:w="70"/>
+              <w:right w:type="dxa" w:w="110"/>
+            </w:tcMar>
+          </w:tcPr>
+          <w:p>
+            <w:pPr>
+              <w:spacing w:after="0" w:line="270"/>
+            </w:pPr>
+            <w:r>
+              <w:rPr>
+                <w:rFonts w:ascii="Calibri" w:cs="Calibri" w:eastAsia="Calibri" w:hAnsi="Calibri"/>
+                <w:b w:val="false"/>
+                <w:bCs w:val="false"/>
+                <w:sz w:val="20"/>
+                <w:szCs w:val="20"/>
+              </w:rPr>
+              <w:t xml:space="preserve">Birçok Task'ı çatısı altında toplayan büyük hedef. İsteğe bağlıdır.</w:t>
+            </w:r>
+          </w:p>
+        </w:tc>
+        <w:tc>
+          <w:tcPr>
+            <w:tcW w:type="dxa" w:w="3759"/>
+            <w:tcBorders>
+              <w:top w:val="single" w:color="C9CEDB" w:sz="4"/>
+              <w:left w:val="single" w:color="C9CEDB" w:sz="4"/>
+              <w:bottom w:val="single" w:color="C9CEDB" w:sz="4"/>
+              <w:right w:val="single" w:color="C9CEDB" w:sz="4"/>
+            </w:tcBorders>
+            <w:shd w:fill="F4F5FA" w:color="auto" w:val="clear"/>
+            <w:tcMar>
+              <w:top w:type="dxa" w:w="70"/>
+              <w:left w:type="dxa" w:w="110"/>
+              <w:bottom w:type="dxa" w:w="70"/>
+              <w:right w:type="dxa" w:w="110"/>
+            </w:tcMar>
+          </w:tcPr>
+          <w:p>
+            <w:pPr>
+              <w:spacing w:after="0" w:line="270"/>
+            </w:pPr>
+            <w:r>
+              <w:rPr>
+                <w:rFonts w:ascii="Calibri" w:cs="Calibri" w:eastAsia="Calibri" w:hAnsi="Calibri"/>
+                <w:b w:val="false"/>
+                <w:bCs w:val="false"/>
+                <w:sz w:val="20"/>
+                <w:szCs w:val="20"/>
+              </w:rPr>
+              <w:t xml:space="preserve">Kullanıcı hesabı yönetimi</w:t>
+            </w:r>
+          </w:p>
+        </w:tc>
+      </w:tr>
+      <w:tr>
+        <w:trPr>
+          <w:cantSplit/>
+        </w:trPr>
+        <w:tc>
+          <w:tcPr>
+            <w:tcW w:type="dxa" w:w="2120"/>
+            <w:tcBorders>
+              <w:top w:val="single" w:color="C9CEDB" w:sz="4"/>
+              <w:left w:val="single" w:color="C9CEDB" w:sz="4"/>
+              <w:bottom w:val="single" w:color="C9CEDB" w:sz="4"/>
+              <w:right w:val="single" w:color="C9CEDB" w:sz="4"/>
+            </w:tcBorders>
+            <w:tcMar>
+              <w:top w:type="dxa" w:w="70"/>
+              <w:left w:type="dxa" w:w="110"/>
+              <w:bottom w:type="dxa" w:w="70"/>
+              <w:right w:type="dxa" w:w="110"/>
+            </w:tcMar>
+          </w:tcPr>
+          <w:p>
+            <w:pPr>
+              <w:spacing w:after="0" w:line="270"/>
+            </w:pPr>
+            <w:r>
+              <w:rPr>
+                <w:rFonts w:ascii="Calibri" w:cs="Calibri" w:eastAsia="Calibri" w:hAnsi="Calibri"/>
+                <w:b/>
+                <w:bCs/>
+                <w:sz w:val="20"/>
+                <w:szCs w:val="20"/>
+              </w:rPr>
+              <w:t xml:space="preserve">Task</w:t>
+            </w:r>
+          </w:p>
+        </w:tc>
+        <w:tc>
+          <w:tcPr>
+            <w:tcW w:type="dxa" w:w="3759"/>
+            <w:tcBorders>
+              <w:top w:val="single" w:color="C9CEDB" w:sz="4"/>
+              <w:left w:val="single" w:color="C9CEDB" w:sz="4"/>
+              <w:bottom w:val="single" w:color="C9CEDB" w:sz="4"/>
+              <w:right w:val="single" w:color="C9CEDB" w:sz="4"/>
+            </w:tcBorders>
+            <w:tcMar>
+              <w:top w:type="dxa" w:w="70"/>
+              <w:left w:type="dxa" w:w="110"/>
+              <w:bottom w:type="dxa" w:w="70"/>
+              <w:right w:type="dxa" w:w="110"/>
+            </w:tcMar>
+          </w:tcPr>
+          <w:p>
+            <w:pPr>
+              <w:spacing w:after="0" w:line="270"/>
+            </w:pPr>
+            <w:r>
+              <w:rPr>
+                <w:rFonts w:ascii="Calibri" w:cs="Calibri" w:eastAsia="Calibri" w:hAnsi="Calibri"/>
+                <w:b w:val="false"/>
+                <w:bCs w:val="false"/>
+                <w:sz w:val="20"/>
+                <w:szCs w:val="20"/>
+              </w:rPr>
+              <w:t xml:space="preserve">Yapılacak tek bir iş. Başlığı, sahibi, tarihi ve puanı vardır.</w:t>
+            </w:r>
+          </w:p>
+        </w:tc>
+        <w:tc>
+          <w:tcPr>
+            <w:tcW w:type="dxa" w:w="3759"/>
+            <w:tcBorders>
+              <w:top w:val="single" w:color="C9CEDB" w:sz="4"/>
+              <w:left w:val="single" w:color="C9CEDB" w:sz="4"/>
+              <w:bottom w:val="single" w:color="C9CEDB" w:sz="4"/>
+              <w:right w:val="single" w:color="C9CEDB" w:sz="4"/>
+            </w:tcBorders>
+            <w:tcMar>
+              <w:top w:type="dxa" w:w="70"/>
+              <w:left w:type="dxa" w:w="110"/>
+              <w:bottom w:type="dxa" w:w="70"/>
+              <w:right w:type="dxa" w:w="110"/>
+            </w:tcMar>
+          </w:tcPr>
+          <w:p>
+            <w:pPr>
+              <w:spacing w:after="0" w:line="270"/>
+            </w:pPr>
+            <w:r>
+              <w:rPr>
+                <w:rFonts w:ascii="Calibri" w:cs="Calibri" w:eastAsia="Calibri" w:hAnsi="Calibri"/>
+                <w:b w:val="false"/>
+                <w:bCs w:val="false"/>
+                <w:sz w:val="20"/>
+                <w:szCs w:val="20"/>
+              </w:rPr>
+              <w:t xml:space="preserve">Giriş ekranını tasarla</w:t>
+            </w:r>
+          </w:p>
+        </w:tc>
+      </w:tr>
+      <w:tr>
+        <w:trPr>
+          <w:cantSplit/>
+        </w:trPr>
+        <w:tc>
+          <w:tcPr>
+            <w:tcW w:type="dxa" w:w="2120"/>
+            <w:tcBorders>
+              <w:top w:val="single" w:color="C9CEDB" w:sz="4"/>
+              <w:left w:val="single" w:color="C9CEDB" w:sz="4"/>
+              <w:bottom w:val="single" w:color="C9CEDB" w:sz="4"/>
+              <w:right w:val="single" w:color="C9CEDB" w:sz="4"/>
+            </w:tcBorders>
+            <w:shd w:fill="F4F5FA" w:color="auto" w:val="clear"/>
+            <w:tcMar>
+              <w:top w:type="dxa" w:w="70"/>
+              <w:left w:type="dxa" w:w="110"/>
+              <w:bottom w:type="dxa" w:w="70"/>
+              <w:right w:type="dxa" w:w="110"/>
+            </w:tcMar>
+          </w:tcPr>
+          <w:p>
+            <w:pPr>
+              <w:spacing w:after="0" w:line="270"/>
+            </w:pPr>
+            <w:r>
+              <w:rPr>
+                <w:rFonts w:ascii="Calibri" w:cs="Calibri" w:eastAsia="Calibri" w:hAnsi="Calibri"/>
+                <w:b/>
+                <w:bCs/>
+                <w:sz w:val="20"/>
+                <w:szCs w:val="20"/>
+              </w:rPr>
+              <w:t xml:space="preserve">Sub-Task</w:t>
+            </w:r>
+          </w:p>
+        </w:tc>
+        <w:tc>
+          <w:tcPr>
+            <w:tcW w:type="dxa" w:w="3759"/>
+            <w:tcBorders>
+              <w:top w:val="single" w:color="C9CEDB" w:sz="4"/>
+              <w:left w:val="single" w:color="C9CEDB" w:sz="4"/>
+              <w:bottom w:val="single" w:color="C9CEDB" w:sz="4"/>
+              <w:right w:val="single" w:color="C9CEDB" w:sz="4"/>
+            </w:tcBorders>
+            <w:shd w:fill="F4F5FA" w:color="auto" w:val="clear"/>
+            <w:tcMar>
+              <w:top w:type="dxa" w:w="70"/>
+              <w:left w:type="dxa" w:w="110"/>
+              <w:bottom w:type="dxa" w:w="70"/>
+              <w:right w:type="dxa" w:w="110"/>
+            </w:tcMar>
+          </w:tcPr>
+          <w:p>
+            <w:pPr>
+              <w:spacing w:after="0" w:line="270"/>
+            </w:pPr>
+            <w:r>
+              <w:rPr>
+                <w:rFonts w:ascii="Calibri" w:cs="Calibri" w:eastAsia="Calibri" w:hAnsi="Calibri"/>
+                <w:b w:val="false"/>
+                <w:bCs w:val="false"/>
+                <w:sz w:val="20"/>
+                <w:szCs w:val="20"/>
+              </w:rPr>
+              <w:t xml:space="preserve">Bir Task'ın küçük parçası. Tek başına var olamaz, her zaman bir üst Task'a bağlıdır.</w:t>
+            </w:r>
+          </w:p>
+        </w:tc>
+        <w:tc>
+          <w:tcPr>
+            <w:tcW w:type="dxa" w:w="3759"/>
+            <w:tcBorders>
+              <w:top w:val="single" w:color="C9CEDB" w:sz="4"/>
+              <w:left w:val="single" w:color="C9CEDB" w:sz="4"/>
+              <w:bottom w:val="single" w:color="C9CEDB" w:sz="4"/>
+              <w:right w:val="single" w:color="C9CEDB" w:sz="4"/>
+            </w:tcBorders>
+            <w:shd w:fill="F4F5FA" w:color="auto" w:val="clear"/>
+            <w:tcMar>
+              <w:top w:type="dxa" w:w="70"/>
+              <w:left w:type="dxa" w:w="110"/>
+              <w:bottom w:type="dxa" w:w="70"/>
+              <w:right w:type="dxa" w:w="110"/>
+            </w:tcMar>
+          </w:tcPr>
+          <w:p>
+            <w:pPr>
+              <w:spacing w:after="0" w:line="270"/>
+            </w:pPr>
+            <w:r>
+              <w:rPr>
+                <w:rFonts w:ascii="Calibri" w:cs="Calibri" w:eastAsia="Calibri" w:hAnsi="Calibri"/>
+                <w:b w:val="false"/>
+                <w:bCs w:val="false"/>
+                <w:sz w:val="20"/>
+                <w:szCs w:val="20"/>
+              </w:rPr>
+              <w:t xml:space="preserve">Form alanlarını çiz</w:t>
+            </w:r>
+          </w:p>
+        </w:tc>
+      </w:tr>
+      <w:tr>
+        <w:trPr>
+          <w:cantSplit/>
+        </w:trPr>
+        <w:tc>
+          <w:tcPr>
+            <w:tcW w:type="dxa" w:w="2120"/>
+            <w:tcBorders>
+              <w:top w:val="single" w:color="C9CEDB" w:sz="4"/>
+              <w:left w:val="single" w:color="C9CEDB" w:sz="4"/>
+              <w:bottom w:val="single" w:color="C9CEDB" w:sz="4"/>
+              <w:right w:val="single" w:color="C9CEDB" w:sz="4"/>
+            </w:tcBorders>
+            <w:tcMar>
+              <w:top w:type="dxa" w:w="70"/>
+              <w:left w:type="dxa" w:w="110"/>
+              <w:bottom w:type="dxa" w:w="70"/>
+              <w:right w:type="dxa" w:w="110"/>
+            </w:tcMar>
+          </w:tcPr>
+          <w:p>
+            <w:pPr>
+              <w:spacing w:after="0" w:line="270"/>
+            </w:pPr>
+            <w:r>
+              <w:rPr>
+                <w:rFonts w:ascii="Calibri" w:cs="Calibri" w:eastAsia="Calibri" w:hAnsi="Calibri"/>
+                <w:b/>
+                <w:bCs/>
+                <w:sz w:val="20"/>
+                <w:szCs w:val="20"/>
+              </w:rPr>
+              <w:t xml:space="preserve">Sprint</w:t>
+            </w:r>
+          </w:p>
+        </w:tc>
+        <w:tc>
+          <w:tcPr>
+            <w:tcW w:type="dxa" w:w="3759"/>
+            <w:tcBorders>
+              <w:top w:val="single" w:color="C9CEDB" w:sz="4"/>
+              <w:left w:val="single" w:color="C9CEDB" w:sz="4"/>
+              <w:bottom w:val="single" w:color="C9CEDB" w:sz="4"/>
+              <w:right w:val="single" w:color="C9CEDB" w:sz="4"/>
+            </w:tcBorders>
+            <w:tcMar>
+              <w:top w:type="dxa" w:w="70"/>
+              <w:left w:type="dxa" w:w="110"/>
+              <w:bottom w:type="dxa" w:w="70"/>
+              <w:right w:type="dxa" w:w="110"/>
+            </w:tcMar>
+          </w:tcPr>
+          <w:p>
+            <w:pPr>
+              <w:spacing w:after="0" w:line="270"/>
+            </w:pPr>
+            <w:r>
+              <w:rPr>
+                <w:rFonts w:ascii="Calibri" w:cs="Calibri" w:eastAsia="Calibri" w:hAnsi="Calibri"/>
+                <w:b w:val="false"/>
+                <w:bCs w:val="false"/>
+                <w:sz w:val="20"/>
+                <w:szCs w:val="20"/>
+              </w:rPr>
+              <w:t xml:space="preserve">Genellikle 1–2 hafta süren, hedefi ve tarihleri belli çalışma dönemi. Ekip o dönemde hangi işleri yapacağını seçer.</w:t>
+            </w:r>
+          </w:p>
+        </w:tc>
+        <w:tc>
+          <w:tcPr>
+            <w:tcW w:type="dxa" w:w="3759"/>
+            <w:tcBorders>
+              <w:top w:val="single" w:color="C9CEDB" w:sz="4"/>
+              <w:left w:val="single" w:color="C9CEDB" w:sz="4"/>
+              <w:bottom w:val="single" w:color="C9CEDB" w:sz="4"/>
+              <w:right w:val="single" w:color="C9CEDB" w:sz="4"/>
+            </w:tcBorders>
+            <w:tcMar>
+              <w:top w:type="dxa" w:w="70"/>
+              <w:left w:type="dxa" w:w="110"/>
+              <w:bottom w:type="dxa" w:w="70"/>
+              <w:right w:type="dxa" w:w="110"/>
+            </w:tcMar>
+          </w:tcPr>
+          <w:p>
+            <w:pPr>
+              <w:spacing w:after="0" w:line="270"/>
+            </w:pPr>
+            <w:r>
+              <w:rPr>
+                <w:rFonts w:ascii="Calibri" w:cs="Calibri" w:eastAsia="Calibri" w:hAnsi="Calibri"/>
+                <w:b w:val="false"/>
+                <w:bCs w:val="false"/>
+                <w:sz w:val="20"/>
+                <w:szCs w:val="20"/>
+              </w:rPr>
+              <w:t xml:space="preserve">Sprint 1 (15–28 Ekim)</w:t>
+            </w:r>
+          </w:p>
+        </w:tc>
+      </w:tr>
+      <w:tr>
+        <w:trPr>
+          <w:cantSplit/>
+        </w:trPr>
+        <w:tc>
+          <w:tcPr>
+            <w:tcW w:type="dxa" w:w="2120"/>
+            <w:tcBorders>
+              <w:top w:val="single" w:color="C9CEDB" w:sz="4"/>
+              <w:left w:val="single" w:color="C9CEDB" w:sz="4"/>
+              <w:bottom w:val="single" w:color="C9CEDB" w:sz="4"/>
+              <w:right w:val="single" w:color="C9CEDB" w:sz="4"/>
+            </w:tcBorders>
+            <w:shd w:fill="F4F5FA" w:color="auto" w:val="clear"/>
+            <w:tcMar>
+              <w:top w:type="dxa" w:w="70"/>
+              <w:left w:type="dxa" w:w="110"/>
+              <w:bottom w:type="dxa" w:w="70"/>
+              <w:right w:type="dxa" w:w="110"/>
+            </w:tcMar>
+          </w:tcPr>
+          <w:p>
+            <w:pPr>
+              <w:spacing w:after="0" w:line="270"/>
+            </w:pPr>
+            <w:r>
+              <w:rPr>
+                <w:rFonts w:ascii="Calibri" w:cs="Calibri" w:eastAsia="Calibri" w:hAnsi="Calibri"/>
+                <w:b/>
+                <w:bCs/>
+                <w:sz w:val="20"/>
+                <w:szCs w:val="20"/>
+              </w:rPr>
+              <w:t xml:space="preserve">Backlog</w:t>
+            </w:r>
+          </w:p>
+        </w:tc>
+        <w:tc>
+          <w:tcPr>
+            <w:tcW w:type="dxa" w:w="3759"/>
+            <w:tcBorders>
+              <w:top w:val="single" w:color="C9CEDB" w:sz="4"/>
+              <w:left w:val="single" w:color="C9CEDB" w:sz="4"/>
+              <w:bottom w:val="single" w:color="C9CEDB" w:sz="4"/>
+              <w:right w:val="single" w:color="C9CEDB" w:sz="4"/>
+            </w:tcBorders>
+            <w:shd w:fill="F4F5FA" w:color="auto" w:val="clear"/>
+            <w:tcMar>
+              <w:top w:type="dxa" w:w="70"/>
+              <w:left w:type="dxa" w:w="110"/>
+              <w:bottom w:type="dxa" w:w="70"/>
+              <w:right w:type="dxa" w:w="110"/>
+            </w:tcMar>
+          </w:tcPr>
+          <w:p>
+            <w:pPr>
+              <w:spacing w:after="0" w:line="270"/>
+            </w:pPr>
+            <w:r>
+              <w:rPr>
+                <w:rFonts w:ascii="Calibri" w:cs="Calibri" w:eastAsia="Calibri" w:hAnsi="Calibri"/>
+                <w:b w:val="false"/>
+                <w:bCs w:val="false"/>
+                <w:sz w:val="20"/>
+                <w:szCs w:val="20"/>
+              </w:rPr>
+              <w:t xml:space="preserve">Henüz bir Sprint'e alınmamış, öncelik sırasıyla bekleyen işlerin listesi.</w:t>
+            </w:r>
+          </w:p>
+        </w:tc>
+        <w:tc>
+          <w:tcPr>
+            <w:tcW w:type="dxa" w:w="3759"/>
+            <w:tcBorders>
+              <w:top w:val="single" w:color="C9CEDB" w:sz="4"/>
+              <w:left w:val="single" w:color="C9CEDB" w:sz="4"/>
+              <w:bottom w:val="single" w:color="C9CEDB" w:sz="4"/>
+              <w:right w:val="single" w:color="C9CEDB" w:sz="4"/>
+            </w:tcBorders>
+            <w:shd w:fill="F4F5FA" w:color="auto" w:val="clear"/>
+            <w:tcMar>
+              <w:top w:type="dxa" w:w="70"/>
+              <w:left w:type="dxa" w:w="110"/>
+              <w:bottom w:type="dxa" w:w="70"/>
+              <w:right w:type="dxa" w:w="110"/>
+            </w:tcMar>
+          </w:tcPr>
+          <w:p>
+            <w:pPr>
+              <w:spacing w:after="0" w:line="270"/>
+            </w:pPr>
+            <w:r>
+              <w:rPr>
+                <w:rFonts w:ascii="Calibri" w:cs="Calibri" w:eastAsia="Calibri" w:hAnsi="Calibri"/>
+                <w:b w:val="false"/>
+                <w:bCs w:val="false"/>
+                <w:sz w:val="20"/>
+                <w:szCs w:val="20"/>
+              </w:rPr>
+              <w:t xml:space="preserve">—</w:t>
+            </w:r>
+          </w:p>
+        </w:tc>
+      </w:tr>
+      <w:tr>
+        <w:trPr>
+          <w:cantSplit/>
+        </w:trPr>
+        <w:tc>
+          <w:tcPr>
+            <w:tcW w:type="dxa" w:w="2120"/>
+            <w:tcBorders>
+              <w:top w:val="single" w:color="C9CEDB" w:sz="4"/>
+              <w:left w:val="single" w:color="C9CEDB" w:sz="4"/>
+              <w:bottom w:val="single" w:color="C9CEDB" w:sz="4"/>
+              <w:right w:val="single" w:color="C9CEDB" w:sz="4"/>
+            </w:tcBorders>
+            <w:tcMar>
+              <w:top w:type="dxa" w:w="70"/>
+              <w:left w:type="dxa" w:w="110"/>
+              <w:bottom w:type="dxa" w:w="70"/>
+              <w:right w:type="dxa" w:w="110"/>
+            </w:tcMar>
+          </w:tcPr>
+          <w:p>
+            <w:pPr>
+              <w:spacing w:after="0" w:line="270"/>
+            </w:pPr>
+            <w:r>
+              <w:rPr>
+                <w:rFonts w:ascii="Calibri" w:cs="Calibri" w:eastAsia="Calibri" w:hAnsi="Calibri"/>
+                <w:b/>
+                <w:bCs/>
+                <w:sz w:val="20"/>
+                <w:szCs w:val="20"/>
+              </w:rPr>
+              <w:t xml:space="preserve">Story Point</w:t>
+            </w:r>
+          </w:p>
+        </w:tc>
+        <w:tc>
+          <w:tcPr>
+            <w:tcW w:type="dxa" w:w="3759"/>
+            <w:tcBorders>
+              <w:top w:val="single" w:color="C9CEDB" w:sz="4"/>
+              <w:left w:val="single" w:color="C9CEDB" w:sz="4"/>
+              <w:bottom w:val="single" w:color="C9CEDB" w:sz="4"/>
+              <w:right w:val="single" w:color="C9CEDB" w:sz="4"/>
+            </w:tcBorders>
+            <w:tcMar>
+              <w:top w:type="dxa" w:w="70"/>
+              <w:left w:type="dxa" w:w="110"/>
+              <w:bottom w:type="dxa" w:w="70"/>
+              <w:right w:type="dxa" w:w="110"/>
+            </w:tcMar>
+          </w:tcPr>
+          <w:p>
+            <w:pPr>
+              <w:spacing w:after="0" w:line="270"/>
+            </w:pPr>
+            <w:r>
+              <w:rPr>
+                <w:rFonts w:ascii="Calibri" w:cs="Calibri" w:eastAsia="Calibri" w:hAnsi="Calibri"/>
+                <w:b w:val="false"/>
+                <w:bCs w:val="false"/>
+                <w:sz w:val="20"/>
+                <w:szCs w:val="20"/>
+              </w:rPr>
+              <w:t xml:space="preserve">Bir işin büyüklüğünü gösteren puan (1, 2, 3, 5, 8, 13, 21, 34, 55).</w:t>
+            </w:r>
+          </w:p>
+        </w:tc>
+        <w:tc>
+          <w:tcPr>
+            <w:tcW w:type="dxa" w:w="3759"/>
+            <w:tcBorders>
+              <w:top w:val="single" w:color="C9CEDB" w:sz="4"/>
+              <w:left w:val="single" w:color="C9CEDB" w:sz="4"/>
+              <w:bottom w:val="single" w:color="C9CEDB" w:sz="4"/>
+              <w:right w:val="single" w:color="C9CEDB" w:sz="4"/>
+            </w:tcBorders>
+            <w:tcMar>
+              <w:top w:type="dxa" w:w="70"/>
+              <w:left w:type="dxa" w:w="110"/>
+              <w:bottom w:type="dxa" w:w="70"/>
+              <w:right w:type="dxa" w:w="110"/>
+            </w:tcMar>
+          </w:tcPr>
+          <w:p>
+            <w:pPr>
+              <w:spacing w:after="0" w:line="270"/>
+            </w:pPr>
+            <w:r>
+              <w:rPr>
+                <w:rFonts w:ascii="Calibri" w:cs="Calibri" w:eastAsia="Calibri" w:hAnsi="Calibri"/>
+                <w:b w:val="false"/>
+                <w:bCs w:val="false"/>
+                <w:sz w:val="20"/>
+                <w:szCs w:val="20"/>
+              </w:rPr>
+              <w:t xml:space="preserve">5</w:t>
+            </w:r>
+          </w:p>
+        </w:tc>
+      </w:tr>
+    </w:tbl>
+    <w:p>
+      <w:pPr>
+        <w:spacing w:after="160"/>
+      </w:pPr>
+    </w:p>
+    <w:p>
+      <w:pPr>
+        <w:keepNext/>
+        <w:spacing w:after="80" w:before="120"/>
+        <w:jc w:val="center"/>
+      </w:pPr>
+      <w:r>
+        <w:drawing>
+          <wp:inline distT="0" distB="0" distL="0" distR="0">
+            <wp:extent cx="5715000" cy="3571875"/>
+            <wp:effectExtent t="0" r="0" b="0" l="0"/>
+            <wp:docPr id="2" name="01-overview" descr="Seyir ana ekranı ve işaretli bölümler" title="Seyir ana ekranı ve işaretli bölümler"/>
+            <wp:cNvGraphicFramePr>
+              <a:graphicFrameLocks xmlns:a="http://schemas.openxmlformats.org/drawingml/2006/main" noChangeAspect="1"/>
+            </wp:cNvGraphicFramePr>
+            <a:graphic xmlns:a="http://schemas.openxmlformats.org/drawingml/2006/main">
+              <a:graphicData uri="http://schemas.openxmlformats.org/drawingml/2006/picture">
+                <pic:pic xmlns:pic="http://schemas.openxmlformats.org/drawingml/2006/picture">
+                  <pic:nvPicPr>
+                    <pic:cNvPr id="0" name="" descr=""/>
+                    <pic:cNvPicPr>
+                      <a:picLocks noChangeAspect="1" noChangeArrowheads="1"/>
+                    </pic:cNvPicPr>
+                  </pic:nvPicPr>
+                  <pic:blipFill>
+                    <a:blip r:embed="rId8" cstate="none"/>
+                    <a:srcRect/>
+                    <a:stretch>
+                      <a:fillRect/>
+                    </a:stretch>
+                  </pic:blipFill>
+                  <pic:spPr bwMode="auto">
+                    <a:xfrm>
+                      <a:off x="0" y="0"/>
+                      <a:ext cx="5715000" cy="3571875"/>
+                    </a:xfrm>
+                    <a:prstGeom prst="rect">
+                      <a:avLst/>
+                    </a:prstGeom>
+                  </pic:spPr>
+                </pic:pic>
+              </a:graphicData>
+            </a:graphic>
+          </wp:inline>
+        </w:drawing>
+      </w:r>
+    </w:p>
+    <w:p>
+      <w:pPr>
+        <w:keepNext/>
+        <w:spacing w:after="120"/>
+        <w:jc w:val="center"/>
+      </w:pPr>
+      <w:r>
+        <w:rPr>
+          <w:rFonts w:ascii="Calibri" w:cs="Calibri" w:eastAsia="Calibri" w:hAnsi="Calibri"/>
+          <w:i/>
+          <w:iCs/>
+          <w:color w:val="555B6E"/>
+          <w:sz w:val="20"/>
+          <w:szCs w:val="20"/>
+        </w:rPr>
+        <w:t xml:space="preserve">Ana ekran: soldaki menüden Projeye ve bölümlerine, üstteki çubuktan arama, yardım ve hesap menüsüne ulaşırsın.</w:t>
+      </w:r>
+    </w:p>
+    <w:tbl>
+      <w:tblPr>
+        <w:tblW w:type="dxa" w:w="9638"/>
+        <w:tblBorders>
+          <w:top w:val="single" w:color="auto" w:sz="4"/>
+          <w:left w:val="single" w:color="auto" w:sz="4"/>
+          <w:bottom w:val="single" w:color="auto" w:sz="4"/>
+          <w:right w:val="single" w:color="auto" w:sz="4"/>
+          <w:insideH w:val="single" w:color="auto" w:sz="4"/>
+          <w:insideV w:val="single" w:color="auto" w:sz="4"/>
+        </w:tblBorders>
+      </w:tblPr>
+      <w:tblGrid>
+        <w:gridCol w:w="560"/>
+        <w:gridCol w:w="9078"/>
+      </w:tblGrid>
+      <w:tr>
+        <w:trPr>
+          <w:cantSplit/>
+        </w:trPr>
+        <w:tc>
+          <w:tcPr>
+            <w:tcW w:type="dxa" w:w="560"/>
+            <w:tcBorders>
+              <w:top w:val="none" w:color="FFFFFF" w:sz="0"/>
+              <w:left w:val="none" w:color="FFFFFF" w:sz="0"/>
+              <w:bottom w:val="none" w:color="FFFFFF" w:sz="0"/>
+              <w:right w:val="none" w:color="FFFFFF" w:sz="0"/>
+            </w:tcBorders>
+            <w:tcMar>
+              <w:top w:type="dxa" w:w="40"/>
+              <w:left w:type="dxa" w:w="40"/>
+              <w:bottom w:type="dxa" w:w="40"/>
+              <w:right w:type="dxa" w:w="60"/>
+            </w:tcMar>
+            <w:vAlign w:val="top"/>
+          </w:tcPr>
+          <w:p>
+            <w:pPr>
+              <w:jc w:val="center"/>
+            </w:pPr>
+            <w:r>
+              <w:rPr>
+                <w:rFonts w:ascii="Calibri" w:cs="Calibri" w:eastAsia="Calibri" w:hAnsi="Calibri"/>
+                <w:b/>
+                <w:bCs/>
+                <w:color w:val="FFFFFF"/>
+                <w:sz w:val="22"/>
+                <w:szCs w:val="22"/>
+                <w:shd w:fill="E11D48" w:color="auto" w:val="clear"/>
+              </w:rPr>
+              <w:t xml:space="preserve"> 1 </w:t>
+            </w:r>
+          </w:p>
+        </w:tc>
+        <w:tc>
+          <w:tcPr>
+            <w:tcW w:type="dxa" w:w="9078"/>
+            <w:tcBorders>
+              <w:top w:val="none" w:color="FFFFFF" w:sz="0"/>
+              <w:left w:val="none" w:color="FFFFFF" w:sz="0"/>
+              <w:bottom w:val="none" w:color="FFFFFF" w:sz="0"/>
+              <w:right w:val="none" w:color="FFFFFF" w:sz="0"/>
+            </w:tcBorders>
+            <w:tcMar>
+              <w:top w:type="dxa" w:w="40"/>
+              <w:left w:type="dxa" w:w="60"/>
+              <w:bottom w:type="dxa" w:w="40"/>
+              <w:right w:type="dxa" w:w="40"/>
+            </w:tcMar>
+          </w:tcPr>
+          <w:p>
+            <w:pPr>
+              <w:spacing w:after="0"/>
+            </w:pPr>
+            <w:r>
+              <w:rPr>
+                <w:rFonts w:ascii="Calibri" w:cs="Calibri" w:eastAsia="Calibri" w:hAnsi="Calibri"/>
+                <w:sz w:val="21"/>
+                <w:szCs w:val="21"/>
+              </w:rPr>
+              <w:t xml:space="preserve"/>
+            </w:r>
+            <w:r>
+              <w:rPr>
+                <w:rFonts w:ascii="Calibri" w:cs="Calibri" w:eastAsia="Calibri" w:hAnsi="Calibri"/>
+                <w:b/>
+                <w:bCs/>
+                <w:sz w:val="21"/>
+                <w:szCs w:val="21"/>
+              </w:rPr>
+              <w:t xml:space="preserve">Proje</w:t>
+            </w:r>
+            <w:r>
+              <w:rPr>
+                <w:rFonts w:ascii="Calibri" w:cs="Calibri" w:eastAsia="Calibri" w:hAnsi="Calibri"/>
+                <w:sz w:val="21"/>
+                <w:szCs w:val="21"/>
+              </w:rPr>
+              <w:t xml:space="preserve">: Çalıştığın proje alanı. Tıklayınca altındaki bölümler açılır.</w:t>
+            </w:r>
+          </w:p>
+        </w:tc>
+      </w:tr>
+      <w:tr>
+        <w:trPr>
+          <w:cantSplit/>
+        </w:trPr>
+        <w:tc>
+          <w:tcPr>
+            <w:tcW w:type="dxa" w:w="560"/>
+            <w:tcBorders>
+              <w:top w:val="none" w:color="FFFFFF" w:sz="0"/>
+              <w:left w:val="none" w:color="FFFFFF" w:sz="0"/>
+              <w:bottom w:val="none" w:color="FFFFFF" w:sz="0"/>
+              <w:right w:val="none" w:color="FFFFFF" w:sz="0"/>
+            </w:tcBorders>
+            <w:tcMar>
+              <w:top w:type="dxa" w:w="40"/>
+              <w:left w:type="dxa" w:w="40"/>
+              <w:bottom w:type="dxa" w:w="40"/>
+              <w:right w:type="dxa" w:w="60"/>
+            </w:tcMar>
+            <w:vAlign w:val="top"/>
+          </w:tcPr>
+          <w:p>
+            <w:pPr>
+              <w:jc w:val="center"/>
+            </w:pPr>
+            <w:r>
+              <w:rPr>
+                <w:rFonts w:ascii="Calibri" w:cs="Calibri" w:eastAsia="Calibri" w:hAnsi="Calibri"/>
+                <w:b/>
+                <w:bCs/>
+                <w:color w:val="FFFFFF"/>
+                <w:sz w:val="22"/>
+                <w:szCs w:val="22"/>
+                <w:shd w:fill="E11D48" w:color="auto" w:val="clear"/>
+              </w:rPr>
+              <w:t xml:space="preserve"> 2 </w:t>
+            </w:r>
+          </w:p>
+        </w:tc>
+        <w:tc>
+          <w:tcPr>
+            <w:tcW w:type="dxa" w:w="9078"/>
+            <w:tcBorders>
+              <w:top w:val="none" w:color="FFFFFF" w:sz="0"/>
+              <w:left w:val="none" w:color="FFFFFF" w:sz="0"/>
+              <w:bottom w:val="none" w:color="FFFFFF" w:sz="0"/>
+              <w:right w:val="none" w:color="FFFFFF" w:sz="0"/>
+            </w:tcBorders>
+            <w:tcMar>
+              <w:top w:type="dxa" w:w="40"/>
+              <w:left w:type="dxa" w:w="60"/>
+              <w:bottom w:type="dxa" w:w="40"/>
+              <w:right w:type="dxa" w:w="40"/>
+            </w:tcMar>
+          </w:tcPr>
+          <w:p>
+            <w:pPr>
+              <w:spacing w:after="0"/>
+            </w:pPr>
+            <w:r>
+              <w:rPr>
+                <w:rFonts w:ascii="Calibri" w:cs="Calibri" w:eastAsia="Calibri" w:hAnsi="Calibri"/>
+                <w:sz w:val="21"/>
+                <w:szCs w:val="21"/>
+              </w:rPr>
+              <w:t xml:space="preserve"/>
+            </w:r>
+            <w:r>
+              <w:rPr>
+                <w:rFonts w:ascii="Calibri" w:cs="Calibri" w:eastAsia="Calibri" w:hAnsi="Calibri"/>
+                <w:b/>
+                <w:bCs/>
+                <w:sz w:val="21"/>
+                <w:szCs w:val="21"/>
+              </w:rPr>
+              <w:t xml:space="preserve">Backlog ve sprint'ler</w:t>
+            </w:r>
+            <w:r>
+              <w:rPr>
+                <w:rFonts w:ascii="Calibri" w:cs="Calibri" w:eastAsia="Calibri" w:hAnsi="Calibri"/>
+                <w:sz w:val="21"/>
+                <w:szCs w:val="21"/>
+              </w:rPr>
+              <w:t xml:space="preserve">: Sprint oluşturma ve planlama burada yapılır.</w:t>
+            </w:r>
+          </w:p>
+        </w:tc>
+      </w:tr>
+      <w:tr>
+        <w:trPr>
+          <w:cantSplit/>
+        </w:trPr>
+        <w:tc>
+          <w:tcPr>
+            <w:tcW w:type="dxa" w:w="560"/>
+            <w:tcBorders>
+              <w:top w:val="none" w:color="FFFFFF" w:sz="0"/>
+              <w:left w:val="none" w:color="FFFFFF" w:sz="0"/>
+              <w:bottom w:val="none" w:color="FFFFFF" w:sz="0"/>
+              <w:right w:val="none" w:color="FFFFFF" w:sz="0"/>
+            </w:tcBorders>
+            <w:tcMar>
+              <w:top w:type="dxa" w:w="40"/>
+              <w:left w:type="dxa" w:w="40"/>
+              <w:bottom w:type="dxa" w:w="40"/>
+              <w:right w:type="dxa" w:w="60"/>
+            </w:tcMar>
+            <w:vAlign w:val="top"/>
+          </w:tcPr>
+          <w:p>
+            <w:pPr>
+              <w:jc w:val="center"/>
+            </w:pPr>
+            <w:r>
+              <w:rPr>
+                <w:rFonts w:ascii="Calibri" w:cs="Calibri" w:eastAsia="Calibri" w:hAnsi="Calibri"/>
+                <w:b/>
+                <w:bCs/>
+                <w:color w:val="FFFFFF"/>
+                <w:sz w:val="22"/>
+                <w:szCs w:val="22"/>
+                <w:shd w:fill="E11D48" w:color="auto" w:val="clear"/>
+              </w:rPr>
+              <w:t xml:space="preserve"> 3 </w:t>
+            </w:r>
+          </w:p>
+        </w:tc>
+        <w:tc>
+          <w:tcPr>
+            <w:tcW w:type="dxa" w:w="9078"/>
+            <w:tcBorders>
+              <w:top w:val="none" w:color="FFFFFF" w:sz="0"/>
+              <w:left w:val="none" w:color="FFFFFF" w:sz="0"/>
+              <w:bottom w:val="none" w:color="FFFFFF" w:sz="0"/>
+              <w:right w:val="none" w:color="FFFFFF" w:sz="0"/>
+            </w:tcBorders>
+            <w:tcMar>
+              <w:top w:type="dxa" w:w="40"/>
+              <w:left w:type="dxa" w:w="60"/>
+              <w:bottom w:type="dxa" w:w="40"/>
+              <w:right w:type="dxa" w:w="40"/>
+            </w:tcMar>
+          </w:tcPr>
+          <w:p>
+            <w:pPr>
+              <w:spacing w:after="0"/>
+            </w:pPr>
+            <w:r>
+              <w:rPr>
+                <w:rFonts w:ascii="Calibri" w:cs="Calibri" w:eastAsia="Calibri" w:hAnsi="Calibri"/>
+                <w:sz w:val="21"/>
+                <w:szCs w:val="21"/>
+              </w:rPr>
+              <w:t xml:space="preserve"/>
+            </w:r>
+            <w:r>
+              <w:rPr>
+                <w:rFonts w:ascii="Calibri" w:cs="Calibri" w:eastAsia="Calibri" w:hAnsi="Calibri"/>
+                <w:b/>
+                <w:bCs/>
+                <w:sz w:val="21"/>
+                <w:szCs w:val="21"/>
+              </w:rPr>
+              <w:t xml:space="preserve">Sprint panosu</w:t>
+            </w:r>
+            <w:r>
+              <w:rPr>
+                <w:rFonts w:ascii="Calibri" w:cs="Calibri" w:eastAsia="Calibri" w:hAnsi="Calibri"/>
+                <w:sz w:val="21"/>
+                <w:szCs w:val="21"/>
+              </w:rPr>
+              <w:t xml:space="preserve">: Sprint'teki işleri durum sütunlarında (Kanban) gösterir.</w:t>
+            </w:r>
+          </w:p>
+        </w:tc>
+      </w:tr>
+      <w:tr>
+        <w:trPr>
+          <w:cantSplit/>
+        </w:trPr>
+        <w:tc>
+          <w:tcPr>
+            <w:tcW w:type="dxa" w:w="560"/>
+            <w:tcBorders>
+              <w:top w:val="none" w:color="FFFFFF" w:sz="0"/>
+              <w:left w:val="none" w:color="FFFFFF" w:sz="0"/>
+              <w:bottom w:val="none" w:color="FFFFFF" w:sz="0"/>
+              <w:right w:val="none" w:color="FFFFFF" w:sz="0"/>
+            </w:tcBorders>
+            <w:tcMar>
+              <w:top w:type="dxa" w:w="40"/>
+              <w:left w:type="dxa" w:w="40"/>
+              <w:bottom w:type="dxa" w:w="40"/>
+              <w:right w:type="dxa" w:w="60"/>
+            </w:tcMar>
+            <w:vAlign w:val="top"/>
+          </w:tcPr>
+          <w:p>
+            <w:pPr>
+              <w:jc w:val="center"/>
+            </w:pPr>
+            <w:r>
+              <w:rPr>
+                <w:rFonts w:ascii="Calibri" w:cs="Calibri" w:eastAsia="Calibri" w:hAnsi="Calibri"/>
+                <w:b/>
+                <w:bCs/>
+                <w:color w:val="FFFFFF"/>
+                <w:sz w:val="22"/>
+                <w:szCs w:val="22"/>
+                <w:shd w:fill="E11D48" w:color="auto" w:val="clear"/>
+              </w:rPr>
+              <w:t xml:space="preserve"> 4 </w:t>
+            </w:r>
+          </w:p>
+        </w:tc>
+        <w:tc>
+          <w:tcPr>
+            <w:tcW w:type="dxa" w:w="9078"/>
+            <w:tcBorders>
+              <w:top w:val="none" w:color="FFFFFF" w:sz="0"/>
+              <w:left w:val="none" w:color="FFFFFF" w:sz="0"/>
+              <w:bottom w:val="none" w:color="FFFFFF" w:sz="0"/>
+              <w:right w:val="none" w:color="FFFFFF" w:sz="0"/>
+            </w:tcBorders>
+            <w:tcMar>
+              <w:top w:type="dxa" w:w="40"/>
+              <w:left w:type="dxa" w:w="60"/>
+              <w:bottom w:type="dxa" w:w="40"/>
+              <w:right w:type="dxa" w:w="40"/>
+            </w:tcMar>
+          </w:tcPr>
+          <w:p>
+            <w:pPr>
+              <w:spacing w:after="0"/>
+            </w:pPr>
+            <w:r>
+              <w:rPr>
+                <w:rFonts w:ascii="Calibri" w:cs="Calibri" w:eastAsia="Calibri" w:hAnsi="Calibri"/>
+                <w:sz w:val="21"/>
+                <w:szCs w:val="21"/>
+              </w:rPr>
+              <w:t xml:space="preserve"/>
+            </w:r>
+            <w:r>
+              <w:rPr>
+                <w:rFonts w:ascii="Calibri" w:cs="Calibri" w:eastAsia="Calibri" w:hAnsi="Calibri"/>
+                <w:b/>
+                <w:bCs/>
+                <w:sz w:val="21"/>
+                <w:szCs w:val="21"/>
+              </w:rPr>
+              <w:t xml:space="preserve">Görevler</w:t>
+            </w:r>
+            <w:r>
+              <w:rPr>
+                <w:rFonts w:ascii="Calibri" w:cs="Calibri" w:eastAsia="Calibri" w:hAnsi="Calibri"/>
+                <w:sz w:val="21"/>
+                <w:szCs w:val="21"/>
+              </w:rPr>
+              <w:t xml:space="preserve">: Projenin iş listesi; Epic, Task ve Sub-Task'lar burada eklenir.</w:t>
+            </w:r>
+          </w:p>
+        </w:tc>
+      </w:tr>
+      <w:tr>
+        <w:trPr>
+          <w:cantSplit/>
+        </w:trPr>
+        <w:tc>
+          <w:tcPr>
+            <w:tcW w:type="dxa" w:w="560"/>
+            <w:tcBorders>
+              <w:top w:val="none" w:color="FFFFFF" w:sz="0"/>
+              <w:left w:val="none" w:color="FFFFFF" w:sz="0"/>
+              <w:bottom w:val="none" w:color="FFFFFF" w:sz="0"/>
+              <w:right w:val="none" w:color="FFFFFF" w:sz="0"/>
+            </w:tcBorders>
+            <w:tcMar>
+              <w:top w:type="dxa" w:w="40"/>
+              <w:left w:type="dxa" w:w="40"/>
+              <w:bottom w:type="dxa" w:w="40"/>
+              <w:right w:type="dxa" w:w="60"/>
+            </w:tcMar>
+            <w:vAlign w:val="top"/>
+          </w:tcPr>
+          <w:p>
+            <w:pPr>
+              <w:jc w:val="center"/>
+            </w:pPr>
+            <w:r>
+              <w:rPr>
+                <w:rFonts w:ascii="Calibri" w:cs="Calibri" w:eastAsia="Calibri" w:hAnsi="Calibri"/>
+                <w:b/>
+                <w:bCs/>
+                <w:color w:val="FFFFFF"/>
+                <w:sz w:val="22"/>
+                <w:szCs w:val="22"/>
+                <w:shd w:fill="E11D48" w:color="auto" w:val="clear"/>
+              </w:rPr>
+              <w:t xml:space="preserve"> 5 </w:t>
+            </w:r>
+          </w:p>
+        </w:tc>
+        <w:tc>
+          <w:tcPr>
+            <w:tcW w:type="dxa" w:w="9078"/>
+            <w:tcBorders>
+              <w:top w:val="none" w:color="FFFFFF" w:sz="0"/>
+              <w:left w:val="none" w:color="FFFFFF" w:sz="0"/>
+              <w:bottom w:val="none" w:color="FFFFFF" w:sz="0"/>
+              <w:right w:val="none" w:color="FFFFFF" w:sz="0"/>
+            </w:tcBorders>
+            <w:tcMar>
+              <w:top w:type="dxa" w:w="40"/>
+              <w:left w:type="dxa" w:w="60"/>
+              <w:bottom w:type="dxa" w:w="40"/>
+              <w:right w:type="dxa" w:w="40"/>
+            </w:tcMar>
+          </w:tcPr>
+          <w:p>
+            <w:pPr>
+              <w:spacing w:after="0"/>
+            </w:pPr>
+            <w:r>
+              <w:rPr>
+                <w:rFonts w:ascii="Calibri" w:cs="Calibri" w:eastAsia="Calibri" w:hAnsi="Calibri"/>
+                <w:sz w:val="21"/>
+                <w:szCs w:val="21"/>
+              </w:rPr>
+              <w:t xml:space="preserve"/>
+            </w:r>
+            <w:r>
+              <w:rPr>
+                <w:rFonts w:ascii="Calibri" w:cs="Calibri" w:eastAsia="Calibri" w:hAnsi="Calibri"/>
+                <w:b/>
+                <w:bCs/>
+                <w:sz w:val="21"/>
+                <w:szCs w:val="21"/>
+              </w:rPr>
+              <w:t xml:space="preserve">Arama</w:t>
+            </w:r>
+            <w:r>
+              <w:rPr>
+                <w:rFonts w:ascii="Calibri" w:cs="Calibri" w:eastAsia="Calibri" w:hAnsi="Calibri"/>
+                <w:sz w:val="21"/>
+                <w:szCs w:val="21"/>
+              </w:rPr>
+              <w:t xml:space="preserve">: Task, doküman veya kişi ara (kısayol: Ctrl + K).</w:t>
+            </w:r>
+          </w:p>
+        </w:tc>
+      </w:tr>
+      <w:tr>
+        <w:trPr>
+          <w:cantSplit/>
+        </w:trPr>
+        <w:tc>
+          <w:tcPr>
+            <w:tcW w:type="dxa" w:w="560"/>
+            <w:tcBorders>
+              <w:top w:val="none" w:color="FFFFFF" w:sz="0"/>
+              <w:left w:val="none" w:color="FFFFFF" w:sz="0"/>
+              <w:bottom w:val="none" w:color="FFFFFF" w:sz="0"/>
+              <w:right w:val="none" w:color="FFFFFF" w:sz="0"/>
+            </w:tcBorders>
+            <w:tcMar>
+              <w:top w:type="dxa" w:w="40"/>
+              <w:left w:type="dxa" w:w="40"/>
+              <w:bottom w:type="dxa" w:w="40"/>
+              <w:right w:type="dxa" w:w="60"/>
+            </w:tcMar>
+            <w:vAlign w:val="top"/>
+          </w:tcPr>
+          <w:p>
+            <w:pPr>
+              <w:jc w:val="center"/>
+            </w:pPr>
+            <w:r>
+              <w:rPr>
+                <w:rFonts w:ascii="Calibri" w:cs="Calibri" w:eastAsia="Calibri" w:hAnsi="Calibri"/>
+                <w:b/>
+                <w:bCs/>
+                <w:color w:val="FFFFFF"/>
+                <w:sz w:val="22"/>
+                <w:szCs w:val="22"/>
+                <w:shd w:fill="E11D48" w:color="auto" w:val="clear"/>
+              </w:rPr>
+              <w:t xml:space="preserve"> 6 </w:t>
+            </w:r>
+          </w:p>
+        </w:tc>
+        <w:tc>
+          <w:tcPr>
+            <w:tcW w:type="dxa" w:w="9078"/>
+            <w:tcBorders>
+              <w:top w:val="none" w:color="FFFFFF" w:sz="0"/>
+              <w:left w:val="none" w:color="FFFFFF" w:sz="0"/>
+              <w:bottom w:val="none" w:color="FFFFFF" w:sz="0"/>
+              <w:right w:val="none" w:color="FFFFFF" w:sz="0"/>
+            </w:tcBorders>
+            <w:tcMar>
+              <w:top w:type="dxa" w:w="40"/>
+              <w:left w:type="dxa" w:w="60"/>
+              <w:bottom w:type="dxa" w:w="40"/>
+              <w:right w:type="dxa" w:w="40"/>
+            </w:tcMar>
+          </w:tcPr>
+          <w:p>
+            <w:pPr>
+              <w:spacing w:after="0"/>
+            </w:pPr>
+            <w:r>
+              <w:rPr>
+                <w:rFonts w:ascii="Calibri" w:cs="Calibri" w:eastAsia="Calibri" w:hAnsi="Calibri"/>
+                <w:sz w:val="21"/>
+                <w:szCs w:val="21"/>
+              </w:rPr>
+              <w:t xml:space="preserve"/>
+            </w:r>
+            <w:r>
+              <w:rPr>
+                <w:rFonts w:ascii="Calibri" w:cs="Calibri" w:eastAsia="Calibri" w:hAnsi="Calibri"/>
+                <w:b/>
+                <w:bCs/>
+                <w:sz w:val="21"/>
+                <w:szCs w:val="21"/>
+              </w:rPr>
+              <w:t xml:space="preserve">Yardım</w:t>
+            </w:r>
+            <w:r>
+              <w:rPr>
+                <w:rFonts w:ascii="Calibri" w:cs="Calibri" w:eastAsia="Calibri" w:hAnsi="Calibri"/>
+                <w:sz w:val="21"/>
+                <w:szCs w:val="21"/>
+              </w:rPr>
+              <w:t xml:space="preserve">: Bu kılavuzu her zaman buradan açabilirsin.</w:t>
+            </w:r>
+          </w:p>
+        </w:tc>
+      </w:tr>
+      <w:tr>
+        <w:trPr>
+          <w:cantSplit/>
+        </w:trPr>
+        <w:tc>
+          <w:tcPr>
+            <w:tcW w:type="dxa" w:w="560"/>
+            <w:tcBorders>
+              <w:top w:val="none" w:color="FFFFFF" w:sz="0"/>
+              <w:left w:val="none" w:color="FFFFFF" w:sz="0"/>
+              <w:bottom w:val="none" w:color="FFFFFF" w:sz="0"/>
+              <w:right w:val="none" w:color="FFFFFF" w:sz="0"/>
+            </w:tcBorders>
+            <w:tcMar>
+              <w:top w:type="dxa" w:w="40"/>
+              <w:left w:type="dxa" w:w="40"/>
+              <w:bottom w:type="dxa" w:w="40"/>
+              <w:right w:type="dxa" w:w="60"/>
+            </w:tcMar>
+            <w:vAlign w:val="top"/>
+          </w:tcPr>
+          <w:p>
+            <w:pPr>
+              <w:jc w:val="center"/>
+            </w:pPr>
+            <w:r>
+              <w:rPr>
+                <w:rFonts w:ascii="Calibri" w:cs="Calibri" w:eastAsia="Calibri" w:hAnsi="Calibri"/>
+                <w:b/>
+                <w:bCs/>
+                <w:color w:val="FFFFFF"/>
+                <w:sz w:val="22"/>
+                <w:szCs w:val="22"/>
+                <w:shd w:fill="E11D48" w:color="auto" w:val="clear"/>
+              </w:rPr>
+              <w:t xml:space="preserve"> 7 </w:t>
+            </w:r>
+          </w:p>
+        </w:tc>
+        <w:tc>
+          <w:tcPr>
+            <w:tcW w:type="dxa" w:w="9078"/>
+            <w:tcBorders>
+              <w:top w:val="none" w:color="FFFFFF" w:sz="0"/>
+              <w:left w:val="none" w:color="FFFFFF" w:sz="0"/>
+              <w:bottom w:val="none" w:color="FFFFFF" w:sz="0"/>
+              <w:right w:val="none" w:color="FFFFFF" w:sz="0"/>
+            </w:tcBorders>
+            <w:tcMar>
+              <w:top w:type="dxa" w:w="40"/>
+              <w:left w:type="dxa" w:w="60"/>
+              <w:bottom w:type="dxa" w:w="40"/>
+              <w:right w:type="dxa" w:w="40"/>
+            </w:tcMar>
+          </w:tcPr>
+          <w:p>
+            <w:pPr>
+              <w:spacing w:after="0"/>
+            </w:pPr>
+            <w:r>
+              <w:rPr>
+                <w:rFonts w:ascii="Calibri" w:cs="Calibri" w:eastAsia="Calibri" w:hAnsi="Calibri"/>
+                <w:sz w:val="21"/>
+                <w:szCs w:val="21"/>
+              </w:rPr>
+              <w:t xml:space="preserve"/>
+            </w:r>
+            <w:r>
+              <w:rPr>
+                <w:rFonts w:ascii="Calibri" w:cs="Calibri" w:eastAsia="Calibri" w:hAnsi="Calibri"/>
+                <w:b/>
+                <w:bCs/>
+                <w:sz w:val="21"/>
+                <w:szCs w:val="21"/>
+              </w:rPr>
+              <w:t xml:space="preserve">Hesap menüsü</w:t>
+            </w:r>
+            <w:r>
+              <w:rPr>
+                <w:rFonts w:ascii="Calibri" w:cs="Calibri" w:eastAsia="Calibri" w:hAnsi="Calibri"/>
+                <w:sz w:val="21"/>
+                <w:szCs w:val="21"/>
+              </w:rPr>
+              <w:t xml:space="preserve">: Profil, dil (Türkçe/İngilizce), tema ve çıkış.</w:t>
+            </w:r>
+          </w:p>
+        </w:tc>
+      </w:tr>
+      <w:tr>
+        <w:trPr>
+          <w:cantSplit/>
+        </w:trPr>
+        <w:tc>
+          <w:tcPr>
+            <w:tcW w:type="dxa" w:w="560"/>
+            <w:tcBorders>
+              <w:top w:val="none" w:color="FFFFFF" w:sz="0"/>
+              <w:left w:val="none" w:color="FFFFFF" w:sz="0"/>
+              <w:bottom w:val="none" w:color="FFFFFF" w:sz="0"/>
+              <w:right w:val="none" w:color="FFFFFF" w:sz="0"/>
+            </w:tcBorders>
+            <w:tcMar>
+              <w:top w:type="dxa" w:w="40"/>
+              <w:left w:type="dxa" w:w="40"/>
+              <w:bottom w:type="dxa" w:w="40"/>
+              <w:right w:type="dxa" w:w="60"/>
+            </w:tcMar>
+            <w:vAlign w:val="top"/>
+          </w:tcPr>
+          <w:p>
+            <w:pPr>
+              <w:jc w:val="center"/>
+            </w:pPr>
+            <w:r>
+              <w:rPr>
+                <w:rFonts w:ascii="Calibri" w:cs="Calibri" w:eastAsia="Calibri" w:hAnsi="Calibri"/>
+                <w:b/>
+                <w:bCs/>
+                <w:color w:val="FFFFFF"/>
+                <w:sz w:val="22"/>
+                <w:szCs w:val="22"/>
+                <w:shd w:fill="E11D48" w:color="auto" w:val="clear"/>
+              </w:rPr>
+              <w:t xml:space="preserve"> 8 </w:t>
+            </w:r>
+          </w:p>
+        </w:tc>
+        <w:tc>
+          <w:tcPr>
+            <w:tcW w:type="dxa" w:w="9078"/>
+            <w:tcBorders>
+              <w:top w:val="none" w:color="FFFFFF" w:sz="0"/>
+              <w:left w:val="none" w:color="FFFFFF" w:sz="0"/>
+              <w:bottom w:val="none" w:color="FFFFFF" w:sz="0"/>
+              <w:right w:val="none" w:color="FFFFFF" w:sz="0"/>
+            </w:tcBorders>
+            <w:tcMar>
+              <w:top w:type="dxa" w:w="40"/>
+              <w:left w:type="dxa" w:w="60"/>
+              <w:bottom w:type="dxa" w:w="40"/>
+              <w:right w:type="dxa" w:w="40"/>
+            </w:tcMar>
+          </w:tcPr>
+          <w:p>
+            <w:pPr>
+              <w:spacing w:after="0"/>
+            </w:pPr>
+            <w:r>
+              <w:rPr>
+                <w:rFonts w:ascii="Calibri" w:cs="Calibri" w:eastAsia="Calibri" w:hAnsi="Calibri"/>
+                <w:sz w:val="21"/>
+                <w:szCs w:val="21"/>
+              </w:rPr>
+              <w:t xml:space="preserve"/>
+            </w:r>
+            <w:r>
+              <w:rPr>
+                <w:rFonts w:ascii="Calibri" w:cs="Calibri" w:eastAsia="Calibri" w:hAnsi="Calibri"/>
+                <w:b/>
+                <w:bCs/>
+                <w:sz w:val="21"/>
+                <w:szCs w:val="21"/>
+              </w:rPr>
+              <w:t xml:space="preserve">Yeni iş ekleme satırı</w:t>
+            </w:r>
+            <w:r>
+              <w:rPr>
+                <w:rFonts w:ascii="Calibri" w:cs="Calibri" w:eastAsia="Calibri" w:hAnsi="Calibri"/>
+                <w:sz w:val="21"/>
+                <w:szCs w:val="21"/>
+              </w:rPr>
+              <w:t xml:space="preserve">: Başlığı yazıp Enter'a basarak yeni Task eklersin.</w:t>
+            </w:r>
+          </w:p>
+        </w:tc>
+      </w:tr>
+    </w:tbl>
+    <w:p>
+      <w:pPr>
+        <w:spacing w:after="200"/>
+      </w:pPr>
+    </w:p>
     <w:tbl>
       <w:tblPr>
         <w:tblW w:type="dxa" w:w="9638"/>
@@ -2187,7 +4831,7 @@
         <w:pStyle w:val="ListParagraph"/>
         <w:numPr>
           <w:ilvl w:val="0"/>
-          <w:numId w:val="2"/>
+          <w:numId w:val="3"/>
         </w:numPr>
         <w:spacing w:after="100" w:line="290"/>
       </w:pPr>
@@ -2259,7 +4903,7 @@
         <w:pStyle w:val="ListParagraph"/>
         <w:numPr>
           <w:ilvl w:val="0"/>
-          <w:numId w:val="2"/>
+          <w:numId w:val="3"/>
         </w:numPr>
         <w:spacing w:after="100" w:line="290"/>
       </w:pPr>
@@ -2295,7 +4939,7 @@
         <w:pStyle w:val="ListParagraph"/>
         <w:numPr>
           <w:ilvl w:val="0"/>
-          <w:numId w:val="2"/>
+          <w:numId w:val="3"/>
         </w:numPr>
         <w:spacing w:after="100" w:line="290"/>
       </w:pPr>
@@ -2331,7 +4975,7 @@
         <w:pStyle w:val="ListParagraph"/>
         <w:numPr>
           <w:ilvl w:val="0"/>
-          <w:numId w:val="2"/>
+          <w:numId w:val="3"/>
         </w:numPr>
         <w:spacing w:after="100" w:line="290"/>
       </w:pPr>
@@ -2403,7 +5047,7 @@
         <w:pStyle w:val="ListParagraph"/>
         <w:numPr>
           <w:ilvl w:val="0"/>
-          <w:numId w:val="2"/>
+          <w:numId w:val="3"/>
         </w:numPr>
         <w:spacing w:after="100" w:line="290"/>
       </w:pPr>
@@ -2450,7 +5094,7 @@
           <wp:inline distT="0" distB="0" distL="0" distR="0">
             <wp:extent cx="3724275" cy="4095750"/>
             <wp:effectExtent t="0" r="0" b="0" l="0"/>
-            <wp:docPr id="2" name="02-space-create" descr="Yeni Proje oluşturma penceresi" title="Yeni Proje oluşturma penceresi"/>
+            <wp:docPr id="3" name="02-space-create" descr="Yeni Proje oluşturma penceresi" title="Yeni Proje oluşturma penceresi"/>
             <wp:cNvGraphicFramePr>
               <a:graphicFrameLocks xmlns:a="http://schemas.openxmlformats.org/drawingml/2006/main" noChangeAspect="1"/>
             </wp:cNvGraphicFramePr>
@@ -2964,7 +5608,7 @@
         <w:pStyle w:val="ListParagraph"/>
         <w:numPr>
           <w:ilvl w:val="0"/>
-          <w:numId w:val="3"/>
+          <w:numId w:val="2"/>
         </w:numPr>
         <w:spacing w:after="80" w:line="290"/>
       </w:pPr>
@@ -2982,7 +5626,7 @@
         <w:pStyle w:val="ListParagraph"/>
         <w:numPr>
           <w:ilvl w:val="0"/>
-          <w:numId w:val="3"/>
+          <w:numId w:val="2"/>
         </w:numPr>
         <w:spacing w:after="80" w:line="290"/>
       </w:pPr>
@@ -3000,7 +5644,7 @@
         <w:pStyle w:val="ListParagraph"/>
         <w:numPr>
           <w:ilvl w:val="0"/>
-          <w:numId w:val="3"/>
+          <w:numId w:val="2"/>
         </w:numPr>
         <w:spacing w:after="80" w:line="290"/>
       </w:pPr>
@@ -3191,7 +5835,7 @@
           <wp:inline distT="0" distB="0" distL="0" distR="0">
             <wp:extent cx="5715000" cy="3571875"/>
             <wp:effectExtent t="0" r="0" b="0" l="0"/>
-            <wp:docPr id="3" name="09-epic-create" descr="Listede Epic ekleme satırı" title="Listede Epic ekleme satırı"/>
+            <wp:docPr id="4" name="09-epic-create" descr="Listede Epic ekleme satırı" title="Listede Epic ekleme satırı"/>
             <wp:cNvGraphicFramePr>
               <a:graphicFrameLocks xmlns:a="http://schemas.openxmlformats.org/drawingml/2006/main" noChangeAspect="1"/>
             </wp:cNvGraphicFramePr>
@@ -3910,7 +6554,7 @@
           <wp:inline distT="0" distB="0" distL="0" distR="0">
             <wp:extent cx="5715000" cy="3571875"/>
             <wp:effectExtent t="0" r="0" b="0" l="0"/>
-            <wp:docPr id="4" name="18-epic-promote-menu" descr="Task satırı menüsünde Epic'e dönüştür seçeneği" title="Task satırı menüsünde Epic'e dönüştür seçeneği"/>
+            <wp:docPr id="5" name="18-epic-promote-menu" descr="Task satırı menüsünde Epic'e dönüştür seçeneği" title="Task satırı menüsünde Epic'e dönüştür seçeneği"/>
             <wp:cNvGraphicFramePr>
               <a:graphicFrameLocks xmlns:a="http://schemas.openxmlformats.org/drawingml/2006/main" noChangeAspect="1"/>
             </wp:cNvGraphicFramePr>
@@ -4173,7 +6817,7 @@
           <wp:inline distT="0" distB="0" distL="0" distR="0">
             <wp:extent cx="4800600" cy="3209925"/>
             <wp:effectExtent t="0" r="0" b="0" l="0"/>
-            <wp:docPr id="5" name="19-epic-promote-dialog" descr="Epic'e dönüştürme onay penceresi" title="Epic'e dönüştürme onay penceresi"/>
+            <wp:docPr id="6" name="19-epic-promote-dialog" descr="Epic'e dönüştürme onay penceresi" title="Epic'e dönüştürme onay penceresi"/>
             <wp:cNvGraphicFramePr>
               <a:graphicFrameLocks xmlns:a="http://schemas.openxmlformats.org/drawingml/2006/main" noChangeAspect="1"/>
             </wp:cNvGraphicFramePr>
@@ -4524,7 +7168,7 @@
           <wp:inline distT="0" distB="0" distL="0" distR="0">
             <wp:extent cx="5715000" cy="3571875"/>
             <wp:effectExtent t="0" r="0" b="0" l="0"/>
-            <wp:docPr id="6" name="20-epic-result" descr="Dönüşümden sonra liste" title="Dönüşümden sonra liste"/>
+            <wp:docPr id="7" name="20-epic-result" descr="Dönüşümden sonra liste" title="Dönüşümden sonra liste"/>
             <wp:cNvGraphicFramePr>
               <a:graphicFrameLocks xmlns:a="http://schemas.openxmlformats.org/drawingml/2006/main" noChangeAspect="1"/>
             </wp:cNvGraphicFramePr>
@@ -5809,7 +8453,7 @@
           <wp:inline distT="0" distB="0" distL="0" distR="0">
             <wp:extent cx="5715000" cy="3571875"/>
             <wp:effectExtent t="0" r="0" b="0" l="0"/>
-            <wp:docPr id="7" name="10-task-create" descr="Listede hızlı Task ekleme satırı" title="Listede hızlı Task ekleme satırı"/>
+            <wp:docPr id="8" name="10-task-create" descr="Listede hızlı Task ekleme satırı" title="Listede hızlı Task ekleme satırı"/>
             <wp:cNvGraphicFramePr>
               <a:graphicFrameLocks xmlns:a="http://schemas.openxmlformats.org/drawingml/2006/main" noChangeAspect="1"/>
             </wp:cNvGraphicFramePr>
@@ -6424,7 +9068,7 @@
           <wp:inline distT="0" distB="0" distL="0" distR="0">
             <wp:extent cx="5353050" cy="4095750"/>
             <wp:effectExtent t="0" r="0" b="0" l="0"/>
-            <wp:docPr id="8" name="11-task-edit" descr="Task detay paneli ve düzenlenebilir alanlar" title="Task detay paneli ve düzenlenebilir alanlar"/>
+            <wp:docPr id="9" name="11-task-edit" descr="Task detay paneli ve düzenlenebilir alanlar" title="Task detay paneli ve düzenlenebilir alanlar"/>
             <wp:cNvGraphicFramePr>
               <a:graphicFrameLocks xmlns:a="http://schemas.openxmlformats.org/drawingml/2006/main" noChangeAspect="1"/>
             </wp:cNvGraphicFramePr>
@@ -8184,7 +10828,7 @@
           <wp:inline distT="0" distB="0" distL="0" distR="0">
             <wp:extent cx="5715000" cy="3571875"/>
             <wp:effectExtent t="0" r="0" b="0" l="0"/>
-            <wp:docPr id="9" name="17-task-status" descr="Listeden durum değiştirme menüsü" title="Listeden durum değiştirme menüsü"/>
+            <wp:docPr id="10" name="17-task-status" descr="Listeden durum değiştirme menüsü" title="Listeden durum değiştirme menüsü"/>
             <wp:cNvGraphicFramePr>
               <a:graphicFrameLocks xmlns:a="http://schemas.openxmlformats.org/drawingml/2006/main" noChangeAspect="1"/>
             </wp:cNvGraphicFramePr>
@@ -9035,7 +11679,7 @@
           <wp:inline distT="0" distB="0" distL="0" distR="0">
             <wp:extent cx="5715000" cy="3571875"/>
             <wp:effectExtent t="0" r="0" b="0" l="0"/>
-            <wp:docPr id="10" name="12-subtask-menu" descr="Task satırı menüsünde Alt öğe ekle seçeneği" title="Task satırı menüsünde Alt öğe ekle seçeneği"/>
+            <wp:docPr id="11" name="12-subtask-menu" descr="Task satırı menüsünde Alt öğe ekle seçeneği" title="Task satırı menüsünde Alt öğe ekle seçeneği"/>
             <wp:cNvGraphicFramePr>
               <a:graphicFrameLocks xmlns:a="http://schemas.openxmlformats.org/drawingml/2006/main" noChangeAspect="1"/>
             </wp:cNvGraphicFramePr>
@@ -9298,7 +11942,7 @@
           <wp:inline distT="0" distB="0" distL="0" distR="0">
             <wp:extent cx="5715000" cy="3571875"/>
             <wp:effectExtent t="0" r="0" b="0" l="0"/>
-            <wp:docPr id="11" name="13-subtask-create" descr="Sub-Task ekleme satırı" title="Sub-Task ekleme satırı"/>
+            <wp:docPr id="12" name="13-subtask-create" descr="Sub-Task ekleme satırı" title="Sub-Task ekleme satırı"/>
             <wp:cNvGraphicFramePr>
               <a:graphicFrameLocks xmlns:a="http://schemas.openxmlformats.org/drawingml/2006/main" noChangeAspect="1"/>
             </wp:cNvGraphicFramePr>
@@ -9649,7 +12293,7 @@
           <wp:inline distT="0" distB="0" distL="0" distR="0">
             <wp:extent cx="5715000" cy="3571875"/>
             <wp:effectExtent t="0" r="0" b="0" l="0"/>
-            <wp:docPr id="12" name="14-subtask-list" descr="Üst Task'ın altında listelenen Sub-Task'lar" title="Üst Task'ın altında listelenen Sub-Task'lar"/>
+            <wp:docPr id="13" name="14-subtask-list" descr="Üst Task'ın altında listelenen Sub-Task'lar" title="Üst Task'ın altında listelenen Sub-Task'lar"/>
             <wp:cNvGraphicFramePr>
               <a:graphicFrameLocks xmlns:a="http://schemas.openxmlformats.org/drawingml/2006/main" noChangeAspect="1"/>
             </wp:cNvGraphicFramePr>
@@ -10349,7 +12993,7 @@
           <wp:inline distT="0" distB="0" distL="0" distR="0">
             <wp:extent cx="5715000" cy="3571875"/>
             <wp:effectExtent t="0" r="0" b="0" l="0"/>
-            <wp:docPr id="13" name="15-subtask-edit" descr="Sub-Task detay sayfası" title="Sub-Task detay sayfası"/>
+            <wp:docPr id="14" name="15-subtask-edit" descr="Sub-Task detay sayfası" title="Sub-Task detay sayfası"/>
             <wp:cNvGraphicFramePr>
               <a:graphicFrameLocks xmlns:a="http://schemas.openxmlformats.org/drawingml/2006/main" noChangeAspect="1"/>
             </wp:cNvGraphicFramePr>
@@ -10801,7 +13445,7 @@
           <wp:inline distT="0" distB="0" distL="0" distR="0">
             <wp:extent cx="5715000" cy="3571875"/>
             <wp:effectExtent t="0" r="0" b="0" l="0"/>
-            <wp:docPr id="14" name="16-task-rollup" descr="Üst Task'ta Sub-Task toplamı" title="Üst Task'ta Sub-Task toplamı"/>
+            <wp:docPr id="15" name="16-task-rollup" descr="Üst Task'ta Sub-Task toplamı" title="Üst Task'ta Sub-Task toplamı"/>
             <wp:cNvGraphicFramePr>
               <a:graphicFrameLocks xmlns:a="http://schemas.openxmlformats.org/drawingml/2006/main" noChangeAspect="1"/>
             </wp:cNvGraphicFramePr>
@@ -11146,7 +13790,7 @@
         <w:pStyle w:val="ListParagraph"/>
         <w:numPr>
           <w:ilvl w:val="0"/>
-          <w:numId w:val="3"/>
+          <w:numId w:val="2"/>
         </w:numPr>
         <w:spacing w:after="80" w:line="290"/>
       </w:pPr>
@@ -11182,7 +13826,7 @@
         <w:pStyle w:val="ListParagraph"/>
         <w:numPr>
           <w:ilvl w:val="0"/>
-          <w:numId w:val="3"/>
+          <w:numId w:val="2"/>
         </w:numPr>
         <w:spacing w:after="80" w:line="290"/>
       </w:pPr>
@@ -11218,7 +13862,7 @@
         <w:pStyle w:val="ListParagraph"/>
         <w:numPr>
           <w:ilvl w:val="0"/>
-          <w:numId w:val="3"/>
+          <w:numId w:val="2"/>
         </w:numPr>
         <w:spacing w:after="80" w:line="290"/>
       </w:pPr>
@@ -11547,7 +14191,7 @@
           <wp:inline distT="0" distB="0" distL="0" distR="0">
             <wp:extent cx="5715000" cy="3571875"/>
             <wp:effectExtent t="0" r="0" b="0" l="0"/>
-            <wp:docPr id="15" name="28-dnd" descr="Bir Task sürüklenirken hedef Task ve Ayır alanı" title="Bir Task sürüklenirken hedef Task ve Ayır alanı"/>
+            <wp:docPr id="16" name="28-dnd" descr="Bir Task sürüklenirken hedef Task ve Ayır alanı" title="Bir Task sürüklenirken hedef Task ve Ayır alanı"/>
             <wp:cNvGraphicFramePr>
               <a:graphicFrameLocks xmlns:a="http://schemas.openxmlformats.org/drawingml/2006/main" noChangeAspect="1"/>
             </wp:cNvGraphicFramePr>
@@ -11943,7 +14587,7 @@
           <wp:inline distT="0" distB="0" distL="0" distR="0">
             <wp:extent cx="5715000" cy="3571875"/>
             <wp:effectExtent t="0" r="0" b="0" l="0"/>
-            <wp:docPr id="16" name="20-backlog" descr="Backlog ve sprint'ler sayfası" title="Backlog ve sprint'ler sayfası"/>
+            <wp:docPr id="17" name="20-backlog" descr="Backlog ve sprint'ler sayfası" title="Backlog ve sprint'ler sayfası"/>
             <wp:cNvGraphicFramePr>
               <a:graphicFrameLocks xmlns:a="http://schemas.openxmlformats.org/drawingml/2006/main" noChangeAspect="1"/>
             </wp:cNvGraphicFramePr>
@@ -12551,7 +15195,7 @@
           <wp:inline distT="0" distB="0" distL="0" distR="0">
             <wp:extent cx="4552950" cy="4095750"/>
             <wp:effectExtent t="0" r="0" b="0" l="0"/>
-            <wp:docPr id="17" name="21-sprint-create" descr="Yeni Sprint oluşturma penceresi" title="Yeni Sprint oluşturma penceresi"/>
+            <wp:docPr id="18" name="21-sprint-create" descr="Yeni Sprint oluşturma penceresi" title="Yeni Sprint oluşturma penceresi"/>
             <wp:cNvGraphicFramePr>
               <a:graphicFrameLocks xmlns:a="http://schemas.openxmlformats.org/drawingml/2006/main" noChangeAspect="1"/>
             </wp:cNvGraphicFramePr>
@@ -13850,7 +16494,7 @@
           <wp:inline distT="0" distB="0" distL="0" distR="0">
             <wp:extent cx="5715000" cy="3571875"/>
             <wp:effectExtent t="0" r="0" b="0" l="0"/>
-            <wp:docPr id="18" name="22-sprint-move" descr="Task'ı Sprint'e taşıma menüsü" title="Task'ı Sprint'e taşıma menüsü"/>
+            <wp:docPr id="19" name="22-sprint-move" descr="Task'ı Sprint'e taşıma menüsü" title="Task'ı Sprint'e taşıma menüsü"/>
             <wp:cNvGraphicFramePr>
               <a:graphicFrameLocks xmlns:a="http://schemas.openxmlformats.org/drawingml/2006/main" noChangeAspect="1"/>
             </wp:cNvGraphicFramePr>
@@ -14125,7 +16769,7 @@
         <w:pStyle w:val="ListParagraph"/>
         <w:numPr>
           <w:ilvl w:val="0"/>
-          <w:numId w:val="3"/>
+          <w:numId w:val="2"/>
         </w:numPr>
         <w:spacing w:after="80" w:line="290"/>
       </w:pPr>
@@ -14161,7 +16805,7 @@
         <w:pStyle w:val="ListParagraph"/>
         <w:numPr>
           <w:ilvl w:val="0"/>
-          <w:numId w:val="3"/>
+          <w:numId w:val="2"/>
         </w:numPr>
         <w:spacing w:after="80" w:line="290"/>
       </w:pPr>
@@ -14215,7 +16859,7 @@
         <w:pStyle w:val="ListParagraph"/>
         <w:numPr>
           <w:ilvl w:val="0"/>
-          <w:numId w:val="3"/>
+          <w:numId w:val="2"/>
         </w:numPr>
         <w:spacing w:after="80" w:line="290"/>
       </w:pPr>
@@ -14490,7 +17134,7 @@
           <wp:inline distT="0" distB="0" distL="0" distR="0">
             <wp:extent cx="5715000" cy="3571875"/>
             <wp:effectExtent t="0" r="0" b="0" l="0"/>
-            <wp:docPr id="19" name="23-sprint-menu" descr="Sprint menüsü" title="Sprint menüsü"/>
+            <wp:docPr id="20" name="23-sprint-menu" descr="Sprint menüsü" title="Sprint menüsü"/>
             <wp:cNvGraphicFramePr>
               <a:graphicFrameLocks xmlns:a="http://schemas.openxmlformats.org/drawingml/2006/main" noChangeAspect="1"/>
             </wp:cNvGraphicFramePr>
@@ -14859,7 +17503,7 @@
           <wp:inline distT="0" distB="0" distL="0" distR="0">
             <wp:extent cx="4552950" cy="4095750"/>
             <wp:effectExtent t="0" r="0" b="0" l="0"/>
-            <wp:docPr id="20" name="24-sprint-edit" descr="Sprint düzenleme penceresi" title="Sprint düzenleme penceresi"/>
+            <wp:docPr id="21" name="24-sprint-edit" descr="Sprint düzenleme penceresi" title="Sprint düzenleme penceresi"/>
             <wp:cNvGraphicFramePr>
               <a:graphicFrameLocks xmlns:a="http://schemas.openxmlformats.org/drawingml/2006/main" noChangeAspect="1"/>
             </wp:cNvGraphicFramePr>
@@ -15311,7 +17955,7 @@
           <wp:inline distT="0" distB="0" distL="0" distR="0">
             <wp:extent cx="5715000" cy="1743075"/>
             <wp:effectExtent t="0" r="0" b="0" l="0"/>
-            <wp:docPr id="21" name="25-sprint-header" descr="Sprint başlığı ve özet paneli" title="Sprint başlığı ve özet paneli"/>
+            <wp:docPr id="22" name="25-sprint-header" descr="Sprint başlığı ve özet paneli" title="Sprint başlığı ve özet paneli"/>
             <wp:cNvGraphicFramePr>
               <a:graphicFrameLocks xmlns:a="http://schemas.openxmlformats.org/drawingml/2006/main" noChangeAspect="1"/>
             </wp:cNvGraphicFramePr>
@@ -15850,7 +18494,7 @@
         <w:pStyle w:val="ListParagraph"/>
         <w:numPr>
           <w:ilvl w:val="0"/>
-          <w:numId w:val="3"/>
+          <w:numId w:val="2"/>
         </w:numPr>
         <w:spacing w:after="80" w:line="290"/>
       </w:pPr>
@@ -15886,7 +18530,7 @@
         <w:pStyle w:val="ListParagraph"/>
         <w:numPr>
           <w:ilvl w:val="0"/>
-          <w:numId w:val="3"/>
+          <w:numId w:val="2"/>
         </w:numPr>
         <w:spacing w:after="80" w:line="290"/>
       </w:pPr>
@@ -15958,7 +18602,7 @@
         <w:pStyle w:val="ListParagraph"/>
         <w:numPr>
           <w:ilvl w:val="0"/>
-          <w:numId w:val="3"/>
+          <w:numId w:val="2"/>
         </w:numPr>
         <w:spacing w:after="80" w:line="290"/>
       </w:pPr>
@@ -15994,7 +18638,7 @@
         <w:pStyle w:val="ListParagraph"/>
         <w:numPr>
           <w:ilvl w:val="0"/>
-          <w:numId w:val="3"/>
+          <w:numId w:val="2"/>
         </w:numPr>
         <w:spacing w:after="80" w:line="290"/>
       </w:pPr>
@@ -16228,7 +18872,7 @@
           <wp:inline distT="0" distB="0" distL="0" distR="0">
             <wp:extent cx="5715000" cy="3571875"/>
             <wp:effectExtent t="0" r="0" b="0" l="0"/>
-            <wp:docPr id="22" name="26-board" descr="Sprint panosu (Kanban)" title="Sprint panosu (Kanban)"/>
+            <wp:docPr id="23" name="26-board" descr="Sprint panosu (Kanban)" title="Sprint panosu (Kanban)"/>
             <wp:cNvGraphicFramePr>
               <a:graphicFrameLocks xmlns:a="http://schemas.openxmlformats.org/drawingml/2006/main" noChangeAspect="1"/>
             </wp:cNvGraphicFramePr>
@@ -16679,7 +19323,7 @@
         <w:pStyle w:val="ListParagraph"/>
         <w:numPr>
           <w:ilvl w:val="0"/>
-          <w:numId w:val="3"/>
+          <w:numId w:val="2"/>
         </w:numPr>
         <w:spacing w:after="80" w:line="290"/>
       </w:pPr>
@@ -16733,7 +19377,7 @@
         <w:pStyle w:val="ListParagraph"/>
         <w:numPr>
           <w:ilvl w:val="0"/>
-          <w:numId w:val="3"/>
+          <w:numId w:val="2"/>
         </w:numPr>
         <w:spacing w:after="80" w:line="290"/>
       </w:pPr>
@@ -16805,7 +19449,7 @@
         <w:pStyle w:val="ListParagraph"/>
         <w:numPr>
           <w:ilvl w:val="0"/>
-          <w:numId w:val="3"/>
+          <w:numId w:val="2"/>
         </w:numPr>
         <w:spacing w:after="80" w:line="290"/>
       </w:pPr>
@@ -16868,7 +19512,7 @@
           <w:sz w:val="22"/>
           <w:szCs w:val="22"/>
         </w:rPr>
-        <w:t xml:space="preserve">Bug’lar görev listesinde görünmez; kendi ekranları vardır. Sprint panosunda (ve Kanban board’da) sağ üstteki kırmızı </w:t>
+        <w:t xml:space="preserve">Bug’lar görev listesinde görünmez; kendi ekranları vardır. Sayfanın üstündeki sekmelerde </w:t>
       </w:r>
       <w:r>
         <w:rPr>
@@ -16878,6 +19522,24 @@
           <w:sz w:val="22"/>
           <w:szCs w:val="22"/>
         </w:rPr>
+        <w:t xml:space="preserve">Raporlar</w:t>
+      </w:r>
+      <w:r>
+        <w:rPr>
+          <w:rFonts w:ascii="Calibri" w:cs="Calibri" w:eastAsia="Calibri" w:hAnsi="Calibri"/>
+          <w:sz w:val="22"/>
+          <w:szCs w:val="22"/>
+        </w:rPr>
+        <w:t xml:space="preserve">’ın yanındaki kırmızı </w:t>
+      </w:r>
+      <w:r>
+        <w:rPr>
+          <w:rFonts w:ascii="Calibri" w:cs="Calibri" w:eastAsia="Calibri" w:hAnsi="Calibri"/>
+          <w:b/>
+          <w:bCs/>
+          <w:sz w:val="22"/>
+          <w:szCs w:val="22"/>
+        </w:rPr>
         <w:t xml:space="preserve">Bugs</w:t>
       </w:r>
       <w:r>
@@ -16886,7 +19548,25 @@
           <w:sz w:val="22"/>
           <w:szCs w:val="22"/>
         </w:rPr>
-        <w:t xml:space="preserve"> düğmesine tıklayınca açılır. Düğmedeki sayı açık Bug sayısıdır.</w:t>
+        <w:t xml:space="preserve"> sekmesine tıklayınca açılır (Kanban board’da sağ üstteki kırmızı </w:t>
+      </w:r>
+      <w:r>
+        <w:rPr>
+          <w:rFonts w:ascii="Calibri" w:cs="Calibri" w:eastAsia="Calibri" w:hAnsi="Calibri"/>
+          <w:b/>
+          <w:bCs/>
+          <w:sz w:val="22"/>
+          <w:szCs w:val="22"/>
+        </w:rPr>
+        <w:t xml:space="preserve">Bugs</w:t>
+      </w:r>
+      <w:r>
+        <w:rPr>
+          <w:rFonts w:ascii="Calibri" w:cs="Calibri" w:eastAsia="Calibri" w:hAnsi="Calibri"/>
+          <w:sz w:val="22"/>
+          <w:szCs w:val="22"/>
+        </w:rPr>
+        <w:t xml:space="preserve"> düğmesi). Sekmedeki sayı açık Bug sayısıdır.</w:t>
       </w:r>
     </w:p>
     <w:p>
@@ -16904,7 +19584,7 @@
           <w:sz w:val="22"/>
           <w:szCs w:val="22"/>
         </w:rPr>
-        <w:t xml:space="preserve">Kırmızı </w:t>
+        <w:t xml:space="preserve">Üstteki sekmelerden kırmızı </w:t>
       </w:r>
       <w:r>
         <w:rPr>
@@ -16922,7 +19602,7 @@
           <w:sz w:val="22"/>
           <w:szCs w:val="22"/>
         </w:rPr>
-        <w:t xml:space="preserve"> düğmesine tıkla. (Ya da </w:t>
+        <w:t xml:space="preserve">’a tıkla. (Ya da </w:t>
       </w:r>
       <w:r>
         <w:rPr>
@@ -17301,7 +19981,7 @@
           <wp:inline distT="0" distB="0" distL="0" distR="0">
             <wp:extent cx="5715000" cy="3571875"/>
             <wp:effectExtent t="0" r="0" b="0" l="0"/>
-            <wp:docPr id="23" name="27-bugs" descr="Bug ekranı" title="Bug ekranı"/>
+            <wp:docPr id="24" name="27-bugs" descr="Bug ekranı" title="Bug ekranı"/>
             <wp:cNvGraphicFramePr>
               <a:graphicFrameLocks xmlns:a="http://schemas.openxmlformats.org/drawingml/2006/main" noChangeAspect="1"/>
             </wp:cNvGraphicFramePr>
@@ -17454,7 +20134,7 @@
                 <w:sz w:val="21"/>
                 <w:szCs w:val="21"/>
               </w:rPr>
-              <w:t xml:space="preserve">: Sprint panosundaki kırmızı </w:t>
+              <w:t xml:space="preserve">: Raporlar’ın yanındaki kırmızı </w:t>
             </w:r>
             <w:r>
               <w:rPr>
@@ -17472,7 +20152,7 @@
                 <w:sz w:val="21"/>
                 <w:szCs w:val="21"/>
               </w:rPr>
-              <w:t xml:space="preserve"> düğmesiyle açılan ekran.</w:t>
+              <w:t xml:space="preserve"> sekmesiyle açılan ekran.</w:t>
             </w:r>
           </w:p>
         </w:tc>
@@ -17941,7 +20621,7 @@
           <w:sz w:val="22"/>
           <w:szCs w:val="22"/>
         </w:rPr>
-        <w:t xml:space="preserve">Task</w:t>
+        <w:t xml:space="preserve">Sprint</w:t>
       </w:r>
       <w:r>
         <w:rPr>
@@ -17959,15 +20639,15 @@
           <w:sz w:val="22"/>
           <w:szCs w:val="22"/>
         </w:rPr>
-        <w:t xml:space="preserve">Epic</w:t>
-      </w:r>
-      <w:r>
-        <w:rPr>
-          <w:rFonts w:ascii="Calibri" w:cs="Calibri" w:eastAsia="Calibri" w:hAnsi="Calibri"/>
-          <w:sz w:val="22"/>
-          <w:szCs w:val="22"/>
-        </w:rPr>
-        <w:t xml:space="preserve"> veya </w:t>
+        <w:t xml:space="preserve">Task</w:t>
+      </w:r>
+      <w:r>
+        <w:rPr>
+          <w:rFonts w:ascii="Calibri" w:cs="Calibri" w:eastAsia="Calibri" w:hAnsi="Calibri"/>
+          <w:sz w:val="22"/>
+          <w:szCs w:val="22"/>
+        </w:rPr>
+        <w:t xml:space="preserve">, </w:t>
       </w:r>
       <w:r>
         <w:rPr>
@@ -17977,6 +20657,24 @@
           <w:sz w:val="22"/>
           <w:szCs w:val="22"/>
         </w:rPr>
+        <w:t xml:space="preserve">Epic</w:t>
+      </w:r>
+      <w:r>
+        <w:rPr>
+          <w:rFonts w:ascii="Calibri" w:cs="Calibri" w:eastAsia="Calibri" w:hAnsi="Calibri"/>
+          <w:sz w:val="22"/>
+          <w:szCs w:val="22"/>
+        </w:rPr>
+        <w:t xml:space="preserve"> veya </w:t>
+      </w:r>
+      <w:r>
+        <w:rPr>
+          <w:rFonts w:ascii="Calibri" w:cs="Calibri" w:eastAsia="Calibri" w:hAnsi="Calibri"/>
+          <w:b/>
+          <w:bCs/>
+          <w:sz w:val="22"/>
+          <w:szCs w:val="22"/>
+        </w:rPr>
         <w:t xml:space="preserve">Bug</w:t>
       </w:r>
       <w:r>
@@ -17985,7 +20683,25 @@
           <w:sz w:val="22"/>
           <w:szCs w:val="22"/>
         </w:rPr>
-        <w:t xml:space="preserve">. Yeni Proje sol menüdeki </w:t>
+        <w:t xml:space="preserve">. </w:t>
+      </w:r>
+      <w:r>
+        <w:rPr>
+          <w:rFonts w:ascii="Calibri" w:cs="Calibri" w:eastAsia="Calibri" w:hAnsi="Calibri"/>
+          <w:b/>
+          <w:bCs/>
+          <w:sz w:val="22"/>
+          <w:szCs w:val="22"/>
+        </w:rPr>
+        <w:t xml:space="preserve">Sprint</w:t>
+      </w:r>
+      <w:r>
+        <w:rPr>
+          <w:rFonts w:ascii="Calibri" w:cs="Calibri" w:eastAsia="Calibri" w:hAnsi="Calibri"/>
+          <w:sz w:val="22"/>
+          <w:szCs w:val="22"/>
+        </w:rPr>
+        <w:t xml:space="preserve">, Backlog sayfasındaki Sprint oluştur penceresini açar. Yeni Proje sol menüdeki </w:t>
       </w:r>
       <w:r>
         <w:rPr>
@@ -18166,7 +20882,7 @@
           <wp:inline distT="0" distB="0" distL="0" distR="0">
             <wp:extent cx="5715000" cy="3571875"/>
             <wp:effectExtent t="0" r="0" b="0" l="0"/>
-            <wp:docPr id="24" name="22-new-menu" descr="New menüsü" title="New menüsü"/>
+            <wp:docPr id="25" name="22-new-menu" descr="New menüsü" title="New menüsü"/>
             <wp:cNvGraphicFramePr>
               <a:graphicFrameLocks xmlns:a="http://schemas.openxmlformats.org/drawingml/2006/main" noChangeAspect="1"/>
             </wp:cNvGraphicFramePr>
@@ -18399,15 +21115,15 @@
                 <w:sz w:val="21"/>
                 <w:szCs w:val="21"/>
               </w:rPr>
-              <w:t xml:space="preserve">Task</w:t>
-            </w:r>
-            <w:r>
-              <w:rPr>
-                <w:rFonts w:ascii="Calibri" w:cs="Calibri" w:eastAsia="Calibri" w:hAnsi="Calibri"/>
-                <w:sz w:val="21"/>
-                <w:szCs w:val="21"/>
-              </w:rPr>
-              <w:t xml:space="preserve">: Sprint için bir iş parçası.</w:t>
+              <w:t xml:space="preserve">Sprint</w:t>
+            </w:r>
+            <w:r>
+              <w:rPr>
+                <w:rFonts w:ascii="Calibri" w:cs="Calibri" w:eastAsia="Calibri" w:hAnsi="Calibri"/>
+                <w:sz w:val="21"/>
+                <w:szCs w:val="21"/>
+              </w:rPr>
+              <w:t xml:space="preserve">: Bir Proje için yeni sprint planla (adı, hedefi ve tarihleri).</w:t>
             </w:r>
           </w:p>
         </w:tc>
@@ -18448,6 +21164,94 @@
                 <w:shd w:fill="E11D48" w:color="auto" w:val="clear"/>
               </w:rPr>
               <w:t xml:space="preserve"> 3 </w:t>
+            </w:r>
+          </w:p>
+        </w:tc>
+        <w:tc>
+          <w:tcPr>
+            <w:tcW w:type="dxa" w:w="9078"/>
+            <w:tcBorders>
+              <w:top w:val="none" w:color="FFFFFF" w:sz="0"/>
+              <w:left w:val="none" w:color="FFFFFF" w:sz="0"/>
+              <w:bottom w:val="none" w:color="FFFFFF" w:sz="0"/>
+              <w:right w:val="none" w:color="FFFFFF" w:sz="0"/>
+            </w:tcBorders>
+            <w:tcMar>
+              <w:top w:type="dxa" w:w="40"/>
+              <w:left w:type="dxa" w:w="60"/>
+              <w:bottom w:type="dxa" w:w="40"/>
+              <w:right w:type="dxa" w:w="40"/>
+            </w:tcMar>
+          </w:tcPr>
+          <w:p>
+            <w:pPr>
+              <w:spacing w:after="0"/>
+            </w:pPr>
+            <w:r>
+              <w:rPr>
+                <w:rFonts w:ascii="Calibri" w:cs="Calibri" w:eastAsia="Calibri" w:hAnsi="Calibri"/>
+                <w:sz w:val="21"/>
+                <w:szCs w:val="21"/>
+              </w:rPr>
+              <w:t xml:space="preserve"/>
+            </w:r>
+            <w:r>
+              <w:rPr>
+                <w:rFonts w:ascii="Calibri" w:cs="Calibri" w:eastAsia="Calibri" w:hAnsi="Calibri"/>
+                <w:b/>
+                <w:bCs/>
+                <w:sz w:val="21"/>
+                <w:szCs w:val="21"/>
+              </w:rPr>
+              <w:t xml:space="preserve">Task</w:t>
+            </w:r>
+            <w:r>
+              <w:rPr>
+                <w:rFonts w:ascii="Calibri" w:cs="Calibri" w:eastAsia="Calibri" w:hAnsi="Calibri"/>
+                <w:sz w:val="21"/>
+                <w:szCs w:val="21"/>
+              </w:rPr>
+              <w:t xml:space="preserve">: Sprint için bir iş parçası.</w:t>
+            </w:r>
+          </w:p>
+        </w:tc>
+      </w:tr>
+      <w:tr>
+        <w:trPr>
+          <w:cantSplit/>
+        </w:trPr>
+        <w:tc>
+          <w:tcPr>
+            <w:tcW w:type="dxa" w:w="560"/>
+            <w:tcBorders>
+              <w:top w:val="none" w:color="FFFFFF" w:sz="0"/>
+              <w:left w:val="none" w:color="FFFFFF" w:sz="0"/>
+              <w:bottom w:val="none" w:color="FFFFFF" w:sz="0"/>
+              <w:right w:val="none" w:color="FFFFFF" w:sz="0"/>
+            </w:tcBorders>
+            <w:tcMar>
+              <w:top w:type="dxa" w:w="40"/>
+              <w:left w:type="dxa" w:w="40"/>
+              <w:bottom w:type="dxa" w:w="40"/>
+              <w:right w:type="dxa" w:w="60"/>
+            </w:tcMar>
+            <w:vAlign w:val="top"/>
+          </w:tcPr>
+          <w:p>
+            <w:pPr>
+              <w:jc w:val="center"/>
+            </w:pPr>
+            <w:r>
+              <w:rPr>
+                <w:rFonts w:ascii="Calibri" w:cs="Calibri" w:eastAsia="Calibri" w:hAnsi="Calibri"/>
+                <w:b/>
+                <w:bCs/>
+                <w:color w:val="FFFFFF"/>
+                <w:sz w:val="22"/>
+                <w:szCs w:val="22"/>
+                <w:shd w:fill="E11D48" w:color="auto" w:val="clear"/>
+              </w:rPr>
+              <w:t xml:space="preserve"> 4 </w:t>
             </w:r>
           </w:p>
         </w:tc>
@@ -18943,7 +21747,7 @@
           <wp:inline distT="0" distB="0" distL="0" distR="0">
             <wp:extent cx="5029200" cy="4095750"/>
             <wp:effectExtent t="0" r="0" b="0" l="0"/>
-            <wp:docPr id="25" name="23-share" descr="Sharing and permissions penceresi" title="Sharing and permissions penceresi"/>
+            <wp:docPr id="26" name="23-share" descr="Sharing and permissions penceresi" title="Sharing and permissions penceresi"/>
             <wp:cNvGraphicFramePr>
               <a:graphicFrameLocks xmlns:a="http://schemas.openxmlformats.org/drawingml/2006/main" noChangeAspect="1"/>
             </wp:cNvGraphicFramePr>
@@ -19803,7 +22607,7 @@
           <wp:inline distT="0" distB="0" distL="0" distR="0">
             <wp:extent cx="5715000" cy="3571875"/>
             <wp:effectExtent t="0" r="0" b="0" l="0"/>
-            <wp:docPr id="26" name="24-roles" descr="Roller ve yetkiler tablosu" title="Roller ve yetkiler tablosu"/>
+            <wp:docPr id="27" name="24-roles" descr="Roller ve yetkiler tablosu" title="Roller ve yetkiler tablosu"/>
             <wp:cNvGraphicFramePr>
               <a:graphicFrameLocks xmlns:a="http://schemas.openxmlformats.org/drawingml/2006/main" noChangeAspect="1"/>
             </wp:cNvGraphicFramePr>
@@ -20333,7 +23137,7 @@
         <w:pStyle w:val="ListParagraph"/>
         <w:numPr>
           <w:ilvl w:val="0"/>
-          <w:numId w:val="3"/>
+          <w:numId w:val="2"/>
         </w:numPr>
         <w:spacing w:after="80" w:line="290"/>
       </w:pPr>
@@ -20387,7 +23191,7 @@
         <w:pStyle w:val="ListParagraph"/>
         <w:numPr>
           <w:ilvl w:val="0"/>
-          <w:numId w:val="3"/>
+          <w:numId w:val="2"/>
         </w:numPr>
         <w:spacing w:after="80" w:line="290"/>
       </w:pPr>
@@ -20441,7 +23245,7 @@
         <w:pStyle w:val="ListParagraph"/>
         <w:numPr>
           <w:ilvl w:val="0"/>
-          <w:numId w:val="3"/>
+          <w:numId w:val="2"/>
         </w:numPr>
         <w:spacing w:after="80" w:line="290"/>
       </w:pPr>
@@ -20477,7 +23281,7 @@
         <w:pStyle w:val="ListParagraph"/>
         <w:numPr>
           <w:ilvl w:val="0"/>
-          <w:numId w:val="3"/>
+          <w:numId w:val="2"/>
         </w:numPr>
         <w:spacing w:after="80" w:line="290"/>
       </w:pPr>
@@ -20824,7 +23628,7 @@
           <wp:inline distT="0" distB="0" distL="0" distR="0">
             <wp:extent cx="5715000" cy="3571875"/>
             <wp:effectExtent t="0" r="0" b="0" l="0"/>
-            <wp:docPr id="27" name="25-kanban" descr="Proje Kanban board" title="Proje Kanban board"/>
+            <wp:docPr id="28" name="25-kanban" descr="Proje Kanban board" title="Proje Kanban board"/>
             <wp:cNvGraphicFramePr>
               <a:graphicFrameLocks xmlns:a="http://schemas.openxmlformats.org/drawingml/2006/main" noChangeAspect="1"/>
             </wp:cNvGraphicFramePr>
@@ -22047,7 +24851,7 @@
         <w:pStyle w:val="ListParagraph"/>
         <w:numPr>
           <w:ilvl w:val="0"/>
-          <w:numId w:val="3"/>
+          <w:numId w:val="2"/>
         </w:numPr>
         <w:spacing w:after="80" w:line="290"/>
       </w:pPr>
@@ -22083,7 +24887,7 @@
         <w:pStyle w:val="ListParagraph"/>
         <w:numPr>
           <w:ilvl w:val="0"/>
-          <w:numId w:val="3"/>
+          <w:numId w:val="2"/>
         </w:numPr>
         <w:spacing w:after="80" w:line="290"/>
       </w:pPr>
@@ -22119,7 +24923,7 @@
         <w:pStyle w:val="ListParagraph"/>
         <w:numPr>
           <w:ilvl w:val="0"/>
-          <w:numId w:val="3"/>
+          <w:numId w:val="2"/>
         </w:numPr>
         <w:spacing w:after="80" w:line="290"/>
       </w:pPr>
@@ -22155,7 +24959,7 @@
         <w:pStyle w:val="ListParagraph"/>
         <w:numPr>
           <w:ilvl w:val="0"/>
-          <w:numId w:val="3"/>
+          <w:numId w:val="2"/>
         </w:numPr>
         <w:spacing w:after="80" w:line="290"/>
       </w:pPr>
@@ -22191,7 +24995,7 @@
         <w:pStyle w:val="ListParagraph"/>
         <w:numPr>
           <w:ilvl w:val="0"/>
-          <w:numId w:val="3"/>
+          <w:numId w:val="2"/>
         </w:numPr>
         <w:spacing w:after="80" w:line="290"/>
       </w:pPr>
@@ -22227,7 +25031,7 @@
         <w:pStyle w:val="ListParagraph"/>
         <w:numPr>
           <w:ilvl w:val="0"/>
-          <w:numId w:val="3"/>
+          <w:numId w:val="2"/>
         </w:numPr>
         <w:spacing w:after="80" w:line="290"/>
       </w:pPr>
@@ -22281,7 +25085,7 @@
         <w:pStyle w:val="ListParagraph"/>
         <w:numPr>
           <w:ilvl w:val="0"/>
-          <w:numId w:val="3"/>
+          <w:numId w:val="2"/>
         </w:numPr>
         <w:spacing w:after="80" w:line="290"/>
       </w:pPr>
@@ -22317,7 +25121,7 @@
         <w:pStyle w:val="ListParagraph"/>
         <w:numPr>
           <w:ilvl w:val="0"/>
-          <w:numId w:val="3"/>
+          <w:numId w:val="2"/>
         </w:numPr>
         <w:spacing w:after="80" w:line="290"/>
       </w:pPr>
@@ -22930,13 +25734,13 @@
     </w:lvlOverride>
   </w:num>
   <w:num w:numId="2">
-    <w:abstractNumId w:val="3"/>
+    <w:abstractNumId w:val="2"/>
     <w:lvlOverride w:ilvl="0">
       <w:startOverride w:val="1"/>
     </w:lvlOverride>
   </w:num>
   <w:num w:numId="3">
-    <w:abstractNumId w:val="2"/>
+    <w:abstractNumId w:val="3"/>
     <w:lvlOverride w:ilvl="0">
       <w:startOverride w:val="1"/>
     </w:lvlOverride>

</xml_diff>

<commit_message>
docs: move quick tour out of in-app help into a separate presenter guide (Word)
Co-Authored-By: Claude Sonnet 5.5 <noreply@anthropic.com>
</commit_message>
<xml_diff>
--- a/apps/web/public/help/Egebis-Seyir-Kullanim-Kilavuzu.docx
+++ b/apps/web/public/help/Egebis-Seyir-Kullanim-Kilavuzu.docx
@@ -108,19 +108,6 @@
           <w:sz w:val="24"/>
           <w:szCs w:val="24"/>
         </w:rPr>
-        <w:t xml:space="preserve">Hızlı tur: Seyir’i 5 dakikada anlat (sunum için)</w:t>
-      </w:r>
-    </w:p>
-    <w:p>
-      <w:pPr>
-        <w:spacing w:after="100"/>
-      </w:pPr>
-      <w:r>
-        <w:rPr>
-          <w:rFonts w:ascii="Calibri" w:cs="Calibri" w:eastAsia="Calibri" w:hAnsi="Calibri"/>
-          <w:sz w:val="24"/>
-          <w:szCs w:val="24"/>
-        </w:rPr>
         <w:t xml:space="preserve">Başlamadan önce: temel kavramlar</w:t>
       </w:r>
     </w:p>
@@ -377,7 +364,7 @@
           <w:sz w:val="34"/>
           <w:szCs w:val="34"/>
         </w:rPr>
-        <w:t xml:space="preserve">Hızlı tur: Seyir’i 5 dakikada anlat (sunum için)</w:t>
+        <w:t xml:space="preserve">Başlamadan önce: temel kavramlar</w:t>
       </w:r>
     </w:p>
     <w:p>
@@ -390,7 +377,7 @@
           <w:sz w:val="22"/>
           <w:szCs w:val="22"/>
         </w:rPr>
-        <w:t xml:space="preserve">Bu bölüm uygulamayı hızlıca öğrenmek ve başkasına göstermek için. Uzun anlatımlar sonraki bölümlerde; burada yalnızca </w:t>
+        <w:t xml:space="preserve">Seyir, ekibin işlerini planladığı ve takip ettiği bir proje yönetimi uygulamasıdır. Bu kılavuz hiç kullanmamış biri için yazıldı: her adımda ekranın neresine bakacağını, kırmızı </w:t>
       </w:r>
       <w:r>
         <w:rPr>
@@ -400,129 +387,29 @@
           <w:sz w:val="22"/>
           <w:szCs w:val="22"/>
         </w:rPr>
-        <w:t xml:space="preserve">ne gösterip ne söyleyeceğin</w:t>
-      </w:r>
-      <w:r>
-        <w:rPr>
-          <w:rFonts w:ascii="Calibri" w:cs="Calibri" w:eastAsia="Calibri" w:hAnsi="Calibri"/>
-          <w:sz w:val="22"/>
-          <w:szCs w:val="22"/>
-        </w:rPr>
-        <w:t xml:space="preserve"> var.</w:t>
-      </w:r>
-    </w:p>
-    <w:p>
-      <w:pPr>
-        <w:pStyle w:val="ListParagraph"/>
-        <w:numPr>
-          <w:ilvl w:val="0"/>
-          <w:numId w:val="2"/>
-        </w:numPr>
-        <w:spacing w:after="80" w:line="290"/>
-      </w:pPr>
-      <w:r>
-        <w:rPr>
-          <w:rFonts w:ascii="Calibri" w:cs="Calibri" w:eastAsia="Calibri" w:hAnsi="Calibri"/>
-          <w:sz w:val="22"/>
-          <w:szCs w:val="22"/>
-        </w:rPr>
-        <w:t xml:space="preserve"/>
-      </w:r>
-      <w:r>
-        <w:rPr>
-          <w:rFonts w:ascii="Calibri" w:cs="Calibri" w:eastAsia="Calibri" w:hAnsi="Calibri"/>
-          <w:b/>
-          <w:bCs/>
-          <w:sz w:val="22"/>
-          <w:szCs w:val="22"/>
-        </w:rPr>
-        <w:t xml:space="preserve">Seyir nedir?</w:t>
-      </w:r>
-      <w:r>
-        <w:rPr>
-          <w:rFonts w:ascii="Calibri" w:cs="Calibri" w:eastAsia="Calibri" w:hAnsi="Calibri"/>
-          <w:sz w:val="22"/>
-          <w:szCs w:val="22"/>
-        </w:rPr>
-        <w:t xml:space="preserve"> Ekibin bütün işini tek yerde planladığı, sprintlerle ilerlettiği ve takip ettiği uygulama.</w:t>
-      </w:r>
-    </w:p>
-    <w:p>
-      <w:pPr>
-        <w:pStyle w:val="ListParagraph"/>
-        <w:numPr>
-          <w:ilvl w:val="0"/>
-          <w:numId w:val="2"/>
-        </w:numPr>
-        <w:spacing w:after="80" w:line="290"/>
-      </w:pPr>
-      <w:r>
-        <w:rPr>
-          <w:rFonts w:ascii="Calibri" w:cs="Calibri" w:eastAsia="Calibri" w:hAnsi="Calibri"/>
-          <w:sz w:val="22"/>
-          <w:szCs w:val="22"/>
-        </w:rPr>
-        <w:t xml:space="preserve"/>
-      </w:r>
-      <w:r>
-        <w:rPr>
-          <w:rFonts w:ascii="Calibri" w:cs="Calibri" w:eastAsia="Calibri" w:hAnsi="Calibri"/>
-          <w:b/>
-          <w:bCs/>
-          <w:sz w:val="22"/>
-          <w:szCs w:val="22"/>
-        </w:rPr>
-        <w:t xml:space="preserve">Kimin için?</w:t>
-      </w:r>
-      <w:r>
-        <w:rPr>
-          <w:rFonts w:ascii="Calibri" w:cs="Calibri" w:eastAsia="Calibri" w:hAnsi="Calibri"/>
-          <w:sz w:val="22"/>
-          <w:szCs w:val="22"/>
-        </w:rPr>
-        <w:t xml:space="preserve"> İş yazan, iş yapan ve ilerlemeyi izleyen herkes: yönetici, ürün sahibi, yazılımcı, paydaş.</w:t>
-      </w:r>
-    </w:p>
-    <w:p>
-      <w:pPr>
-        <w:pStyle w:val="ListParagraph"/>
-        <w:numPr>
-          <w:ilvl w:val="0"/>
-          <w:numId w:val="2"/>
-        </w:numPr>
-        <w:spacing w:after="80" w:line="290"/>
-      </w:pPr>
-      <w:r>
-        <w:rPr>
-          <w:rFonts w:ascii="Calibri" w:cs="Calibri" w:eastAsia="Calibri" w:hAnsi="Calibri"/>
-          <w:sz w:val="22"/>
-          <w:szCs w:val="22"/>
-        </w:rPr>
-        <w:t xml:space="preserve"/>
-      </w:r>
-      <w:r>
-        <w:rPr>
-          <w:rFonts w:ascii="Calibri" w:cs="Calibri" w:eastAsia="Calibri" w:hAnsi="Calibri"/>
-          <w:b/>
-          <w:bCs/>
-          <w:sz w:val="22"/>
-          <w:szCs w:val="22"/>
-        </w:rPr>
-        <w:t xml:space="preserve">Fark ne?</w:t>
-      </w:r>
-      <w:r>
-        <w:rPr>
-          <w:rFonts w:ascii="Calibri" w:cs="Calibri" w:eastAsia="Calibri" w:hAnsi="Calibri"/>
-          <w:sz w:val="22"/>
-          <w:szCs w:val="22"/>
-        </w:rPr>
-        <w:t xml:space="preserve"> Kendi sunucunuzda çalışır; veri kurumda kalır. Türkçe ve İngilizce.</w:t>
-      </w:r>
-    </w:p>
-    <w:p>
-      <w:pPr>
-        <w:spacing w:after="100"/>
-      </w:pPr>
+        <w:t xml:space="preserve">numaralı işaretlerle</w:t>
+      </w:r>
+      <w:r>
+        <w:rPr>
+          <w:rFonts w:ascii="Calibri" w:cs="Calibri" w:eastAsia="Calibri" w:hAnsi="Calibri"/>
+          <w:sz w:val="22"/>
+          <w:szCs w:val="22"/>
+        </w:rPr>
+        <w:t xml:space="preserve"> gösteriyoruz. Görseldeki numara, görselin altındaki listeyle birebir eşleşir.</w:t>
+      </w:r>
+    </w:p>
+    <w:p>
+      <w:pPr>
+        <w:spacing w:after="140" w:line="300"/>
+      </w:pPr>
+      <w:r>
+        <w:rPr>
+          <w:rFonts w:ascii="Calibri" w:cs="Calibri" w:eastAsia="Calibri" w:hAnsi="Calibri"/>
+          <w:sz w:val="22"/>
+          <w:szCs w:val="22"/>
+        </w:rPr>
+        <w:t xml:space="preserve">Önce şu kelimeleri bilmek yeterli (Seyir'de bunların İngilizce adları kullanılır):</w:t>
+      </w:r>
     </w:p>
     <w:tbl>
       <w:tblPr>
@@ -576,7 +463,7 @@
                 <w:sz w:val="20"/>
                 <w:szCs w:val="20"/>
               </w:rPr>
-              <w:t xml:space="preserve">Sıra</w:t>
+              <w:t xml:space="preserve">Kavram</w:t>
             </w:r>
           </w:p>
         </w:tc>
@@ -610,7 +497,7 @@
                 <w:sz w:val="20"/>
                 <w:szCs w:val="20"/>
               </w:rPr>
-              <w:t xml:space="preserve">Ekranda göster</w:t>
+              <w:t xml:space="preserve">Ne demek?</w:t>
             </w:r>
           </w:p>
         </w:tc>
@@ -644,7 +531,7 @@
                 <w:sz w:val="20"/>
                 <w:szCs w:val="20"/>
               </w:rPr>
-              <w:t xml:space="preserve">Söyleyeceğin cümle</w:t>
+              <w:t xml:space="preserve">Örnek</w:t>
             </w:r>
           </w:p>
         </w:tc>
@@ -681,7 +568,7 @@
                 <w:sz w:val="20"/>
                 <w:szCs w:val="20"/>
               </w:rPr>
-              <w:t xml:space="preserve">1</w:t>
+              <w:t xml:space="preserve">Proje</w:t>
             </w:r>
           </w:p>
         </w:tc>
@@ -713,18 +600,30 @@
                 <w:sz w:val="20"/>
                 <w:szCs w:val="20"/>
               </w:rPr>
-              <w:t xml:space="preserve">Sol menüde </w:t>
-            </w:r>
-            <w:r>
-              <w:rPr>
-                <w:rFonts w:ascii="Calibri" w:cs="Calibri" w:eastAsia="Calibri" w:hAnsi="Calibri"/>
-                <w:b/>
-                <w:bCs/>
-                <w:sz w:val="20"/>
-                <w:szCs w:val="20"/>
-              </w:rPr>
-              <w:t xml:space="preserve">Proje oluştur</w:t>
-            </w:r>
+              <w:t xml:space="preserve">Bir ürün veya ekip için ayrılmış çalışma alanı. Bütün işler bir Proje içinde tutulur.</w:t>
+            </w:r>
+          </w:p>
+        </w:tc>
+        <w:tc>
+          <w:tcPr>
+            <w:tcW w:type="dxa" w:w="3759"/>
+            <w:tcBorders>
+              <w:top w:val="single" w:color="C9CEDB" w:sz="4"/>
+              <w:left w:val="single" w:color="C9CEDB" w:sz="4"/>
+              <w:bottom w:val="single" w:color="C9CEDB" w:sz="4"/>
+              <w:right w:val="single" w:color="C9CEDB" w:sz="4"/>
+            </w:tcBorders>
+            <w:tcMar>
+              <w:top w:type="dxa" w:w="70"/>
+              <w:left w:type="dxa" w:w="110"/>
+              <w:bottom w:type="dxa" w:w="70"/>
+              <w:right w:type="dxa" w:w="110"/>
+            </w:tcMar>
+          </w:tcPr>
+          <w:p>
+            <w:pPr>
+              <w:spacing w:after="0" w:line="270"/>
+            </w:pPr>
             <w:r>
               <w:rPr>
                 <w:rFonts w:ascii="Calibri" w:cs="Calibri" w:eastAsia="Calibri" w:hAnsi="Calibri"/>
@@ -733,39 +632,7 @@
                 <w:sz w:val="20"/>
                 <w:szCs w:val="20"/>
               </w:rPr>
-              <w:t xml:space="preserve"> (mor düğme)</w:t>
-            </w:r>
-          </w:p>
-        </w:tc>
-        <w:tc>
-          <w:tcPr>
-            <w:tcW w:type="dxa" w:w="3759"/>
-            <w:tcBorders>
-              <w:top w:val="single" w:color="C9CEDB" w:sz="4"/>
-              <w:left w:val="single" w:color="C9CEDB" w:sz="4"/>
-              <w:bottom w:val="single" w:color="C9CEDB" w:sz="4"/>
-              <w:right w:val="single" w:color="C9CEDB" w:sz="4"/>
-            </w:tcBorders>
-            <w:tcMar>
-              <w:top w:type="dxa" w:w="70"/>
-              <w:left w:type="dxa" w:w="110"/>
-              <w:bottom w:type="dxa" w:w="70"/>
-              <w:right w:type="dxa" w:w="110"/>
-            </w:tcMar>
-          </w:tcPr>
-          <w:p>
-            <w:pPr>
-              <w:spacing w:after="0" w:line="270"/>
-            </w:pPr>
-            <w:r>
-              <w:rPr>
-                <w:rFonts w:ascii="Calibri" w:cs="Calibri" w:eastAsia="Calibri" w:hAnsi="Calibri"/>
-                <w:b w:val="false"/>
-                <w:bCs w:val="false"/>
-                <w:sz w:val="20"/>
-                <w:szCs w:val="20"/>
-              </w:rPr>
-              <w:t xml:space="preserve">Her ürün ya da ekip için ayrı bir çalışma alanı açılır.</w:t>
+              <w:t xml:space="preserve">Mobil Uygulama</w:t>
             </w:r>
           </w:p>
         </w:tc>
@@ -803,7 +670,7 @@
                 <w:sz w:val="20"/>
                 <w:szCs w:val="20"/>
               </w:rPr>
-              <w:t xml:space="preserve">2</w:t>
+              <w:t xml:space="preserve">Epic</w:t>
             </w:r>
           </w:p>
         </w:tc>
@@ -836,18 +703,31 @@
                 <w:sz w:val="20"/>
                 <w:szCs w:val="20"/>
               </w:rPr>
-              <w:t xml:space="preserve">Üstteki mor </w:t>
-            </w:r>
-            <w:r>
-              <w:rPr>
-                <w:rFonts w:ascii="Calibri" w:cs="Calibri" w:eastAsia="Calibri" w:hAnsi="Calibri"/>
-                <w:b/>
-                <w:bCs/>
-                <w:sz w:val="20"/>
-                <w:szCs w:val="20"/>
-              </w:rPr>
-              <w:t xml:space="preserve">New</w:t>
-            </w:r>
+              <w:t xml:space="preserve">Birçok Task'ı çatısı altında toplayan büyük hedef. İsteğe bağlıdır.</w:t>
+            </w:r>
+          </w:p>
+        </w:tc>
+        <w:tc>
+          <w:tcPr>
+            <w:tcW w:type="dxa" w:w="3759"/>
+            <w:tcBorders>
+              <w:top w:val="single" w:color="C9CEDB" w:sz="4"/>
+              <w:left w:val="single" w:color="C9CEDB" w:sz="4"/>
+              <w:bottom w:val="single" w:color="C9CEDB" w:sz="4"/>
+              <w:right w:val="single" w:color="C9CEDB" w:sz="4"/>
+            </w:tcBorders>
+            <w:shd w:fill="F4F5FA" w:color="auto" w:val="clear"/>
+            <w:tcMar>
+              <w:top w:type="dxa" w:w="70"/>
+              <w:left w:type="dxa" w:w="110"/>
+              <w:bottom w:type="dxa" w:w="70"/>
+              <w:right w:type="dxa" w:w="110"/>
+            </w:tcMar>
+          </w:tcPr>
+          <w:p>
+            <w:pPr>
+              <w:spacing w:after="0" w:line="270"/>
+            </w:pPr>
             <w:r>
               <w:rPr>
                 <w:rFonts w:ascii="Calibri" w:cs="Calibri" w:eastAsia="Calibri" w:hAnsi="Calibri"/>
@@ -856,40 +736,7 @@
                 <w:sz w:val="20"/>
                 <w:szCs w:val="20"/>
               </w:rPr>
-              <w:t xml:space="preserve"> düğmesi</w:t>
-            </w:r>
-          </w:p>
-        </w:tc>
-        <w:tc>
-          <w:tcPr>
-            <w:tcW w:type="dxa" w:w="3759"/>
-            <w:tcBorders>
-              <w:top w:val="single" w:color="C9CEDB" w:sz="4"/>
-              <w:left w:val="single" w:color="C9CEDB" w:sz="4"/>
-              <w:bottom w:val="single" w:color="C9CEDB" w:sz="4"/>
-              <w:right w:val="single" w:color="C9CEDB" w:sz="4"/>
-            </w:tcBorders>
-            <w:shd w:fill="F4F5FA" w:color="auto" w:val="clear"/>
-            <w:tcMar>
-              <w:top w:type="dxa" w:w="70"/>
-              <w:left w:type="dxa" w:w="110"/>
-              <w:bottom w:type="dxa" w:w="70"/>
-              <w:right w:type="dxa" w:w="110"/>
-            </w:tcMar>
-          </w:tcPr>
-          <w:p>
-            <w:pPr>
-              <w:spacing w:after="0" w:line="270"/>
-            </w:pPr>
-            <w:r>
-              <w:rPr>
-                <w:rFonts w:ascii="Calibri" w:cs="Calibri" w:eastAsia="Calibri" w:hAnsi="Calibri"/>
-                <w:b w:val="false"/>
-                <w:bCs w:val="false"/>
-                <w:sz w:val="20"/>
-                <w:szCs w:val="20"/>
-              </w:rPr>
-              <w:t xml:space="preserve">İş eklemenin tek kapısı: Sprint, Task, Epic, Bug buradan açılır.</w:t>
+              <w:t xml:space="preserve">Kullanıcı hesabı yönetimi</w:t>
             </w:r>
           </w:p>
         </w:tc>
@@ -926,7 +773,7 @@
                 <w:sz w:val="20"/>
                 <w:szCs w:val="20"/>
               </w:rPr>
-              <w:t xml:space="preserve">3</w:t>
+              <w:t xml:space="preserve">Task</w:t>
             </w:r>
           </w:p>
         </w:tc>
@@ -958,18 +805,30 @@
                 <w:sz w:val="20"/>
                 <w:szCs w:val="20"/>
               </w:rPr>
-              <w:t xml:space="preserve">Bir </w:t>
-            </w:r>
-            <w:r>
-              <w:rPr>
-                <w:rFonts w:ascii="Calibri" w:cs="Calibri" w:eastAsia="Calibri" w:hAnsi="Calibri"/>
-                <w:b/>
-                <w:bCs/>
-                <w:sz w:val="20"/>
-                <w:szCs w:val="20"/>
-              </w:rPr>
-              <w:t xml:space="preserve">Epic</w:t>
-            </w:r>
+              <w:t xml:space="preserve">Yapılacak tek bir iş. Başlığı, sahibi, tarihi ve puanı vardır.</w:t>
+            </w:r>
+          </w:p>
+        </w:tc>
+        <w:tc>
+          <w:tcPr>
+            <w:tcW w:type="dxa" w:w="3759"/>
+            <w:tcBorders>
+              <w:top w:val="single" w:color="C9CEDB" w:sz="4"/>
+              <w:left w:val="single" w:color="C9CEDB" w:sz="4"/>
+              <w:bottom w:val="single" w:color="C9CEDB" w:sz="4"/>
+              <w:right w:val="single" w:color="C9CEDB" w:sz="4"/>
+            </w:tcBorders>
+            <w:tcMar>
+              <w:top w:type="dxa" w:w="70"/>
+              <w:left w:type="dxa" w:w="110"/>
+              <w:bottom w:type="dxa" w:w="70"/>
+              <w:right w:type="dxa" w:w="110"/>
+            </w:tcMar>
+          </w:tcPr>
+          <w:p>
+            <w:pPr>
+              <w:spacing w:after="0" w:line="270"/>
+            </w:pPr>
             <w:r>
               <w:rPr>
                 <w:rFonts w:ascii="Calibri" w:cs="Calibri" w:eastAsia="Calibri" w:hAnsi="Calibri"/>
@@ -978,59 +837,7 @@
                 <w:sz w:val="20"/>
                 <w:szCs w:val="20"/>
               </w:rPr>
-              <w:t xml:space="preserve"> ve altına </w:t>
-            </w:r>
-            <w:r>
-              <w:rPr>
-                <w:rFonts w:ascii="Calibri" w:cs="Calibri" w:eastAsia="Calibri" w:hAnsi="Calibri"/>
-                <w:b/>
-                <w:bCs/>
-                <w:sz w:val="20"/>
-                <w:szCs w:val="20"/>
-              </w:rPr>
-              <w:t xml:space="preserve">Task</w:t>
-            </w:r>
-            <w:r>
-              <w:rPr>
-                <w:rFonts w:ascii="Calibri" w:cs="Calibri" w:eastAsia="Calibri" w:hAnsi="Calibri"/>
-                <w:b w:val="false"/>
-                <w:bCs w:val="false"/>
-                <w:sz w:val="20"/>
-                <w:szCs w:val="20"/>
-              </w:rPr>
-              <w:t xml:space="preserve">’lar ekle</w:t>
-            </w:r>
-          </w:p>
-        </w:tc>
-        <w:tc>
-          <w:tcPr>
-            <w:tcW w:type="dxa" w:w="3759"/>
-            <w:tcBorders>
-              <w:top w:val="single" w:color="C9CEDB" w:sz="4"/>
-              <w:left w:val="single" w:color="C9CEDB" w:sz="4"/>
-              <w:bottom w:val="single" w:color="C9CEDB" w:sz="4"/>
-              <w:right w:val="single" w:color="C9CEDB" w:sz="4"/>
-            </w:tcBorders>
-            <w:tcMar>
-              <w:top w:type="dxa" w:w="70"/>
-              <w:left w:type="dxa" w:w="110"/>
-              <w:bottom w:type="dxa" w:w="70"/>
-              <w:right w:type="dxa" w:w="110"/>
-            </w:tcMar>
-          </w:tcPr>
-          <w:p>
-            <w:pPr>
-              <w:spacing w:after="0" w:line="270"/>
-            </w:pPr>
-            <w:r>
-              <w:rPr>
-                <w:rFonts w:ascii="Calibri" w:cs="Calibri" w:eastAsia="Calibri" w:hAnsi="Calibri"/>
-                <w:b w:val="false"/>
-                <w:bCs w:val="false"/>
-                <w:sz w:val="20"/>
-                <w:szCs w:val="20"/>
-              </w:rPr>
-              <w:t xml:space="preserve">Büyük hedef Epic, yapılacak iş Task; küçük parçalar Sub-Task.</w:t>
+              <w:t xml:space="preserve">Giriş ekranını tasarla</w:t>
             </w:r>
           </w:p>
         </w:tc>
@@ -1068,7 +875,7 @@
                 <w:sz w:val="20"/>
                 <w:szCs w:val="20"/>
               </w:rPr>
-              <w:t xml:space="preserve">4</w:t>
+              <w:t xml:space="preserve">Sub-Task</w:t>
             </w:r>
           </w:p>
         </w:tc>
@@ -1101,18 +908,31 @@
                 <w:sz w:val="20"/>
                 <w:szCs w:val="20"/>
               </w:rPr>
-              <w:t xml:space="preserve">Bir Task’ı başka Task’ın üstüne </w:t>
-            </w:r>
-            <w:r>
-              <w:rPr>
-                <w:rFonts w:ascii="Calibri" w:cs="Calibri" w:eastAsia="Calibri" w:hAnsi="Calibri"/>
-                <w:b/>
-                <w:bCs/>
-                <w:sz w:val="20"/>
-                <w:szCs w:val="20"/>
-              </w:rPr>
-              <w:t xml:space="preserve">sürükle</w:t>
-            </w:r>
+              <w:t xml:space="preserve">Bir Task'ın küçük parçası. Tek başına var olamaz, her zaman bir üst Task'a bağlıdır.</w:t>
+            </w:r>
+          </w:p>
+        </w:tc>
+        <w:tc>
+          <w:tcPr>
+            <w:tcW w:type="dxa" w:w="3759"/>
+            <w:tcBorders>
+              <w:top w:val="single" w:color="C9CEDB" w:sz="4"/>
+              <w:left w:val="single" w:color="C9CEDB" w:sz="4"/>
+              <w:bottom w:val="single" w:color="C9CEDB" w:sz="4"/>
+              <w:right w:val="single" w:color="C9CEDB" w:sz="4"/>
+            </w:tcBorders>
+            <w:shd w:fill="F4F5FA" w:color="auto" w:val="clear"/>
+            <w:tcMar>
+              <w:top w:type="dxa" w:w="70"/>
+              <w:left w:type="dxa" w:w="110"/>
+              <w:bottom w:type="dxa" w:w="70"/>
+              <w:right w:type="dxa" w:w="110"/>
+            </w:tcMar>
+          </w:tcPr>
+          <w:p>
+            <w:pPr>
+              <w:spacing w:after="0" w:line="270"/>
+            </w:pPr>
             <w:r>
               <w:rPr>
                 <w:rFonts w:ascii="Calibri" w:cs="Calibri" w:eastAsia="Calibri" w:hAnsi="Calibri"/>
@@ -1121,40 +941,7 @@
                 <w:sz w:val="20"/>
                 <w:szCs w:val="20"/>
               </w:rPr>
-              <w:t xml:space="preserve"/>
-            </w:r>
-          </w:p>
-        </w:tc>
-        <w:tc>
-          <w:tcPr>
-            <w:tcW w:type="dxa" w:w="3759"/>
-            <w:tcBorders>
-              <w:top w:val="single" w:color="C9CEDB" w:sz="4"/>
-              <w:left w:val="single" w:color="C9CEDB" w:sz="4"/>
-              <w:bottom w:val="single" w:color="C9CEDB" w:sz="4"/>
-              <w:right w:val="single" w:color="C9CEDB" w:sz="4"/>
-            </w:tcBorders>
-            <w:shd w:fill="F4F5FA" w:color="auto" w:val="clear"/>
-            <w:tcMar>
-              <w:top w:type="dxa" w:w="70"/>
-              <w:left w:type="dxa" w:w="110"/>
-              <w:bottom w:type="dxa" w:w="70"/>
-              <w:right w:type="dxa" w:w="110"/>
-            </w:tcMar>
-          </w:tcPr>
-          <w:p>
-            <w:pPr>
-              <w:spacing w:after="0" w:line="270"/>
-            </w:pPr>
-            <w:r>
-              <w:rPr>
-                <w:rFonts w:ascii="Calibri" w:cs="Calibri" w:eastAsia="Calibri" w:hAnsi="Calibri"/>
-                <w:b w:val="false"/>
-                <w:bCs w:val="false"/>
-                <w:sz w:val="20"/>
-                <w:szCs w:val="20"/>
-              </w:rPr>
-              <w:t xml:space="preserve">Sürüklemek yeterli: onay verince Sub-Task olur, “Ayır” alanına bırakınca tekrar Task.</w:t>
+              <w:t xml:space="preserve">Form alanlarını çiz</w:t>
             </w:r>
           </w:p>
         </w:tc>
@@ -1191,7 +978,7 @@
                 <w:sz w:val="20"/>
                 <w:szCs w:val="20"/>
               </w:rPr>
-              <w:t xml:space="preserve">5</w:t>
+              <w:t xml:space="preserve">Sprint</w:t>
             </w:r>
           </w:p>
         </w:tc>
@@ -1223,18 +1010,30 @@
                 <w:sz w:val="20"/>
                 <w:szCs w:val="20"/>
               </w:rPr>
-              <w:t xml:space="preserve">New → </w:t>
-            </w:r>
-            <w:r>
-              <w:rPr>
-                <w:rFonts w:ascii="Calibri" w:cs="Calibri" w:eastAsia="Calibri" w:hAnsi="Calibri"/>
-                <w:b/>
-                <w:bCs/>
-                <w:sz w:val="20"/>
-                <w:szCs w:val="20"/>
-              </w:rPr>
-              <w:t xml:space="preserve">Sprint</w:t>
-            </w:r>
+              <w:t xml:space="preserve">Genellikle 1–2 hafta süren, hedefi ve tarihleri belli çalışma dönemi. Ekip o dönemde hangi işleri yapacağını seçer.</w:t>
+            </w:r>
+          </w:p>
+        </w:tc>
+        <w:tc>
+          <w:tcPr>
+            <w:tcW w:type="dxa" w:w="3759"/>
+            <w:tcBorders>
+              <w:top w:val="single" w:color="C9CEDB" w:sz="4"/>
+              <w:left w:val="single" w:color="C9CEDB" w:sz="4"/>
+              <w:bottom w:val="single" w:color="C9CEDB" w:sz="4"/>
+              <w:right w:val="single" w:color="C9CEDB" w:sz="4"/>
+            </w:tcBorders>
+            <w:tcMar>
+              <w:top w:type="dxa" w:w="70"/>
+              <w:left w:type="dxa" w:w="110"/>
+              <w:bottom w:type="dxa" w:w="70"/>
+              <w:right w:type="dxa" w:w="110"/>
+            </w:tcMar>
+          </w:tcPr>
+          <w:p>
+            <w:pPr>
+              <w:spacing w:after="0" w:line="270"/>
+            </w:pPr>
             <w:r>
               <w:rPr>
                 <w:rFonts w:ascii="Calibri" w:cs="Calibri" w:eastAsia="Calibri" w:hAnsi="Calibri"/>
@@ -1243,39 +1042,7 @@
                 <w:sz w:val="20"/>
                 <w:szCs w:val="20"/>
               </w:rPr>
-              <w:t xml:space="preserve"/>
-            </w:r>
-          </w:p>
-        </w:tc>
-        <w:tc>
-          <w:tcPr>
-            <w:tcW w:type="dxa" w:w="3759"/>
-            <w:tcBorders>
-              <w:top w:val="single" w:color="C9CEDB" w:sz="4"/>
-              <w:left w:val="single" w:color="C9CEDB" w:sz="4"/>
-              <w:bottom w:val="single" w:color="C9CEDB" w:sz="4"/>
-              <w:right w:val="single" w:color="C9CEDB" w:sz="4"/>
-            </w:tcBorders>
-            <w:tcMar>
-              <w:top w:type="dxa" w:w="70"/>
-              <w:left w:type="dxa" w:w="110"/>
-              <w:bottom w:type="dxa" w:w="70"/>
-              <w:right w:type="dxa" w:w="110"/>
-            </w:tcMar>
-          </w:tcPr>
-          <w:p>
-            <w:pPr>
-              <w:spacing w:after="0" w:line="270"/>
-            </w:pPr>
-            <w:r>
-              <w:rPr>
-                <w:rFonts w:ascii="Calibri" w:cs="Calibri" w:eastAsia="Calibri" w:hAnsi="Calibri"/>
-                <w:b w:val="false"/>
-                <w:bCs w:val="false"/>
-                <w:sz w:val="20"/>
-                <w:szCs w:val="20"/>
-              </w:rPr>
-              <w:t xml:space="preserve">Sprint, ekibin 1–2 haftalık hedefidir; tarihleri ve hedefi burada yazılır.</w:t>
+              <w:t xml:space="preserve">Sprint 1 (15–28 Ekim)</w:t>
             </w:r>
           </w:p>
         </w:tc>
@@ -1313,7 +1080,7 @@
                 <w:sz w:val="20"/>
                 <w:szCs w:val="20"/>
               </w:rPr>
-              <w:t xml:space="preserve">6</w:t>
+              <w:t xml:space="preserve">Backlog</w:t>
             </w:r>
           </w:p>
         </w:tc>
@@ -1346,18 +1113,31 @@
                 <w:sz w:val="20"/>
                 <w:szCs w:val="20"/>
               </w:rPr>
-              <w:t xml:space="preserve">Backlog’daki işleri </w:t>
-            </w:r>
-            <w:r>
-              <w:rPr>
-                <w:rFonts w:ascii="Calibri" w:cs="Calibri" w:eastAsia="Calibri" w:hAnsi="Calibri"/>
-                <w:b/>
-                <w:bCs/>
-                <w:sz w:val="20"/>
-                <w:szCs w:val="20"/>
-              </w:rPr>
-              <w:t xml:space="preserve">Sprint’e taşı</w:t>
-            </w:r>
+              <w:t xml:space="preserve">Henüz bir Sprint'e alınmamış, öncelik sırasıyla bekleyen işlerin listesi.</w:t>
+            </w:r>
+          </w:p>
+        </w:tc>
+        <w:tc>
+          <w:tcPr>
+            <w:tcW w:type="dxa" w:w="3759"/>
+            <w:tcBorders>
+              <w:top w:val="single" w:color="C9CEDB" w:sz="4"/>
+              <w:left w:val="single" w:color="C9CEDB" w:sz="4"/>
+              <w:bottom w:val="single" w:color="C9CEDB" w:sz="4"/>
+              <w:right w:val="single" w:color="C9CEDB" w:sz="4"/>
+            </w:tcBorders>
+            <w:shd w:fill="F4F5FA" w:color="auto" w:val="clear"/>
+            <w:tcMar>
+              <w:top w:type="dxa" w:w="70"/>
+              <w:left w:type="dxa" w:w="110"/>
+              <w:bottom w:type="dxa" w:w="70"/>
+              <w:right w:type="dxa" w:w="110"/>
+            </w:tcMar>
+          </w:tcPr>
+          <w:p>
+            <w:pPr>
+              <w:spacing w:after="0" w:line="270"/>
+            </w:pPr>
             <w:r>
               <w:rPr>
                 <w:rFonts w:ascii="Calibri" w:cs="Calibri" w:eastAsia="Calibri" w:hAnsi="Calibri"/>
@@ -1366,40 +1146,7 @@
                 <w:sz w:val="20"/>
                 <w:szCs w:val="20"/>
               </w:rPr>
-              <w:t xml:space="preserve"/>
-            </w:r>
-          </w:p>
-        </w:tc>
-        <w:tc>
-          <w:tcPr>
-            <w:tcW w:type="dxa" w:w="3759"/>
-            <w:tcBorders>
-              <w:top w:val="single" w:color="C9CEDB" w:sz="4"/>
-              <w:left w:val="single" w:color="C9CEDB" w:sz="4"/>
-              <w:bottom w:val="single" w:color="C9CEDB" w:sz="4"/>
-              <w:right w:val="single" w:color="C9CEDB" w:sz="4"/>
-            </w:tcBorders>
-            <w:shd w:fill="F4F5FA" w:color="auto" w:val="clear"/>
-            <w:tcMar>
-              <w:top w:type="dxa" w:w="70"/>
-              <w:left w:type="dxa" w:w="110"/>
-              <w:bottom w:type="dxa" w:w="70"/>
-              <w:right w:type="dxa" w:w="110"/>
-            </w:tcMar>
-          </w:tcPr>
-          <w:p>
-            <w:pPr>
-              <w:spacing w:after="0" w:line="270"/>
-            </w:pPr>
-            <w:r>
-              <w:rPr>
-                <w:rFonts w:ascii="Calibri" w:cs="Calibri" w:eastAsia="Calibri" w:hAnsi="Calibri"/>
-                <w:b w:val="false"/>
-                <w:bCs w:val="false"/>
-                <w:sz w:val="20"/>
-                <w:szCs w:val="20"/>
-              </w:rPr>
-              <w:t xml:space="preserve">Ekip bu dönem hangi işleri yapacağını seçer.</w:t>
+              <w:t xml:space="preserve">—</w:t>
             </w:r>
           </w:p>
         </w:tc>
@@ -1436,7 +1183,7 @@
                 <w:sz w:val="20"/>
                 <w:szCs w:val="20"/>
               </w:rPr>
-              <w:t xml:space="preserve">7</w:t>
+              <w:t xml:space="preserve">Story Point</w:t>
             </w:r>
           </w:p>
         </w:tc>
@@ -1468,18 +1215,30 @@
                 <w:sz w:val="20"/>
                 <w:szCs w:val="20"/>
               </w:rPr>
-              <w:t xml:space="preserve"/>
-            </w:r>
-            <w:r>
-              <w:rPr>
-                <w:rFonts w:ascii="Calibri" w:cs="Calibri" w:eastAsia="Calibri" w:hAnsi="Calibri"/>
-                <w:b/>
-                <w:bCs/>
-                <w:sz w:val="20"/>
-                <w:szCs w:val="20"/>
-              </w:rPr>
-              <w:t xml:space="preserve">Sprint panosu</w:t>
-            </w:r>
+              <w:t xml:space="preserve">Bir işin büyüklüğünü gösteren puan (1, 2, 3, 5, 8, 13, 21, 34, 55).</w:t>
+            </w:r>
+          </w:p>
+        </w:tc>
+        <w:tc>
+          <w:tcPr>
+            <w:tcW w:type="dxa" w:w="3759"/>
+            <w:tcBorders>
+              <w:top w:val="single" w:color="C9CEDB" w:sz="4"/>
+              <w:left w:val="single" w:color="C9CEDB" w:sz="4"/>
+              <w:bottom w:val="single" w:color="C9CEDB" w:sz="4"/>
+              <w:right w:val="single" w:color="C9CEDB" w:sz="4"/>
+            </w:tcBorders>
+            <w:tcMar>
+              <w:top w:type="dxa" w:w="70"/>
+              <w:left w:type="dxa" w:w="110"/>
+              <w:bottom w:type="dxa" w:w="70"/>
+              <w:right w:type="dxa" w:w="110"/>
+            </w:tcMar>
+          </w:tcPr>
+          <w:p>
+            <w:pPr>
+              <w:spacing w:after="0" w:line="270"/>
+            </w:pPr>
             <w:r>
               <w:rPr>
                 <w:rFonts w:ascii="Calibri" w:cs="Calibri" w:eastAsia="Calibri" w:hAnsi="Calibri"/>
@@ -1488,495 +1247,7 @@
                 <w:sz w:val="20"/>
                 <w:szCs w:val="20"/>
               </w:rPr>
-              <w:t xml:space="preserve">: kartı sütundan sütuna sürükle</w:t>
-            </w:r>
-          </w:p>
-        </w:tc>
-        <w:tc>
-          <w:tcPr>
-            <w:tcW w:type="dxa" w:w="3759"/>
-            <w:tcBorders>
-              <w:top w:val="single" w:color="C9CEDB" w:sz="4"/>
-              <w:left w:val="single" w:color="C9CEDB" w:sz="4"/>
-              <w:bottom w:val="single" w:color="C9CEDB" w:sz="4"/>
-              <w:right w:val="single" w:color="C9CEDB" w:sz="4"/>
-            </w:tcBorders>
-            <w:tcMar>
-              <w:top w:type="dxa" w:w="70"/>
-              <w:left w:type="dxa" w:w="110"/>
-              <w:bottom w:type="dxa" w:w="70"/>
-              <w:right w:type="dxa" w:w="110"/>
-            </w:tcMar>
-          </w:tcPr>
-          <w:p>
-            <w:pPr>
-              <w:spacing w:after="0" w:line="270"/>
-            </w:pPr>
-            <w:r>
-              <w:rPr>
-                <w:rFonts w:ascii="Calibri" w:cs="Calibri" w:eastAsia="Calibri" w:hAnsi="Calibri"/>
-                <w:b w:val="false"/>
-                <w:bCs w:val="false"/>
-                <w:sz w:val="20"/>
-                <w:szCs w:val="20"/>
-              </w:rPr>
-              <w:t xml:space="preserve">Herkes işin hangi aşamada olduğunu bir bakışta görür.</w:t>
-            </w:r>
-          </w:p>
-        </w:tc>
-      </w:tr>
-      <w:tr>
-        <w:trPr>
-          <w:cantSplit/>
-        </w:trPr>
-        <w:tc>
-          <w:tcPr>
-            <w:tcW w:type="dxa" w:w="2120"/>
-            <w:tcBorders>
-              <w:top w:val="single" w:color="C9CEDB" w:sz="4"/>
-              <w:left w:val="single" w:color="C9CEDB" w:sz="4"/>
-              <w:bottom w:val="single" w:color="C9CEDB" w:sz="4"/>
-              <w:right w:val="single" w:color="C9CEDB" w:sz="4"/>
-            </w:tcBorders>
-            <w:shd w:fill="F4F5FA" w:color="auto" w:val="clear"/>
-            <w:tcMar>
-              <w:top w:type="dxa" w:w="70"/>
-              <w:left w:type="dxa" w:w="110"/>
-              <w:bottom w:type="dxa" w:w="70"/>
-              <w:right w:type="dxa" w:w="110"/>
-            </w:tcMar>
-          </w:tcPr>
-          <w:p>
-            <w:pPr>
-              <w:spacing w:after="0" w:line="270"/>
-            </w:pPr>
-            <w:r>
-              <w:rPr>
-                <w:rFonts w:ascii="Calibri" w:cs="Calibri" w:eastAsia="Calibri" w:hAnsi="Calibri"/>
-                <w:b/>
-                <w:bCs/>
-                <w:sz w:val="20"/>
-                <w:szCs w:val="20"/>
-              </w:rPr>
-              <w:t xml:space="preserve">8</w:t>
-            </w:r>
-          </w:p>
-        </w:tc>
-        <w:tc>
-          <w:tcPr>
-            <w:tcW w:type="dxa" w:w="3759"/>
-            <w:tcBorders>
-              <w:top w:val="single" w:color="C9CEDB" w:sz="4"/>
-              <w:left w:val="single" w:color="C9CEDB" w:sz="4"/>
-              <w:bottom w:val="single" w:color="C9CEDB" w:sz="4"/>
-              <w:right w:val="single" w:color="C9CEDB" w:sz="4"/>
-            </w:tcBorders>
-            <w:shd w:fill="F4F5FA" w:color="auto" w:val="clear"/>
-            <w:tcMar>
-              <w:top w:type="dxa" w:w="70"/>
-              <w:left w:type="dxa" w:w="110"/>
-              <w:bottom w:type="dxa" w:w="70"/>
-              <w:right w:type="dxa" w:w="110"/>
-            </w:tcMar>
-          </w:tcPr>
-          <w:p>
-            <w:pPr>
-              <w:spacing w:after="0" w:line="270"/>
-            </w:pPr>
-            <w:r>
-              <w:rPr>
-                <w:rFonts w:ascii="Calibri" w:cs="Calibri" w:eastAsia="Calibri" w:hAnsi="Calibri"/>
-                <w:b w:val="false"/>
-                <w:bCs w:val="false"/>
-                <w:sz w:val="20"/>
-                <w:szCs w:val="20"/>
-              </w:rPr>
-              <w:t xml:space="preserve">Kırmızı </w:t>
-            </w:r>
-            <w:r>
-              <w:rPr>
-                <w:rFonts w:ascii="Calibri" w:cs="Calibri" w:eastAsia="Calibri" w:hAnsi="Calibri"/>
-                <w:b/>
-                <w:bCs/>
-                <w:sz w:val="20"/>
-                <w:szCs w:val="20"/>
-              </w:rPr>
-              <w:t xml:space="preserve">Bugs</w:t>
-            </w:r>
-            <w:r>
-              <w:rPr>
-                <w:rFonts w:ascii="Calibri" w:cs="Calibri" w:eastAsia="Calibri" w:hAnsi="Calibri"/>
-                <w:b w:val="false"/>
-                <w:bCs w:val="false"/>
-                <w:sz w:val="20"/>
-                <w:szCs w:val="20"/>
-              </w:rPr>
-              <w:t xml:space="preserve"> sekmesi (Raporlar’ın yanında) → Bug aç → ata → Çözüldü</w:t>
-            </w:r>
-          </w:p>
-        </w:tc>
-        <w:tc>
-          <w:tcPr>
-            <w:tcW w:type="dxa" w:w="3759"/>
-            <w:tcBorders>
-              <w:top w:val="single" w:color="C9CEDB" w:sz="4"/>
-              <w:left w:val="single" w:color="C9CEDB" w:sz="4"/>
-              <w:bottom w:val="single" w:color="C9CEDB" w:sz="4"/>
-              <w:right w:val="single" w:color="C9CEDB" w:sz="4"/>
-            </w:tcBorders>
-            <w:shd w:fill="F4F5FA" w:color="auto" w:val="clear"/>
-            <w:tcMar>
-              <w:top w:type="dxa" w:w="70"/>
-              <w:left w:type="dxa" w:w="110"/>
-              <w:bottom w:type="dxa" w:w="70"/>
-              <w:right w:type="dxa" w:w="110"/>
-            </w:tcMar>
-          </w:tcPr>
-          <w:p>
-            <w:pPr>
-              <w:spacing w:after="0" w:line="270"/>
-            </w:pPr>
-            <w:r>
-              <w:rPr>
-                <w:rFonts w:ascii="Calibri" w:cs="Calibri" w:eastAsia="Calibri" w:hAnsi="Calibri"/>
-                <w:b w:val="false"/>
-                <w:bCs w:val="false"/>
-                <w:sz w:val="20"/>
-                <w:szCs w:val="20"/>
-              </w:rPr>
-              <w:t xml:space="preserve">Hatalar kaybolmaz: sahibi, atananı ve durumu olur; herkese e-posta gider.</w:t>
-            </w:r>
-          </w:p>
-        </w:tc>
-      </w:tr>
-      <w:tr>
-        <w:trPr>
-          <w:cantSplit/>
-        </w:trPr>
-        <w:tc>
-          <w:tcPr>
-            <w:tcW w:type="dxa" w:w="2120"/>
-            <w:tcBorders>
-              <w:top w:val="single" w:color="C9CEDB" w:sz="4"/>
-              <w:left w:val="single" w:color="C9CEDB" w:sz="4"/>
-              <w:bottom w:val="single" w:color="C9CEDB" w:sz="4"/>
-              <w:right w:val="single" w:color="C9CEDB" w:sz="4"/>
-            </w:tcBorders>
-            <w:tcMar>
-              <w:top w:type="dxa" w:w="70"/>
-              <w:left w:type="dxa" w:w="110"/>
-              <w:bottom w:type="dxa" w:w="70"/>
-              <w:right w:type="dxa" w:w="110"/>
-            </w:tcMar>
-          </w:tcPr>
-          <w:p>
-            <w:pPr>
-              <w:spacing w:after="0" w:line="270"/>
-            </w:pPr>
-            <w:r>
-              <w:rPr>
-                <w:rFonts w:ascii="Calibri" w:cs="Calibri" w:eastAsia="Calibri" w:hAnsi="Calibri"/>
-                <w:b/>
-                <w:bCs/>
-                <w:sz w:val="20"/>
-                <w:szCs w:val="20"/>
-              </w:rPr>
-              <w:t xml:space="preserve">9</w:t>
-            </w:r>
-          </w:p>
-        </w:tc>
-        <w:tc>
-          <w:tcPr>
-            <w:tcW w:type="dxa" w:w="3759"/>
-            <w:tcBorders>
-              <w:top w:val="single" w:color="C9CEDB" w:sz="4"/>
-              <w:left w:val="single" w:color="C9CEDB" w:sz="4"/>
-              <w:bottom w:val="single" w:color="C9CEDB" w:sz="4"/>
-              <w:right w:val="single" w:color="C9CEDB" w:sz="4"/>
-            </w:tcBorders>
-            <w:tcMar>
-              <w:top w:type="dxa" w:w="70"/>
-              <w:left w:type="dxa" w:w="110"/>
-              <w:bottom w:type="dxa" w:w="70"/>
-              <w:right w:type="dxa" w:w="110"/>
-            </w:tcMar>
-          </w:tcPr>
-          <w:p>
-            <w:pPr>
-              <w:spacing w:after="0" w:line="270"/>
-            </w:pPr>
-            <w:r>
-              <w:rPr>
-                <w:rFonts w:ascii="Calibri" w:cs="Calibri" w:eastAsia="Calibri" w:hAnsi="Calibri"/>
-                <w:b w:val="false"/>
-                <w:bCs w:val="false"/>
-                <w:sz w:val="20"/>
-                <w:szCs w:val="20"/>
-              </w:rPr>
-              <w:t xml:space="preserve"/>
-            </w:r>
-            <w:r>
-              <w:rPr>
-                <w:rFonts w:ascii="Calibri" w:cs="Calibri" w:eastAsia="Calibri" w:hAnsi="Calibri"/>
-                <w:b/>
-                <w:bCs/>
-                <w:sz w:val="20"/>
-                <w:szCs w:val="20"/>
-              </w:rPr>
-              <w:t xml:space="preserve">Raporlar</w:t>
-            </w:r>
-            <w:r>
-              <w:rPr>
-                <w:rFonts w:ascii="Calibri" w:cs="Calibri" w:eastAsia="Calibri" w:hAnsi="Calibri"/>
-                <w:b w:val="false"/>
-                <w:bCs w:val="false"/>
-                <w:sz w:val="20"/>
-                <w:szCs w:val="20"/>
-              </w:rPr>
-              <w:t xml:space="preserve">: Burndown ve Velocity</w:t>
-            </w:r>
-          </w:p>
-        </w:tc>
-        <w:tc>
-          <w:tcPr>
-            <w:tcW w:type="dxa" w:w="3759"/>
-            <w:tcBorders>
-              <w:top w:val="single" w:color="C9CEDB" w:sz="4"/>
-              <w:left w:val="single" w:color="C9CEDB" w:sz="4"/>
-              <w:bottom w:val="single" w:color="C9CEDB" w:sz="4"/>
-              <w:right w:val="single" w:color="C9CEDB" w:sz="4"/>
-            </w:tcBorders>
-            <w:tcMar>
-              <w:top w:type="dxa" w:w="70"/>
-              <w:left w:type="dxa" w:w="110"/>
-              <w:bottom w:type="dxa" w:w="70"/>
-              <w:right w:type="dxa" w:w="110"/>
-            </w:tcMar>
-          </w:tcPr>
-          <w:p>
-            <w:pPr>
-              <w:spacing w:after="0" w:line="270"/>
-            </w:pPr>
-            <w:r>
-              <w:rPr>
-                <w:rFonts w:ascii="Calibri" w:cs="Calibri" w:eastAsia="Calibri" w:hAnsi="Calibri"/>
-                <w:b w:val="false"/>
-                <w:bCs w:val="false"/>
-                <w:sz w:val="20"/>
-                <w:szCs w:val="20"/>
-              </w:rPr>
-              <w:t xml:space="preserve">Sprint zamanında biter mi, ekip ne kadar iş çıkarıyor: grafikte görünür.</w:t>
-            </w:r>
-          </w:p>
-        </w:tc>
-      </w:tr>
-      <w:tr>
-        <w:trPr>
-          <w:cantSplit/>
-        </w:trPr>
-        <w:tc>
-          <w:tcPr>
-            <w:tcW w:type="dxa" w:w="2120"/>
-            <w:tcBorders>
-              <w:top w:val="single" w:color="C9CEDB" w:sz="4"/>
-              <w:left w:val="single" w:color="C9CEDB" w:sz="4"/>
-              <w:bottom w:val="single" w:color="C9CEDB" w:sz="4"/>
-              <w:right w:val="single" w:color="C9CEDB" w:sz="4"/>
-            </w:tcBorders>
-            <w:shd w:fill="F4F5FA" w:color="auto" w:val="clear"/>
-            <w:tcMar>
-              <w:top w:type="dxa" w:w="70"/>
-              <w:left w:type="dxa" w:w="110"/>
-              <w:bottom w:type="dxa" w:w="70"/>
-              <w:right w:type="dxa" w:w="110"/>
-            </w:tcMar>
-          </w:tcPr>
-          <w:p>
-            <w:pPr>
-              <w:spacing w:after="0" w:line="270"/>
-            </w:pPr>
-            <w:r>
-              <w:rPr>
-                <w:rFonts w:ascii="Calibri" w:cs="Calibri" w:eastAsia="Calibri" w:hAnsi="Calibri"/>
-                <w:b/>
-                <w:bCs/>
-                <w:sz w:val="20"/>
-                <w:szCs w:val="20"/>
-              </w:rPr>
-              <w:t xml:space="preserve">10</w:t>
-            </w:r>
-          </w:p>
-        </w:tc>
-        <w:tc>
-          <w:tcPr>
-            <w:tcW w:type="dxa" w:w="3759"/>
-            <w:tcBorders>
-              <w:top w:val="single" w:color="C9CEDB" w:sz="4"/>
-              <w:left w:val="single" w:color="C9CEDB" w:sz="4"/>
-              <w:bottom w:val="single" w:color="C9CEDB" w:sz="4"/>
-              <w:right w:val="single" w:color="C9CEDB" w:sz="4"/>
-            </w:tcBorders>
-            <w:shd w:fill="F4F5FA" w:color="auto" w:val="clear"/>
-            <w:tcMar>
-              <w:top w:type="dxa" w:w="70"/>
-              <w:left w:type="dxa" w:w="110"/>
-              <w:bottom w:type="dxa" w:w="70"/>
-              <w:right w:type="dxa" w:w="110"/>
-            </w:tcMar>
-          </w:tcPr>
-          <w:p>
-            <w:pPr>
-              <w:spacing w:after="0" w:line="270"/>
-            </w:pPr>
-            <w:r>
-              <w:rPr>
-                <w:rFonts w:ascii="Calibri" w:cs="Calibri" w:eastAsia="Calibri" w:hAnsi="Calibri"/>
-                <w:b w:val="false"/>
-                <w:bCs w:val="false"/>
-                <w:sz w:val="20"/>
-                <w:szCs w:val="20"/>
-              </w:rPr>
-              <w:t xml:space="preserve">Bir Epic’te </w:t>
-            </w:r>
-            <w:r>
-              <w:rPr>
-                <w:rFonts w:ascii="Calibri" w:cs="Calibri" w:eastAsia="Calibri" w:hAnsi="Calibri"/>
-                <w:b/>
-                <w:bCs/>
-                <w:sz w:val="20"/>
-                <w:szCs w:val="20"/>
-              </w:rPr>
-              <w:t xml:space="preserve">Share</w:t>
-            </w:r>
-            <w:r>
-              <w:rPr>
-                <w:rFonts w:ascii="Calibri" w:cs="Calibri" w:eastAsia="Calibri" w:hAnsi="Calibri"/>
-                <w:b w:val="false"/>
-                <w:bCs w:val="false"/>
-                <w:sz w:val="20"/>
-                <w:szCs w:val="20"/>
-              </w:rPr>
-              <w:t xml:space="preserve">; Ayarlar → </w:t>
-            </w:r>
-            <w:r>
-              <w:rPr>
-                <w:rFonts w:ascii="Calibri" w:cs="Calibri" w:eastAsia="Calibri" w:hAnsi="Calibri"/>
-                <w:b/>
-                <w:bCs/>
-                <w:sz w:val="20"/>
-                <w:szCs w:val="20"/>
-              </w:rPr>
-              <w:t xml:space="preserve">Roles</w:t>
-            </w:r>
-            <w:r>
-              <w:rPr>
-                <w:rFonts w:ascii="Calibri" w:cs="Calibri" w:eastAsia="Calibri" w:hAnsi="Calibri"/>
-                <w:b w:val="false"/>
-                <w:bCs w:val="false"/>
-                <w:sz w:val="20"/>
-                <w:szCs w:val="20"/>
-              </w:rPr>
-              <w:t xml:space="preserve"/>
-            </w:r>
-          </w:p>
-        </w:tc>
-        <w:tc>
-          <w:tcPr>
-            <w:tcW w:type="dxa" w:w="3759"/>
-            <w:tcBorders>
-              <w:top w:val="single" w:color="C9CEDB" w:sz="4"/>
-              <w:left w:val="single" w:color="C9CEDB" w:sz="4"/>
-              <w:bottom w:val="single" w:color="C9CEDB" w:sz="4"/>
-              <w:right w:val="single" w:color="C9CEDB" w:sz="4"/>
-            </w:tcBorders>
-            <w:shd w:fill="F4F5FA" w:color="auto" w:val="clear"/>
-            <w:tcMar>
-              <w:top w:type="dxa" w:w="70"/>
-              <w:left w:type="dxa" w:w="110"/>
-              <w:bottom w:type="dxa" w:w="70"/>
-              <w:right w:type="dxa" w:w="110"/>
-            </w:tcMar>
-          </w:tcPr>
-          <w:p>
-            <w:pPr>
-              <w:spacing w:after="0" w:line="270"/>
-            </w:pPr>
-            <w:r>
-              <w:rPr>
-                <w:rFonts w:ascii="Calibri" w:cs="Calibri" w:eastAsia="Calibri" w:hAnsi="Calibri"/>
-                <w:b w:val="false"/>
-                <w:bCs w:val="false"/>
-                <w:sz w:val="20"/>
-                <w:szCs w:val="20"/>
-              </w:rPr>
-              <w:t xml:space="preserve">Kim neyi görür, neyi değiştirir: Proje’den tek bir işe kadar ayarlanır.</w:t>
-            </w:r>
-          </w:p>
-        </w:tc>
-      </w:tr>
-    </w:tbl>
-    <w:p>
-      <w:pPr>
-        <w:spacing w:after="160"/>
-      </w:pPr>
-    </w:p>
-    <w:tbl>
-      <w:tblPr>
-        <w:tblW w:type="dxa" w:w="9638"/>
-        <w:tblBorders>
-          <w:top w:val="single" w:color="auto" w:sz="4"/>
-          <w:left w:val="single" w:color="auto" w:sz="4"/>
-          <w:bottom w:val="single" w:color="auto" w:sz="4"/>
-          <w:right w:val="single" w:color="auto" w:sz="4"/>
-          <w:insideH w:val="single" w:color="auto" w:sz="4"/>
-          <w:insideV w:val="single" w:color="auto" w:sz="4"/>
-        </w:tblBorders>
-      </w:tblPr>
-      <w:tblGrid>
-        <w:gridCol w:w="9638"/>
-      </w:tblGrid>
-      <w:tr>
-        <w:trPr>
-          <w:cantSplit/>
-        </w:trPr>
-        <w:tc>
-          <w:tcPr>
-            <w:tcW w:type="dxa" w:w="9638"/>
-            <w:tcBorders>
-              <w:top w:val="none" w:color="FFFFFF" w:sz="0"/>
-              <w:left w:val="single" w:color="10B981" w:sz="24"/>
-              <w:bottom w:val="none" w:color="FFFFFF" w:sz="0"/>
-              <w:right w:val="none" w:color="FFFFFF" w:sz="0"/>
-            </w:tcBorders>
-            <w:shd w:fill="E7F7EE" w:color="auto" w:val="clear"/>
-            <w:tcMar>
-              <w:top w:type="dxa" w:w="100"/>
-              <w:left w:type="dxa" w:w="180"/>
-              <w:bottom w:type="dxa" w:w="100"/>
-              <w:right w:type="dxa" w:w="140"/>
-            </w:tcMar>
-          </w:tcPr>
-          <w:p>
-            <w:pPr>
-              <w:spacing w:after="0" w:line="290"/>
-            </w:pPr>
-            <w:r>
-              <w:rPr>
-                <w:rFonts w:ascii="Calibri" w:cs="Calibri" w:eastAsia="Calibri" w:hAnsi="Calibri"/>
-                <w:b/>
-                <w:bCs/>
-                <w:sz w:val="22"/>
-                <w:szCs w:val="22"/>
-              </w:rPr>
-              <w:t xml:space="preserve">İpucu: </w:t>
-            </w:r>
-            <w:r>
-              <w:rPr>
-                <w:rFonts w:ascii="Calibri" w:cs="Calibri" w:eastAsia="Calibri" w:hAnsi="Calibri"/>
-                <w:sz w:val="22"/>
-                <w:szCs w:val="22"/>
-              </w:rPr>
-              <w:t xml:space="preserve">Sunumdan önce bir Proje, birkaç Task ve bir Sprint hazırla. Sıfırdan yazmak zaman alır; hazır veriyle 5 dakikada bitirirsin. Sürükleme ve Bugs adımları en çok ilgi çekenlerdir, onlara zaman ayır.</w:t>
+              <w:t xml:space="preserve">5</w:t>
             </w:r>
           </w:p>
         </w:tc>
@@ -2778,1921 +2049,6 @@
         <w:spacing w:after="200"/>
       </w:pPr>
     </w:p>
-    <w:p>
-      <w:pPr>
-        <w:spacing w:after="140" w:line="300"/>
-      </w:pPr>
-      <w:r>
-        <w:rPr>
-          <w:rFonts w:ascii="Calibri" w:cs="Calibri" w:eastAsia="Calibri" w:hAnsi="Calibri"/>
-          <w:sz w:val="22"/>
-          <w:szCs w:val="22"/>
-        </w:rPr>
-        <w:t xml:space="preserve"/>
-      </w:r>
-      <w:r>
-        <w:rPr>
-          <w:rFonts w:ascii="Calibri" w:cs="Calibri" w:eastAsia="Calibri" w:hAnsi="Calibri"/>
-          <w:b/>
-          <w:bCs/>
-          <w:sz w:val="22"/>
-          <w:szCs w:val="22"/>
-        </w:rPr>
-        <w:t xml:space="preserve">Sık sorulacak sorular</w:t>
-      </w:r>
-      <w:r>
-        <w:rPr>
-          <w:rFonts w:ascii="Calibri" w:cs="Calibri" w:eastAsia="Calibri" w:hAnsi="Calibri"/>
-          <w:sz w:val="22"/>
-          <w:szCs w:val="22"/>
-        </w:rPr>
-        <w:t xml:space="preserve"/>
-      </w:r>
-    </w:p>
-    <w:p>
-      <w:pPr>
-        <w:pStyle w:val="ListParagraph"/>
-        <w:numPr>
-          <w:ilvl w:val="0"/>
-          <w:numId w:val="2"/>
-        </w:numPr>
-        <w:spacing w:after="80" w:line="290"/>
-      </w:pPr>
-      <w:r>
-        <w:rPr>
-          <w:rFonts w:ascii="Calibri" w:cs="Calibri" w:eastAsia="Calibri" w:hAnsi="Calibri"/>
-          <w:sz w:val="22"/>
-          <w:szCs w:val="22"/>
-        </w:rPr>
-        <w:t xml:space="preserve"/>
-      </w:r>
-      <w:r>
-        <w:rPr>
-          <w:rFonts w:ascii="Calibri" w:cs="Calibri" w:eastAsia="Calibri" w:hAnsi="Calibri"/>
-          <w:b/>
-          <w:bCs/>
-          <w:sz w:val="22"/>
-          <w:szCs w:val="22"/>
-        </w:rPr>
-        <w:t xml:space="preserve">Veriler nerede?</w:t>
-      </w:r>
-      <w:r>
-        <w:rPr>
-          <w:rFonts w:ascii="Calibri" w:cs="Calibri" w:eastAsia="Calibri" w:hAnsi="Calibri"/>
-          <w:sz w:val="22"/>
-          <w:szCs w:val="22"/>
-        </w:rPr>
-        <w:t xml:space="preserve"> Kurumun kendi sunucusunda (PostgreSQL). Günlük otomatik yedek alınır; bir Proje ayrıca yedekten geri yüklenebilir.</w:t>
-      </w:r>
-    </w:p>
-    <w:p>
-      <w:pPr>
-        <w:pStyle w:val="ListParagraph"/>
-        <w:numPr>
-          <w:ilvl w:val="0"/>
-          <w:numId w:val="2"/>
-        </w:numPr>
-        <w:spacing w:after="80" w:line="290"/>
-      </w:pPr>
-      <w:r>
-        <w:rPr>
-          <w:rFonts w:ascii="Calibri" w:cs="Calibri" w:eastAsia="Calibri" w:hAnsi="Calibri"/>
-          <w:sz w:val="22"/>
-          <w:szCs w:val="22"/>
-        </w:rPr>
-        <w:t xml:space="preserve"/>
-      </w:r>
-      <w:r>
-        <w:rPr>
-          <w:rFonts w:ascii="Calibri" w:cs="Calibri" w:eastAsia="Calibri" w:hAnsi="Calibri"/>
-          <w:b/>
-          <w:bCs/>
-          <w:sz w:val="22"/>
-          <w:szCs w:val="22"/>
-        </w:rPr>
-        <w:t xml:space="preserve">Kim neyi görür?</w:t>
-      </w:r>
-      <w:r>
-        <w:rPr>
-          <w:rFonts w:ascii="Calibri" w:cs="Calibri" w:eastAsia="Calibri" w:hAnsi="Calibri"/>
-          <w:sz w:val="22"/>
-          <w:szCs w:val="22"/>
-        </w:rPr>
-        <w:t xml:space="preserve"> Roller ve yetkiler Ayarlar → Roles’ten düzenlenir; özel bir Epic ya da Task “Private” yapılıp yalnızca seçilenlere açılabilir.</w:t>
-      </w:r>
-    </w:p>
-    <w:p>
-      <w:pPr>
-        <w:pStyle w:val="ListParagraph"/>
-        <w:numPr>
-          <w:ilvl w:val="0"/>
-          <w:numId w:val="2"/>
-        </w:numPr>
-        <w:spacing w:after="80" w:line="290"/>
-      </w:pPr>
-      <w:r>
-        <w:rPr>
-          <w:rFonts w:ascii="Calibri" w:cs="Calibri" w:eastAsia="Calibri" w:hAnsi="Calibri"/>
-          <w:sz w:val="22"/>
-          <w:szCs w:val="22"/>
-        </w:rPr>
-        <w:t xml:space="preserve"/>
-      </w:r>
-      <w:r>
-        <w:rPr>
-          <w:rFonts w:ascii="Calibri" w:cs="Calibri" w:eastAsia="Calibri" w:hAnsi="Calibri"/>
-          <w:b/>
-          <w:bCs/>
-          <w:sz w:val="22"/>
-          <w:szCs w:val="22"/>
-        </w:rPr>
-        <w:t xml:space="preserve">Dosya eklenir mi?</w:t>
-      </w:r>
-      <w:r>
-        <w:rPr>
-          <w:rFonts w:ascii="Calibri" w:cs="Calibri" w:eastAsia="Calibri" w:hAnsi="Calibri"/>
-          <w:sz w:val="22"/>
-          <w:szCs w:val="22"/>
-        </w:rPr>
-        <w:t xml:space="preserve"> Evet, Task ve Epic’e her türden dosya, 100 MB’a kadar.</w:t>
-      </w:r>
-    </w:p>
-    <w:p>
-      <w:pPr>
-        <w:pStyle w:val="ListParagraph"/>
-        <w:numPr>
-          <w:ilvl w:val="0"/>
-          <w:numId w:val="2"/>
-        </w:numPr>
-        <w:spacing w:after="80" w:line="290"/>
-      </w:pPr>
-      <w:r>
-        <w:rPr>
-          <w:rFonts w:ascii="Calibri" w:cs="Calibri" w:eastAsia="Calibri" w:hAnsi="Calibri"/>
-          <w:sz w:val="22"/>
-          <w:szCs w:val="22"/>
-        </w:rPr>
-        <w:t xml:space="preserve"/>
-      </w:r>
-      <w:r>
-        <w:rPr>
-          <w:rFonts w:ascii="Calibri" w:cs="Calibri" w:eastAsia="Calibri" w:hAnsi="Calibri"/>
-          <w:b/>
-          <w:bCs/>
-          <w:sz w:val="22"/>
-          <w:szCs w:val="22"/>
-        </w:rPr>
-        <w:t xml:space="preserve">Bildirim var mı?</w:t>
-      </w:r>
-      <w:r>
-        <w:rPr>
-          <w:rFonts w:ascii="Calibri" w:cs="Calibri" w:eastAsia="Calibri" w:hAnsi="Calibri"/>
-          <w:sz w:val="22"/>
-          <w:szCs w:val="22"/>
-        </w:rPr>
-        <w:t xml:space="preserve"> Evet: uygulama içinde ve e-postayla (atama, yorum, durum, Bug). E-posta ayarı Ayarlar → Genel’den girilir.</w:t>
-      </w:r>
-    </w:p>
-    <w:p>
-      <w:pPr>
-        <w:pStyle w:val="ListParagraph"/>
-        <w:numPr>
-          <w:ilvl w:val="0"/>
-          <w:numId w:val="2"/>
-        </w:numPr>
-        <w:spacing w:after="80" w:line="290"/>
-      </w:pPr>
-      <w:r>
-        <w:rPr>
-          <w:rFonts w:ascii="Calibri" w:cs="Calibri" w:eastAsia="Calibri" w:hAnsi="Calibri"/>
-          <w:sz w:val="22"/>
-          <w:szCs w:val="22"/>
-        </w:rPr>
-        <w:t xml:space="preserve"/>
-      </w:r>
-      <w:r>
-        <w:rPr>
-          <w:rFonts w:ascii="Calibri" w:cs="Calibri" w:eastAsia="Calibri" w:hAnsi="Calibri"/>
-          <w:b/>
-          <w:bCs/>
-          <w:sz w:val="22"/>
-          <w:szCs w:val="22"/>
-        </w:rPr>
-        <w:t xml:space="preserve">Başka araçla farkı?</w:t>
-      </w:r>
-      <w:r>
-        <w:rPr>
-          <w:rFonts w:ascii="Calibri" w:cs="Calibri" w:eastAsia="Calibri" w:hAnsi="Calibri"/>
-          <w:sz w:val="22"/>
-          <w:szCs w:val="22"/>
-        </w:rPr>
-        <w:t xml:space="preserve"> Scrum (Sprint, Backlog, Burndown) ve Kanban bir arada; Türkçe; kendi sunucunda.</w:t>
-      </w:r>
-    </w:p>
-    <w:p>
-      <w:pPr>
-        <w:spacing w:after="100"/>
-      </w:pPr>
-    </w:p>
-    <w:p>
-      <w:pPr>
-        <w:pStyle w:val="Heading1"/>
-        <w:keepNext/>
-      </w:pPr>
-      <w:r>
-        <w:rPr>
-          <w:rFonts w:ascii="Calibri" w:cs="Calibri" w:eastAsia="Calibri" w:hAnsi="Calibri"/>
-          <w:b/>
-          <w:bCs/>
-          <w:color w:val="3B2A9E"/>
-          <w:sz w:val="34"/>
-          <w:szCs w:val="34"/>
-        </w:rPr>
-        <w:t xml:space="preserve">Başlamadan önce: temel kavramlar</w:t>
-      </w:r>
-    </w:p>
-    <w:p>
-      <w:pPr>
-        <w:spacing w:after="140" w:line="300"/>
-      </w:pPr>
-      <w:r>
-        <w:rPr>
-          <w:rFonts w:ascii="Calibri" w:cs="Calibri" w:eastAsia="Calibri" w:hAnsi="Calibri"/>
-          <w:sz w:val="22"/>
-          <w:szCs w:val="22"/>
-        </w:rPr>
-        <w:t xml:space="preserve">Seyir, ekibin işlerini planladığı ve takip ettiği bir proje yönetimi uygulamasıdır. Bu kılavuz hiç kullanmamış biri için yazıldı: her adımda ekranın neresine bakacağını, kırmızı </w:t>
-      </w:r>
-      <w:r>
-        <w:rPr>
-          <w:rFonts w:ascii="Calibri" w:cs="Calibri" w:eastAsia="Calibri" w:hAnsi="Calibri"/>
-          <w:b/>
-          <w:bCs/>
-          <w:sz w:val="22"/>
-          <w:szCs w:val="22"/>
-        </w:rPr>
-        <w:t xml:space="preserve">numaralı işaretlerle</w:t>
-      </w:r>
-      <w:r>
-        <w:rPr>
-          <w:rFonts w:ascii="Calibri" w:cs="Calibri" w:eastAsia="Calibri" w:hAnsi="Calibri"/>
-          <w:sz w:val="22"/>
-          <w:szCs w:val="22"/>
-        </w:rPr>
-        <w:t xml:space="preserve"> gösteriyoruz. Görseldeki numara, görselin altındaki listeyle birebir eşleşir.</w:t>
-      </w:r>
-    </w:p>
-    <w:p>
-      <w:pPr>
-        <w:spacing w:after="140" w:line="300"/>
-      </w:pPr>
-      <w:r>
-        <w:rPr>
-          <w:rFonts w:ascii="Calibri" w:cs="Calibri" w:eastAsia="Calibri" w:hAnsi="Calibri"/>
-          <w:sz w:val="22"/>
-          <w:szCs w:val="22"/>
-        </w:rPr>
-        <w:t xml:space="preserve">Önce şu kelimeleri bilmek yeterli (Seyir'de bunların İngilizce adları kullanılır):</w:t>
-      </w:r>
-    </w:p>
-    <w:tbl>
-      <w:tblPr>
-        <w:tblW w:type="dxa" w:w="9638"/>
-        <w:tblBorders>
-          <w:top w:val="single" w:color="auto" w:sz="4"/>
-          <w:left w:val="single" w:color="auto" w:sz="4"/>
-          <w:bottom w:val="single" w:color="auto" w:sz="4"/>
-          <w:right w:val="single" w:color="auto" w:sz="4"/>
-          <w:insideH w:val="single" w:color="auto" w:sz="4"/>
-          <w:insideV w:val="single" w:color="auto" w:sz="4"/>
-        </w:tblBorders>
-      </w:tblPr>
-      <w:tblGrid>
-        <w:gridCol w:w="2120"/>
-        <w:gridCol w:w="3759"/>
-        <w:gridCol w:w="3759"/>
-      </w:tblGrid>
-      <w:tr>
-        <w:trPr>
-          <w:cantSplit/>
-          <w:tblHeader/>
-        </w:trPr>
-        <w:tc>
-          <w:tcPr>
-            <w:tcW w:type="dxa" w:w="2120"/>
-            <w:tcBorders>
-              <w:top w:val="single" w:color="C9CEDB" w:sz="4"/>
-              <w:left w:val="single" w:color="C9CEDB" w:sz="4"/>
-              <w:bottom w:val="single" w:color="C9CEDB" w:sz="4"/>
-              <w:right w:val="single" w:color="C9CEDB" w:sz="4"/>
-            </w:tcBorders>
-            <w:shd w:fill="5B3FD1" w:color="auto" w:val="clear"/>
-            <w:tcMar>
-              <w:top w:type="dxa" w:w="70"/>
-              <w:left w:type="dxa" w:w="110"/>
-              <w:bottom w:type="dxa" w:w="70"/>
-              <w:right w:type="dxa" w:w="110"/>
-            </w:tcMar>
-          </w:tcPr>
-          <w:p>
-            <w:pPr>
-              <w:spacing w:after="0" w:line="270"/>
-            </w:pPr>
-            <w:r>
-              <w:rPr>
-                <w:rFonts w:ascii="Calibri" w:cs="Calibri" w:eastAsia="Calibri" w:hAnsi="Calibri"/>
-                <w:b/>
-                <w:bCs/>
-                <w:color w:val="FFFFFF"/>
-                <w:sz w:val="20"/>
-                <w:szCs w:val="20"/>
-              </w:rPr>
-              <w:t xml:space="preserve">Kavram</w:t>
-            </w:r>
-          </w:p>
-        </w:tc>
-        <w:tc>
-          <w:tcPr>
-            <w:tcW w:type="dxa" w:w="3759"/>
-            <w:tcBorders>
-              <w:top w:val="single" w:color="C9CEDB" w:sz="4"/>
-              <w:left w:val="single" w:color="C9CEDB" w:sz="4"/>
-              <w:bottom w:val="single" w:color="C9CEDB" w:sz="4"/>
-              <w:right w:val="single" w:color="C9CEDB" w:sz="4"/>
-            </w:tcBorders>
-            <w:shd w:fill="5B3FD1" w:color="auto" w:val="clear"/>
-            <w:tcMar>
-              <w:top w:type="dxa" w:w="70"/>
-              <w:left w:type="dxa" w:w="110"/>
-              <w:bottom w:type="dxa" w:w="70"/>
-              <w:right w:type="dxa" w:w="110"/>
-            </w:tcMar>
-          </w:tcPr>
-          <w:p>
-            <w:pPr>
-              <w:spacing w:after="0" w:line="270"/>
-            </w:pPr>
-            <w:r>
-              <w:rPr>
-                <w:rFonts w:ascii="Calibri" w:cs="Calibri" w:eastAsia="Calibri" w:hAnsi="Calibri"/>
-                <w:b/>
-                <w:bCs/>
-                <w:color w:val="FFFFFF"/>
-                <w:sz w:val="20"/>
-                <w:szCs w:val="20"/>
-              </w:rPr>
-              <w:t xml:space="preserve">Ne demek?</w:t>
-            </w:r>
-          </w:p>
-        </w:tc>
-        <w:tc>
-          <w:tcPr>
-            <w:tcW w:type="dxa" w:w="3759"/>
-            <w:tcBorders>
-              <w:top w:val="single" w:color="C9CEDB" w:sz="4"/>
-              <w:left w:val="single" w:color="C9CEDB" w:sz="4"/>
-              <w:bottom w:val="single" w:color="C9CEDB" w:sz="4"/>
-              <w:right w:val="single" w:color="C9CEDB" w:sz="4"/>
-            </w:tcBorders>
-            <w:shd w:fill="5B3FD1" w:color="auto" w:val="clear"/>
-            <w:tcMar>
-              <w:top w:type="dxa" w:w="70"/>
-              <w:left w:type="dxa" w:w="110"/>
-              <w:bottom w:type="dxa" w:w="70"/>
-              <w:right w:type="dxa" w:w="110"/>
-            </w:tcMar>
-          </w:tcPr>
-          <w:p>
-            <w:pPr>
-              <w:spacing w:after="0" w:line="270"/>
-            </w:pPr>
-            <w:r>
-              <w:rPr>
-                <w:rFonts w:ascii="Calibri" w:cs="Calibri" w:eastAsia="Calibri" w:hAnsi="Calibri"/>
-                <w:b/>
-                <w:bCs/>
-                <w:color w:val="FFFFFF"/>
-                <w:sz w:val="20"/>
-                <w:szCs w:val="20"/>
-              </w:rPr>
-              <w:t xml:space="preserve">Örnek</w:t>
-            </w:r>
-          </w:p>
-        </w:tc>
-      </w:tr>
-      <w:tr>
-        <w:trPr>
-          <w:cantSplit/>
-        </w:trPr>
-        <w:tc>
-          <w:tcPr>
-            <w:tcW w:type="dxa" w:w="2120"/>
-            <w:tcBorders>
-              <w:top w:val="single" w:color="C9CEDB" w:sz="4"/>
-              <w:left w:val="single" w:color="C9CEDB" w:sz="4"/>
-              <w:bottom w:val="single" w:color="C9CEDB" w:sz="4"/>
-              <w:right w:val="single" w:color="C9CEDB" w:sz="4"/>
-            </w:tcBorders>
-            <w:tcMar>
-              <w:top w:type="dxa" w:w="70"/>
-              <w:left w:type="dxa" w:w="110"/>
-              <w:bottom w:type="dxa" w:w="70"/>
-              <w:right w:type="dxa" w:w="110"/>
-            </w:tcMar>
-          </w:tcPr>
-          <w:p>
-            <w:pPr>
-              <w:spacing w:after="0" w:line="270"/>
-            </w:pPr>
-            <w:r>
-              <w:rPr>
-                <w:rFonts w:ascii="Calibri" w:cs="Calibri" w:eastAsia="Calibri" w:hAnsi="Calibri"/>
-                <w:b/>
-                <w:bCs/>
-                <w:sz w:val="20"/>
-                <w:szCs w:val="20"/>
-              </w:rPr>
-              <w:t xml:space="preserve">Proje</w:t>
-            </w:r>
-          </w:p>
-        </w:tc>
-        <w:tc>
-          <w:tcPr>
-            <w:tcW w:type="dxa" w:w="3759"/>
-            <w:tcBorders>
-              <w:top w:val="single" w:color="C9CEDB" w:sz="4"/>
-              <w:left w:val="single" w:color="C9CEDB" w:sz="4"/>
-              <w:bottom w:val="single" w:color="C9CEDB" w:sz="4"/>
-              <w:right w:val="single" w:color="C9CEDB" w:sz="4"/>
-            </w:tcBorders>
-            <w:tcMar>
-              <w:top w:type="dxa" w:w="70"/>
-              <w:left w:type="dxa" w:w="110"/>
-              <w:bottom w:type="dxa" w:w="70"/>
-              <w:right w:type="dxa" w:w="110"/>
-            </w:tcMar>
-          </w:tcPr>
-          <w:p>
-            <w:pPr>
-              <w:spacing w:after="0" w:line="270"/>
-            </w:pPr>
-            <w:r>
-              <w:rPr>
-                <w:rFonts w:ascii="Calibri" w:cs="Calibri" w:eastAsia="Calibri" w:hAnsi="Calibri"/>
-                <w:b w:val="false"/>
-                <w:bCs w:val="false"/>
-                <w:sz w:val="20"/>
-                <w:szCs w:val="20"/>
-              </w:rPr>
-              <w:t xml:space="preserve">Bir ürün veya ekip için ayrılmış çalışma alanı. Bütün işler bir Proje içinde tutulur.</w:t>
-            </w:r>
-          </w:p>
-        </w:tc>
-        <w:tc>
-          <w:tcPr>
-            <w:tcW w:type="dxa" w:w="3759"/>
-            <w:tcBorders>
-              <w:top w:val="single" w:color="C9CEDB" w:sz="4"/>
-              <w:left w:val="single" w:color="C9CEDB" w:sz="4"/>
-              <w:bottom w:val="single" w:color="C9CEDB" w:sz="4"/>
-              <w:right w:val="single" w:color="C9CEDB" w:sz="4"/>
-            </w:tcBorders>
-            <w:tcMar>
-              <w:top w:type="dxa" w:w="70"/>
-              <w:left w:type="dxa" w:w="110"/>
-              <w:bottom w:type="dxa" w:w="70"/>
-              <w:right w:type="dxa" w:w="110"/>
-            </w:tcMar>
-          </w:tcPr>
-          <w:p>
-            <w:pPr>
-              <w:spacing w:after="0" w:line="270"/>
-            </w:pPr>
-            <w:r>
-              <w:rPr>
-                <w:rFonts w:ascii="Calibri" w:cs="Calibri" w:eastAsia="Calibri" w:hAnsi="Calibri"/>
-                <w:b w:val="false"/>
-                <w:bCs w:val="false"/>
-                <w:sz w:val="20"/>
-                <w:szCs w:val="20"/>
-              </w:rPr>
-              <w:t xml:space="preserve">Mobil Uygulama</w:t>
-            </w:r>
-          </w:p>
-        </w:tc>
-      </w:tr>
-      <w:tr>
-        <w:trPr>
-          <w:cantSplit/>
-        </w:trPr>
-        <w:tc>
-          <w:tcPr>
-            <w:tcW w:type="dxa" w:w="2120"/>
-            <w:tcBorders>
-              <w:top w:val="single" w:color="C9CEDB" w:sz="4"/>
-              <w:left w:val="single" w:color="C9CEDB" w:sz="4"/>
-              <w:bottom w:val="single" w:color="C9CEDB" w:sz="4"/>
-              <w:right w:val="single" w:color="C9CEDB" w:sz="4"/>
-            </w:tcBorders>
-            <w:shd w:fill="F4F5FA" w:color="auto" w:val="clear"/>
-            <w:tcMar>
-              <w:top w:type="dxa" w:w="70"/>
-              <w:left w:type="dxa" w:w="110"/>
-              <w:bottom w:type="dxa" w:w="70"/>
-              <w:right w:type="dxa" w:w="110"/>
-            </w:tcMar>
-          </w:tcPr>
-          <w:p>
-            <w:pPr>
-              <w:spacing w:after="0" w:line="270"/>
-            </w:pPr>
-            <w:r>
-              <w:rPr>
-                <w:rFonts w:ascii="Calibri" w:cs="Calibri" w:eastAsia="Calibri" w:hAnsi="Calibri"/>
-                <w:b/>
-                <w:bCs/>
-                <w:sz w:val="20"/>
-                <w:szCs w:val="20"/>
-              </w:rPr>
-              <w:t xml:space="preserve">Epic</w:t>
-            </w:r>
-          </w:p>
-        </w:tc>
-        <w:tc>
-          <w:tcPr>
-            <w:tcW w:type="dxa" w:w="3759"/>
-            <w:tcBorders>
-              <w:top w:val="single" w:color="C9CEDB" w:sz="4"/>
-              <w:left w:val="single" w:color="C9CEDB" w:sz="4"/>
-              <w:bottom w:val="single" w:color="C9CEDB" w:sz="4"/>
-              <w:right w:val="single" w:color="C9CEDB" w:sz="4"/>
-            </w:tcBorders>
-            <w:shd w:fill="F4F5FA" w:color="auto" w:val="clear"/>
-            <w:tcMar>
-              <w:top w:type="dxa" w:w="70"/>
-              <w:left w:type="dxa" w:w="110"/>
-              <w:bottom w:type="dxa" w:w="70"/>
-              <w:right w:type="dxa" w:w="110"/>
-            </w:tcMar>
-          </w:tcPr>
-          <w:p>
-            <w:pPr>
-              <w:spacing w:after="0" w:line="270"/>
-            </w:pPr>
-            <w:r>
-              <w:rPr>
-                <w:rFonts w:ascii="Calibri" w:cs="Calibri" w:eastAsia="Calibri" w:hAnsi="Calibri"/>
-                <w:b w:val="false"/>
-                <w:bCs w:val="false"/>
-                <w:sz w:val="20"/>
-                <w:szCs w:val="20"/>
-              </w:rPr>
-              <w:t xml:space="preserve">Birçok Task'ı çatısı altında toplayan büyük hedef. İsteğe bağlıdır.</w:t>
-            </w:r>
-          </w:p>
-        </w:tc>
-        <w:tc>
-          <w:tcPr>
-            <w:tcW w:type="dxa" w:w="3759"/>
-            <w:tcBorders>
-              <w:top w:val="single" w:color="C9CEDB" w:sz="4"/>
-              <w:left w:val="single" w:color="C9CEDB" w:sz="4"/>
-              <w:bottom w:val="single" w:color="C9CEDB" w:sz="4"/>
-              <w:right w:val="single" w:color="C9CEDB" w:sz="4"/>
-            </w:tcBorders>
-            <w:shd w:fill="F4F5FA" w:color="auto" w:val="clear"/>
-            <w:tcMar>
-              <w:top w:type="dxa" w:w="70"/>
-              <w:left w:type="dxa" w:w="110"/>
-              <w:bottom w:type="dxa" w:w="70"/>
-              <w:right w:type="dxa" w:w="110"/>
-            </w:tcMar>
-          </w:tcPr>
-          <w:p>
-            <w:pPr>
-              <w:spacing w:after="0" w:line="270"/>
-            </w:pPr>
-            <w:r>
-              <w:rPr>
-                <w:rFonts w:ascii="Calibri" w:cs="Calibri" w:eastAsia="Calibri" w:hAnsi="Calibri"/>
-                <w:b w:val="false"/>
-                <w:bCs w:val="false"/>
-                <w:sz w:val="20"/>
-                <w:szCs w:val="20"/>
-              </w:rPr>
-              <w:t xml:space="preserve">Kullanıcı hesabı yönetimi</w:t>
-            </w:r>
-          </w:p>
-        </w:tc>
-      </w:tr>
-      <w:tr>
-        <w:trPr>
-          <w:cantSplit/>
-        </w:trPr>
-        <w:tc>
-          <w:tcPr>
-            <w:tcW w:type="dxa" w:w="2120"/>
-            <w:tcBorders>
-              <w:top w:val="single" w:color="C9CEDB" w:sz="4"/>
-              <w:left w:val="single" w:color="C9CEDB" w:sz="4"/>
-              <w:bottom w:val="single" w:color="C9CEDB" w:sz="4"/>
-              <w:right w:val="single" w:color="C9CEDB" w:sz="4"/>
-            </w:tcBorders>
-            <w:tcMar>
-              <w:top w:type="dxa" w:w="70"/>
-              <w:left w:type="dxa" w:w="110"/>
-              <w:bottom w:type="dxa" w:w="70"/>
-              <w:right w:type="dxa" w:w="110"/>
-            </w:tcMar>
-          </w:tcPr>
-          <w:p>
-            <w:pPr>
-              <w:spacing w:after="0" w:line="270"/>
-            </w:pPr>
-            <w:r>
-              <w:rPr>
-                <w:rFonts w:ascii="Calibri" w:cs="Calibri" w:eastAsia="Calibri" w:hAnsi="Calibri"/>
-                <w:b/>
-                <w:bCs/>
-                <w:sz w:val="20"/>
-                <w:szCs w:val="20"/>
-              </w:rPr>
-              <w:t xml:space="preserve">Task</w:t>
-            </w:r>
-          </w:p>
-        </w:tc>
-        <w:tc>
-          <w:tcPr>
-            <w:tcW w:type="dxa" w:w="3759"/>
-            <w:tcBorders>
-              <w:top w:val="single" w:color="C9CEDB" w:sz="4"/>
-              <w:left w:val="single" w:color="C9CEDB" w:sz="4"/>
-              <w:bottom w:val="single" w:color="C9CEDB" w:sz="4"/>
-              <w:right w:val="single" w:color="C9CEDB" w:sz="4"/>
-            </w:tcBorders>
-            <w:tcMar>
-              <w:top w:type="dxa" w:w="70"/>
-              <w:left w:type="dxa" w:w="110"/>
-              <w:bottom w:type="dxa" w:w="70"/>
-              <w:right w:type="dxa" w:w="110"/>
-            </w:tcMar>
-          </w:tcPr>
-          <w:p>
-            <w:pPr>
-              <w:spacing w:after="0" w:line="270"/>
-            </w:pPr>
-            <w:r>
-              <w:rPr>
-                <w:rFonts w:ascii="Calibri" w:cs="Calibri" w:eastAsia="Calibri" w:hAnsi="Calibri"/>
-                <w:b w:val="false"/>
-                <w:bCs w:val="false"/>
-                <w:sz w:val="20"/>
-                <w:szCs w:val="20"/>
-              </w:rPr>
-              <w:t xml:space="preserve">Yapılacak tek bir iş. Başlığı, sahibi, tarihi ve puanı vardır.</w:t>
-            </w:r>
-          </w:p>
-        </w:tc>
-        <w:tc>
-          <w:tcPr>
-            <w:tcW w:type="dxa" w:w="3759"/>
-            <w:tcBorders>
-              <w:top w:val="single" w:color="C9CEDB" w:sz="4"/>
-              <w:left w:val="single" w:color="C9CEDB" w:sz="4"/>
-              <w:bottom w:val="single" w:color="C9CEDB" w:sz="4"/>
-              <w:right w:val="single" w:color="C9CEDB" w:sz="4"/>
-            </w:tcBorders>
-            <w:tcMar>
-              <w:top w:type="dxa" w:w="70"/>
-              <w:left w:type="dxa" w:w="110"/>
-              <w:bottom w:type="dxa" w:w="70"/>
-              <w:right w:type="dxa" w:w="110"/>
-            </w:tcMar>
-          </w:tcPr>
-          <w:p>
-            <w:pPr>
-              <w:spacing w:after="0" w:line="270"/>
-            </w:pPr>
-            <w:r>
-              <w:rPr>
-                <w:rFonts w:ascii="Calibri" w:cs="Calibri" w:eastAsia="Calibri" w:hAnsi="Calibri"/>
-                <w:b w:val="false"/>
-                <w:bCs w:val="false"/>
-                <w:sz w:val="20"/>
-                <w:szCs w:val="20"/>
-              </w:rPr>
-              <w:t xml:space="preserve">Giriş ekranını tasarla</w:t>
-            </w:r>
-          </w:p>
-        </w:tc>
-      </w:tr>
-      <w:tr>
-        <w:trPr>
-          <w:cantSplit/>
-        </w:trPr>
-        <w:tc>
-          <w:tcPr>
-            <w:tcW w:type="dxa" w:w="2120"/>
-            <w:tcBorders>
-              <w:top w:val="single" w:color="C9CEDB" w:sz="4"/>
-              <w:left w:val="single" w:color="C9CEDB" w:sz="4"/>
-              <w:bottom w:val="single" w:color="C9CEDB" w:sz="4"/>
-              <w:right w:val="single" w:color="C9CEDB" w:sz="4"/>
-            </w:tcBorders>
-            <w:shd w:fill="F4F5FA" w:color="auto" w:val="clear"/>
-            <w:tcMar>
-              <w:top w:type="dxa" w:w="70"/>
-              <w:left w:type="dxa" w:w="110"/>
-              <w:bottom w:type="dxa" w:w="70"/>
-              <w:right w:type="dxa" w:w="110"/>
-            </w:tcMar>
-          </w:tcPr>
-          <w:p>
-            <w:pPr>
-              <w:spacing w:after="0" w:line="270"/>
-            </w:pPr>
-            <w:r>
-              <w:rPr>
-                <w:rFonts w:ascii="Calibri" w:cs="Calibri" w:eastAsia="Calibri" w:hAnsi="Calibri"/>
-                <w:b/>
-                <w:bCs/>
-                <w:sz w:val="20"/>
-                <w:szCs w:val="20"/>
-              </w:rPr>
-              <w:t xml:space="preserve">Sub-Task</w:t>
-            </w:r>
-          </w:p>
-        </w:tc>
-        <w:tc>
-          <w:tcPr>
-            <w:tcW w:type="dxa" w:w="3759"/>
-            <w:tcBorders>
-              <w:top w:val="single" w:color="C9CEDB" w:sz="4"/>
-              <w:left w:val="single" w:color="C9CEDB" w:sz="4"/>
-              <w:bottom w:val="single" w:color="C9CEDB" w:sz="4"/>
-              <w:right w:val="single" w:color="C9CEDB" w:sz="4"/>
-            </w:tcBorders>
-            <w:shd w:fill="F4F5FA" w:color="auto" w:val="clear"/>
-            <w:tcMar>
-              <w:top w:type="dxa" w:w="70"/>
-              <w:left w:type="dxa" w:w="110"/>
-              <w:bottom w:type="dxa" w:w="70"/>
-              <w:right w:type="dxa" w:w="110"/>
-            </w:tcMar>
-          </w:tcPr>
-          <w:p>
-            <w:pPr>
-              <w:spacing w:after="0" w:line="270"/>
-            </w:pPr>
-            <w:r>
-              <w:rPr>
-                <w:rFonts w:ascii="Calibri" w:cs="Calibri" w:eastAsia="Calibri" w:hAnsi="Calibri"/>
-                <w:b w:val="false"/>
-                <w:bCs w:val="false"/>
-                <w:sz w:val="20"/>
-                <w:szCs w:val="20"/>
-              </w:rPr>
-              <w:t xml:space="preserve">Bir Task'ın küçük parçası. Tek başına var olamaz, her zaman bir üst Task'a bağlıdır.</w:t>
-            </w:r>
-          </w:p>
-        </w:tc>
-        <w:tc>
-          <w:tcPr>
-            <w:tcW w:type="dxa" w:w="3759"/>
-            <w:tcBorders>
-              <w:top w:val="single" w:color="C9CEDB" w:sz="4"/>
-              <w:left w:val="single" w:color="C9CEDB" w:sz="4"/>
-              <w:bottom w:val="single" w:color="C9CEDB" w:sz="4"/>
-              <w:right w:val="single" w:color="C9CEDB" w:sz="4"/>
-            </w:tcBorders>
-            <w:shd w:fill="F4F5FA" w:color="auto" w:val="clear"/>
-            <w:tcMar>
-              <w:top w:type="dxa" w:w="70"/>
-              <w:left w:type="dxa" w:w="110"/>
-              <w:bottom w:type="dxa" w:w="70"/>
-              <w:right w:type="dxa" w:w="110"/>
-            </w:tcMar>
-          </w:tcPr>
-          <w:p>
-            <w:pPr>
-              <w:spacing w:after="0" w:line="270"/>
-            </w:pPr>
-            <w:r>
-              <w:rPr>
-                <w:rFonts w:ascii="Calibri" w:cs="Calibri" w:eastAsia="Calibri" w:hAnsi="Calibri"/>
-                <w:b w:val="false"/>
-                <w:bCs w:val="false"/>
-                <w:sz w:val="20"/>
-                <w:szCs w:val="20"/>
-              </w:rPr>
-              <w:t xml:space="preserve">Form alanlarını çiz</w:t>
-            </w:r>
-          </w:p>
-        </w:tc>
-      </w:tr>
-      <w:tr>
-        <w:trPr>
-          <w:cantSplit/>
-        </w:trPr>
-        <w:tc>
-          <w:tcPr>
-            <w:tcW w:type="dxa" w:w="2120"/>
-            <w:tcBorders>
-              <w:top w:val="single" w:color="C9CEDB" w:sz="4"/>
-              <w:left w:val="single" w:color="C9CEDB" w:sz="4"/>
-              <w:bottom w:val="single" w:color="C9CEDB" w:sz="4"/>
-              <w:right w:val="single" w:color="C9CEDB" w:sz="4"/>
-            </w:tcBorders>
-            <w:tcMar>
-              <w:top w:type="dxa" w:w="70"/>
-              <w:left w:type="dxa" w:w="110"/>
-              <w:bottom w:type="dxa" w:w="70"/>
-              <w:right w:type="dxa" w:w="110"/>
-            </w:tcMar>
-          </w:tcPr>
-          <w:p>
-            <w:pPr>
-              <w:spacing w:after="0" w:line="270"/>
-            </w:pPr>
-            <w:r>
-              <w:rPr>
-                <w:rFonts w:ascii="Calibri" w:cs="Calibri" w:eastAsia="Calibri" w:hAnsi="Calibri"/>
-                <w:b/>
-                <w:bCs/>
-                <w:sz w:val="20"/>
-                <w:szCs w:val="20"/>
-              </w:rPr>
-              <w:t xml:space="preserve">Sprint</w:t>
-            </w:r>
-          </w:p>
-        </w:tc>
-        <w:tc>
-          <w:tcPr>
-            <w:tcW w:type="dxa" w:w="3759"/>
-            <w:tcBorders>
-              <w:top w:val="single" w:color="C9CEDB" w:sz="4"/>
-              <w:left w:val="single" w:color="C9CEDB" w:sz="4"/>
-              <w:bottom w:val="single" w:color="C9CEDB" w:sz="4"/>
-              <w:right w:val="single" w:color="C9CEDB" w:sz="4"/>
-            </w:tcBorders>
-            <w:tcMar>
-              <w:top w:type="dxa" w:w="70"/>
-              <w:left w:type="dxa" w:w="110"/>
-              <w:bottom w:type="dxa" w:w="70"/>
-              <w:right w:type="dxa" w:w="110"/>
-            </w:tcMar>
-          </w:tcPr>
-          <w:p>
-            <w:pPr>
-              <w:spacing w:after="0" w:line="270"/>
-            </w:pPr>
-            <w:r>
-              <w:rPr>
-                <w:rFonts w:ascii="Calibri" w:cs="Calibri" w:eastAsia="Calibri" w:hAnsi="Calibri"/>
-                <w:b w:val="false"/>
-                <w:bCs w:val="false"/>
-                <w:sz w:val="20"/>
-                <w:szCs w:val="20"/>
-              </w:rPr>
-              <w:t xml:space="preserve">Genellikle 1–2 hafta süren, hedefi ve tarihleri belli çalışma dönemi. Ekip o dönemde hangi işleri yapacağını seçer.</w:t>
-            </w:r>
-          </w:p>
-        </w:tc>
-        <w:tc>
-          <w:tcPr>
-            <w:tcW w:type="dxa" w:w="3759"/>
-            <w:tcBorders>
-              <w:top w:val="single" w:color="C9CEDB" w:sz="4"/>
-              <w:left w:val="single" w:color="C9CEDB" w:sz="4"/>
-              <w:bottom w:val="single" w:color="C9CEDB" w:sz="4"/>
-              <w:right w:val="single" w:color="C9CEDB" w:sz="4"/>
-            </w:tcBorders>
-            <w:tcMar>
-              <w:top w:type="dxa" w:w="70"/>
-              <w:left w:type="dxa" w:w="110"/>
-              <w:bottom w:type="dxa" w:w="70"/>
-              <w:right w:type="dxa" w:w="110"/>
-            </w:tcMar>
-          </w:tcPr>
-          <w:p>
-            <w:pPr>
-              <w:spacing w:after="0" w:line="270"/>
-            </w:pPr>
-            <w:r>
-              <w:rPr>
-                <w:rFonts w:ascii="Calibri" w:cs="Calibri" w:eastAsia="Calibri" w:hAnsi="Calibri"/>
-                <w:b w:val="false"/>
-                <w:bCs w:val="false"/>
-                <w:sz w:val="20"/>
-                <w:szCs w:val="20"/>
-              </w:rPr>
-              <w:t xml:space="preserve">Sprint 1 (15–28 Ekim)</w:t>
-            </w:r>
-          </w:p>
-        </w:tc>
-      </w:tr>
-      <w:tr>
-        <w:trPr>
-          <w:cantSplit/>
-        </w:trPr>
-        <w:tc>
-          <w:tcPr>
-            <w:tcW w:type="dxa" w:w="2120"/>
-            <w:tcBorders>
-              <w:top w:val="single" w:color="C9CEDB" w:sz="4"/>
-              <w:left w:val="single" w:color="C9CEDB" w:sz="4"/>
-              <w:bottom w:val="single" w:color="C9CEDB" w:sz="4"/>
-              <w:right w:val="single" w:color="C9CEDB" w:sz="4"/>
-            </w:tcBorders>
-            <w:shd w:fill="F4F5FA" w:color="auto" w:val="clear"/>
-            <w:tcMar>
-              <w:top w:type="dxa" w:w="70"/>
-              <w:left w:type="dxa" w:w="110"/>
-              <w:bottom w:type="dxa" w:w="70"/>
-              <w:right w:type="dxa" w:w="110"/>
-            </w:tcMar>
-          </w:tcPr>
-          <w:p>
-            <w:pPr>
-              <w:spacing w:after="0" w:line="270"/>
-            </w:pPr>
-            <w:r>
-              <w:rPr>
-                <w:rFonts w:ascii="Calibri" w:cs="Calibri" w:eastAsia="Calibri" w:hAnsi="Calibri"/>
-                <w:b/>
-                <w:bCs/>
-                <w:sz w:val="20"/>
-                <w:szCs w:val="20"/>
-              </w:rPr>
-              <w:t xml:space="preserve">Backlog</w:t>
-            </w:r>
-          </w:p>
-        </w:tc>
-        <w:tc>
-          <w:tcPr>
-            <w:tcW w:type="dxa" w:w="3759"/>
-            <w:tcBorders>
-              <w:top w:val="single" w:color="C9CEDB" w:sz="4"/>
-              <w:left w:val="single" w:color="C9CEDB" w:sz="4"/>
-              <w:bottom w:val="single" w:color="C9CEDB" w:sz="4"/>
-              <w:right w:val="single" w:color="C9CEDB" w:sz="4"/>
-            </w:tcBorders>
-            <w:shd w:fill="F4F5FA" w:color="auto" w:val="clear"/>
-            <w:tcMar>
-              <w:top w:type="dxa" w:w="70"/>
-              <w:left w:type="dxa" w:w="110"/>
-              <w:bottom w:type="dxa" w:w="70"/>
-              <w:right w:type="dxa" w:w="110"/>
-            </w:tcMar>
-          </w:tcPr>
-          <w:p>
-            <w:pPr>
-              <w:spacing w:after="0" w:line="270"/>
-            </w:pPr>
-            <w:r>
-              <w:rPr>
-                <w:rFonts w:ascii="Calibri" w:cs="Calibri" w:eastAsia="Calibri" w:hAnsi="Calibri"/>
-                <w:b w:val="false"/>
-                <w:bCs w:val="false"/>
-                <w:sz w:val="20"/>
-                <w:szCs w:val="20"/>
-              </w:rPr>
-              <w:t xml:space="preserve">Henüz bir Sprint'e alınmamış, öncelik sırasıyla bekleyen işlerin listesi.</w:t>
-            </w:r>
-          </w:p>
-        </w:tc>
-        <w:tc>
-          <w:tcPr>
-            <w:tcW w:type="dxa" w:w="3759"/>
-            <w:tcBorders>
-              <w:top w:val="single" w:color="C9CEDB" w:sz="4"/>
-              <w:left w:val="single" w:color="C9CEDB" w:sz="4"/>
-              <w:bottom w:val="single" w:color="C9CEDB" w:sz="4"/>
-              <w:right w:val="single" w:color="C9CEDB" w:sz="4"/>
-            </w:tcBorders>
-            <w:shd w:fill="F4F5FA" w:color="auto" w:val="clear"/>
-            <w:tcMar>
-              <w:top w:type="dxa" w:w="70"/>
-              <w:left w:type="dxa" w:w="110"/>
-              <w:bottom w:type="dxa" w:w="70"/>
-              <w:right w:type="dxa" w:w="110"/>
-            </w:tcMar>
-          </w:tcPr>
-          <w:p>
-            <w:pPr>
-              <w:spacing w:after="0" w:line="270"/>
-            </w:pPr>
-            <w:r>
-              <w:rPr>
-                <w:rFonts w:ascii="Calibri" w:cs="Calibri" w:eastAsia="Calibri" w:hAnsi="Calibri"/>
-                <w:b w:val="false"/>
-                <w:bCs w:val="false"/>
-                <w:sz w:val="20"/>
-                <w:szCs w:val="20"/>
-              </w:rPr>
-              <w:t xml:space="preserve">—</w:t>
-            </w:r>
-          </w:p>
-        </w:tc>
-      </w:tr>
-      <w:tr>
-        <w:trPr>
-          <w:cantSplit/>
-        </w:trPr>
-        <w:tc>
-          <w:tcPr>
-            <w:tcW w:type="dxa" w:w="2120"/>
-            <w:tcBorders>
-              <w:top w:val="single" w:color="C9CEDB" w:sz="4"/>
-              <w:left w:val="single" w:color="C9CEDB" w:sz="4"/>
-              <w:bottom w:val="single" w:color="C9CEDB" w:sz="4"/>
-              <w:right w:val="single" w:color="C9CEDB" w:sz="4"/>
-            </w:tcBorders>
-            <w:tcMar>
-              <w:top w:type="dxa" w:w="70"/>
-              <w:left w:type="dxa" w:w="110"/>
-              <w:bottom w:type="dxa" w:w="70"/>
-              <w:right w:type="dxa" w:w="110"/>
-            </w:tcMar>
-          </w:tcPr>
-          <w:p>
-            <w:pPr>
-              <w:spacing w:after="0" w:line="270"/>
-            </w:pPr>
-            <w:r>
-              <w:rPr>
-                <w:rFonts w:ascii="Calibri" w:cs="Calibri" w:eastAsia="Calibri" w:hAnsi="Calibri"/>
-                <w:b/>
-                <w:bCs/>
-                <w:sz w:val="20"/>
-                <w:szCs w:val="20"/>
-              </w:rPr>
-              <w:t xml:space="preserve">Story Point</w:t>
-            </w:r>
-          </w:p>
-        </w:tc>
-        <w:tc>
-          <w:tcPr>
-            <w:tcW w:type="dxa" w:w="3759"/>
-            <w:tcBorders>
-              <w:top w:val="single" w:color="C9CEDB" w:sz="4"/>
-              <w:left w:val="single" w:color="C9CEDB" w:sz="4"/>
-              <w:bottom w:val="single" w:color="C9CEDB" w:sz="4"/>
-              <w:right w:val="single" w:color="C9CEDB" w:sz="4"/>
-            </w:tcBorders>
-            <w:tcMar>
-              <w:top w:type="dxa" w:w="70"/>
-              <w:left w:type="dxa" w:w="110"/>
-              <w:bottom w:type="dxa" w:w="70"/>
-              <w:right w:type="dxa" w:w="110"/>
-            </w:tcMar>
-          </w:tcPr>
-          <w:p>
-            <w:pPr>
-              <w:spacing w:after="0" w:line="270"/>
-            </w:pPr>
-            <w:r>
-              <w:rPr>
-                <w:rFonts w:ascii="Calibri" w:cs="Calibri" w:eastAsia="Calibri" w:hAnsi="Calibri"/>
-                <w:b w:val="false"/>
-                <w:bCs w:val="false"/>
-                <w:sz w:val="20"/>
-                <w:szCs w:val="20"/>
-              </w:rPr>
-              <w:t xml:space="preserve">Bir işin büyüklüğünü gösteren puan (1, 2, 3, 5, 8, 13, 21, 34, 55).</w:t>
-            </w:r>
-          </w:p>
-        </w:tc>
-        <w:tc>
-          <w:tcPr>
-            <w:tcW w:type="dxa" w:w="3759"/>
-            <w:tcBorders>
-              <w:top w:val="single" w:color="C9CEDB" w:sz="4"/>
-              <w:left w:val="single" w:color="C9CEDB" w:sz="4"/>
-              <w:bottom w:val="single" w:color="C9CEDB" w:sz="4"/>
-              <w:right w:val="single" w:color="C9CEDB" w:sz="4"/>
-            </w:tcBorders>
-            <w:tcMar>
-              <w:top w:type="dxa" w:w="70"/>
-              <w:left w:type="dxa" w:w="110"/>
-              <w:bottom w:type="dxa" w:w="70"/>
-              <w:right w:type="dxa" w:w="110"/>
-            </w:tcMar>
-          </w:tcPr>
-          <w:p>
-            <w:pPr>
-              <w:spacing w:after="0" w:line="270"/>
-            </w:pPr>
-            <w:r>
-              <w:rPr>
-                <w:rFonts w:ascii="Calibri" w:cs="Calibri" w:eastAsia="Calibri" w:hAnsi="Calibri"/>
-                <w:b w:val="false"/>
-                <w:bCs w:val="false"/>
-                <w:sz w:val="20"/>
-                <w:szCs w:val="20"/>
-              </w:rPr>
-              <w:t xml:space="preserve">5</w:t>
-            </w:r>
-          </w:p>
-        </w:tc>
-      </w:tr>
-    </w:tbl>
-    <w:p>
-      <w:pPr>
-        <w:spacing w:after="160"/>
-      </w:pPr>
-    </w:p>
-    <w:p>
-      <w:pPr>
-        <w:keepNext/>
-        <w:spacing w:after="80" w:before="120"/>
-        <w:jc w:val="center"/>
-      </w:pPr>
-      <w:r>
-        <w:drawing>
-          <wp:inline distT="0" distB="0" distL="0" distR="0">
-            <wp:extent cx="5715000" cy="3571875"/>
-            <wp:effectExtent t="0" r="0" b="0" l="0"/>
-            <wp:docPr id="2" name="01-overview" descr="Seyir ana ekranı ve işaretli bölümler" title="Seyir ana ekranı ve işaretli bölümler"/>
-            <wp:cNvGraphicFramePr>
-              <a:graphicFrameLocks xmlns:a="http://schemas.openxmlformats.org/drawingml/2006/main" noChangeAspect="1"/>
-            </wp:cNvGraphicFramePr>
-            <a:graphic xmlns:a="http://schemas.openxmlformats.org/drawingml/2006/main">
-              <a:graphicData uri="http://schemas.openxmlformats.org/drawingml/2006/picture">
-                <pic:pic xmlns:pic="http://schemas.openxmlformats.org/drawingml/2006/picture">
-                  <pic:nvPicPr>
-                    <pic:cNvPr id="0" name="" descr=""/>
-                    <pic:cNvPicPr>
-                      <a:picLocks noChangeAspect="1" noChangeArrowheads="1"/>
-                    </pic:cNvPicPr>
-                  </pic:nvPicPr>
-                  <pic:blipFill>
-                    <a:blip r:embed="rId8" cstate="none"/>
-                    <a:srcRect/>
-                    <a:stretch>
-                      <a:fillRect/>
-                    </a:stretch>
-                  </pic:blipFill>
-                  <pic:spPr bwMode="auto">
-                    <a:xfrm>
-                      <a:off x="0" y="0"/>
-                      <a:ext cx="5715000" cy="3571875"/>
-                    </a:xfrm>
-                    <a:prstGeom prst="rect">
-                      <a:avLst/>
-                    </a:prstGeom>
-                  </pic:spPr>
-                </pic:pic>
-              </a:graphicData>
-            </a:graphic>
-          </wp:inline>
-        </w:drawing>
-      </w:r>
-    </w:p>
-    <w:p>
-      <w:pPr>
-        <w:keepNext/>
-        <w:spacing w:after="120"/>
-        <w:jc w:val="center"/>
-      </w:pPr>
-      <w:r>
-        <w:rPr>
-          <w:rFonts w:ascii="Calibri" w:cs="Calibri" w:eastAsia="Calibri" w:hAnsi="Calibri"/>
-          <w:i/>
-          <w:iCs/>
-          <w:color w:val="555B6E"/>
-          <w:sz w:val="20"/>
-          <w:szCs w:val="20"/>
-        </w:rPr>
-        <w:t xml:space="preserve">Ana ekran: soldaki menüden Projeye ve bölümlerine, üstteki çubuktan arama, yardım ve hesap menüsüne ulaşırsın.</w:t>
-      </w:r>
-    </w:p>
-    <w:tbl>
-      <w:tblPr>
-        <w:tblW w:type="dxa" w:w="9638"/>
-        <w:tblBorders>
-          <w:top w:val="single" w:color="auto" w:sz="4"/>
-          <w:left w:val="single" w:color="auto" w:sz="4"/>
-          <w:bottom w:val="single" w:color="auto" w:sz="4"/>
-          <w:right w:val="single" w:color="auto" w:sz="4"/>
-          <w:insideH w:val="single" w:color="auto" w:sz="4"/>
-          <w:insideV w:val="single" w:color="auto" w:sz="4"/>
-        </w:tblBorders>
-      </w:tblPr>
-      <w:tblGrid>
-        <w:gridCol w:w="560"/>
-        <w:gridCol w:w="9078"/>
-      </w:tblGrid>
-      <w:tr>
-        <w:trPr>
-          <w:cantSplit/>
-        </w:trPr>
-        <w:tc>
-          <w:tcPr>
-            <w:tcW w:type="dxa" w:w="560"/>
-            <w:tcBorders>
-              <w:top w:val="none" w:color="FFFFFF" w:sz="0"/>
-              <w:left w:val="none" w:color="FFFFFF" w:sz="0"/>
-              <w:bottom w:val="none" w:color="FFFFFF" w:sz="0"/>
-              <w:right w:val="none" w:color="FFFFFF" w:sz="0"/>
-            </w:tcBorders>
-            <w:tcMar>
-              <w:top w:type="dxa" w:w="40"/>
-              <w:left w:type="dxa" w:w="40"/>
-              <w:bottom w:type="dxa" w:w="40"/>
-              <w:right w:type="dxa" w:w="60"/>
-            </w:tcMar>
-            <w:vAlign w:val="top"/>
-          </w:tcPr>
-          <w:p>
-            <w:pPr>
-              <w:jc w:val="center"/>
-            </w:pPr>
-            <w:r>
-              <w:rPr>
-                <w:rFonts w:ascii="Calibri" w:cs="Calibri" w:eastAsia="Calibri" w:hAnsi="Calibri"/>
-                <w:b/>
-                <w:bCs/>
-                <w:color w:val="FFFFFF"/>
-                <w:sz w:val="22"/>
-                <w:szCs w:val="22"/>
-                <w:shd w:fill="E11D48" w:color="auto" w:val="clear"/>
-              </w:rPr>
-              <w:t xml:space="preserve"> 1 </w:t>
-            </w:r>
-          </w:p>
-        </w:tc>
-        <w:tc>
-          <w:tcPr>
-            <w:tcW w:type="dxa" w:w="9078"/>
-            <w:tcBorders>
-              <w:top w:val="none" w:color="FFFFFF" w:sz="0"/>
-              <w:left w:val="none" w:color="FFFFFF" w:sz="0"/>
-              <w:bottom w:val="none" w:color="FFFFFF" w:sz="0"/>
-              <w:right w:val="none" w:color="FFFFFF" w:sz="0"/>
-            </w:tcBorders>
-            <w:tcMar>
-              <w:top w:type="dxa" w:w="40"/>
-              <w:left w:type="dxa" w:w="60"/>
-              <w:bottom w:type="dxa" w:w="40"/>
-              <w:right w:type="dxa" w:w="40"/>
-            </w:tcMar>
-          </w:tcPr>
-          <w:p>
-            <w:pPr>
-              <w:spacing w:after="0"/>
-            </w:pPr>
-            <w:r>
-              <w:rPr>
-                <w:rFonts w:ascii="Calibri" w:cs="Calibri" w:eastAsia="Calibri" w:hAnsi="Calibri"/>
-                <w:sz w:val="21"/>
-                <w:szCs w:val="21"/>
-              </w:rPr>
-              <w:t xml:space="preserve"/>
-            </w:r>
-            <w:r>
-              <w:rPr>
-                <w:rFonts w:ascii="Calibri" w:cs="Calibri" w:eastAsia="Calibri" w:hAnsi="Calibri"/>
-                <w:b/>
-                <w:bCs/>
-                <w:sz w:val="21"/>
-                <w:szCs w:val="21"/>
-              </w:rPr>
-              <w:t xml:space="preserve">Proje</w:t>
-            </w:r>
-            <w:r>
-              <w:rPr>
-                <w:rFonts w:ascii="Calibri" w:cs="Calibri" w:eastAsia="Calibri" w:hAnsi="Calibri"/>
-                <w:sz w:val="21"/>
-                <w:szCs w:val="21"/>
-              </w:rPr>
-              <w:t xml:space="preserve">: Çalıştığın proje alanı. Tıklayınca altındaki bölümler açılır.</w:t>
-            </w:r>
-          </w:p>
-        </w:tc>
-      </w:tr>
-      <w:tr>
-        <w:trPr>
-          <w:cantSplit/>
-        </w:trPr>
-        <w:tc>
-          <w:tcPr>
-            <w:tcW w:type="dxa" w:w="560"/>
-            <w:tcBorders>
-              <w:top w:val="none" w:color="FFFFFF" w:sz="0"/>
-              <w:left w:val="none" w:color="FFFFFF" w:sz="0"/>
-              <w:bottom w:val="none" w:color="FFFFFF" w:sz="0"/>
-              <w:right w:val="none" w:color="FFFFFF" w:sz="0"/>
-            </w:tcBorders>
-            <w:tcMar>
-              <w:top w:type="dxa" w:w="40"/>
-              <w:left w:type="dxa" w:w="40"/>
-              <w:bottom w:type="dxa" w:w="40"/>
-              <w:right w:type="dxa" w:w="60"/>
-            </w:tcMar>
-            <w:vAlign w:val="top"/>
-          </w:tcPr>
-          <w:p>
-            <w:pPr>
-              <w:jc w:val="center"/>
-            </w:pPr>
-            <w:r>
-              <w:rPr>
-                <w:rFonts w:ascii="Calibri" w:cs="Calibri" w:eastAsia="Calibri" w:hAnsi="Calibri"/>
-                <w:b/>
-                <w:bCs/>
-                <w:color w:val="FFFFFF"/>
-                <w:sz w:val="22"/>
-                <w:szCs w:val="22"/>
-                <w:shd w:fill="E11D48" w:color="auto" w:val="clear"/>
-              </w:rPr>
-              <w:t xml:space="preserve"> 2 </w:t>
-            </w:r>
-          </w:p>
-        </w:tc>
-        <w:tc>
-          <w:tcPr>
-            <w:tcW w:type="dxa" w:w="9078"/>
-            <w:tcBorders>
-              <w:top w:val="none" w:color="FFFFFF" w:sz="0"/>
-              <w:left w:val="none" w:color="FFFFFF" w:sz="0"/>
-              <w:bottom w:val="none" w:color="FFFFFF" w:sz="0"/>
-              <w:right w:val="none" w:color="FFFFFF" w:sz="0"/>
-            </w:tcBorders>
-            <w:tcMar>
-              <w:top w:type="dxa" w:w="40"/>
-              <w:left w:type="dxa" w:w="60"/>
-              <w:bottom w:type="dxa" w:w="40"/>
-              <w:right w:type="dxa" w:w="40"/>
-            </w:tcMar>
-          </w:tcPr>
-          <w:p>
-            <w:pPr>
-              <w:spacing w:after="0"/>
-            </w:pPr>
-            <w:r>
-              <w:rPr>
-                <w:rFonts w:ascii="Calibri" w:cs="Calibri" w:eastAsia="Calibri" w:hAnsi="Calibri"/>
-                <w:sz w:val="21"/>
-                <w:szCs w:val="21"/>
-              </w:rPr>
-              <w:t xml:space="preserve"/>
-            </w:r>
-            <w:r>
-              <w:rPr>
-                <w:rFonts w:ascii="Calibri" w:cs="Calibri" w:eastAsia="Calibri" w:hAnsi="Calibri"/>
-                <w:b/>
-                <w:bCs/>
-                <w:sz w:val="21"/>
-                <w:szCs w:val="21"/>
-              </w:rPr>
-              <w:t xml:space="preserve">Backlog ve sprint'ler</w:t>
-            </w:r>
-            <w:r>
-              <w:rPr>
-                <w:rFonts w:ascii="Calibri" w:cs="Calibri" w:eastAsia="Calibri" w:hAnsi="Calibri"/>
-                <w:sz w:val="21"/>
-                <w:szCs w:val="21"/>
-              </w:rPr>
-              <w:t xml:space="preserve">: Sprint oluşturma ve planlama burada yapılır.</w:t>
-            </w:r>
-          </w:p>
-        </w:tc>
-      </w:tr>
-      <w:tr>
-        <w:trPr>
-          <w:cantSplit/>
-        </w:trPr>
-        <w:tc>
-          <w:tcPr>
-            <w:tcW w:type="dxa" w:w="560"/>
-            <w:tcBorders>
-              <w:top w:val="none" w:color="FFFFFF" w:sz="0"/>
-              <w:left w:val="none" w:color="FFFFFF" w:sz="0"/>
-              <w:bottom w:val="none" w:color="FFFFFF" w:sz="0"/>
-              <w:right w:val="none" w:color="FFFFFF" w:sz="0"/>
-            </w:tcBorders>
-            <w:tcMar>
-              <w:top w:type="dxa" w:w="40"/>
-              <w:left w:type="dxa" w:w="40"/>
-              <w:bottom w:type="dxa" w:w="40"/>
-              <w:right w:type="dxa" w:w="60"/>
-            </w:tcMar>
-            <w:vAlign w:val="top"/>
-          </w:tcPr>
-          <w:p>
-            <w:pPr>
-              <w:jc w:val="center"/>
-            </w:pPr>
-            <w:r>
-              <w:rPr>
-                <w:rFonts w:ascii="Calibri" w:cs="Calibri" w:eastAsia="Calibri" w:hAnsi="Calibri"/>
-                <w:b/>
-                <w:bCs/>
-                <w:color w:val="FFFFFF"/>
-                <w:sz w:val="22"/>
-                <w:szCs w:val="22"/>
-                <w:shd w:fill="E11D48" w:color="auto" w:val="clear"/>
-              </w:rPr>
-              <w:t xml:space="preserve"> 3 </w:t>
-            </w:r>
-          </w:p>
-        </w:tc>
-        <w:tc>
-          <w:tcPr>
-            <w:tcW w:type="dxa" w:w="9078"/>
-            <w:tcBorders>
-              <w:top w:val="none" w:color="FFFFFF" w:sz="0"/>
-              <w:left w:val="none" w:color="FFFFFF" w:sz="0"/>
-              <w:bottom w:val="none" w:color="FFFFFF" w:sz="0"/>
-              <w:right w:val="none" w:color="FFFFFF" w:sz="0"/>
-            </w:tcBorders>
-            <w:tcMar>
-              <w:top w:type="dxa" w:w="40"/>
-              <w:left w:type="dxa" w:w="60"/>
-              <w:bottom w:type="dxa" w:w="40"/>
-              <w:right w:type="dxa" w:w="40"/>
-            </w:tcMar>
-          </w:tcPr>
-          <w:p>
-            <w:pPr>
-              <w:spacing w:after="0"/>
-            </w:pPr>
-            <w:r>
-              <w:rPr>
-                <w:rFonts w:ascii="Calibri" w:cs="Calibri" w:eastAsia="Calibri" w:hAnsi="Calibri"/>
-                <w:sz w:val="21"/>
-                <w:szCs w:val="21"/>
-              </w:rPr>
-              <w:t xml:space="preserve"/>
-            </w:r>
-            <w:r>
-              <w:rPr>
-                <w:rFonts w:ascii="Calibri" w:cs="Calibri" w:eastAsia="Calibri" w:hAnsi="Calibri"/>
-                <w:b/>
-                <w:bCs/>
-                <w:sz w:val="21"/>
-                <w:szCs w:val="21"/>
-              </w:rPr>
-              <w:t xml:space="preserve">Sprint panosu</w:t>
-            </w:r>
-            <w:r>
-              <w:rPr>
-                <w:rFonts w:ascii="Calibri" w:cs="Calibri" w:eastAsia="Calibri" w:hAnsi="Calibri"/>
-                <w:sz w:val="21"/>
-                <w:szCs w:val="21"/>
-              </w:rPr>
-              <w:t xml:space="preserve">: Sprint'teki işleri durum sütunlarında (Kanban) gösterir.</w:t>
-            </w:r>
-          </w:p>
-        </w:tc>
-      </w:tr>
-      <w:tr>
-        <w:trPr>
-          <w:cantSplit/>
-        </w:trPr>
-        <w:tc>
-          <w:tcPr>
-            <w:tcW w:type="dxa" w:w="560"/>
-            <w:tcBorders>
-              <w:top w:val="none" w:color="FFFFFF" w:sz="0"/>
-              <w:left w:val="none" w:color="FFFFFF" w:sz="0"/>
-              <w:bottom w:val="none" w:color="FFFFFF" w:sz="0"/>
-              <w:right w:val="none" w:color="FFFFFF" w:sz="0"/>
-            </w:tcBorders>
-            <w:tcMar>
-              <w:top w:type="dxa" w:w="40"/>
-              <w:left w:type="dxa" w:w="40"/>
-              <w:bottom w:type="dxa" w:w="40"/>
-              <w:right w:type="dxa" w:w="60"/>
-            </w:tcMar>
-            <w:vAlign w:val="top"/>
-          </w:tcPr>
-          <w:p>
-            <w:pPr>
-              <w:jc w:val="center"/>
-            </w:pPr>
-            <w:r>
-              <w:rPr>
-                <w:rFonts w:ascii="Calibri" w:cs="Calibri" w:eastAsia="Calibri" w:hAnsi="Calibri"/>
-                <w:b/>
-                <w:bCs/>
-                <w:color w:val="FFFFFF"/>
-                <w:sz w:val="22"/>
-                <w:szCs w:val="22"/>
-                <w:shd w:fill="E11D48" w:color="auto" w:val="clear"/>
-              </w:rPr>
-              <w:t xml:space="preserve"> 4 </w:t>
-            </w:r>
-          </w:p>
-        </w:tc>
-        <w:tc>
-          <w:tcPr>
-            <w:tcW w:type="dxa" w:w="9078"/>
-            <w:tcBorders>
-              <w:top w:val="none" w:color="FFFFFF" w:sz="0"/>
-              <w:left w:val="none" w:color="FFFFFF" w:sz="0"/>
-              <w:bottom w:val="none" w:color="FFFFFF" w:sz="0"/>
-              <w:right w:val="none" w:color="FFFFFF" w:sz="0"/>
-            </w:tcBorders>
-            <w:tcMar>
-              <w:top w:type="dxa" w:w="40"/>
-              <w:left w:type="dxa" w:w="60"/>
-              <w:bottom w:type="dxa" w:w="40"/>
-              <w:right w:type="dxa" w:w="40"/>
-            </w:tcMar>
-          </w:tcPr>
-          <w:p>
-            <w:pPr>
-              <w:spacing w:after="0"/>
-            </w:pPr>
-            <w:r>
-              <w:rPr>
-                <w:rFonts w:ascii="Calibri" w:cs="Calibri" w:eastAsia="Calibri" w:hAnsi="Calibri"/>
-                <w:sz w:val="21"/>
-                <w:szCs w:val="21"/>
-              </w:rPr>
-              <w:t xml:space="preserve"/>
-            </w:r>
-            <w:r>
-              <w:rPr>
-                <w:rFonts w:ascii="Calibri" w:cs="Calibri" w:eastAsia="Calibri" w:hAnsi="Calibri"/>
-                <w:b/>
-                <w:bCs/>
-                <w:sz w:val="21"/>
-                <w:szCs w:val="21"/>
-              </w:rPr>
-              <w:t xml:space="preserve">Görevler</w:t>
-            </w:r>
-            <w:r>
-              <w:rPr>
-                <w:rFonts w:ascii="Calibri" w:cs="Calibri" w:eastAsia="Calibri" w:hAnsi="Calibri"/>
-                <w:sz w:val="21"/>
-                <w:szCs w:val="21"/>
-              </w:rPr>
-              <w:t xml:space="preserve">: Projenin iş listesi; Epic, Task ve Sub-Task'lar burada eklenir.</w:t>
-            </w:r>
-          </w:p>
-        </w:tc>
-      </w:tr>
-      <w:tr>
-        <w:trPr>
-          <w:cantSplit/>
-        </w:trPr>
-        <w:tc>
-          <w:tcPr>
-            <w:tcW w:type="dxa" w:w="560"/>
-            <w:tcBorders>
-              <w:top w:val="none" w:color="FFFFFF" w:sz="0"/>
-              <w:left w:val="none" w:color="FFFFFF" w:sz="0"/>
-              <w:bottom w:val="none" w:color="FFFFFF" w:sz="0"/>
-              <w:right w:val="none" w:color="FFFFFF" w:sz="0"/>
-            </w:tcBorders>
-            <w:tcMar>
-              <w:top w:type="dxa" w:w="40"/>
-              <w:left w:type="dxa" w:w="40"/>
-              <w:bottom w:type="dxa" w:w="40"/>
-              <w:right w:type="dxa" w:w="60"/>
-            </w:tcMar>
-            <w:vAlign w:val="top"/>
-          </w:tcPr>
-          <w:p>
-            <w:pPr>
-              <w:jc w:val="center"/>
-            </w:pPr>
-            <w:r>
-              <w:rPr>
-                <w:rFonts w:ascii="Calibri" w:cs="Calibri" w:eastAsia="Calibri" w:hAnsi="Calibri"/>
-                <w:b/>
-                <w:bCs/>
-                <w:color w:val="FFFFFF"/>
-                <w:sz w:val="22"/>
-                <w:szCs w:val="22"/>
-                <w:shd w:fill="E11D48" w:color="auto" w:val="clear"/>
-              </w:rPr>
-              <w:t xml:space="preserve"> 5 </w:t>
-            </w:r>
-          </w:p>
-        </w:tc>
-        <w:tc>
-          <w:tcPr>
-            <w:tcW w:type="dxa" w:w="9078"/>
-            <w:tcBorders>
-              <w:top w:val="none" w:color="FFFFFF" w:sz="0"/>
-              <w:left w:val="none" w:color="FFFFFF" w:sz="0"/>
-              <w:bottom w:val="none" w:color="FFFFFF" w:sz="0"/>
-              <w:right w:val="none" w:color="FFFFFF" w:sz="0"/>
-            </w:tcBorders>
-            <w:tcMar>
-              <w:top w:type="dxa" w:w="40"/>
-              <w:left w:type="dxa" w:w="60"/>
-              <w:bottom w:type="dxa" w:w="40"/>
-              <w:right w:type="dxa" w:w="40"/>
-            </w:tcMar>
-          </w:tcPr>
-          <w:p>
-            <w:pPr>
-              <w:spacing w:after="0"/>
-            </w:pPr>
-            <w:r>
-              <w:rPr>
-                <w:rFonts w:ascii="Calibri" w:cs="Calibri" w:eastAsia="Calibri" w:hAnsi="Calibri"/>
-                <w:sz w:val="21"/>
-                <w:szCs w:val="21"/>
-              </w:rPr>
-              <w:t xml:space="preserve"/>
-            </w:r>
-            <w:r>
-              <w:rPr>
-                <w:rFonts w:ascii="Calibri" w:cs="Calibri" w:eastAsia="Calibri" w:hAnsi="Calibri"/>
-                <w:b/>
-                <w:bCs/>
-                <w:sz w:val="21"/>
-                <w:szCs w:val="21"/>
-              </w:rPr>
-              <w:t xml:space="preserve">Arama</w:t>
-            </w:r>
-            <w:r>
-              <w:rPr>
-                <w:rFonts w:ascii="Calibri" w:cs="Calibri" w:eastAsia="Calibri" w:hAnsi="Calibri"/>
-                <w:sz w:val="21"/>
-                <w:szCs w:val="21"/>
-              </w:rPr>
-              <w:t xml:space="preserve">: Task, doküman veya kişi ara (kısayol: Ctrl + K).</w:t>
-            </w:r>
-          </w:p>
-        </w:tc>
-      </w:tr>
-      <w:tr>
-        <w:trPr>
-          <w:cantSplit/>
-        </w:trPr>
-        <w:tc>
-          <w:tcPr>
-            <w:tcW w:type="dxa" w:w="560"/>
-            <w:tcBorders>
-              <w:top w:val="none" w:color="FFFFFF" w:sz="0"/>
-              <w:left w:val="none" w:color="FFFFFF" w:sz="0"/>
-              <w:bottom w:val="none" w:color="FFFFFF" w:sz="0"/>
-              <w:right w:val="none" w:color="FFFFFF" w:sz="0"/>
-            </w:tcBorders>
-            <w:tcMar>
-              <w:top w:type="dxa" w:w="40"/>
-              <w:left w:type="dxa" w:w="40"/>
-              <w:bottom w:type="dxa" w:w="40"/>
-              <w:right w:type="dxa" w:w="60"/>
-            </w:tcMar>
-            <w:vAlign w:val="top"/>
-          </w:tcPr>
-          <w:p>
-            <w:pPr>
-              <w:jc w:val="center"/>
-            </w:pPr>
-            <w:r>
-              <w:rPr>
-                <w:rFonts w:ascii="Calibri" w:cs="Calibri" w:eastAsia="Calibri" w:hAnsi="Calibri"/>
-                <w:b/>
-                <w:bCs/>
-                <w:color w:val="FFFFFF"/>
-                <w:sz w:val="22"/>
-                <w:szCs w:val="22"/>
-                <w:shd w:fill="E11D48" w:color="auto" w:val="clear"/>
-              </w:rPr>
-              <w:t xml:space="preserve"> 6 </w:t>
-            </w:r>
-          </w:p>
-        </w:tc>
-        <w:tc>
-          <w:tcPr>
-            <w:tcW w:type="dxa" w:w="9078"/>
-            <w:tcBorders>
-              <w:top w:val="none" w:color="FFFFFF" w:sz="0"/>
-              <w:left w:val="none" w:color="FFFFFF" w:sz="0"/>
-              <w:bottom w:val="none" w:color="FFFFFF" w:sz="0"/>
-              <w:right w:val="none" w:color="FFFFFF" w:sz="0"/>
-            </w:tcBorders>
-            <w:tcMar>
-              <w:top w:type="dxa" w:w="40"/>
-              <w:left w:type="dxa" w:w="60"/>
-              <w:bottom w:type="dxa" w:w="40"/>
-              <w:right w:type="dxa" w:w="40"/>
-            </w:tcMar>
-          </w:tcPr>
-          <w:p>
-            <w:pPr>
-              <w:spacing w:after="0"/>
-            </w:pPr>
-            <w:r>
-              <w:rPr>
-                <w:rFonts w:ascii="Calibri" w:cs="Calibri" w:eastAsia="Calibri" w:hAnsi="Calibri"/>
-                <w:sz w:val="21"/>
-                <w:szCs w:val="21"/>
-              </w:rPr>
-              <w:t xml:space="preserve"/>
-            </w:r>
-            <w:r>
-              <w:rPr>
-                <w:rFonts w:ascii="Calibri" w:cs="Calibri" w:eastAsia="Calibri" w:hAnsi="Calibri"/>
-                <w:b/>
-                <w:bCs/>
-                <w:sz w:val="21"/>
-                <w:szCs w:val="21"/>
-              </w:rPr>
-              <w:t xml:space="preserve">Yardım</w:t>
-            </w:r>
-            <w:r>
-              <w:rPr>
-                <w:rFonts w:ascii="Calibri" w:cs="Calibri" w:eastAsia="Calibri" w:hAnsi="Calibri"/>
-                <w:sz w:val="21"/>
-                <w:szCs w:val="21"/>
-              </w:rPr>
-              <w:t xml:space="preserve">: Bu kılavuzu her zaman buradan açabilirsin.</w:t>
-            </w:r>
-          </w:p>
-        </w:tc>
-      </w:tr>
-      <w:tr>
-        <w:trPr>
-          <w:cantSplit/>
-        </w:trPr>
-        <w:tc>
-          <w:tcPr>
-            <w:tcW w:type="dxa" w:w="560"/>
-            <w:tcBorders>
-              <w:top w:val="none" w:color="FFFFFF" w:sz="0"/>
-              <w:left w:val="none" w:color="FFFFFF" w:sz="0"/>
-              <w:bottom w:val="none" w:color="FFFFFF" w:sz="0"/>
-              <w:right w:val="none" w:color="FFFFFF" w:sz="0"/>
-            </w:tcBorders>
-            <w:tcMar>
-              <w:top w:type="dxa" w:w="40"/>
-              <w:left w:type="dxa" w:w="40"/>
-              <w:bottom w:type="dxa" w:w="40"/>
-              <w:right w:type="dxa" w:w="60"/>
-            </w:tcMar>
-            <w:vAlign w:val="top"/>
-          </w:tcPr>
-          <w:p>
-            <w:pPr>
-              <w:jc w:val="center"/>
-            </w:pPr>
-            <w:r>
-              <w:rPr>
-                <w:rFonts w:ascii="Calibri" w:cs="Calibri" w:eastAsia="Calibri" w:hAnsi="Calibri"/>
-                <w:b/>
-                <w:bCs/>
-                <w:color w:val="FFFFFF"/>
-                <w:sz w:val="22"/>
-                <w:szCs w:val="22"/>
-                <w:shd w:fill="E11D48" w:color="auto" w:val="clear"/>
-              </w:rPr>
-              <w:t xml:space="preserve"> 7 </w:t>
-            </w:r>
-          </w:p>
-        </w:tc>
-        <w:tc>
-          <w:tcPr>
-            <w:tcW w:type="dxa" w:w="9078"/>
-            <w:tcBorders>
-              <w:top w:val="none" w:color="FFFFFF" w:sz="0"/>
-              <w:left w:val="none" w:color="FFFFFF" w:sz="0"/>
-              <w:bottom w:val="none" w:color="FFFFFF" w:sz="0"/>
-              <w:right w:val="none" w:color="FFFFFF" w:sz="0"/>
-            </w:tcBorders>
-            <w:tcMar>
-              <w:top w:type="dxa" w:w="40"/>
-              <w:left w:type="dxa" w:w="60"/>
-              <w:bottom w:type="dxa" w:w="40"/>
-              <w:right w:type="dxa" w:w="40"/>
-            </w:tcMar>
-          </w:tcPr>
-          <w:p>
-            <w:pPr>
-              <w:spacing w:after="0"/>
-            </w:pPr>
-            <w:r>
-              <w:rPr>
-                <w:rFonts w:ascii="Calibri" w:cs="Calibri" w:eastAsia="Calibri" w:hAnsi="Calibri"/>
-                <w:sz w:val="21"/>
-                <w:szCs w:val="21"/>
-              </w:rPr>
-              <w:t xml:space="preserve"/>
-            </w:r>
-            <w:r>
-              <w:rPr>
-                <w:rFonts w:ascii="Calibri" w:cs="Calibri" w:eastAsia="Calibri" w:hAnsi="Calibri"/>
-                <w:b/>
-                <w:bCs/>
-                <w:sz w:val="21"/>
-                <w:szCs w:val="21"/>
-              </w:rPr>
-              <w:t xml:space="preserve">Hesap menüsü</w:t>
-            </w:r>
-            <w:r>
-              <w:rPr>
-                <w:rFonts w:ascii="Calibri" w:cs="Calibri" w:eastAsia="Calibri" w:hAnsi="Calibri"/>
-                <w:sz w:val="21"/>
-                <w:szCs w:val="21"/>
-              </w:rPr>
-              <w:t xml:space="preserve">: Profil, dil (Türkçe/İngilizce), tema ve çıkış.</w:t>
-            </w:r>
-          </w:p>
-        </w:tc>
-      </w:tr>
-      <w:tr>
-        <w:trPr>
-          <w:cantSplit/>
-        </w:trPr>
-        <w:tc>
-          <w:tcPr>
-            <w:tcW w:type="dxa" w:w="560"/>
-            <w:tcBorders>
-              <w:top w:val="none" w:color="FFFFFF" w:sz="0"/>
-              <w:left w:val="none" w:color="FFFFFF" w:sz="0"/>
-              <w:bottom w:val="none" w:color="FFFFFF" w:sz="0"/>
-              <w:right w:val="none" w:color="FFFFFF" w:sz="0"/>
-            </w:tcBorders>
-            <w:tcMar>
-              <w:top w:type="dxa" w:w="40"/>
-              <w:left w:type="dxa" w:w="40"/>
-              <w:bottom w:type="dxa" w:w="40"/>
-              <w:right w:type="dxa" w:w="60"/>
-            </w:tcMar>
-            <w:vAlign w:val="top"/>
-          </w:tcPr>
-          <w:p>
-            <w:pPr>
-              <w:jc w:val="center"/>
-            </w:pPr>
-            <w:r>
-              <w:rPr>
-                <w:rFonts w:ascii="Calibri" w:cs="Calibri" w:eastAsia="Calibri" w:hAnsi="Calibri"/>
-                <w:b/>
-                <w:bCs/>
-                <w:color w:val="FFFFFF"/>
-                <w:sz w:val="22"/>
-                <w:szCs w:val="22"/>
-                <w:shd w:fill="E11D48" w:color="auto" w:val="clear"/>
-              </w:rPr>
-              <w:t xml:space="preserve"> 8 </w:t>
-            </w:r>
-          </w:p>
-        </w:tc>
-        <w:tc>
-          <w:tcPr>
-            <w:tcW w:type="dxa" w:w="9078"/>
-            <w:tcBorders>
-              <w:top w:val="none" w:color="FFFFFF" w:sz="0"/>
-              <w:left w:val="none" w:color="FFFFFF" w:sz="0"/>
-              <w:bottom w:val="none" w:color="FFFFFF" w:sz="0"/>
-              <w:right w:val="none" w:color="FFFFFF" w:sz="0"/>
-            </w:tcBorders>
-            <w:tcMar>
-              <w:top w:type="dxa" w:w="40"/>
-              <w:left w:type="dxa" w:w="60"/>
-              <w:bottom w:type="dxa" w:w="40"/>
-              <w:right w:type="dxa" w:w="40"/>
-            </w:tcMar>
-          </w:tcPr>
-          <w:p>
-            <w:pPr>
-              <w:spacing w:after="0"/>
-            </w:pPr>
-            <w:r>
-              <w:rPr>
-                <w:rFonts w:ascii="Calibri" w:cs="Calibri" w:eastAsia="Calibri" w:hAnsi="Calibri"/>
-                <w:sz w:val="21"/>
-                <w:szCs w:val="21"/>
-              </w:rPr>
-              <w:t xml:space="preserve"/>
-            </w:r>
-            <w:r>
-              <w:rPr>
-                <w:rFonts w:ascii="Calibri" w:cs="Calibri" w:eastAsia="Calibri" w:hAnsi="Calibri"/>
-                <w:b/>
-                <w:bCs/>
-                <w:sz w:val="21"/>
-                <w:szCs w:val="21"/>
-              </w:rPr>
-              <w:t xml:space="preserve">Yeni iş ekleme satırı</w:t>
-            </w:r>
-            <w:r>
-              <w:rPr>
-                <w:rFonts w:ascii="Calibri" w:cs="Calibri" w:eastAsia="Calibri" w:hAnsi="Calibri"/>
-                <w:sz w:val="21"/>
-                <w:szCs w:val="21"/>
-              </w:rPr>
-              <w:t xml:space="preserve">: Başlığı yazıp Enter'a basarak yeni Task eklersin.</w:t>
-            </w:r>
-          </w:p>
-        </w:tc>
-      </w:tr>
-    </w:tbl>
-    <w:p>
-      <w:pPr>
-        <w:spacing w:after="200"/>
-      </w:pPr>
-    </w:p>
     <w:tbl>
       <w:tblPr>
         <w:tblW w:type="dxa" w:w="9638"/>
@@ -4831,7 +2187,7 @@
         <w:pStyle w:val="ListParagraph"/>
         <w:numPr>
           <w:ilvl w:val="0"/>
-          <w:numId w:val="3"/>
+          <w:numId w:val="2"/>
         </w:numPr>
         <w:spacing w:after="100" w:line="290"/>
       </w:pPr>
@@ -4903,7 +2259,7 @@
         <w:pStyle w:val="ListParagraph"/>
         <w:numPr>
           <w:ilvl w:val="0"/>
-          <w:numId w:val="3"/>
+          <w:numId w:val="2"/>
         </w:numPr>
         <w:spacing w:after="100" w:line="290"/>
       </w:pPr>
@@ -4939,7 +2295,7 @@
         <w:pStyle w:val="ListParagraph"/>
         <w:numPr>
           <w:ilvl w:val="0"/>
-          <w:numId w:val="3"/>
+          <w:numId w:val="2"/>
         </w:numPr>
         <w:spacing w:after="100" w:line="290"/>
       </w:pPr>
@@ -4975,7 +2331,7 @@
         <w:pStyle w:val="ListParagraph"/>
         <w:numPr>
           <w:ilvl w:val="0"/>
-          <w:numId w:val="3"/>
+          <w:numId w:val="2"/>
         </w:numPr>
         <w:spacing w:after="100" w:line="290"/>
       </w:pPr>
@@ -5047,7 +2403,7 @@
         <w:pStyle w:val="ListParagraph"/>
         <w:numPr>
           <w:ilvl w:val="0"/>
-          <w:numId w:val="3"/>
+          <w:numId w:val="2"/>
         </w:numPr>
         <w:spacing w:after="100" w:line="290"/>
       </w:pPr>
@@ -5094,7 +2450,7 @@
           <wp:inline distT="0" distB="0" distL="0" distR="0">
             <wp:extent cx="3724275" cy="4095750"/>
             <wp:effectExtent t="0" r="0" b="0" l="0"/>
-            <wp:docPr id="3" name="02-space-create" descr="Yeni Proje oluşturma penceresi" title="Yeni Proje oluşturma penceresi"/>
+            <wp:docPr id="2" name="02-space-create" descr="Yeni Proje oluşturma penceresi" title="Yeni Proje oluşturma penceresi"/>
             <wp:cNvGraphicFramePr>
               <a:graphicFrameLocks xmlns:a="http://schemas.openxmlformats.org/drawingml/2006/main" noChangeAspect="1"/>
             </wp:cNvGraphicFramePr>
@@ -5608,7 +2964,7 @@
         <w:pStyle w:val="ListParagraph"/>
         <w:numPr>
           <w:ilvl w:val="0"/>
-          <w:numId w:val="2"/>
+          <w:numId w:val="3"/>
         </w:numPr>
         <w:spacing w:after="80" w:line="290"/>
       </w:pPr>
@@ -5626,7 +2982,7 @@
         <w:pStyle w:val="ListParagraph"/>
         <w:numPr>
           <w:ilvl w:val="0"/>
-          <w:numId w:val="2"/>
+          <w:numId w:val="3"/>
         </w:numPr>
         <w:spacing w:after="80" w:line="290"/>
       </w:pPr>
@@ -5644,7 +3000,7 @@
         <w:pStyle w:val="ListParagraph"/>
         <w:numPr>
           <w:ilvl w:val="0"/>
-          <w:numId w:val="2"/>
+          <w:numId w:val="3"/>
         </w:numPr>
         <w:spacing w:after="80" w:line="290"/>
       </w:pPr>
@@ -5835,7 +3191,7 @@
           <wp:inline distT="0" distB="0" distL="0" distR="0">
             <wp:extent cx="5715000" cy="3571875"/>
             <wp:effectExtent t="0" r="0" b="0" l="0"/>
-            <wp:docPr id="4" name="09-epic-create" descr="Listede Epic ekleme satırı" title="Listede Epic ekleme satırı"/>
+            <wp:docPr id="3" name="09-epic-create" descr="Listede Epic ekleme satırı" title="Listede Epic ekleme satırı"/>
             <wp:cNvGraphicFramePr>
               <a:graphicFrameLocks xmlns:a="http://schemas.openxmlformats.org/drawingml/2006/main" noChangeAspect="1"/>
             </wp:cNvGraphicFramePr>
@@ -6554,7 +3910,7 @@
           <wp:inline distT="0" distB="0" distL="0" distR="0">
             <wp:extent cx="5715000" cy="3571875"/>
             <wp:effectExtent t="0" r="0" b="0" l="0"/>
-            <wp:docPr id="5" name="18-epic-promote-menu" descr="Task satırı menüsünde Epic'e dönüştür seçeneği" title="Task satırı menüsünde Epic'e dönüştür seçeneği"/>
+            <wp:docPr id="4" name="18-epic-promote-menu" descr="Task satırı menüsünde Epic'e dönüştür seçeneği" title="Task satırı menüsünde Epic'e dönüştür seçeneği"/>
             <wp:cNvGraphicFramePr>
               <a:graphicFrameLocks xmlns:a="http://schemas.openxmlformats.org/drawingml/2006/main" noChangeAspect="1"/>
             </wp:cNvGraphicFramePr>
@@ -6817,7 +4173,7 @@
           <wp:inline distT="0" distB="0" distL="0" distR="0">
             <wp:extent cx="4800600" cy="3209925"/>
             <wp:effectExtent t="0" r="0" b="0" l="0"/>
-            <wp:docPr id="6" name="19-epic-promote-dialog" descr="Epic'e dönüştürme onay penceresi" title="Epic'e dönüştürme onay penceresi"/>
+            <wp:docPr id="5" name="19-epic-promote-dialog" descr="Epic'e dönüştürme onay penceresi" title="Epic'e dönüştürme onay penceresi"/>
             <wp:cNvGraphicFramePr>
               <a:graphicFrameLocks xmlns:a="http://schemas.openxmlformats.org/drawingml/2006/main" noChangeAspect="1"/>
             </wp:cNvGraphicFramePr>
@@ -7168,7 +4524,7 @@
           <wp:inline distT="0" distB="0" distL="0" distR="0">
             <wp:extent cx="5715000" cy="3571875"/>
             <wp:effectExtent t="0" r="0" b="0" l="0"/>
-            <wp:docPr id="7" name="20-epic-result" descr="Dönüşümden sonra liste" title="Dönüşümden sonra liste"/>
+            <wp:docPr id="6" name="20-epic-result" descr="Dönüşümden sonra liste" title="Dönüşümden sonra liste"/>
             <wp:cNvGraphicFramePr>
               <a:graphicFrameLocks xmlns:a="http://schemas.openxmlformats.org/drawingml/2006/main" noChangeAspect="1"/>
             </wp:cNvGraphicFramePr>
@@ -8453,7 +5809,7 @@
           <wp:inline distT="0" distB="0" distL="0" distR="0">
             <wp:extent cx="5715000" cy="3571875"/>
             <wp:effectExtent t="0" r="0" b="0" l="0"/>
-            <wp:docPr id="8" name="10-task-create" descr="Listede hızlı Task ekleme satırı" title="Listede hızlı Task ekleme satırı"/>
+            <wp:docPr id="7" name="10-task-create" descr="Listede hızlı Task ekleme satırı" title="Listede hızlı Task ekleme satırı"/>
             <wp:cNvGraphicFramePr>
               <a:graphicFrameLocks xmlns:a="http://schemas.openxmlformats.org/drawingml/2006/main" noChangeAspect="1"/>
             </wp:cNvGraphicFramePr>
@@ -9068,7 +6424,7 @@
           <wp:inline distT="0" distB="0" distL="0" distR="0">
             <wp:extent cx="5353050" cy="4095750"/>
             <wp:effectExtent t="0" r="0" b="0" l="0"/>
-            <wp:docPr id="9" name="11-task-edit" descr="Task detay paneli ve düzenlenebilir alanlar" title="Task detay paneli ve düzenlenebilir alanlar"/>
+            <wp:docPr id="8" name="11-task-edit" descr="Task detay paneli ve düzenlenebilir alanlar" title="Task detay paneli ve düzenlenebilir alanlar"/>
             <wp:cNvGraphicFramePr>
               <a:graphicFrameLocks xmlns:a="http://schemas.openxmlformats.org/drawingml/2006/main" noChangeAspect="1"/>
             </wp:cNvGraphicFramePr>
@@ -10828,7 +8184,7 @@
           <wp:inline distT="0" distB="0" distL="0" distR="0">
             <wp:extent cx="5715000" cy="3571875"/>
             <wp:effectExtent t="0" r="0" b="0" l="0"/>
-            <wp:docPr id="10" name="17-task-status" descr="Listeden durum değiştirme menüsü" title="Listeden durum değiştirme menüsü"/>
+            <wp:docPr id="9" name="17-task-status" descr="Listeden durum değiştirme menüsü" title="Listeden durum değiştirme menüsü"/>
             <wp:cNvGraphicFramePr>
               <a:graphicFrameLocks xmlns:a="http://schemas.openxmlformats.org/drawingml/2006/main" noChangeAspect="1"/>
             </wp:cNvGraphicFramePr>
@@ -11679,7 +9035,7 @@
           <wp:inline distT="0" distB="0" distL="0" distR="0">
             <wp:extent cx="5715000" cy="3571875"/>
             <wp:effectExtent t="0" r="0" b="0" l="0"/>
-            <wp:docPr id="11" name="12-subtask-menu" descr="Task satırı menüsünde Alt öğe ekle seçeneği" title="Task satırı menüsünde Alt öğe ekle seçeneği"/>
+            <wp:docPr id="10" name="12-subtask-menu" descr="Task satırı menüsünde Alt öğe ekle seçeneği" title="Task satırı menüsünde Alt öğe ekle seçeneği"/>
             <wp:cNvGraphicFramePr>
               <a:graphicFrameLocks xmlns:a="http://schemas.openxmlformats.org/drawingml/2006/main" noChangeAspect="1"/>
             </wp:cNvGraphicFramePr>
@@ -11942,7 +9298,7 @@
           <wp:inline distT="0" distB="0" distL="0" distR="0">
             <wp:extent cx="5715000" cy="3571875"/>
             <wp:effectExtent t="0" r="0" b="0" l="0"/>
-            <wp:docPr id="12" name="13-subtask-create" descr="Sub-Task ekleme satırı" title="Sub-Task ekleme satırı"/>
+            <wp:docPr id="11" name="13-subtask-create" descr="Sub-Task ekleme satırı" title="Sub-Task ekleme satırı"/>
             <wp:cNvGraphicFramePr>
               <a:graphicFrameLocks xmlns:a="http://schemas.openxmlformats.org/drawingml/2006/main" noChangeAspect="1"/>
             </wp:cNvGraphicFramePr>
@@ -12293,7 +9649,7 @@
           <wp:inline distT="0" distB="0" distL="0" distR="0">
             <wp:extent cx="5715000" cy="3571875"/>
             <wp:effectExtent t="0" r="0" b="0" l="0"/>
-            <wp:docPr id="13" name="14-subtask-list" descr="Üst Task'ın altında listelenen Sub-Task'lar" title="Üst Task'ın altında listelenen Sub-Task'lar"/>
+            <wp:docPr id="12" name="14-subtask-list" descr="Üst Task'ın altında listelenen Sub-Task'lar" title="Üst Task'ın altında listelenen Sub-Task'lar"/>
             <wp:cNvGraphicFramePr>
               <a:graphicFrameLocks xmlns:a="http://schemas.openxmlformats.org/drawingml/2006/main" noChangeAspect="1"/>
             </wp:cNvGraphicFramePr>
@@ -12993,7 +10349,7 @@
           <wp:inline distT="0" distB="0" distL="0" distR="0">
             <wp:extent cx="5715000" cy="3571875"/>
             <wp:effectExtent t="0" r="0" b="0" l="0"/>
-            <wp:docPr id="14" name="15-subtask-edit" descr="Sub-Task detay sayfası" title="Sub-Task detay sayfası"/>
+            <wp:docPr id="13" name="15-subtask-edit" descr="Sub-Task detay sayfası" title="Sub-Task detay sayfası"/>
             <wp:cNvGraphicFramePr>
               <a:graphicFrameLocks xmlns:a="http://schemas.openxmlformats.org/drawingml/2006/main" noChangeAspect="1"/>
             </wp:cNvGraphicFramePr>
@@ -13445,7 +10801,7 @@
           <wp:inline distT="0" distB="0" distL="0" distR="0">
             <wp:extent cx="5715000" cy="3571875"/>
             <wp:effectExtent t="0" r="0" b="0" l="0"/>
-            <wp:docPr id="15" name="16-task-rollup" descr="Üst Task'ta Sub-Task toplamı" title="Üst Task'ta Sub-Task toplamı"/>
+            <wp:docPr id="14" name="16-task-rollup" descr="Üst Task'ta Sub-Task toplamı" title="Üst Task'ta Sub-Task toplamı"/>
             <wp:cNvGraphicFramePr>
               <a:graphicFrameLocks xmlns:a="http://schemas.openxmlformats.org/drawingml/2006/main" noChangeAspect="1"/>
             </wp:cNvGraphicFramePr>
@@ -13790,7 +11146,7 @@
         <w:pStyle w:val="ListParagraph"/>
         <w:numPr>
           <w:ilvl w:val="0"/>
-          <w:numId w:val="2"/>
+          <w:numId w:val="3"/>
         </w:numPr>
         <w:spacing w:after="80" w:line="290"/>
       </w:pPr>
@@ -13826,7 +11182,7 @@
         <w:pStyle w:val="ListParagraph"/>
         <w:numPr>
           <w:ilvl w:val="0"/>
-          <w:numId w:val="2"/>
+          <w:numId w:val="3"/>
         </w:numPr>
         <w:spacing w:after="80" w:line="290"/>
       </w:pPr>
@@ -13862,7 +11218,7 @@
         <w:pStyle w:val="ListParagraph"/>
         <w:numPr>
           <w:ilvl w:val="0"/>
-          <w:numId w:val="2"/>
+          <w:numId w:val="3"/>
         </w:numPr>
         <w:spacing w:after="80" w:line="290"/>
       </w:pPr>
@@ -14191,7 +11547,7 @@
           <wp:inline distT="0" distB="0" distL="0" distR="0">
             <wp:extent cx="5715000" cy="3571875"/>
             <wp:effectExtent t="0" r="0" b="0" l="0"/>
-            <wp:docPr id="16" name="28-dnd" descr="Bir Task sürüklenirken hedef Task ve Ayır alanı" title="Bir Task sürüklenirken hedef Task ve Ayır alanı"/>
+            <wp:docPr id="15" name="28-dnd" descr="Bir Task sürüklenirken hedef Task ve Ayır alanı" title="Bir Task sürüklenirken hedef Task ve Ayır alanı"/>
             <wp:cNvGraphicFramePr>
               <a:graphicFrameLocks xmlns:a="http://schemas.openxmlformats.org/drawingml/2006/main" noChangeAspect="1"/>
             </wp:cNvGraphicFramePr>
@@ -14587,7 +11943,7 @@
           <wp:inline distT="0" distB="0" distL="0" distR="0">
             <wp:extent cx="5715000" cy="3571875"/>
             <wp:effectExtent t="0" r="0" b="0" l="0"/>
-            <wp:docPr id="17" name="20-backlog" descr="Backlog ve sprint'ler sayfası" title="Backlog ve sprint'ler sayfası"/>
+            <wp:docPr id="16" name="20-backlog" descr="Backlog ve sprint'ler sayfası" title="Backlog ve sprint'ler sayfası"/>
             <wp:cNvGraphicFramePr>
               <a:graphicFrameLocks xmlns:a="http://schemas.openxmlformats.org/drawingml/2006/main" noChangeAspect="1"/>
             </wp:cNvGraphicFramePr>
@@ -15195,7 +12551,7 @@
           <wp:inline distT="0" distB="0" distL="0" distR="0">
             <wp:extent cx="4552950" cy="4095750"/>
             <wp:effectExtent t="0" r="0" b="0" l="0"/>
-            <wp:docPr id="18" name="21-sprint-create" descr="Yeni Sprint oluşturma penceresi" title="Yeni Sprint oluşturma penceresi"/>
+            <wp:docPr id="17" name="21-sprint-create" descr="Yeni Sprint oluşturma penceresi" title="Yeni Sprint oluşturma penceresi"/>
             <wp:cNvGraphicFramePr>
               <a:graphicFrameLocks xmlns:a="http://schemas.openxmlformats.org/drawingml/2006/main" noChangeAspect="1"/>
             </wp:cNvGraphicFramePr>
@@ -16494,7 +13850,7 @@
           <wp:inline distT="0" distB="0" distL="0" distR="0">
             <wp:extent cx="5715000" cy="3571875"/>
             <wp:effectExtent t="0" r="0" b="0" l="0"/>
-            <wp:docPr id="19" name="22-sprint-move" descr="Task'ı Sprint'e taşıma menüsü" title="Task'ı Sprint'e taşıma menüsü"/>
+            <wp:docPr id="18" name="22-sprint-move" descr="Task'ı Sprint'e taşıma menüsü" title="Task'ı Sprint'e taşıma menüsü"/>
             <wp:cNvGraphicFramePr>
               <a:graphicFrameLocks xmlns:a="http://schemas.openxmlformats.org/drawingml/2006/main" noChangeAspect="1"/>
             </wp:cNvGraphicFramePr>
@@ -16769,7 +14125,7 @@
         <w:pStyle w:val="ListParagraph"/>
         <w:numPr>
           <w:ilvl w:val="0"/>
-          <w:numId w:val="2"/>
+          <w:numId w:val="3"/>
         </w:numPr>
         <w:spacing w:after="80" w:line="290"/>
       </w:pPr>
@@ -16805,7 +14161,7 @@
         <w:pStyle w:val="ListParagraph"/>
         <w:numPr>
           <w:ilvl w:val="0"/>
-          <w:numId w:val="2"/>
+          <w:numId w:val="3"/>
         </w:numPr>
         <w:spacing w:after="80" w:line="290"/>
       </w:pPr>
@@ -16859,7 +14215,7 @@
         <w:pStyle w:val="ListParagraph"/>
         <w:numPr>
           <w:ilvl w:val="0"/>
-          <w:numId w:val="2"/>
+          <w:numId w:val="3"/>
         </w:numPr>
         <w:spacing w:after="80" w:line="290"/>
       </w:pPr>
@@ -17134,7 +14490,7 @@
           <wp:inline distT="0" distB="0" distL="0" distR="0">
             <wp:extent cx="5715000" cy="3571875"/>
             <wp:effectExtent t="0" r="0" b="0" l="0"/>
-            <wp:docPr id="20" name="23-sprint-menu" descr="Sprint menüsü" title="Sprint menüsü"/>
+            <wp:docPr id="19" name="23-sprint-menu" descr="Sprint menüsü" title="Sprint menüsü"/>
             <wp:cNvGraphicFramePr>
               <a:graphicFrameLocks xmlns:a="http://schemas.openxmlformats.org/drawingml/2006/main" noChangeAspect="1"/>
             </wp:cNvGraphicFramePr>
@@ -17503,7 +14859,7 @@
           <wp:inline distT="0" distB="0" distL="0" distR="0">
             <wp:extent cx="4552950" cy="4095750"/>
             <wp:effectExtent t="0" r="0" b="0" l="0"/>
-            <wp:docPr id="21" name="24-sprint-edit" descr="Sprint düzenleme penceresi" title="Sprint düzenleme penceresi"/>
+            <wp:docPr id="20" name="24-sprint-edit" descr="Sprint düzenleme penceresi" title="Sprint düzenleme penceresi"/>
             <wp:cNvGraphicFramePr>
               <a:graphicFrameLocks xmlns:a="http://schemas.openxmlformats.org/drawingml/2006/main" noChangeAspect="1"/>
             </wp:cNvGraphicFramePr>
@@ -17955,7 +15311,7 @@
           <wp:inline distT="0" distB="0" distL="0" distR="0">
             <wp:extent cx="5715000" cy="1743075"/>
             <wp:effectExtent t="0" r="0" b="0" l="0"/>
-            <wp:docPr id="22" name="25-sprint-header" descr="Sprint başlığı ve özet paneli" title="Sprint başlığı ve özet paneli"/>
+            <wp:docPr id="21" name="25-sprint-header" descr="Sprint başlığı ve özet paneli" title="Sprint başlığı ve özet paneli"/>
             <wp:cNvGraphicFramePr>
               <a:graphicFrameLocks xmlns:a="http://schemas.openxmlformats.org/drawingml/2006/main" noChangeAspect="1"/>
             </wp:cNvGraphicFramePr>
@@ -18494,7 +15850,7 @@
         <w:pStyle w:val="ListParagraph"/>
         <w:numPr>
           <w:ilvl w:val="0"/>
-          <w:numId w:val="2"/>
+          <w:numId w:val="3"/>
         </w:numPr>
         <w:spacing w:after="80" w:line="290"/>
       </w:pPr>
@@ -18530,7 +15886,7 @@
         <w:pStyle w:val="ListParagraph"/>
         <w:numPr>
           <w:ilvl w:val="0"/>
-          <w:numId w:val="2"/>
+          <w:numId w:val="3"/>
         </w:numPr>
         <w:spacing w:after="80" w:line="290"/>
       </w:pPr>
@@ -18602,7 +15958,7 @@
         <w:pStyle w:val="ListParagraph"/>
         <w:numPr>
           <w:ilvl w:val="0"/>
-          <w:numId w:val="2"/>
+          <w:numId w:val="3"/>
         </w:numPr>
         <w:spacing w:after="80" w:line="290"/>
       </w:pPr>
@@ -18638,7 +15994,7 @@
         <w:pStyle w:val="ListParagraph"/>
         <w:numPr>
           <w:ilvl w:val="0"/>
-          <w:numId w:val="2"/>
+          <w:numId w:val="3"/>
         </w:numPr>
         <w:spacing w:after="80" w:line="290"/>
       </w:pPr>
@@ -18872,7 +16228,7 @@
           <wp:inline distT="0" distB="0" distL="0" distR="0">
             <wp:extent cx="5715000" cy="3571875"/>
             <wp:effectExtent t="0" r="0" b="0" l="0"/>
-            <wp:docPr id="23" name="26-board" descr="Sprint panosu (Kanban)" title="Sprint panosu (Kanban)"/>
+            <wp:docPr id="22" name="26-board" descr="Sprint panosu (Kanban)" title="Sprint panosu (Kanban)"/>
             <wp:cNvGraphicFramePr>
               <a:graphicFrameLocks xmlns:a="http://schemas.openxmlformats.org/drawingml/2006/main" noChangeAspect="1"/>
             </wp:cNvGraphicFramePr>
@@ -19323,7 +16679,7 @@
         <w:pStyle w:val="ListParagraph"/>
         <w:numPr>
           <w:ilvl w:val="0"/>
-          <w:numId w:val="2"/>
+          <w:numId w:val="3"/>
         </w:numPr>
         <w:spacing w:after="80" w:line="290"/>
       </w:pPr>
@@ -19377,7 +16733,7 @@
         <w:pStyle w:val="ListParagraph"/>
         <w:numPr>
           <w:ilvl w:val="0"/>
-          <w:numId w:val="2"/>
+          <w:numId w:val="3"/>
         </w:numPr>
         <w:spacing w:after="80" w:line="290"/>
       </w:pPr>
@@ -19449,7 +16805,7 @@
         <w:pStyle w:val="ListParagraph"/>
         <w:numPr>
           <w:ilvl w:val="0"/>
-          <w:numId w:val="2"/>
+          <w:numId w:val="3"/>
         </w:numPr>
         <w:spacing w:after="80" w:line="290"/>
       </w:pPr>
@@ -19981,7 +17337,7 @@
           <wp:inline distT="0" distB="0" distL="0" distR="0">
             <wp:extent cx="5715000" cy="3571875"/>
             <wp:effectExtent t="0" r="0" b="0" l="0"/>
-            <wp:docPr id="24" name="27-bugs" descr="Bug ekranı" title="Bug ekranı"/>
+            <wp:docPr id="23" name="27-bugs" descr="Bug ekranı" title="Bug ekranı"/>
             <wp:cNvGraphicFramePr>
               <a:graphicFrameLocks xmlns:a="http://schemas.openxmlformats.org/drawingml/2006/main" noChangeAspect="1"/>
             </wp:cNvGraphicFramePr>
@@ -20882,7 +18238,7 @@
           <wp:inline distT="0" distB="0" distL="0" distR="0">
             <wp:extent cx="5715000" cy="3571875"/>
             <wp:effectExtent t="0" r="0" b="0" l="0"/>
-            <wp:docPr id="25" name="22-new-menu" descr="New menüsü" title="New menüsü"/>
+            <wp:docPr id="24" name="22-new-menu" descr="New menüsü" title="New menüsü"/>
             <wp:cNvGraphicFramePr>
               <a:graphicFrameLocks xmlns:a="http://schemas.openxmlformats.org/drawingml/2006/main" noChangeAspect="1"/>
             </wp:cNvGraphicFramePr>
@@ -21747,7 +19103,7 @@
           <wp:inline distT="0" distB="0" distL="0" distR="0">
             <wp:extent cx="5029200" cy="4095750"/>
             <wp:effectExtent t="0" r="0" b="0" l="0"/>
-            <wp:docPr id="26" name="23-share" descr="Sharing and permissions penceresi" title="Sharing and permissions penceresi"/>
+            <wp:docPr id="25" name="23-share" descr="Sharing and permissions penceresi" title="Sharing and permissions penceresi"/>
             <wp:cNvGraphicFramePr>
               <a:graphicFrameLocks xmlns:a="http://schemas.openxmlformats.org/drawingml/2006/main" noChangeAspect="1"/>
             </wp:cNvGraphicFramePr>
@@ -22607,7 +19963,7 @@
           <wp:inline distT="0" distB="0" distL="0" distR="0">
             <wp:extent cx="5715000" cy="3571875"/>
             <wp:effectExtent t="0" r="0" b="0" l="0"/>
-            <wp:docPr id="27" name="24-roles" descr="Roller ve yetkiler tablosu" title="Roller ve yetkiler tablosu"/>
+            <wp:docPr id="26" name="24-roles" descr="Roller ve yetkiler tablosu" title="Roller ve yetkiler tablosu"/>
             <wp:cNvGraphicFramePr>
               <a:graphicFrameLocks xmlns:a="http://schemas.openxmlformats.org/drawingml/2006/main" noChangeAspect="1"/>
             </wp:cNvGraphicFramePr>
@@ -23137,7 +20493,7 @@
         <w:pStyle w:val="ListParagraph"/>
         <w:numPr>
           <w:ilvl w:val="0"/>
-          <w:numId w:val="2"/>
+          <w:numId w:val="3"/>
         </w:numPr>
         <w:spacing w:after="80" w:line="290"/>
       </w:pPr>
@@ -23191,7 +20547,7 @@
         <w:pStyle w:val="ListParagraph"/>
         <w:numPr>
           <w:ilvl w:val="0"/>
-          <w:numId w:val="2"/>
+          <w:numId w:val="3"/>
         </w:numPr>
         <w:spacing w:after="80" w:line="290"/>
       </w:pPr>
@@ -23245,7 +20601,7 @@
         <w:pStyle w:val="ListParagraph"/>
         <w:numPr>
           <w:ilvl w:val="0"/>
-          <w:numId w:val="2"/>
+          <w:numId w:val="3"/>
         </w:numPr>
         <w:spacing w:after="80" w:line="290"/>
       </w:pPr>
@@ -23281,7 +20637,7 @@
         <w:pStyle w:val="ListParagraph"/>
         <w:numPr>
           <w:ilvl w:val="0"/>
-          <w:numId w:val="2"/>
+          <w:numId w:val="3"/>
         </w:numPr>
         <w:spacing w:after="80" w:line="290"/>
       </w:pPr>
@@ -23628,7 +20984,7 @@
           <wp:inline distT="0" distB="0" distL="0" distR="0">
             <wp:extent cx="5715000" cy="3571875"/>
             <wp:effectExtent t="0" r="0" b="0" l="0"/>
-            <wp:docPr id="28" name="25-kanban" descr="Proje Kanban board" title="Proje Kanban board"/>
+            <wp:docPr id="27" name="25-kanban" descr="Proje Kanban board" title="Proje Kanban board"/>
             <wp:cNvGraphicFramePr>
               <a:graphicFrameLocks xmlns:a="http://schemas.openxmlformats.org/drawingml/2006/main" noChangeAspect="1"/>
             </wp:cNvGraphicFramePr>
@@ -24851,7 +22207,7 @@
         <w:pStyle w:val="ListParagraph"/>
         <w:numPr>
           <w:ilvl w:val="0"/>
-          <w:numId w:val="2"/>
+          <w:numId w:val="3"/>
         </w:numPr>
         <w:spacing w:after="80" w:line="290"/>
       </w:pPr>
@@ -24887,7 +22243,7 @@
         <w:pStyle w:val="ListParagraph"/>
         <w:numPr>
           <w:ilvl w:val="0"/>
-          <w:numId w:val="2"/>
+          <w:numId w:val="3"/>
         </w:numPr>
         <w:spacing w:after="80" w:line="290"/>
       </w:pPr>
@@ -24923,7 +22279,7 @@
         <w:pStyle w:val="ListParagraph"/>
         <w:numPr>
           <w:ilvl w:val="0"/>
-          <w:numId w:val="2"/>
+          <w:numId w:val="3"/>
         </w:numPr>
         <w:spacing w:after="80" w:line="290"/>
       </w:pPr>
@@ -24959,7 +22315,7 @@
         <w:pStyle w:val="ListParagraph"/>
         <w:numPr>
           <w:ilvl w:val="0"/>
-          <w:numId w:val="2"/>
+          <w:numId w:val="3"/>
         </w:numPr>
         <w:spacing w:after="80" w:line="290"/>
       </w:pPr>
@@ -24995,7 +22351,7 @@
         <w:pStyle w:val="ListParagraph"/>
         <w:numPr>
           <w:ilvl w:val="0"/>
-          <w:numId w:val="2"/>
+          <w:numId w:val="3"/>
         </w:numPr>
         <w:spacing w:after="80" w:line="290"/>
       </w:pPr>
@@ -25031,7 +22387,7 @@
         <w:pStyle w:val="ListParagraph"/>
         <w:numPr>
           <w:ilvl w:val="0"/>
-          <w:numId w:val="2"/>
+          <w:numId w:val="3"/>
         </w:numPr>
         <w:spacing w:after="80" w:line="290"/>
       </w:pPr>
@@ -25085,7 +22441,7 @@
         <w:pStyle w:val="ListParagraph"/>
         <w:numPr>
           <w:ilvl w:val="0"/>
-          <w:numId w:val="2"/>
+          <w:numId w:val="3"/>
         </w:numPr>
         <w:spacing w:after="80" w:line="290"/>
       </w:pPr>
@@ -25121,7 +22477,7 @@
         <w:pStyle w:val="ListParagraph"/>
         <w:numPr>
           <w:ilvl w:val="0"/>
-          <w:numId w:val="2"/>
+          <w:numId w:val="3"/>
         </w:numPr>
         <w:spacing w:after="80" w:line="290"/>
       </w:pPr>
@@ -25734,13 +23090,13 @@
     </w:lvlOverride>
   </w:num>
   <w:num w:numId="2">
-    <w:abstractNumId w:val="2"/>
+    <w:abstractNumId w:val="3"/>
     <w:lvlOverride w:ilvl="0">
       <w:startOverride w:val="1"/>
     </w:lvlOverride>
   </w:num>
   <w:num w:numId="3">
-    <w:abstractNumId w:val="3"/>
+    <w:abstractNumId w:val="2"/>
     <w:lvlOverride w:ilvl="0">
       <w:startOverride w:val="1"/>
     </w:lvlOverride>

</xml_diff>